<commit_message>
Corretto day hh mm
</commit_message>
<xml_diff>
--- a/SMS Manager for Power monitoring.docx
+++ b/SMS Manager for Power monitoring.docx
@@ -51,7 +51,7 @@
           <w:color w:val="000000" w:themeColor="text1"/>
           <w:sz w:val="28"/>
           <w:szCs w:val="28"/>
-          <w:lang w:eastAsia="it-IT"/>
+          <w:lang w:val="en-US" w:eastAsia="it-IT"/>
         </w:rPr>
       </w:pPr>
       <w:r>
@@ -66,6 +66,7 @@
         </w:rPr>
         <w:t xml:space="preserve">  </w:t>
       </w:r>
+      <w:proofErr w:type="spellStart"/>
       <w:r>
         <w:rPr>
           <w:rFonts w:ascii="Arial" w:eastAsia="Times New Roman" w:hAnsi="Arial" w:cs="Arial"/>
@@ -74,31 +75,54 @@
           <w:color w:val="000000" w:themeColor="text1"/>
           <w:sz w:val="28"/>
           <w:szCs w:val="28"/>
-          <w:lang w:eastAsia="it-IT"/>
-        </w:rPr>
-        <w:t>Specifiche:</w:t>
-      </w:r>
-    </w:p>
-    <w:p>
-      <w:pPr>
-        <w:spacing w:after="0" w:line="330" w:lineRule="atLeast"/>
-        <w:rPr>
-          <w:rFonts w:ascii="Arial" w:eastAsia="Times New Roman" w:hAnsi="Arial" w:cs="Arial"/>
-          <w:color w:val="000000" w:themeColor="text1"/>
-          <w:sz w:val="24"/>
-          <w:szCs w:val="24"/>
-          <w:lang w:eastAsia="it-IT"/>
-        </w:rPr>
-      </w:pPr>
-      <w:r>
-        <w:rPr>
-          <w:rFonts w:ascii="Arial" w:eastAsia="Times New Roman" w:hAnsi="Arial" w:cs="Arial"/>
-          <w:color w:val="000000" w:themeColor="text1"/>
-          <w:sz w:val="24"/>
-          <w:szCs w:val="24"/>
-          <w:lang w:eastAsia="it-IT"/>
-        </w:rPr>
-        <w:t>  - OK    Verifica corretta registrazione</w:t>
+          <w:lang w:val="en-US" w:eastAsia="it-IT"/>
+        </w:rPr>
+        <w:t>Specifiche</w:t>
+      </w:r>
+      <w:proofErr w:type="spellEnd"/>
+      <w:r>
+        <w:rPr>
+          <w:rFonts w:ascii="Arial" w:eastAsia="Times New Roman" w:hAnsi="Arial" w:cs="Arial"/>
+          <w:b/>
+          <w:bCs/>
+          <w:color w:val="000000" w:themeColor="text1"/>
+          <w:sz w:val="28"/>
+          <w:szCs w:val="28"/>
+          <w:lang w:val="en-US" w:eastAsia="it-IT"/>
+        </w:rPr>
+        <w:t>:</w:t>
+      </w:r>
+    </w:p>
+    <w:p>
+      <w:pPr>
+        <w:spacing w:after="0" w:line="330" w:lineRule="atLeast"/>
+        <w:rPr>
+          <w:rFonts w:ascii="Arial" w:eastAsia="Times New Roman" w:hAnsi="Arial" w:cs="Arial"/>
+          <w:color w:val="000000" w:themeColor="text1"/>
+          <w:sz w:val="24"/>
+          <w:szCs w:val="24"/>
+          <w:lang w:eastAsia="it-IT"/>
+        </w:rPr>
+      </w:pPr>
+      <w:r>
+        <w:rPr>
+          <w:rFonts w:ascii="Arial" w:eastAsia="Times New Roman" w:hAnsi="Arial" w:cs="Arial"/>
+          <w:color w:val="000000" w:themeColor="text1"/>
+          <w:sz w:val="24"/>
+          <w:szCs w:val="24"/>
+          <w:lang w:val="en-US" w:eastAsia="it-IT"/>
+        </w:rPr>
+        <w:t xml:space="preserve">  </w:t>
+      </w:r>
+      <w:r>
+        <w:rPr>
+          <w:rFonts w:ascii="Arial" w:eastAsia="Times New Roman" w:hAnsi="Arial" w:cs="Arial"/>
+          <w:color w:val="000000" w:themeColor="text1"/>
+          <w:sz w:val="24"/>
+          <w:szCs w:val="24"/>
+          <w:lang w:eastAsia="it-IT"/>
+        </w:rPr>
+        <w:t>- OK    Verifica corretta registrazione</w:t>
       </w:r>
     </w:p>
     <w:p>
@@ -1864,7 +1888,846 @@
           <w:szCs w:val="24"/>
           <w:lang w:eastAsia="it-IT"/>
         </w:rPr>
-        <w:t>  -  Con "D" il MASTER può CANCELLARE tutti i cellulari eccetto il numero Master autorizzato (0)    </w:t>
+        <w:t>  -  Con "D" il MASTER può CANCELLARE tutti i cellulari eccetto il numero Master autorizzato (0)</w:t>
+      </w:r>
+    </w:p>
+    <w:p>
+      <w:pPr>
+        <w:spacing w:after="0" w:line="330" w:lineRule="atLeast"/>
+        <w:rPr>
+          <w:rFonts w:ascii="Arial" w:eastAsia="Times New Roman" w:hAnsi="Arial" w:cs="Arial"/>
+          <w:color w:val="000000" w:themeColor="text1"/>
+          <w:sz w:val="24"/>
+          <w:szCs w:val="24"/>
+          <w:lang w:eastAsia="it-IT"/>
+        </w:rPr>
+      </w:pPr>
+    </w:p>
+    <w:p>
+      <w:pPr>
+        <w:spacing w:after="0" w:line="330" w:lineRule="atLeast"/>
+        <w:rPr>
+          <w:rFonts w:ascii="Arial" w:eastAsia="Times New Roman" w:hAnsi="Arial" w:cs="Arial"/>
+          <w:b/>
+          <w:bCs/>
+          <w:color w:val="000000" w:themeColor="text1"/>
+          <w:sz w:val="24"/>
+          <w:szCs w:val="24"/>
+          <w:lang w:eastAsia="it-IT"/>
+        </w:rPr>
+      </w:pPr>
+      <w:r>
+        <w:rPr>
+          <w:rFonts w:ascii="Arial" w:eastAsia="Times New Roman" w:hAnsi="Arial" w:cs="Arial"/>
+          <w:b/>
+          <w:bCs/>
+          <w:color w:val="000000" w:themeColor="text1"/>
+          <w:sz w:val="24"/>
+          <w:szCs w:val="24"/>
+          <w:lang w:eastAsia="it-IT"/>
+        </w:rPr>
+        <w:t>Punti chiave del flusso</w:t>
+      </w:r>
+    </w:p>
+    <w:p>
+      <w:pPr>
+        <w:numPr>
+          <w:ilvl w:val="0"/>
+          <w:numId w:val="1"/>
+        </w:numPr>
+        <w:spacing w:after="0" w:line="240" w:lineRule="auto"/>
+        <w:rPr>
+          <w:rFonts w:ascii="Segoe UI" w:eastAsia="Times New Roman" w:hAnsi="Segoe UI" w:cs="Segoe UI"/>
+          <w:color w:val="000000" w:themeColor="text1"/>
+          <w:sz w:val="20"/>
+          <w:szCs w:val="20"/>
+          <w:lang w:eastAsia="it-IT"/>
+        </w:rPr>
+      </w:pPr>
+      <w:hyperlink r:id="rId5" w:history="1">
+        <w:proofErr w:type="gramStart"/>
+        <w:r>
+          <w:rPr>
+            <w:rFonts w:ascii="Segoe UI" w:eastAsia="Times New Roman" w:hAnsi="Segoe UI" w:cs="Segoe UI"/>
+            <w:color w:val="000000" w:themeColor="text1"/>
+            <w:sz w:val="18"/>
+            <w:szCs w:val="18"/>
+            <w:u w:val="single"/>
+            <w:bdr w:val="single" w:sz="4" w:space="1" w:color="auto" w:frame="1"/>
+            <w:lang w:eastAsia="it-IT"/>
+          </w:rPr>
+          <w:t>setup(</w:t>
+        </w:r>
+        <w:proofErr w:type="gramEnd"/>
+        <w:r>
+          <w:rPr>
+            <w:rFonts w:ascii="Segoe UI" w:eastAsia="Times New Roman" w:hAnsi="Segoe UI" w:cs="Segoe UI"/>
+            <w:color w:val="000000" w:themeColor="text1"/>
+            <w:sz w:val="18"/>
+            <w:szCs w:val="18"/>
+            <w:u w:val="single"/>
+            <w:bdr w:val="single" w:sz="4" w:space="1" w:color="auto" w:frame="1"/>
+            <w:lang w:eastAsia="it-IT"/>
+          </w:rPr>
+          <w:t>)</w:t>
+        </w:r>
+      </w:hyperlink>
+    </w:p>
+    <w:p>
+      <w:pPr>
+        <w:numPr>
+          <w:ilvl w:val="1"/>
+          <w:numId w:val="1"/>
+        </w:numPr>
+        <w:spacing w:before="60" w:after="60" w:line="240" w:lineRule="auto"/>
+        <w:rPr>
+          <w:rFonts w:ascii="Segoe UI" w:eastAsia="Times New Roman" w:hAnsi="Segoe UI" w:cs="Segoe UI"/>
+          <w:color w:val="000000" w:themeColor="text1"/>
+          <w:sz w:val="20"/>
+          <w:szCs w:val="20"/>
+          <w:lang w:eastAsia="it-IT"/>
+        </w:rPr>
+      </w:pPr>
+      <w:r>
+        <w:rPr>
+          <w:rFonts w:ascii="Segoe UI" w:eastAsia="Times New Roman" w:hAnsi="Segoe UI" w:cs="Segoe UI"/>
+          <w:color w:val="000000" w:themeColor="text1"/>
+          <w:sz w:val="20"/>
+          <w:szCs w:val="20"/>
+          <w:lang w:eastAsia="it-IT"/>
+        </w:rPr>
+        <w:t>inizializza reset pin</w:t>
+      </w:r>
+    </w:p>
+    <w:p>
+      <w:pPr>
+        <w:numPr>
+          <w:ilvl w:val="1"/>
+          <w:numId w:val="1"/>
+        </w:numPr>
+        <w:spacing w:after="0" w:line="240" w:lineRule="auto"/>
+        <w:rPr>
+          <w:rFonts w:ascii="Segoe UI" w:eastAsia="Times New Roman" w:hAnsi="Segoe UI" w:cs="Segoe UI"/>
+          <w:color w:val="000000" w:themeColor="text1"/>
+          <w:sz w:val="20"/>
+          <w:szCs w:val="20"/>
+          <w:lang w:eastAsia="it-IT"/>
+        </w:rPr>
+      </w:pPr>
+      <w:r>
+        <w:rPr>
+          <w:rFonts w:ascii="Segoe UI" w:eastAsia="Times New Roman" w:hAnsi="Segoe UI" w:cs="Segoe UI"/>
+          <w:color w:val="000000" w:themeColor="text1"/>
+          <w:sz w:val="20"/>
+          <w:szCs w:val="20"/>
+          <w:lang w:eastAsia="it-IT"/>
+        </w:rPr>
+        <w:t>chiama </w:t>
+      </w:r>
+      <w:proofErr w:type="spellStart"/>
+      <w:r>
+        <w:rPr>
+          <w:rFonts w:ascii="Segoe UI" w:eastAsia="Times New Roman" w:hAnsi="Segoe UI" w:cs="Segoe UI"/>
+          <w:color w:val="000000" w:themeColor="text1"/>
+          <w:sz w:val="20"/>
+          <w:szCs w:val="20"/>
+          <w:lang w:eastAsia="it-IT"/>
+        </w:rPr>
+        <w:fldChar w:fldCharType="begin"/>
+      </w:r>
+      <w:r>
+        <w:rPr>
+          <w:rFonts w:ascii="Segoe UI" w:eastAsia="Times New Roman" w:hAnsi="Segoe UI" w:cs="Segoe UI"/>
+          <w:color w:val="000000" w:themeColor="text1"/>
+          <w:sz w:val="20"/>
+          <w:szCs w:val="20"/>
+          <w:lang w:eastAsia="it-IT"/>
+        </w:rPr>
+        <w:instrText xml:space="preserve"> HYPERLINK "vscode-file://vscode-app/c:/Users/Massimo/AppData/Local/Programs/Microsoft%20VS%20Code/f6cfa2ea24/resources/app/out/vs/code/electron-browser/workbench/workbench.html" \o "" </w:instrText>
+      </w:r>
+      <w:r>
+        <w:rPr>
+          <w:rFonts w:ascii="Segoe UI" w:eastAsia="Times New Roman" w:hAnsi="Segoe UI" w:cs="Segoe UI"/>
+          <w:color w:val="000000" w:themeColor="text1"/>
+          <w:sz w:val="20"/>
+          <w:szCs w:val="20"/>
+          <w:lang w:eastAsia="it-IT"/>
+        </w:rPr>
+        <w:fldChar w:fldCharType="separate"/>
+      </w:r>
+      <w:r>
+        <w:rPr>
+          <w:rFonts w:ascii="Segoe UI" w:eastAsia="Times New Roman" w:hAnsi="Segoe UI" w:cs="Segoe UI"/>
+          <w:color w:val="000000" w:themeColor="text1"/>
+          <w:sz w:val="18"/>
+          <w:szCs w:val="18"/>
+          <w:bdr w:val="single" w:sz="4" w:space="1" w:color="auto" w:frame="1"/>
+          <w:lang w:eastAsia="it-IT"/>
+        </w:rPr>
+        <w:t>initgsm</w:t>
+      </w:r>
+      <w:proofErr w:type="spellEnd"/>
+      <w:r>
+        <w:rPr>
+          <w:rFonts w:ascii="Segoe UI" w:eastAsia="Times New Roman" w:hAnsi="Segoe UI" w:cs="Segoe UI"/>
+          <w:color w:val="000000" w:themeColor="text1"/>
+          <w:sz w:val="18"/>
+          <w:szCs w:val="18"/>
+          <w:bdr w:val="single" w:sz="4" w:space="1" w:color="auto" w:frame="1"/>
+          <w:lang w:eastAsia="it-IT"/>
+        </w:rPr>
+        <w:t>()</w:t>
+      </w:r>
+      <w:r>
+        <w:rPr>
+          <w:rFonts w:ascii="Segoe UI" w:eastAsia="Times New Roman" w:hAnsi="Segoe UI" w:cs="Segoe UI"/>
+          <w:color w:val="000000" w:themeColor="text1"/>
+          <w:sz w:val="20"/>
+          <w:szCs w:val="20"/>
+          <w:lang w:eastAsia="it-IT"/>
+        </w:rPr>
+        <w:fldChar w:fldCharType="end"/>
+      </w:r>
+    </w:p>
+    <w:p>
+      <w:pPr>
+        <w:numPr>
+          <w:ilvl w:val="1"/>
+          <w:numId w:val="1"/>
+        </w:numPr>
+        <w:spacing w:after="0" w:line="240" w:lineRule="auto"/>
+        <w:rPr>
+          <w:rFonts w:ascii="Segoe UI" w:eastAsia="Times New Roman" w:hAnsi="Segoe UI" w:cs="Segoe UI"/>
+          <w:color w:val="000000" w:themeColor="text1"/>
+          <w:sz w:val="20"/>
+          <w:szCs w:val="20"/>
+          <w:lang w:eastAsia="it-IT"/>
+        </w:rPr>
+      </w:pPr>
+      <w:r>
+        <w:rPr>
+          <w:rFonts w:ascii="Segoe UI" w:eastAsia="Times New Roman" w:hAnsi="Segoe UI" w:cs="Segoe UI"/>
+          <w:color w:val="000000" w:themeColor="text1"/>
+          <w:sz w:val="20"/>
+          <w:szCs w:val="20"/>
+          <w:lang w:eastAsia="it-IT"/>
+        </w:rPr>
+        <w:t>imposta </w:t>
+      </w:r>
+      <w:proofErr w:type="spellStart"/>
+      <w:r>
+        <w:rPr>
+          <w:rFonts w:ascii="Segoe UI" w:eastAsia="Times New Roman" w:hAnsi="Segoe UI" w:cs="Segoe UI"/>
+          <w:color w:val="000000" w:themeColor="text1"/>
+          <w:sz w:val="20"/>
+          <w:szCs w:val="20"/>
+          <w:lang w:eastAsia="it-IT"/>
+        </w:rPr>
+        <w:fldChar w:fldCharType="begin"/>
+      </w:r>
+      <w:r>
+        <w:rPr>
+          <w:rFonts w:ascii="Segoe UI" w:eastAsia="Times New Roman" w:hAnsi="Segoe UI" w:cs="Segoe UI"/>
+          <w:color w:val="000000" w:themeColor="text1"/>
+          <w:sz w:val="20"/>
+          <w:szCs w:val="20"/>
+          <w:lang w:eastAsia="it-IT"/>
+        </w:rPr>
+        <w:instrText xml:space="preserve"> HYPERLINK "vscode-file://vscode-app/c:/Users/Massimo/AppData/Local/Programs/Microsoft%20VS%20Code/f6cfa2ea24/resources/app/out/vs/code/electron-browser/workbench/workbench.html" \o "" </w:instrText>
+      </w:r>
+      <w:r>
+        <w:rPr>
+          <w:rFonts w:ascii="Segoe UI" w:eastAsia="Times New Roman" w:hAnsi="Segoe UI" w:cs="Segoe UI"/>
+          <w:color w:val="000000" w:themeColor="text1"/>
+          <w:sz w:val="20"/>
+          <w:szCs w:val="20"/>
+          <w:lang w:eastAsia="it-IT"/>
+        </w:rPr>
+        <w:fldChar w:fldCharType="separate"/>
+      </w:r>
+      <w:r>
+        <w:rPr>
+          <w:rFonts w:ascii="Segoe UI" w:eastAsia="Times New Roman" w:hAnsi="Segoe UI" w:cs="Segoe UI"/>
+          <w:color w:val="000000" w:themeColor="text1"/>
+          <w:sz w:val="18"/>
+          <w:szCs w:val="18"/>
+          <w:bdr w:val="single" w:sz="4" w:space="1" w:color="auto" w:frame="1"/>
+          <w:lang w:eastAsia="it-IT"/>
+        </w:rPr>
+        <w:t>EEPROM.update</w:t>
+      </w:r>
+      <w:proofErr w:type="spellEnd"/>
+      <w:r>
+        <w:rPr>
+          <w:rFonts w:ascii="Segoe UI" w:eastAsia="Times New Roman" w:hAnsi="Segoe UI" w:cs="Segoe UI"/>
+          <w:color w:val="000000" w:themeColor="text1"/>
+          <w:sz w:val="18"/>
+          <w:szCs w:val="18"/>
+          <w:bdr w:val="single" w:sz="4" w:space="1" w:color="auto" w:frame="1"/>
+          <w:lang w:eastAsia="it-IT"/>
+        </w:rPr>
+        <w:t>(5, 0)</w:t>
+      </w:r>
+      <w:r>
+        <w:rPr>
+          <w:rFonts w:ascii="Segoe UI" w:eastAsia="Times New Roman" w:hAnsi="Segoe UI" w:cs="Segoe UI"/>
+          <w:color w:val="000000" w:themeColor="text1"/>
+          <w:sz w:val="20"/>
+          <w:szCs w:val="20"/>
+          <w:lang w:eastAsia="it-IT"/>
+        </w:rPr>
+        <w:fldChar w:fldCharType="end"/>
+      </w:r>
+    </w:p>
+    <w:p>
+      <w:pPr>
+        <w:numPr>
+          <w:ilvl w:val="1"/>
+          <w:numId w:val="1"/>
+        </w:numPr>
+        <w:spacing w:after="0" w:line="240" w:lineRule="auto"/>
+        <w:rPr>
+          <w:rFonts w:ascii="Segoe UI" w:eastAsia="Times New Roman" w:hAnsi="Segoe UI" w:cs="Segoe UI"/>
+          <w:color w:val="000000" w:themeColor="text1"/>
+          <w:sz w:val="20"/>
+          <w:szCs w:val="20"/>
+          <w:lang w:eastAsia="it-IT"/>
+        </w:rPr>
+      </w:pPr>
+      <w:r>
+        <w:rPr>
+          <w:rFonts w:ascii="Segoe UI" w:eastAsia="Times New Roman" w:hAnsi="Segoe UI" w:cs="Segoe UI"/>
+          <w:color w:val="000000" w:themeColor="text1"/>
+          <w:sz w:val="20"/>
+          <w:szCs w:val="20"/>
+          <w:lang w:eastAsia="it-IT"/>
+        </w:rPr>
+        <w:t>carica numeri autorizzati con </w:t>
+      </w:r>
+      <w:proofErr w:type="spellStart"/>
+      <w:r>
+        <w:rPr>
+          <w:rFonts w:ascii="Segoe UI" w:eastAsia="Times New Roman" w:hAnsi="Segoe UI" w:cs="Segoe UI"/>
+          <w:color w:val="000000" w:themeColor="text1"/>
+          <w:sz w:val="20"/>
+          <w:szCs w:val="20"/>
+          <w:lang w:eastAsia="it-IT"/>
+        </w:rPr>
+        <w:fldChar w:fldCharType="begin"/>
+      </w:r>
+      <w:r>
+        <w:rPr>
+          <w:rFonts w:ascii="Segoe UI" w:eastAsia="Times New Roman" w:hAnsi="Segoe UI" w:cs="Segoe UI"/>
+          <w:color w:val="000000" w:themeColor="text1"/>
+          <w:sz w:val="20"/>
+          <w:szCs w:val="20"/>
+          <w:lang w:eastAsia="it-IT"/>
+        </w:rPr>
+        <w:instrText xml:space="preserve"> HYPERLINK "vscode-file://vscode-app/c:/Users/Massimo/AppData/Local/Programs/Microsoft%20VS%20Code/f6cfa2ea24/resources/app/out/vs/code/electron-browser/workbench/workbench.html" \o "" </w:instrText>
+      </w:r>
+      <w:r>
+        <w:rPr>
+          <w:rFonts w:ascii="Segoe UI" w:eastAsia="Times New Roman" w:hAnsi="Segoe UI" w:cs="Segoe UI"/>
+          <w:color w:val="000000" w:themeColor="text1"/>
+          <w:sz w:val="20"/>
+          <w:szCs w:val="20"/>
+          <w:lang w:eastAsia="it-IT"/>
+        </w:rPr>
+        <w:fldChar w:fldCharType="separate"/>
+      </w:r>
+      <w:r>
+        <w:rPr>
+          <w:rFonts w:ascii="Segoe UI" w:eastAsia="Times New Roman" w:hAnsi="Segoe UI" w:cs="Segoe UI"/>
+          <w:color w:val="000000" w:themeColor="text1"/>
+          <w:sz w:val="18"/>
+          <w:szCs w:val="18"/>
+          <w:bdr w:val="single" w:sz="4" w:space="1" w:color="auto" w:frame="1"/>
+          <w:lang w:eastAsia="it-IT"/>
+        </w:rPr>
+        <w:t>RestorePhones</w:t>
+      </w:r>
+      <w:proofErr w:type="spellEnd"/>
+      <w:r>
+        <w:rPr>
+          <w:rFonts w:ascii="Segoe UI" w:eastAsia="Times New Roman" w:hAnsi="Segoe UI" w:cs="Segoe UI"/>
+          <w:color w:val="000000" w:themeColor="text1"/>
+          <w:sz w:val="18"/>
+          <w:szCs w:val="18"/>
+          <w:bdr w:val="single" w:sz="4" w:space="1" w:color="auto" w:frame="1"/>
+          <w:lang w:eastAsia="it-IT"/>
+        </w:rPr>
+        <w:t>()</w:t>
+      </w:r>
+      <w:r>
+        <w:rPr>
+          <w:rFonts w:ascii="Segoe UI" w:eastAsia="Times New Roman" w:hAnsi="Segoe UI" w:cs="Segoe UI"/>
+          <w:color w:val="000000" w:themeColor="text1"/>
+          <w:sz w:val="20"/>
+          <w:szCs w:val="20"/>
+          <w:lang w:eastAsia="it-IT"/>
+        </w:rPr>
+        <w:fldChar w:fldCharType="end"/>
+      </w:r>
+    </w:p>
+    <w:p>
+      <w:pPr>
+        <w:numPr>
+          <w:ilvl w:val="0"/>
+          <w:numId w:val="1"/>
+        </w:numPr>
+        <w:spacing w:after="0" w:line="240" w:lineRule="auto"/>
+        <w:rPr>
+          <w:rFonts w:ascii="Segoe UI" w:eastAsia="Times New Roman" w:hAnsi="Segoe UI" w:cs="Segoe UI"/>
+          <w:color w:val="000000" w:themeColor="text1"/>
+          <w:sz w:val="20"/>
+          <w:szCs w:val="20"/>
+          <w:lang w:eastAsia="it-IT"/>
+        </w:rPr>
+      </w:pPr>
+      <w:hyperlink r:id="rId6" w:history="1">
+        <w:proofErr w:type="gramStart"/>
+        <w:r>
+          <w:rPr>
+            <w:rFonts w:ascii="Segoe UI" w:eastAsia="Times New Roman" w:hAnsi="Segoe UI" w:cs="Segoe UI"/>
+            <w:color w:val="000000" w:themeColor="text1"/>
+            <w:sz w:val="18"/>
+            <w:szCs w:val="18"/>
+            <w:u w:val="single"/>
+            <w:bdr w:val="single" w:sz="4" w:space="1" w:color="auto" w:frame="1"/>
+            <w:lang w:eastAsia="it-IT"/>
+          </w:rPr>
+          <w:t>loop(</w:t>
+        </w:r>
+        <w:proofErr w:type="gramEnd"/>
+        <w:r>
+          <w:rPr>
+            <w:rFonts w:ascii="Segoe UI" w:eastAsia="Times New Roman" w:hAnsi="Segoe UI" w:cs="Segoe UI"/>
+            <w:color w:val="000000" w:themeColor="text1"/>
+            <w:sz w:val="18"/>
+            <w:szCs w:val="18"/>
+            <w:u w:val="single"/>
+            <w:bdr w:val="single" w:sz="4" w:space="1" w:color="auto" w:frame="1"/>
+            <w:lang w:eastAsia="it-IT"/>
+          </w:rPr>
+          <w:t>)</w:t>
+        </w:r>
+      </w:hyperlink>
+    </w:p>
+    <w:p>
+      <w:pPr>
+        <w:numPr>
+          <w:ilvl w:val="1"/>
+          <w:numId w:val="1"/>
+        </w:numPr>
+        <w:spacing w:before="60" w:after="60" w:line="240" w:lineRule="auto"/>
+        <w:rPr>
+          <w:rFonts w:ascii="Segoe UI" w:eastAsia="Times New Roman" w:hAnsi="Segoe UI" w:cs="Segoe UI"/>
+          <w:color w:val="000000" w:themeColor="text1"/>
+          <w:sz w:val="20"/>
+          <w:szCs w:val="20"/>
+          <w:lang w:eastAsia="it-IT"/>
+        </w:rPr>
+      </w:pPr>
+      <w:r>
+        <w:rPr>
+          <w:rFonts w:ascii="Segoe UI" w:eastAsia="Times New Roman" w:hAnsi="Segoe UI" w:cs="Segoe UI"/>
+          <w:color w:val="000000" w:themeColor="text1"/>
+          <w:sz w:val="20"/>
+          <w:szCs w:val="20"/>
+          <w:lang w:eastAsia="it-IT"/>
+        </w:rPr>
+        <w:lastRenderedPageBreak/>
+        <w:t>ogni 10s controlla SMS non letti</w:t>
+      </w:r>
+    </w:p>
+    <w:p>
+      <w:pPr>
+        <w:numPr>
+          <w:ilvl w:val="1"/>
+          <w:numId w:val="1"/>
+        </w:numPr>
+        <w:spacing w:before="60" w:after="60" w:line="240" w:lineRule="auto"/>
+        <w:rPr>
+          <w:rFonts w:ascii="Segoe UI" w:eastAsia="Times New Roman" w:hAnsi="Segoe UI" w:cs="Segoe UI"/>
+          <w:color w:val="000000" w:themeColor="text1"/>
+          <w:sz w:val="20"/>
+          <w:szCs w:val="20"/>
+          <w:lang w:eastAsia="it-IT"/>
+        </w:rPr>
+      </w:pPr>
+      <w:r>
+        <w:rPr>
+          <w:rFonts w:ascii="Segoe UI" w:eastAsia="Times New Roman" w:hAnsi="Segoe UI" w:cs="Segoe UI"/>
+          <w:color w:val="000000" w:themeColor="text1"/>
+          <w:sz w:val="20"/>
+          <w:szCs w:val="20"/>
+          <w:lang w:eastAsia="it-IT"/>
+        </w:rPr>
+        <w:t>gestisce comandi SMS:</w:t>
+      </w:r>
+    </w:p>
+    <w:p>
+      <w:pPr>
+        <w:pStyle w:val="Paragrafoelenco"/>
+        <w:numPr>
+          <w:ilvl w:val="2"/>
+          <w:numId w:val="1"/>
+        </w:numPr>
+        <w:spacing w:before="60" w:after="60" w:line="240" w:lineRule="auto"/>
+        <w:rPr>
+          <w:rFonts w:ascii="Segoe UI" w:eastAsia="Times New Roman" w:hAnsi="Segoe UI" w:cs="Segoe UI"/>
+          <w:color w:val="000000" w:themeColor="text1"/>
+          <w:sz w:val="20"/>
+          <w:szCs w:val="20"/>
+          <w:lang w:eastAsia="it-IT"/>
+        </w:rPr>
+      </w:pPr>
+      <w:r>
+        <w:rPr>
+          <w:rFonts w:ascii="Segoe UI" w:eastAsia="Times New Roman" w:hAnsi="Segoe UI" w:cs="Segoe UI"/>
+          <w:color w:val="000000" w:themeColor="text1"/>
+          <w:sz w:val="20"/>
+          <w:szCs w:val="20"/>
+          <w:lang w:eastAsia="it-IT"/>
+        </w:rPr>
+        <w:t>M = cambia Master</w:t>
+      </w:r>
+    </w:p>
+    <w:p>
+      <w:pPr>
+        <w:pStyle w:val="Paragrafoelenco"/>
+        <w:numPr>
+          <w:ilvl w:val="2"/>
+          <w:numId w:val="1"/>
+        </w:numPr>
+        <w:spacing w:before="60" w:after="60" w:line="240" w:lineRule="auto"/>
+        <w:rPr>
+          <w:rFonts w:ascii="Segoe UI" w:eastAsia="Times New Roman" w:hAnsi="Segoe UI" w:cs="Segoe UI"/>
+          <w:color w:val="000000" w:themeColor="text1"/>
+          <w:sz w:val="20"/>
+          <w:szCs w:val="20"/>
+          <w:lang w:eastAsia="it-IT"/>
+        </w:rPr>
+      </w:pPr>
+      <w:r>
+        <w:rPr>
+          <w:rFonts w:ascii="Segoe UI" w:eastAsia="Times New Roman" w:hAnsi="Segoe UI" w:cs="Segoe UI"/>
+          <w:color w:val="000000" w:themeColor="text1"/>
+          <w:sz w:val="20"/>
+          <w:szCs w:val="20"/>
+          <w:lang w:eastAsia="it-IT"/>
+        </w:rPr>
+        <w:t>A = aggiunge/sostituisce ausiliario</w:t>
+      </w:r>
+    </w:p>
+    <w:p>
+      <w:pPr>
+        <w:pStyle w:val="Paragrafoelenco"/>
+        <w:numPr>
+          <w:ilvl w:val="2"/>
+          <w:numId w:val="1"/>
+        </w:numPr>
+        <w:spacing w:before="60" w:after="60" w:line="240" w:lineRule="auto"/>
+        <w:rPr>
+          <w:rFonts w:ascii="Segoe UI" w:eastAsia="Times New Roman" w:hAnsi="Segoe UI" w:cs="Segoe UI"/>
+          <w:color w:val="000000" w:themeColor="text1"/>
+          <w:sz w:val="20"/>
+          <w:szCs w:val="20"/>
+          <w:lang w:eastAsia="it-IT"/>
+        </w:rPr>
+      </w:pPr>
+      <w:r>
+        <w:rPr>
+          <w:rFonts w:ascii="Segoe UI" w:eastAsia="Times New Roman" w:hAnsi="Segoe UI" w:cs="Segoe UI"/>
+          <w:color w:val="000000" w:themeColor="text1"/>
+          <w:sz w:val="20"/>
+          <w:szCs w:val="20"/>
+          <w:lang w:eastAsia="it-IT"/>
+        </w:rPr>
+        <w:t>D = cancella ausiliari</w:t>
+      </w:r>
+    </w:p>
+    <w:p>
+      <w:pPr>
+        <w:pStyle w:val="Paragrafoelenco"/>
+        <w:numPr>
+          <w:ilvl w:val="2"/>
+          <w:numId w:val="1"/>
+        </w:numPr>
+        <w:spacing w:before="60" w:after="60" w:line="240" w:lineRule="auto"/>
+        <w:rPr>
+          <w:rFonts w:ascii="Segoe UI" w:eastAsia="Times New Roman" w:hAnsi="Segoe UI" w:cs="Segoe UI"/>
+          <w:color w:val="000000" w:themeColor="text1"/>
+          <w:sz w:val="20"/>
+          <w:szCs w:val="20"/>
+          <w:lang w:eastAsia="it-IT"/>
+        </w:rPr>
+      </w:pPr>
+      <w:r>
+        <w:rPr>
+          <w:rFonts w:ascii="Segoe UI" w:eastAsia="Times New Roman" w:hAnsi="Segoe UI" w:cs="Segoe UI"/>
+          <w:color w:val="000000" w:themeColor="text1"/>
+          <w:sz w:val="20"/>
+          <w:szCs w:val="20"/>
+          <w:lang w:eastAsia="it-IT"/>
+        </w:rPr>
+        <w:t>N = lista numeri autorizzati</w:t>
+      </w:r>
+    </w:p>
+    <w:p>
+      <w:pPr>
+        <w:pStyle w:val="Paragrafoelenco"/>
+        <w:numPr>
+          <w:ilvl w:val="2"/>
+          <w:numId w:val="1"/>
+        </w:numPr>
+        <w:spacing w:before="60" w:after="60" w:line="240" w:lineRule="auto"/>
+        <w:rPr>
+          <w:rFonts w:ascii="Segoe UI" w:eastAsia="Times New Roman" w:hAnsi="Segoe UI" w:cs="Segoe UI"/>
+          <w:color w:val="000000" w:themeColor="text1"/>
+          <w:sz w:val="20"/>
+          <w:szCs w:val="20"/>
+          <w:lang w:eastAsia="it-IT"/>
+        </w:rPr>
+      </w:pPr>
+      <w:r>
+        <w:rPr>
+          <w:rFonts w:ascii="Segoe UI" w:eastAsia="Times New Roman" w:hAnsi="Segoe UI" w:cs="Segoe UI"/>
+          <w:color w:val="000000" w:themeColor="text1"/>
+          <w:sz w:val="20"/>
+          <w:szCs w:val="20"/>
+          <w:lang w:eastAsia="it-IT"/>
+        </w:rPr>
+        <w:t>E = cancella tutti i numeri</w:t>
+      </w:r>
+    </w:p>
+    <w:p>
+      <w:pPr>
+        <w:pStyle w:val="Paragrafoelenco"/>
+        <w:numPr>
+          <w:ilvl w:val="2"/>
+          <w:numId w:val="1"/>
+        </w:numPr>
+        <w:spacing w:before="60" w:after="60" w:line="240" w:lineRule="auto"/>
+        <w:rPr>
+          <w:rFonts w:ascii="Segoe UI" w:eastAsia="Times New Roman" w:hAnsi="Segoe UI" w:cs="Segoe UI"/>
+          <w:color w:val="000000" w:themeColor="text1"/>
+          <w:sz w:val="20"/>
+          <w:szCs w:val="20"/>
+          <w:lang w:eastAsia="it-IT"/>
+        </w:rPr>
+      </w:pPr>
+      <w:r>
+        <w:rPr>
+          <w:rFonts w:ascii="Segoe UI" w:eastAsia="Times New Roman" w:hAnsi="Segoe UI" w:cs="Segoe UI"/>
+          <w:color w:val="000000" w:themeColor="text1"/>
+          <w:sz w:val="20"/>
+          <w:szCs w:val="20"/>
+          <w:lang w:eastAsia="it-IT"/>
+        </w:rPr>
+        <w:t>S = invia stato tensione</w:t>
+      </w:r>
+    </w:p>
+    <w:p>
+      <w:pPr>
+        <w:numPr>
+          <w:ilvl w:val="1"/>
+          <w:numId w:val="1"/>
+        </w:numPr>
+        <w:spacing w:before="60" w:after="60" w:line="240" w:lineRule="auto"/>
+        <w:rPr>
+          <w:rFonts w:ascii="Segoe UI" w:eastAsia="Times New Roman" w:hAnsi="Segoe UI" w:cs="Segoe UI"/>
+          <w:color w:val="000000" w:themeColor="text1"/>
+          <w:sz w:val="20"/>
+          <w:szCs w:val="20"/>
+          <w:lang w:eastAsia="it-IT"/>
+        </w:rPr>
+      </w:pPr>
+      <w:r>
+        <w:rPr>
+          <w:rFonts w:ascii="Segoe UI" w:eastAsia="Times New Roman" w:hAnsi="Segoe UI" w:cs="Segoe UI"/>
+          <w:color w:val="000000" w:themeColor="text1"/>
+          <w:sz w:val="20"/>
+          <w:szCs w:val="20"/>
+          <w:lang w:eastAsia="it-IT"/>
+        </w:rPr>
+        <w:t>calcola tensione e invia notifiche:</w:t>
+      </w:r>
+    </w:p>
+    <w:p>
+      <w:pPr>
+        <w:pStyle w:val="Paragrafoelenco"/>
+        <w:numPr>
+          <w:ilvl w:val="2"/>
+          <w:numId w:val="3"/>
+        </w:numPr>
+        <w:spacing w:before="60" w:after="60" w:line="240" w:lineRule="auto"/>
+        <w:rPr>
+          <w:rFonts w:ascii="Segoe UI" w:eastAsia="Times New Roman" w:hAnsi="Segoe UI" w:cs="Segoe UI"/>
+          <w:color w:val="000000" w:themeColor="text1"/>
+          <w:sz w:val="20"/>
+          <w:szCs w:val="20"/>
+          <w:lang w:eastAsia="it-IT"/>
+        </w:rPr>
+      </w:pPr>
+      <w:r>
+        <w:rPr>
+          <w:rFonts w:ascii="Segoe UI" w:eastAsia="Times New Roman" w:hAnsi="Segoe UI" w:cs="Segoe UI"/>
+          <w:color w:val="000000" w:themeColor="text1"/>
+          <w:sz w:val="20"/>
+          <w:szCs w:val="20"/>
+          <w:lang w:eastAsia="it-IT"/>
+        </w:rPr>
+        <w:t>sotto 180V → MANCANZA RETE</w:t>
+      </w:r>
+    </w:p>
+    <w:p>
+      <w:pPr>
+        <w:pStyle w:val="Paragrafoelenco"/>
+        <w:numPr>
+          <w:ilvl w:val="2"/>
+          <w:numId w:val="3"/>
+        </w:numPr>
+        <w:spacing w:before="60" w:after="60" w:line="240" w:lineRule="auto"/>
+        <w:rPr>
+          <w:rFonts w:ascii="Segoe UI" w:eastAsia="Times New Roman" w:hAnsi="Segoe UI" w:cs="Segoe UI"/>
+          <w:color w:val="000000" w:themeColor="text1"/>
+          <w:sz w:val="20"/>
+          <w:szCs w:val="20"/>
+          <w:lang w:eastAsia="it-IT"/>
+        </w:rPr>
+      </w:pPr>
+      <w:r>
+        <w:rPr>
+          <w:rFonts w:ascii="Segoe UI" w:eastAsia="Times New Roman" w:hAnsi="Segoe UI" w:cs="Segoe UI"/>
+          <w:color w:val="000000" w:themeColor="text1"/>
+          <w:sz w:val="20"/>
+          <w:szCs w:val="20"/>
+          <w:lang w:eastAsia="it-IT"/>
+        </w:rPr>
+        <w:t>sopra 200V → RIPRESA RETE</w:t>
+      </w:r>
+    </w:p>
+    <w:p>
+      <w:pPr>
+        <w:numPr>
+          <w:ilvl w:val="1"/>
+          <w:numId w:val="1"/>
+        </w:numPr>
+        <w:spacing w:after="0" w:line="240" w:lineRule="auto"/>
+        <w:rPr>
+          <w:rFonts w:ascii="Segoe UI" w:eastAsia="Times New Roman" w:hAnsi="Segoe UI" w:cs="Segoe UI"/>
+          <w:color w:val="000000" w:themeColor="text1"/>
+          <w:sz w:val="20"/>
+          <w:szCs w:val="20"/>
+          <w:lang w:eastAsia="it-IT"/>
+        </w:rPr>
+      </w:pPr>
+      <w:r>
+        <w:rPr>
+          <w:rFonts w:ascii="Segoe UI" w:eastAsia="Times New Roman" w:hAnsi="Segoe UI" w:cs="Segoe UI"/>
+          <w:color w:val="000000" w:themeColor="text1"/>
+          <w:sz w:val="20"/>
+          <w:szCs w:val="20"/>
+          <w:lang w:eastAsia="it-IT"/>
+        </w:rPr>
+        <w:t>ogni 15 minuti verifica reset giornaliero e chiama </w:t>
+      </w:r>
+      <w:proofErr w:type="spellStart"/>
+      <w:r>
+        <w:rPr>
+          <w:rFonts w:ascii="Segoe UI" w:eastAsia="Times New Roman" w:hAnsi="Segoe UI" w:cs="Segoe UI"/>
+          <w:color w:val="000000" w:themeColor="text1"/>
+          <w:sz w:val="20"/>
+          <w:szCs w:val="20"/>
+          <w:lang w:eastAsia="it-IT"/>
+        </w:rPr>
+        <w:fldChar w:fldCharType="begin"/>
+      </w:r>
+      <w:r>
+        <w:rPr>
+          <w:rFonts w:ascii="Segoe UI" w:eastAsia="Times New Roman" w:hAnsi="Segoe UI" w:cs="Segoe UI"/>
+          <w:color w:val="000000" w:themeColor="text1"/>
+          <w:sz w:val="20"/>
+          <w:szCs w:val="20"/>
+          <w:lang w:eastAsia="it-IT"/>
+        </w:rPr>
+        <w:instrText xml:space="preserve"> HYPERLINK "vscode-file://vscode-app/c:/Users/Massimo/AppData/Local/Programs/Microsoft%20VS%20Code/f6cfa2ea24/resources/app/out/vs/code/electron-browser/workbench/workbench.html" \o "" </w:instrText>
+      </w:r>
+      <w:r>
+        <w:rPr>
+          <w:rFonts w:ascii="Segoe UI" w:eastAsia="Times New Roman" w:hAnsi="Segoe UI" w:cs="Segoe UI"/>
+          <w:color w:val="000000" w:themeColor="text1"/>
+          <w:sz w:val="20"/>
+          <w:szCs w:val="20"/>
+          <w:lang w:eastAsia="it-IT"/>
+        </w:rPr>
+        <w:fldChar w:fldCharType="separate"/>
+      </w:r>
+      <w:r>
+        <w:rPr>
+          <w:rFonts w:ascii="Segoe UI" w:eastAsia="Times New Roman" w:hAnsi="Segoe UI" w:cs="Segoe UI"/>
+          <w:color w:val="000000" w:themeColor="text1"/>
+          <w:sz w:val="18"/>
+          <w:szCs w:val="18"/>
+          <w:bdr w:val="single" w:sz="4" w:space="1" w:color="auto" w:frame="1"/>
+          <w:lang w:eastAsia="it-IT"/>
+        </w:rPr>
+        <w:t>initgsm</w:t>
+      </w:r>
+      <w:proofErr w:type="spellEnd"/>
+      <w:r>
+        <w:rPr>
+          <w:rFonts w:ascii="Segoe UI" w:eastAsia="Times New Roman" w:hAnsi="Segoe UI" w:cs="Segoe UI"/>
+          <w:color w:val="000000" w:themeColor="text1"/>
+          <w:sz w:val="18"/>
+          <w:szCs w:val="18"/>
+          <w:bdr w:val="single" w:sz="4" w:space="1" w:color="auto" w:frame="1"/>
+          <w:lang w:eastAsia="it-IT"/>
+        </w:rPr>
+        <w:t>()</w:t>
+      </w:r>
+      <w:r>
+        <w:rPr>
+          <w:rFonts w:ascii="Segoe UI" w:eastAsia="Times New Roman" w:hAnsi="Segoe UI" w:cs="Segoe UI"/>
+          <w:color w:val="000000" w:themeColor="text1"/>
+          <w:sz w:val="20"/>
+          <w:szCs w:val="20"/>
+          <w:lang w:eastAsia="it-IT"/>
+        </w:rPr>
+        <w:fldChar w:fldCharType="end"/>
+      </w:r>
+      <w:r>
+        <w:rPr>
+          <w:rFonts w:ascii="Segoe UI" w:eastAsia="Times New Roman" w:hAnsi="Segoe UI" w:cs="Segoe UI"/>
+          <w:color w:val="000000" w:themeColor="text1"/>
+          <w:sz w:val="20"/>
+          <w:szCs w:val="20"/>
+          <w:lang w:eastAsia="it-IT"/>
+        </w:rPr>
+        <w:t> se necessario</w:t>
+      </w:r>
+    </w:p>
+    <w:p>
+      <w:pPr>
+        <w:spacing w:after="0" w:line="330" w:lineRule="atLeast"/>
+        <w:rPr>
+          <w:rFonts w:ascii="Arial" w:eastAsia="Times New Roman" w:hAnsi="Arial" w:cs="Arial"/>
+          <w:color w:val="000000" w:themeColor="text1"/>
+          <w:sz w:val="24"/>
+          <w:szCs w:val="24"/>
+          <w:lang w:eastAsia="it-IT"/>
+        </w:rPr>
+      </w:pPr>
+      <w:r>
+        <w:rPr>
+          <w:rFonts w:ascii="Arial" w:eastAsia="Times New Roman" w:hAnsi="Arial" w:cs="Arial"/>
+          <w:color w:val="000000" w:themeColor="text1"/>
+          <w:sz w:val="24"/>
+          <w:szCs w:val="24"/>
+          <w:lang w:eastAsia="it-IT"/>
+        </w:rPr>
+        <w:t xml:space="preserve">    </w:t>
       </w:r>
     </w:p>
     <w:p>
@@ -1894,6 +2757,467 @@
     </w:sectPr>
   </w:body>
 </w:document>
+</file>
+
+<file path=word/numbering.xml><?xml version="1.0" encoding="utf-8"?>
+<w:numbering xmlns:wpc="http://schemas.microsoft.com/office/word/2010/wordprocessingCanvas" xmlns:cx="http://schemas.microsoft.com/office/drawing/2014/chartex" xmlns:cx1="http://schemas.microsoft.com/office/drawing/2015/9/8/chartex" xmlns:cx2="http://schemas.microsoft.com/office/drawing/2015/10/21/chartex" xmlns:cx3="http://schemas.microsoft.com/office/drawing/2016/5/9/chartex" xmlns:cx4="http://schemas.microsoft.com/office/drawing/2016/5/10/chartex" xmlns:cx5="http://schemas.microsoft.com/office/drawing/2016/5/11/chartex" xmlns:cx6="http://schemas.microsoft.com/office/drawing/2016/5/12/chartex" xmlns:cx7="http://schemas.microsoft.com/office/drawing/2016/5/13/chartex" xmlns:cx8="http://schemas.microsoft.com/office/drawing/2016/5/14/chartex" xmlns:mc="http://schemas.openxmlformats.org/markup-compatibility/2006" xmlns:aink="http://schemas.microsoft.com/office/drawing/2016/ink" xmlns:am3d="http://schemas.microsoft.com/office/drawing/2017/model3d" xmlns:o="urn:schemas-microsoft-com:office:office" xmlns:r="http://schemas.openxmlformats.org/officeDocument/2006/relationships" xmlns:m="http://schemas.openxmlformats.org/officeDocument/2006/math" xmlns:v="urn:schemas-microsoft-com:vml" xmlns:wp14="http://schemas.microsoft.com/office/word/2010/wordprocessingDrawing" xmlns:wp="http://schemas.openxmlformats.org/drawingml/2006/wordprocessingDrawing" xmlns:w10="urn:schemas-microsoft-com:office:word" xmlns:w="http://schemas.openxmlformats.org/wordprocessingml/2006/main" xmlns:w14="http://schemas.microsoft.com/office/word/2010/wordml" xmlns:w15="http://schemas.microsoft.com/office/word/2012/wordml" xmlns:w16cex="http://schemas.microsoft.com/office/word/2018/wordml/cex" xmlns:w16cid="http://schemas.microsoft.com/office/word/2016/wordml/cid" xmlns:w16="http://schemas.microsoft.com/office/word/2018/wordml" xmlns:w16sdtdh="http://schemas.microsoft.com/office/word/2020/wordml/sdtdatahash" xmlns:w16se="http://schemas.microsoft.com/office/word/2015/wordml/symex" xmlns:wpg="http://schemas.microsoft.com/office/word/2010/wordprocessingGroup" xmlns:wpi="http://schemas.microsoft.com/office/word/2010/wordprocessingInk" xmlns:wne="http://schemas.microsoft.com/office/word/2006/wordml" xmlns:wps="http://schemas.microsoft.com/office/word/2010/wordprocessingShape" mc:Ignorable="w14 w15 w16se w16cid w16 w16cex w16sdtdh wp14">
+  <w:abstractNum w:abstractNumId="0" w15:restartNumberingAfterBreak="0">
+    <w:nsid w:val="241023C7"/>
+    <w:multiLevelType w:val="multilevel"/>
+    <w:tmpl w:val="68AC0170"/>
+    <w:lvl w:ilvl="0">
+      <w:start w:val="1"/>
+      <w:numFmt w:val="bullet"/>
+      <w:lvlText w:val=""/>
+      <w:lvlJc w:val="left"/>
+      <w:pPr>
+        <w:tabs>
+          <w:tab w:val="num" w:pos="720"/>
+        </w:tabs>
+        <w:ind w:left="720" w:hanging="360"/>
+      </w:pPr>
+      <w:rPr>
+        <w:rFonts w:ascii="Symbol" w:hAnsi="Symbol" w:hint="default"/>
+        <w:sz w:val="20"/>
+      </w:rPr>
+    </w:lvl>
+    <w:lvl w:ilvl="1">
+      <w:start w:val="1"/>
+      <w:numFmt w:val="bullet"/>
+      <w:lvlText w:val="o"/>
+      <w:lvlJc w:val="left"/>
+      <w:pPr>
+        <w:tabs>
+          <w:tab w:val="num" w:pos="1440"/>
+        </w:tabs>
+        <w:ind w:left="1440" w:hanging="360"/>
+      </w:pPr>
+      <w:rPr>
+        <w:rFonts w:ascii="Courier New" w:hAnsi="Courier New" w:hint="default"/>
+        <w:sz w:val="20"/>
+      </w:rPr>
+    </w:lvl>
+    <w:lvl w:ilvl="2">
+      <w:start w:val="1"/>
+      <w:numFmt w:val="decimal"/>
+      <w:lvlText w:val="%3."/>
+      <w:lvlJc w:val="left"/>
+      <w:pPr>
+        <w:tabs>
+          <w:tab w:val="num" w:pos="2160"/>
+        </w:tabs>
+        <w:ind w:left="2160" w:hanging="360"/>
+      </w:pPr>
+      <w:rPr>
+        <w:rFonts w:hint="default"/>
+        <w:sz w:val="20"/>
+      </w:rPr>
+    </w:lvl>
+    <w:lvl w:ilvl="3" w:tentative="1">
+      <w:start w:val="1"/>
+      <w:numFmt w:val="bullet"/>
+      <w:lvlText w:val=""/>
+      <w:lvlJc w:val="left"/>
+      <w:pPr>
+        <w:tabs>
+          <w:tab w:val="num" w:pos="2880"/>
+        </w:tabs>
+        <w:ind w:left="2880" w:hanging="360"/>
+      </w:pPr>
+      <w:rPr>
+        <w:rFonts w:ascii="Wingdings" w:hAnsi="Wingdings" w:hint="default"/>
+        <w:sz w:val="20"/>
+      </w:rPr>
+    </w:lvl>
+    <w:lvl w:ilvl="4" w:tentative="1">
+      <w:start w:val="1"/>
+      <w:numFmt w:val="bullet"/>
+      <w:lvlText w:val=""/>
+      <w:lvlJc w:val="left"/>
+      <w:pPr>
+        <w:tabs>
+          <w:tab w:val="num" w:pos="3600"/>
+        </w:tabs>
+        <w:ind w:left="3600" w:hanging="360"/>
+      </w:pPr>
+      <w:rPr>
+        <w:rFonts w:ascii="Wingdings" w:hAnsi="Wingdings" w:hint="default"/>
+        <w:sz w:val="20"/>
+      </w:rPr>
+    </w:lvl>
+    <w:lvl w:ilvl="5" w:tentative="1">
+      <w:start w:val="1"/>
+      <w:numFmt w:val="bullet"/>
+      <w:lvlText w:val=""/>
+      <w:lvlJc w:val="left"/>
+      <w:pPr>
+        <w:tabs>
+          <w:tab w:val="num" w:pos="4320"/>
+        </w:tabs>
+        <w:ind w:left="4320" w:hanging="360"/>
+      </w:pPr>
+      <w:rPr>
+        <w:rFonts w:ascii="Wingdings" w:hAnsi="Wingdings" w:hint="default"/>
+        <w:sz w:val="20"/>
+      </w:rPr>
+    </w:lvl>
+    <w:lvl w:ilvl="6" w:tentative="1">
+      <w:start w:val="1"/>
+      <w:numFmt w:val="bullet"/>
+      <w:lvlText w:val=""/>
+      <w:lvlJc w:val="left"/>
+      <w:pPr>
+        <w:tabs>
+          <w:tab w:val="num" w:pos="5040"/>
+        </w:tabs>
+        <w:ind w:left="5040" w:hanging="360"/>
+      </w:pPr>
+      <w:rPr>
+        <w:rFonts w:ascii="Wingdings" w:hAnsi="Wingdings" w:hint="default"/>
+        <w:sz w:val="20"/>
+      </w:rPr>
+    </w:lvl>
+    <w:lvl w:ilvl="7" w:tentative="1">
+      <w:start w:val="1"/>
+      <w:numFmt w:val="bullet"/>
+      <w:lvlText w:val=""/>
+      <w:lvlJc w:val="left"/>
+      <w:pPr>
+        <w:tabs>
+          <w:tab w:val="num" w:pos="5760"/>
+        </w:tabs>
+        <w:ind w:left="5760" w:hanging="360"/>
+      </w:pPr>
+      <w:rPr>
+        <w:rFonts w:ascii="Wingdings" w:hAnsi="Wingdings" w:hint="default"/>
+        <w:sz w:val="20"/>
+      </w:rPr>
+    </w:lvl>
+    <w:lvl w:ilvl="8" w:tentative="1">
+      <w:start w:val="1"/>
+      <w:numFmt w:val="bullet"/>
+      <w:lvlText w:val=""/>
+      <w:lvlJc w:val="left"/>
+      <w:pPr>
+        <w:tabs>
+          <w:tab w:val="num" w:pos="6480"/>
+        </w:tabs>
+        <w:ind w:left="6480" w:hanging="360"/>
+      </w:pPr>
+      <w:rPr>
+        <w:rFonts w:ascii="Wingdings" w:hAnsi="Wingdings" w:hint="default"/>
+        <w:sz w:val="20"/>
+      </w:rPr>
+    </w:lvl>
+  </w:abstractNum>
+  <w:abstractNum w:abstractNumId="1" w15:restartNumberingAfterBreak="0">
+    <w:nsid w:val="3A801318"/>
+    <w:multiLevelType w:val="multilevel"/>
+    <w:tmpl w:val="68AC0170"/>
+    <w:lvl w:ilvl="0">
+      <w:start w:val="1"/>
+      <w:numFmt w:val="bullet"/>
+      <w:lvlText w:val=""/>
+      <w:lvlJc w:val="left"/>
+      <w:pPr>
+        <w:tabs>
+          <w:tab w:val="num" w:pos="720"/>
+        </w:tabs>
+        <w:ind w:left="720" w:hanging="360"/>
+      </w:pPr>
+      <w:rPr>
+        <w:rFonts w:ascii="Symbol" w:hAnsi="Symbol" w:hint="default"/>
+        <w:sz w:val="20"/>
+      </w:rPr>
+    </w:lvl>
+    <w:lvl w:ilvl="1">
+      <w:start w:val="1"/>
+      <w:numFmt w:val="bullet"/>
+      <w:lvlText w:val="o"/>
+      <w:lvlJc w:val="left"/>
+      <w:pPr>
+        <w:tabs>
+          <w:tab w:val="num" w:pos="1440"/>
+        </w:tabs>
+        <w:ind w:left="1440" w:hanging="360"/>
+      </w:pPr>
+      <w:rPr>
+        <w:rFonts w:ascii="Courier New" w:hAnsi="Courier New" w:hint="default"/>
+        <w:sz w:val="20"/>
+      </w:rPr>
+    </w:lvl>
+    <w:lvl w:ilvl="2">
+      <w:start w:val="1"/>
+      <w:numFmt w:val="decimal"/>
+      <w:lvlText w:val="%3."/>
+      <w:lvlJc w:val="left"/>
+      <w:pPr>
+        <w:tabs>
+          <w:tab w:val="num" w:pos="2160"/>
+        </w:tabs>
+        <w:ind w:left="2160" w:hanging="360"/>
+      </w:pPr>
+      <w:rPr>
+        <w:rFonts w:hint="default"/>
+        <w:sz w:val="20"/>
+      </w:rPr>
+    </w:lvl>
+    <w:lvl w:ilvl="3" w:tentative="1">
+      <w:start w:val="1"/>
+      <w:numFmt w:val="bullet"/>
+      <w:lvlText w:val=""/>
+      <w:lvlJc w:val="left"/>
+      <w:pPr>
+        <w:tabs>
+          <w:tab w:val="num" w:pos="2880"/>
+        </w:tabs>
+        <w:ind w:left="2880" w:hanging="360"/>
+      </w:pPr>
+      <w:rPr>
+        <w:rFonts w:ascii="Wingdings" w:hAnsi="Wingdings" w:hint="default"/>
+        <w:sz w:val="20"/>
+      </w:rPr>
+    </w:lvl>
+    <w:lvl w:ilvl="4" w:tentative="1">
+      <w:start w:val="1"/>
+      <w:numFmt w:val="bullet"/>
+      <w:lvlText w:val=""/>
+      <w:lvlJc w:val="left"/>
+      <w:pPr>
+        <w:tabs>
+          <w:tab w:val="num" w:pos="3600"/>
+        </w:tabs>
+        <w:ind w:left="3600" w:hanging="360"/>
+      </w:pPr>
+      <w:rPr>
+        <w:rFonts w:ascii="Wingdings" w:hAnsi="Wingdings" w:hint="default"/>
+        <w:sz w:val="20"/>
+      </w:rPr>
+    </w:lvl>
+    <w:lvl w:ilvl="5" w:tentative="1">
+      <w:start w:val="1"/>
+      <w:numFmt w:val="bullet"/>
+      <w:lvlText w:val=""/>
+      <w:lvlJc w:val="left"/>
+      <w:pPr>
+        <w:tabs>
+          <w:tab w:val="num" w:pos="4320"/>
+        </w:tabs>
+        <w:ind w:left="4320" w:hanging="360"/>
+      </w:pPr>
+      <w:rPr>
+        <w:rFonts w:ascii="Wingdings" w:hAnsi="Wingdings" w:hint="default"/>
+        <w:sz w:val="20"/>
+      </w:rPr>
+    </w:lvl>
+    <w:lvl w:ilvl="6" w:tentative="1">
+      <w:start w:val="1"/>
+      <w:numFmt w:val="bullet"/>
+      <w:lvlText w:val=""/>
+      <w:lvlJc w:val="left"/>
+      <w:pPr>
+        <w:tabs>
+          <w:tab w:val="num" w:pos="5040"/>
+        </w:tabs>
+        <w:ind w:left="5040" w:hanging="360"/>
+      </w:pPr>
+      <w:rPr>
+        <w:rFonts w:ascii="Wingdings" w:hAnsi="Wingdings" w:hint="default"/>
+        <w:sz w:val="20"/>
+      </w:rPr>
+    </w:lvl>
+    <w:lvl w:ilvl="7" w:tentative="1">
+      <w:start w:val="1"/>
+      <w:numFmt w:val="bullet"/>
+      <w:lvlText w:val=""/>
+      <w:lvlJc w:val="left"/>
+      <w:pPr>
+        <w:tabs>
+          <w:tab w:val="num" w:pos="5760"/>
+        </w:tabs>
+        <w:ind w:left="5760" w:hanging="360"/>
+      </w:pPr>
+      <w:rPr>
+        <w:rFonts w:ascii="Wingdings" w:hAnsi="Wingdings" w:hint="default"/>
+        <w:sz w:val="20"/>
+      </w:rPr>
+    </w:lvl>
+    <w:lvl w:ilvl="8" w:tentative="1">
+      <w:start w:val="1"/>
+      <w:numFmt w:val="bullet"/>
+      <w:lvlText w:val=""/>
+      <w:lvlJc w:val="left"/>
+      <w:pPr>
+        <w:tabs>
+          <w:tab w:val="num" w:pos="6480"/>
+        </w:tabs>
+        <w:ind w:left="6480" w:hanging="360"/>
+      </w:pPr>
+      <w:rPr>
+        <w:rFonts w:ascii="Wingdings" w:hAnsi="Wingdings" w:hint="default"/>
+        <w:sz w:val="20"/>
+      </w:rPr>
+    </w:lvl>
+  </w:abstractNum>
+  <w:abstractNum w:abstractNumId="2" w15:restartNumberingAfterBreak="0">
+    <w:nsid w:val="3C2C1EFC"/>
+    <w:multiLevelType w:val="multilevel"/>
+    <w:tmpl w:val="D5A475AA"/>
+    <w:lvl w:ilvl="0">
+      <w:start w:val="1"/>
+      <w:numFmt w:val="bullet"/>
+      <w:lvlText w:val=""/>
+      <w:lvlJc w:val="left"/>
+      <w:pPr>
+        <w:tabs>
+          <w:tab w:val="num" w:pos="720"/>
+        </w:tabs>
+        <w:ind w:left="720" w:hanging="360"/>
+      </w:pPr>
+      <w:rPr>
+        <w:rFonts w:ascii="Symbol" w:hAnsi="Symbol" w:hint="default"/>
+        <w:sz w:val="20"/>
+      </w:rPr>
+    </w:lvl>
+    <w:lvl w:ilvl="1">
+      <w:start w:val="1"/>
+      <w:numFmt w:val="bullet"/>
+      <w:lvlText w:val="o"/>
+      <w:lvlJc w:val="left"/>
+      <w:pPr>
+        <w:tabs>
+          <w:tab w:val="num" w:pos="1440"/>
+        </w:tabs>
+        <w:ind w:left="1440" w:hanging="360"/>
+      </w:pPr>
+      <w:rPr>
+        <w:rFonts w:ascii="Courier New" w:hAnsi="Courier New" w:hint="default"/>
+        <w:sz w:val="20"/>
+      </w:rPr>
+    </w:lvl>
+    <w:lvl w:ilvl="2">
+      <w:start w:val="1"/>
+      <w:numFmt w:val="bullet"/>
+      <w:lvlText w:val=""/>
+      <w:lvlJc w:val="left"/>
+      <w:pPr>
+        <w:tabs>
+          <w:tab w:val="num" w:pos="2160"/>
+        </w:tabs>
+        <w:ind w:left="2160" w:hanging="360"/>
+      </w:pPr>
+      <w:rPr>
+        <w:rFonts w:ascii="Wingdings" w:hAnsi="Wingdings" w:hint="default"/>
+        <w:sz w:val="20"/>
+      </w:rPr>
+    </w:lvl>
+    <w:lvl w:ilvl="3" w:tentative="1">
+      <w:start w:val="1"/>
+      <w:numFmt w:val="bullet"/>
+      <w:lvlText w:val=""/>
+      <w:lvlJc w:val="left"/>
+      <w:pPr>
+        <w:tabs>
+          <w:tab w:val="num" w:pos="2880"/>
+        </w:tabs>
+        <w:ind w:left="2880" w:hanging="360"/>
+      </w:pPr>
+      <w:rPr>
+        <w:rFonts w:ascii="Wingdings" w:hAnsi="Wingdings" w:hint="default"/>
+        <w:sz w:val="20"/>
+      </w:rPr>
+    </w:lvl>
+    <w:lvl w:ilvl="4" w:tentative="1">
+      <w:start w:val="1"/>
+      <w:numFmt w:val="bullet"/>
+      <w:lvlText w:val=""/>
+      <w:lvlJc w:val="left"/>
+      <w:pPr>
+        <w:tabs>
+          <w:tab w:val="num" w:pos="3600"/>
+        </w:tabs>
+        <w:ind w:left="3600" w:hanging="360"/>
+      </w:pPr>
+      <w:rPr>
+        <w:rFonts w:ascii="Wingdings" w:hAnsi="Wingdings" w:hint="default"/>
+        <w:sz w:val="20"/>
+      </w:rPr>
+    </w:lvl>
+    <w:lvl w:ilvl="5" w:tentative="1">
+      <w:start w:val="1"/>
+      <w:numFmt w:val="bullet"/>
+      <w:lvlText w:val=""/>
+      <w:lvlJc w:val="left"/>
+      <w:pPr>
+        <w:tabs>
+          <w:tab w:val="num" w:pos="4320"/>
+        </w:tabs>
+        <w:ind w:left="4320" w:hanging="360"/>
+      </w:pPr>
+      <w:rPr>
+        <w:rFonts w:ascii="Wingdings" w:hAnsi="Wingdings" w:hint="default"/>
+        <w:sz w:val="20"/>
+      </w:rPr>
+    </w:lvl>
+    <w:lvl w:ilvl="6" w:tentative="1">
+      <w:start w:val="1"/>
+      <w:numFmt w:val="bullet"/>
+      <w:lvlText w:val=""/>
+      <w:lvlJc w:val="left"/>
+      <w:pPr>
+        <w:tabs>
+          <w:tab w:val="num" w:pos="5040"/>
+        </w:tabs>
+        <w:ind w:left="5040" w:hanging="360"/>
+      </w:pPr>
+      <w:rPr>
+        <w:rFonts w:ascii="Wingdings" w:hAnsi="Wingdings" w:hint="default"/>
+        <w:sz w:val="20"/>
+      </w:rPr>
+    </w:lvl>
+    <w:lvl w:ilvl="7" w:tentative="1">
+      <w:start w:val="1"/>
+      <w:numFmt w:val="bullet"/>
+      <w:lvlText w:val=""/>
+      <w:lvlJc w:val="left"/>
+      <w:pPr>
+        <w:tabs>
+          <w:tab w:val="num" w:pos="5760"/>
+        </w:tabs>
+        <w:ind w:left="5760" w:hanging="360"/>
+      </w:pPr>
+      <w:rPr>
+        <w:rFonts w:ascii="Wingdings" w:hAnsi="Wingdings" w:hint="default"/>
+        <w:sz w:val="20"/>
+      </w:rPr>
+    </w:lvl>
+    <w:lvl w:ilvl="8" w:tentative="1">
+      <w:start w:val="1"/>
+      <w:numFmt w:val="bullet"/>
+      <w:lvlText w:val=""/>
+      <w:lvlJc w:val="left"/>
+      <w:pPr>
+        <w:tabs>
+          <w:tab w:val="num" w:pos="6480"/>
+        </w:tabs>
+        <w:ind w:left="6480" w:hanging="360"/>
+      </w:pPr>
+      <w:rPr>
+        <w:rFonts w:ascii="Wingdings" w:hAnsi="Wingdings" w:hint="default"/>
+        <w:sz w:val="20"/>
+      </w:rPr>
+    </w:lvl>
+  </w:abstractNum>
+  <w:num w:numId="1">
+    <w:abstractNumId w:val="2"/>
+  </w:num>
+  <w:num w:numId="2">
+    <w:abstractNumId w:val="0"/>
+  </w:num>
+  <w:num w:numId="3">
+    <w:abstractNumId w:val="1"/>
+  </w:num>
+</w:numbering>
 </file>
 
 <file path=word/styles.xml><?xml version="1.0" encoding="utf-8"?>
@@ -2019,6 +3343,7 @@
     <w:lsdException w:name="HTML Sample" w:semiHidden="1" w:unhideWhenUsed="1"/>
     <w:lsdException w:name="HTML Typewriter" w:semiHidden="1" w:unhideWhenUsed="1"/>
     <w:lsdException w:name="HTML Variable" w:semiHidden="1" w:unhideWhenUsed="1"/>
+    <w:lsdException w:name="Normal Table" w:semiHidden="1" w:unhideWhenUsed="1"/>
     <w:lsdException w:name="annotation subject" w:semiHidden="1" w:unhideWhenUsed="1"/>
     <w:lsdException w:name="No List" w:semiHidden="1" w:unhideWhenUsed="1"/>
     <w:lsdException w:name="Outline List 1" w:semiHidden="1" w:unhideWhenUsed="1"/>
@@ -2065,8 +3390,10 @@
     <w:lsdException w:name="Table Subtle 2" w:semiHidden="1" w:unhideWhenUsed="1"/>
     <w:lsdException w:name="Table Web 1" w:semiHidden="1" w:unhideWhenUsed="1"/>
     <w:lsdException w:name="Table Web 2" w:semiHidden="1" w:unhideWhenUsed="1"/>
+    <w:lsdException w:name="Table Web 3" w:semiHidden="1" w:unhideWhenUsed="1"/>
     <w:lsdException w:name="Balloon Text" w:semiHidden="1" w:unhideWhenUsed="1"/>
     <w:lsdException w:name="Table Grid" w:uiPriority="39"/>
+    <w:lsdException w:name="Table Theme" w:semiHidden="1" w:unhideWhenUsed="1"/>
     <w:lsdException w:name="Placeholder Text" w:semiHidden="1"/>
     <w:lsdException w:name="No Spacing" w:uiPriority="1" w:qFormat="1"/>
     <w:lsdException w:name="Light Shading" w:uiPriority="60"/>
@@ -2292,6 +3619,26 @@
     <w:name w:val="Normal"/>
     <w:qFormat/>
   </w:style>
+  <w:style w:type="paragraph" w:styleId="Titolo3">
+    <w:name w:val="heading 3"/>
+    <w:basedOn w:val="Normale"/>
+    <w:link w:val="Titolo3Carattere"/>
+    <w:uiPriority w:val="9"/>
+    <w:qFormat/>
+    <w:rsid w:val="009A72EE"/>
+    <w:pPr>
+      <w:spacing w:before="100" w:beforeAutospacing="1" w:after="100" w:afterAutospacing="1" w:line="240" w:lineRule="auto"/>
+      <w:outlineLvl w:val="2"/>
+    </w:pPr>
+    <w:rPr>
+      <w:rFonts w:ascii="Times New Roman" w:eastAsia="Times New Roman" w:hAnsi="Times New Roman" w:cs="Times New Roman"/>
+      <w:b/>
+      <w:bCs/>
+      <w:sz w:val="27"/>
+      <w:szCs w:val="27"/>
+      <w:lang w:eastAsia="it-IT"/>
+    </w:rPr>
+  </w:style>
   <w:style w:type="character" w:default="1" w:styleId="Carpredefinitoparagrafo">
     <w:name w:val="Default Paragraph Font"/>
     <w:uiPriority w:val="1"/>
@@ -2318,6 +3665,67 @@
     <w:uiPriority w:val="99"/>
     <w:semiHidden/>
     <w:unhideWhenUsed/>
+  </w:style>
+  <w:style w:type="character" w:customStyle="1" w:styleId="Titolo3Carattere">
+    <w:name w:val="Titolo 3 Carattere"/>
+    <w:basedOn w:val="Carpredefinitoparagrafo"/>
+    <w:link w:val="Titolo3"/>
+    <w:uiPriority w:val="9"/>
+    <w:rsid w:val="009A72EE"/>
+    <w:rPr>
+      <w:rFonts w:ascii="Times New Roman" w:eastAsia="Times New Roman" w:hAnsi="Times New Roman" w:cs="Times New Roman"/>
+      <w:b/>
+      <w:bCs/>
+      <w:sz w:val="27"/>
+      <w:szCs w:val="27"/>
+      <w:lang w:eastAsia="it-IT"/>
+    </w:rPr>
+  </w:style>
+  <w:style w:type="paragraph" w:styleId="NormaleWeb">
+    <w:name w:val="Normal (Web)"/>
+    <w:basedOn w:val="Normale"/>
+    <w:uiPriority w:val="99"/>
+    <w:semiHidden/>
+    <w:unhideWhenUsed/>
+    <w:rsid w:val="009A72EE"/>
+    <w:pPr>
+      <w:spacing w:before="100" w:beforeAutospacing="1" w:after="100" w:afterAutospacing="1" w:line="240" w:lineRule="auto"/>
+    </w:pPr>
+    <w:rPr>
+      <w:rFonts w:ascii="Times New Roman" w:eastAsia="Times New Roman" w:hAnsi="Times New Roman" w:cs="Times New Roman"/>
+      <w:sz w:val="24"/>
+      <w:szCs w:val="24"/>
+      <w:lang w:eastAsia="it-IT"/>
+    </w:rPr>
+  </w:style>
+  <w:style w:type="character" w:customStyle="1" w:styleId="icon-label">
+    <w:name w:val="icon-label"/>
+    <w:basedOn w:val="Carpredefinitoparagrafo"/>
+    <w:rsid w:val="009A72EE"/>
+  </w:style>
+  <w:style w:type="character" w:styleId="CodiceHTML">
+    <w:name w:val="HTML Code"/>
+    <w:basedOn w:val="Carpredefinitoparagrafo"/>
+    <w:uiPriority w:val="99"/>
+    <w:semiHidden/>
+    <w:unhideWhenUsed/>
+    <w:rsid w:val="009A72EE"/>
+    <w:rPr>
+      <w:rFonts w:ascii="Courier New" w:eastAsia="Times New Roman" w:hAnsi="Courier New" w:cs="Courier New"/>
+      <w:sz w:val="20"/>
+      <w:szCs w:val="20"/>
+    </w:rPr>
+  </w:style>
+  <w:style w:type="paragraph" w:styleId="Paragrafoelenco">
+    <w:name w:val="List Paragraph"/>
+    <w:basedOn w:val="Normale"/>
+    <w:uiPriority w:val="34"/>
+    <w:qFormat/>
+    <w:rsid w:val="009A72EE"/>
+    <w:pPr>
+      <w:ind w:left="720"/>
+      <w:contextualSpacing/>
+    </w:pPr>
   </w:style>
 </w:styles>
 </file>

</xml_diff>

<commit_message>
Check parser 1.3 + tabella Doc Word
</commit_message>
<xml_diff>
--- a/SMS Manager for Power monitoring.docx
+++ b/SMS Manager for Power monitoring.docx
@@ -890,13 +890,9 @@
           <w:szCs w:val="24"/>
           <w:lang w:eastAsia="it-IT"/>
         </w:rPr>
-        <w:t>olo se numero master o nessun numero</w:t>
-      </w:r>
-    </w:p>
-    <w:p>
-      <w:pPr>
-        <w:spacing w:after="0" w:line="330" w:lineRule="atLeast"/>
-        <w:ind w:left="708"/>
+        <w:t xml:space="preserve">olo se numero </w:t>
+      </w:r>
+      <w:r>
         <w:rPr>
           <w:rFonts w:ascii="Arial" w:eastAsia="Times New Roman" w:hAnsi="Arial" w:cs="Arial"/>
           <w:b/>
@@ -906,7 +902,8 @@
           <w:szCs w:val="24"/>
           <w:lang w:eastAsia="it-IT"/>
         </w:rPr>
-      </w:pPr>
+        <w:t>M</w:t>
+      </w:r>
       <w:r>
         <w:rPr>
           <w:rFonts w:ascii="Arial" w:eastAsia="Times New Roman" w:hAnsi="Arial" w:cs="Arial"/>
@@ -917,9 +914,13 @@
           <w:szCs w:val="24"/>
           <w:lang w:eastAsia="it-IT"/>
         </w:rPr>
-        <w:t xml:space="preserve"> </w:t>
-      </w:r>
-      <w:r>
+        <w:t>aster o nessun numero</w:t>
+      </w:r>
+    </w:p>
+    <w:p>
+      <w:pPr>
+        <w:spacing w:after="0" w:line="330" w:lineRule="atLeast"/>
+        <w:ind w:left="708"/>
         <w:rPr>
           <w:rFonts w:ascii="Arial" w:eastAsia="Times New Roman" w:hAnsi="Arial" w:cs="Arial"/>
           <w:b/>
@@ -929,8 +930,7 @@
           <w:szCs w:val="24"/>
           <w:lang w:eastAsia="it-IT"/>
         </w:rPr>
-        <w:t xml:space="preserve">- </w:t>
-      </w:r>
+      </w:pPr>
       <w:r>
         <w:rPr>
           <w:rFonts w:ascii="Arial" w:eastAsia="Times New Roman" w:hAnsi="Arial" w:cs="Arial"/>
@@ -941,7 +941,7 @@
           <w:szCs w:val="24"/>
           <w:lang w:eastAsia="it-IT"/>
         </w:rPr>
-        <w:t>V</w:t>
+        <w:t xml:space="preserve"> </w:t>
       </w:r>
       <w:r>
         <w:rPr>
@@ -953,143 +953,9 @@
           <w:szCs w:val="24"/>
           <w:lang w:eastAsia="it-IT"/>
         </w:rPr>
-        <w:t>alida il numero richiedente se lunghezza numero è compresa tra 10 e 13</w:t>
-      </w:r>
-    </w:p>
-    <w:p>
-      <w:pPr>
-        <w:spacing w:after="0" w:line="330" w:lineRule="atLeast"/>
-        <w:ind w:left="708"/>
-        <w:rPr>
-          <w:rFonts w:ascii="Arial" w:eastAsia="Times New Roman" w:hAnsi="Arial" w:cs="Arial"/>
-          <w:color w:val="000000" w:themeColor="text1"/>
-          <w:sz w:val="24"/>
-          <w:szCs w:val="24"/>
-          <w:lang w:eastAsia="it-IT"/>
-        </w:rPr>
-      </w:pPr>
-    </w:p>
-    <w:p>
-      <w:pPr>
-        <w:spacing w:after="0" w:line="330" w:lineRule="atLeast"/>
-        <w:ind w:left="708"/>
-        <w:rPr>
-          <w:rFonts w:ascii="Arial" w:eastAsia="Times New Roman" w:hAnsi="Arial" w:cs="Arial"/>
-          <w:color w:val="000000" w:themeColor="text1"/>
-          <w:sz w:val="24"/>
-          <w:szCs w:val="24"/>
-          <w:lang w:eastAsia="it-IT"/>
-        </w:rPr>
-      </w:pPr>
-    </w:p>
-    <w:p>
-      <w:pPr>
-        <w:spacing w:after="0" w:line="330" w:lineRule="atLeast"/>
-        <w:ind w:left="708"/>
-        <w:rPr>
-          <w:rFonts w:ascii="Arial" w:eastAsia="Times New Roman" w:hAnsi="Arial" w:cs="Arial"/>
-          <w:color w:val="000000" w:themeColor="text1"/>
-          <w:sz w:val="24"/>
-          <w:szCs w:val="24"/>
-          <w:lang w:eastAsia="it-IT"/>
-        </w:rPr>
-      </w:pPr>
-      <w:r>
-        <w:rPr>
-          <w:rFonts w:ascii="Arial" w:eastAsia="Times New Roman" w:hAnsi="Arial" w:cs="Arial"/>
-          <w:color w:val="000000" w:themeColor="text1"/>
-          <w:sz w:val="24"/>
-          <w:szCs w:val="24"/>
-          <w:lang w:eastAsia="it-IT"/>
-        </w:rPr>
-        <w:lastRenderedPageBreak/>
         <w:t xml:space="preserve">- </w:t>
       </w:r>
       <w:r>
-        <w:rPr>
-          <w:rFonts w:ascii="Arial" w:eastAsia="Times New Roman" w:hAnsi="Arial" w:cs="Arial"/>
-          <w:b/>
-          <w:bCs/>
-          <w:color w:val="000000" w:themeColor="text1"/>
-          <w:sz w:val="24"/>
-          <w:szCs w:val="24"/>
-          <w:lang w:eastAsia="it-IT"/>
-        </w:rPr>
-        <w:t>A[n]+numero</w:t>
-      </w:r>
-      <w:r>
-        <w:rPr>
-          <w:rFonts w:ascii="Arial" w:eastAsia="Times New Roman" w:hAnsi="Arial" w:cs="Arial"/>
-          <w:color w:val="000000" w:themeColor="text1"/>
-          <w:sz w:val="24"/>
-          <w:szCs w:val="24"/>
-          <w:lang w:eastAsia="it-IT"/>
-        </w:rPr>
-        <w:t xml:space="preserve"> → Aggiunge/Sostituisce numero ausiliario</w:t>
-      </w:r>
-    </w:p>
-    <w:p>
-      <w:pPr>
-        <w:spacing w:after="0" w:line="330" w:lineRule="atLeast"/>
-        <w:ind w:left="708"/>
-        <w:rPr>
-          <w:rFonts w:ascii="Arial" w:eastAsia="Times New Roman" w:hAnsi="Arial" w:cs="Arial"/>
-          <w:color w:val="000000" w:themeColor="text1"/>
-          <w:sz w:val="24"/>
-          <w:szCs w:val="24"/>
-          <w:lang w:eastAsia="it-IT"/>
-        </w:rPr>
-      </w:pPr>
-    </w:p>
-    <w:p>
-      <w:pPr>
-        <w:spacing w:after="0" w:line="330" w:lineRule="atLeast"/>
-        <w:ind w:left="708"/>
-        <w:rPr>
-          <w:rFonts w:ascii="Arial" w:eastAsia="Times New Roman" w:hAnsi="Arial" w:cs="Arial"/>
-          <w:color w:val="000000" w:themeColor="text1"/>
-          <w:sz w:val="24"/>
-          <w:szCs w:val="24"/>
-          <w:lang w:eastAsia="it-IT"/>
-        </w:rPr>
-      </w:pPr>
-      <w:r>
-        <w:rPr>
-          <w:rFonts w:ascii="Arial" w:eastAsia="Times New Roman" w:hAnsi="Arial" w:cs="Arial"/>
-          <w:color w:val="000000" w:themeColor="text1"/>
-          <w:sz w:val="24"/>
-          <w:szCs w:val="24"/>
-          <w:lang w:eastAsia="it-IT"/>
-        </w:rPr>
-        <w:t xml:space="preserve">- </w:t>
-      </w:r>
-      <w:r>
-        <w:rPr>
-          <w:rFonts w:ascii="Arial" w:eastAsia="Times New Roman" w:hAnsi="Arial" w:cs="Arial"/>
-          <w:b/>
-          <w:bCs/>
-          <w:color w:val="000000" w:themeColor="text1"/>
-          <w:sz w:val="24"/>
-          <w:szCs w:val="24"/>
-          <w:lang w:eastAsia="it-IT"/>
-        </w:rPr>
-        <w:t>D</w:t>
-      </w:r>
-      <w:r>
-        <w:rPr>
-          <w:rFonts w:ascii="Arial" w:eastAsia="Times New Roman" w:hAnsi="Arial" w:cs="Arial"/>
-          <w:color w:val="000000" w:themeColor="text1"/>
-          <w:sz w:val="24"/>
-          <w:szCs w:val="24"/>
-          <w:lang w:eastAsia="it-IT"/>
-        </w:rPr>
-        <w:t xml:space="preserve"> → Cancella numeri ausiliari</w:t>
-      </w:r>
-    </w:p>
-    <w:p>
-      <w:pPr>
-        <w:spacing w:after="0" w:line="330" w:lineRule="atLeast"/>
-        <w:ind w:left="708"/>
         <w:rPr>
           <w:rFonts w:ascii="Arial" w:eastAsia="Times New Roman" w:hAnsi="Arial" w:cs="Arial"/>
           <w:b/>
@@ -1099,7 +965,8 @@
           <w:szCs w:val="24"/>
           <w:lang w:eastAsia="it-IT"/>
         </w:rPr>
-      </w:pPr>
+        <w:t>V</w:t>
+      </w:r>
       <w:r>
         <w:rPr>
           <w:rFonts w:ascii="Arial" w:eastAsia="Times New Roman" w:hAnsi="Arial" w:cs="Arial"/>
@@ -1110,9 +977,85 @@
           <w:szCs w:val="24"/>
           <w:lang w:eastAsia="it-IT"/>
         </w:rPr>
+        <w:t>alida il numero richiedente se lunghezza numero è compresa tra 10 e 13</w:t>
+      </w:r>
+    </w:p>
+    <w:p>
+      <w:pPr>
+        <w:spacing w:after="0" w:line="330" w:lineRule="atLeast"/>
+        <w:ind w:left="708"/>
+        <w:rPr>
+          <w:rFonts w:ascii="Arial" w:eastAsia="Times New Roman" w:hAnsi="Arial" w:cs="Arial"/>
+          <w:color w:val="000000" w:themeColor="text1"/>
+          <w:sz w:val="24"/>
+          <w:szCs w:val="24"/>
+          <w:lang w:eastAsia="it-IT"/>
+        </w:rPr>
+      </w:pPr>
+    </w:p>
+    <w:p>
+      <w:pPr>
+        <w:spacing w:after="0" w:line="330" w:lineRule="atLeast"/>
+        <w:ind w:left="708"/>
+        <w:rPr>
+          <w:rFonts w:ascii="Arial" w:eastAsia="Times New Roman" w:hAnsi="Arial" w:cs="Arial"/>
+          <w:color w:val="000000" w:themeColor="text1"/>
+          <w:sz w:val="24"/>
+          <w:szCs w:val="24"/>
+          <w:lang w:eastAsia="it-IT"/>
+        </w:rPr>
+      </w:pPr>
+    </w:p>
+    <w:p>
+      <w:pPr>
+        <w:spacing w:after="0" w:line="330" w:lineRule="atLeast"/>
+        <w:ind w:left="708"/>
+        <w:rPr>
+          <w:rFonts w:ascii="Arial" w:eastAsia="Times New Roman" w:hAnsi="Arial" w:cs="Arial"/>
+          <w:color w:val="000000" w:themeColor="text1"/>
+          <w:sz w:val="24"/>
+          <w:szCs w:val="24"/>
+          <w:lang w:eastAsia="it-IT"/>
+        </w:rPr>
+      </w:pPr>
+      <w:r>
+        <w:rPr>
+          <w:rFonts w:ascii="Arial" w:eastAsia="Times New Roman" w:hAnsi="Arial" w:cs="Arial"/>
+          <w:color w:val="000000" w:themeColor="text1"/>
+          <w:sz w:val="24"/>
+          <w:szCs w:val="24"/>
+          <w:lang w:eastAsia="it-IT"/>
+        </w:rPr>
+        <w:lastRenderedPageBreak/>
         <w:t xml:space="preserve">- </w:t>
       </w:r>
       <w:r>
+        <w:rPr>
+          <w:rFonts w:ascii="Arial" w:eastAsia="Times New Roman" w:hAnsi="Arial" w:cs="Arial"/>
+          <w:b/>
+          <w:bCs/>
+          <w:color w:val="000000" w:themeColor="text1"/>
+          <w:sz w:val="24"/>
+          <w:szCs w:val="24"/>
+          <w:lang w:eastAsia="it-IT"/>
+        </w:rPr>
+        <w:t>A[n]+numero</w:t>
+      </w:r>
+      <w:r>
+        <w:rPr>
+          <w:rFonts w:ascii="Arial" w:eastAsia="Times New Roman" w:hAnsi="Arial" w:cs="Arial"/>
+          <w:color w:val="000000" w:themeColor="text1"/>
+          <w:sz w:val="24"/>
+          <w:szCs w:val="24"/>
+          <w:lang w:eastAsia="it-IT"/>
+        </w:rPr>
+        <w:t xml:space="preserve"> → Aggiunge/Sostituisce numero ausiliario</w:t>
+      </w:r>
+    </w:p>
+    <w:p>
+      <w:pPr>
+        <w:spacing w:after="0" w:line="330" w:lineRule="atLeast"/>
+        <w:ind w:left="708"/>
         <w:rPr>
           <w:rFonts w:ascii="Arial" w:eastAsia="Times New Roman" w:hAnsi="Arial" w:cs="Arial"/>
           <w:b/>
@@ -1122,8 +1065,7 @@
           <w:szCs w:val="24"/>
           <w:lang w:eastAsia="it-IT"/>
         </w:rPr>
-        <w:t>S</w:t>
-      </w:r>
+      </w:pPr>
       <w:r>
         <w:rPr>
           <w:rFonts w:ascii="Arial" w:eastAsia="Times New Roman" w:hAnsi="Arial" w:cs="Arial"/>
@@ -1134,7 +1076,7 @@
           <w:szCs w:val="24"/>
           <w:lang w:eastAsia="it-IT"/>
         </w:rPr>
-        <w:t xml:space="preserve">olo se numero </w:t>
+        <w:t xml:space="preserve">- </w:t>
       </w:r>
       <w:r>
         <w:rPr>
@@ -1146,7 +1088,7 @@
           <w:szCs w:val="24"/>
           <w:lang w:eastAsia="it-IT"/>
         </w:rPr>
-        <w:t>M</w:t>
+        <w:t>S</w:t>
       </w:r>
       <w:r>
         <w:rPr>
@@ -1158,136 +1100,31 @@
           <w:szCs w:val="24"/>
           <w:lang w:eastAsia="it-IT"/>
         </w:rPr>
-        <w:t>aster</w:t>
-      </w:r>
-    </w:p>
-    <w:p>
-      <w:pPr>
-        <w:spacing w:after="0" w:line="330" w:lineRule="atLeast"/>
-        <w:ind w:left="708"/>
-        <w:rPr>
-          <w:rFonts w:ascii="Arial" w:eastAsia="Times New Roman" w:hAnsi="Arial" w:cs="Arial"/>
-          <w:color w:val="000000" w:themeColor="text1"/>
-          <w:sz w:val="24"/>
-          <w:szCs w:val="24"/>
-          <w:lang w:eastAsia="it-IT"/>
-        </w:rPr>
-      </w:pPr>
-    </w:p>
-    <w:p>
-      <w:pPr>
-        <w:spacing w:after="0" w:line="330" w:lineRule="atLeast"/>
-        <w:ind w:left="708"/>
-        <w:rPr>
-          <w:rFonts w:ascii="Arial" w:eastAsia="Times New Roman" w:hAnsi="Arial" w:cs="Arial"/>
-          <w:color w:val="000000" w:themeColor="text1"/>
-          <w:sz w:val="24"/>
-          <w:szCs w:val="24"/>
-          <w:lang w:eastAsia="it-IT"/>
-        </w:rPr>
-      </w:pPr>
-    </w:p>
-    <w:p>
-      <w:pPr>
-        <w:spacing w:after="0" w:line="330" w:lineRule="atLeast"/>
-        <w:ind w:left="708"/>
-        <w:rPr>
-          <w:rFonts w:ascii="Arial" w:eastAsia="Times New Roman" w:hAnsi="Arial" w:cs="Arial"/>
-          <w:color w:val="000000" w:themeColor="text1"/>
-          <w:sz w:val="24"/>
-          <w:szCs w:val="24"/>
-          <w:lang w:eastAsia="it-IT"/>
-        </w:rPr>
-      </w:pPr>
-      <w:r>
-        <w:rPr>
-          <w:rFonts w:ascii="Arial" w:eastAsia="Times New Roman" w:hAnsi="Arial" w:cs="Arial"/>
-          <w:color w:val="000000" w:themeColor="text1"/>
-          <w:sz w:val="24"/>
-          <w:szCs w:val="24"/>
-          <w:lang w:eastAsia="it-IT"/>
-        </w:rPr>
-        <w:t xml:space="preserve">- </w:t>
+        <w:t xml:space="preserve">olo se numero </w:t>
       </w:r>
       <w:r>
         <w:rPr>
           <w:rFonts w:ascii="Arial" w:eastAsia="Times New Roman" w:hAnsi="Arial" w:cs="Arial"/>
           <w:b/>
           <w:bCs/>
-          <w:color w:val="000000" w:themeColor="text1"/>
-          <w:sz w:val="24"/>
-          <w:szCs w:val="24"/>
-          <w:lang w:eastAsia="it-IT"/>
-        </w:rPr>
-        <w:t>N</w:t>
-      </w:r>
-      <w:r>
-        <w:rPr>
-          <w:rFonts w:ascii="Arial" w:eastAsia="Times New Roman" w:hAnsi="Arial" w:cs="Arial"/>
-          <w:color w:val="000000" w:themeColor="text1"/>
-          <w:sz w:val="24"/>
-          <w:szCs w:val="24"/>
-          <w:lang w:eastAsia="it-IT"/>
-        </w:rPr>
-        <w:t xml:space="preserve"> → Elenca numeri autorizzati</w:t>
-      </w:r>
-    </w:p>
-    <w:p>
-      <w:pPr>
-        <w:spacing w:after="0" w:line="330" w:lineRule="atLeast"/>
-        <w:ind w:left="708"/>
-        <w:rPr>
-          <w:rFonts w:ascii="Arial" w:eastAsia="Times New Roman" w:hAnsi="Arial" w:cs="Arial"/>
-          <w:color w:val="000000" w:themeColor="text1"/>
-          <w:sz w:val="24"/>
-          <w:szCs w:val="24"/>
-          <w:lang w:eastAsia="it-IT"/>
-        </w:rPr>
-      </w:pPr>
-    </w:p>
-    <w:p>
-      <w:pPr>
-        <w:spacing w:after="0" w:line="330" w:lineRule="atLeast"/>
-        <w:ind w:left="708"/>
-        <w:rPr>
-          <w:rFonts w:ascii="Arial" w:eastAsia="Times New Roman" w:hAnsi="Arial" w:cs="Arial"/>
-          <w:color w:val="000000" w:themeColor="text1"/>
-          <w:sz w:val="24"/>
-          <w:szCs w:val="24"/>
-          <w:lang w:eastAsia="it-IT"/>
-        </w:rPr>
-      </w:pPr>
-      <w:r>
-        <w:rPr>
-          <w:rFonts w:ascii="Arial" w:eastAsia="Times New Roman" w:hAnsi="Arial" w:cs="Arial"/>
-          <w:color w:val="000000" w:themeColor="text1"/>
-          <w:sz w:val="24"/>
-          <w:szCs w:val="24"/>
-          <w:lang w:eastAsia="it-IT"/>
-        </w:rPr>
-        <w:t xml:space="preserve">- </w:t>
+          <w:color w:val="00B050"/>
+          <w:sz w:val="24"/>
+          <w:szCs w:val="24"/>
+          <w:lang w:eastAsia="it-IT"/>
+        </w:rPr>
+        <w:t>M</w:t>
       </w:r>
       <w:r>
         <w:rPr>
           <w:rFonts w:ascii="Arial" w:eastAsia="Times New Roman" w:hAnsi="Arial" w:cs="Arial"/>
           <w:b/>
           <w:bCs/>
-          <w:color w:val="000000" w:themeColor="text1"/>
-          <w:sz w:val="24"/>
-          <w:szCs w:val="24"/>
-          <w:lang w:eastAsia="it-IT"/>
-        </w:rPr>
-        <w:t>S</w:t>
-      </w:r>
-      <w:r>
-        <w:rPr>
-          <w:rFonts w:ascii="Arial" w:eastAsia="Times New Roman" w:hAnsi="Arial" w:cs="Arial"/>
-          <w:color w:val="000000" w:themeColor="text1"/>
-          <w:sz w:val="24"/>
-          <w:szCs w:val="24"/>
-          <w:lang w:eastAsia="it-IT"/>
-        </w:rPr>
-        <w:t xml:space="preserve"> → Invia stato tensione</w:t>
+          <w:color w:val="00B050"/>
+          <w:sz w:val="24"/>
+          <w:szCs w:val="24"/>
+          <w:lang w:eastAsia="it-IT"/>
+        </w:rPr>
+        <w:t>aster</w:t>
       </w:r>
     </w:p>
     <w:p>
@@ -1335,75 +1172,1729 @@
           <w:szCs w:val="24"/>
           <w:lang w:eastAsia="it-IT"/>
         </w:rPr>
-        <w:t>E</w:t>
-      </w:r>
-      <w:r>
-        <w:rPr>
-          <w:rFonts w:ascii="Arial" w:eastAsia="Times New Roman" w:hAnsi="Arial" w:cs="Arial"/>
-          <w:color w:val="000000" w:themeColor="text1"/>
-          <w:sz w:val="24"/>
-          <w:szCs w:val="24"/>
-          <w:lang w:eastAsia="it-IT"/>
-        </w:rPr>
-        <w:t xml:space="preserve"> → Comando riservato, cancella tutti i numeri</w:t>
+        <w:t>D</w:t>
+      </w:r>
+      <w:r>
+        <w:rPr>
+          <w:rFonts w:ascii="Arial" w:eastAsia="Times New Roman" w:hAnsi="Arial" w:cs="Arial"/>
+          <w:color w:val="000000" w:themeColor="text1"/>
+          <w:sz w:val="24"/>
+          <w:szCs w:val="24"/>
+          <w:lang w:eastAsia="it-IT"/>
+        </w:rPr>
+        <w:t xml:space="preserve"> → Cancella numeri ausiliari</w:t>
       </w:r>
     </w:p>
     <w:p>
       <w:pPr>
         <w:spacing w:after="0" w:line="330" w:lineRule="atLeast"/>
         <w:ind w:left="708"/>
-        <w:rPr>
-          <w:rFonts w:ascii="Arial" w:eastAsia="Times New Roman" w:hAnsi="Arial" w:cs="Arial"/>
-          <w:color w:val="000000" w:themeColor="text1"/>
-          <w:sz w:val="24"/>
-          <w:szCs w:val="24"/>
-          <w:lang w:eastAsia="it-IT"/>
-        </w:rPr>
-      </w:pPr>
-    </w:p>
-    <w:p>
-      <w:pPr>
-        <w:spacing w:after="0" w:line="330" w:lineRule="atLeast"/>
-        <w:ind w:left="708"/>
-        <w:rPr>
-          <w:rFonts w:ascii="Arial" w:eastAsia="Times New Roman" w:hAnsi="Arial" w:cs="Arial"/>
-          <w:color w:val="000000" w:themeColor="text1"/>
-          <w:sz w:val="24"/>
-          <w:szCs w:val="24"/>
-          <w:lang w:eastAsia="it-IT"/>
-        </w:rPr>
-      </w:pPr>
-      <w:r>
-        <w:rPr>
-          <w:rFonts w:ascii="Arial" w:eastAsia="Times New Roman" w:hAnsi="Arial" w:cs="Arial"/>
-          <w:color w:val="000000" w:themeColor="text1"/>
-          <w:sz w:val="24"/>
-          <w:szCs w:val="24"/>
-          <w:lang w:eastAsia="it-IT"/>
-        </w:rPr>
-        <w:t>- Salva e legge i numeri autorizzati su EEPROM per persistenza.</w:t>
-      </w:r>
-    </w:p>
-    <w:p>
-      <w:pPr>
-        <w:spacing w:after="240" w:line="330" w:lineRule="atLeast"/>
-        <w:rPr>
-          <w:rFonts w:ascii="Arial" w:eastAsia="Times New Roman" w:hAnsi="Arial" w:cs="Arial"/>
-          <w:color w:val="000000" w:themeColor="text1"/>
-          <w:sz w:val="24"/>
-          <w:szCs w:val="24"/>
-          <w:lang w:eastAsia="it-IT"/>
-        </w:rPr>
-      </w:pPr>
-    </w:p>
-    <w:p>
-      <w:pPr>
-        <w:spacing w:after="0" w:line="330" w:lineRule="atLeast"/>
-        <w:jc w:val="center"/>
         <w:rPr>
           <w:rFonts w:ascii="Arial" w:eastAsia="Times New Roman" w:hAnsi="Arial" w:cs="Arial"/>
           <w:b/>
           <w:bCs/>
+          <w:color w:val="00B050"/>
+          <w:sz w:val="24"/>
+          <w:szCs w:val="24"/>
+          <w:lang w:eastAsia="it-IT"/>
+        </w:rPr>
+      </w:pPr>
+      <w:r>
+        <w:rPr>
+          <w:rFonts w:ascii="Arial" w:eastAsia="Times New Roman" w:hAnsi="Arial" w:cs="Arial"/>
+          <w:b/>
+          <w:bCs/>
+          <w:color w:val="00B050"/>
+          <w:sz w:val="24"/>
+          <w:szCs w:val="24"/>
+          <w:lang w:eastAsia="it-IT"/>
+        </w:rPr>
+        <w:t xml:space="preserve">- </w:t>
+      </w:r>
+      <w:r>
+        <w:rPr>
+          <w:rFonts w:ascii="Arial" w:eastAsia="Times New Roman" w:hAnsi="Arial" w:cs="Arial"/>
+          <w:b/>
+          <w:bCs/>
+          <w:color w:val="00B050"/>
+          <w:sz w:val="24"/>
+          <w:szCs w:val="24"/>
+          <w:lang w:eastAsia="it-IT"/>
+        </w:rPr>
+        <w:t>S</w:t>
+      </w:r>
+      <w:r>
+        <w:rPr>
+          <w:rFonts w:ascii="Arial" w:eastAsia="Times New Roman" w:hAnsi="Arial" w:cs="Arial"/>
+          <w:b/>
+          <w:bCs/>
+          <w:color w:val="00B050"/>
+          <w:sz w:val="24"/>
+          <w:szCs w:val="24"/>
+          <w:lang w:eastAsia="it-IT"/>
+        </w:rPr>
+        <w:t xml:space="preserve">olo se numero </w:t>
+      </w:r>
+      <w:r>
+        <w:rPr>
+          <w:rFonts w:ascii="Arial" w:eastAsia="Times New Roman" w:hAnsi="Arial" w:cs="Arial"/>
+          <w:b/>
+          <w:bCs/>
+          <w:color w:val="00B050"/>
+          <w:sz w:val="24"/>
+          <w:szCs w:val="24"/>
+          <w:lang w:eastAsia="it-IT"/>
+        </w:rPr>
+        <w:t>M</w:t>
+      </w:r>
+      <w:r>
+        <w:rPr>
+          <w:rFonts w:ascii="Arial" w:eastAsia="Times New Roman" w:hAnsi="Arial" w:cs="Arial"/>
+          <w:b/>
+          <w:bCs/>
+          <w:color w:val="00B050"/>
+          <w:sz w:val="24"/>
+          <w:szCs w:val="24"/>
+          <w:lang w:eastAsia="it-IT"/>
+        </w:rPr>
+        <w:t>aster</w:t>
+      </w:r>
+    </w:p>
+    <w:p>
+      <w:pPr>
+        <w:spacing w:after="0" w:line="330" w:lineRule="atLeast"/>
+        <w:ind w:left="708"/>
+        <w:rPr>
+          <w:rFonts w:ascii="Arial" w:eastAsia="Times New Roman" w:hAnsi="Arial" w:cs="Arial"/>
+          <w:color w:val="000000" w:themeColor="text1"/>
+          <w:sz w:val="24"/>
+          <w:szCs w:val="24"/>
+          <w:lang w:eastAsia="it-IT"/>
+        </w:rPr>
+      </w:pPr>
+    </w:p>
+    <w:p>
+      <w:pPr>
+        <w:spacing w:after="0" w:line="330" w:lineRule="atLeast"/>
+        <w:ind w:left="708"/>
+        <w:rPr>
+          <w:rFonts w:ascii="Arial" w:eastAsia="Times New Roman" w:hAnsi="Arial" w:cs="Arial"/>
+          <w:color w:val="000000" w:themeColor="text1"/>
+          <w:sz w:val="24"/>
+          <w:szCs w:val="24"/>
+          <w:lang w:eastAsia="it-IT"/>
+        </w:rPr>
+      </w:pPr>
+    </w:p>
+    <w:p>
+      <w:pPr>
+        <w:spacing w:after="0" w:line="330" w:lineRule="atLeast"/>
+        <w:ind w:left="708"/>
+        <w:rPr>
+          <w:rFonts w:ascii="Arial" w:eastAsia="Times New Roman" w:hAnsi="Arial" w:cs="Arial"/>
+          <w:color w:val="000000" w:themeColor="text1"/>
+          <w:sz w:val="24"/>
+          <w:szCs w:val="24"/>
+          <w:lang w:eastAsia="it-IT"/>
+        </w:rPr>
+      </w:pPr>
+      <w:r>
+        <w:rPr>
+          <w:rFonts w:ascii="Arial" w:eastAsia="Times New Roman" w:hAnsi="Arial" w:cs="Arial"/>
+          <w:color w:val="000000" w:themeColor="text1"/>
+          <w:sz w:val="24"/>
+          <w:szCs w:val="24"/>
+          <w:lang w:eastAsia="it-IT"/>
+        </w:rPr>
+        <w:t xml:space="preserve">- </w:t>
+      </w:r>
+      <w:r>
+        <w:rPr>
+          <w:rFonts w:ascii="Arial" w:eastAsia="Times New Roman" w:hAnsi="Arial" w:cs="Arial"/>
+          <w:b/>
+          <w:bCs/>
+          <w:color w:val="000000" w:themeColor="text1"/>
+          <w:sz w:val="24"/>
+          <w:szCs w:val="24"/>
+          <w:lang w:eastAsia="it-IT"/>
+        </w:rPr>
+        <w:t>N</w:t>
+      </w:r>
+      <w:r>
+        <w:rPr>
+          <w:rFonts w:ascii="Arial" w:eastAsia="Times New Roman" w:hAnsi="Arial" w:cs="Arial"/>
+          <w:color w:val="000000" w:themeColor="text1"/>
+          <w:sz w:val="24"/>
+          <w:szCs w:val="24"/>
+          <w:lang w:eastAsia="it-IT"/>
+        </w:rPr>
+        <w:t xml:space="preserve"> → Elenca numeri autorizzati</w:t>
+      </w:r>
+    </w:p>
+    <w:p>
+      <w:pPr>
+        <w:spacing w:after="0" w:line="330" w:lineRule="atLeast"/>
+        <w:ind w:left="708"/>
+        <w:rPr>
+          <w:rFonts w:ascii="Arial" w:eastAsia="Times New Roman" w:hAnsi="Arial" w:cs="Arial"/>
+          <w:color w:val="000000" w:themeColor="text1"/>
+          <w:sz w:val="24"/>
+          <w:szCs w:val="24"/>
+          <w:lang w:eastAsia="it-IT"/>
+        </w:rPr>
+      </w:pPr>
+    </w:p>
+    <w:p>
+      <w:pPr>
+        <w:spacing w:after="0" w:line="330" w:lineRule="atLeast"/>
+        <w:ind w:left="708"/>
+        <w:rPr>
+          <w:rFonts w:ascii="Arial" w:eastAsia="Times New Roman" w:hAnsi="Arial" w:cs="Arial"/>
+          <w:color w:val="000000" w:themeColor="text1"/>
+          <w:sz w:val="24"/>
+          <w:szCs w:val="24"/>
+          <w:lang w:eastAsia="it-IT"/>
+        </w:rPr>
+      </w:pPr>
+      <w:r>
+        <w:rPr>
+          <w:rFonts w:ascii="Arial" w:eastAsia="Times New Roman" w:hAnsi="Arial" w:cs="Arial"/>
+          <w:color w:val="000000" w:themeColor="text1"/>
+          <w:sz w:val="24"/>
+          <w:szCs w:val="24"/>
+          <w:lang w:eastAsia="it-IT"/>
+        </w:rPr>
+        <w:t xml:space="preserve">- </w:t>
+      </w:r>
+      <w:r>
+        <w:rPr>
+          <w:rFonts w:ascii="Arial" w:eastAsia="Times New Roman" w:hAnsi="Arial" w:cs="Arial"/>
+          <w:b/>
+          <w:bCs/>
+          <w:color w:val="000000" w:themeColor="text1"/>
+          <w:sz w:val="24"/>
+          <w:szCs w:val="24"/>
+          <w:lang w:eastAsia="it-IT"/>
+        </w:rPr>
+        <w:t>S</w:t>
+      </w:r>
+      <w:r>
+        <w:rPr>
+          <w:rFonts w:ascii="Arial" w:eastAsia="Times New Roman" w:hAnsi="Arial" w:cs="Arial"/>
+          <w:color w:val="000000" w:themeColor="text1"/>
+          <w:sz w:val="24"/>
+          <w:szCs w:val="24"/>
+          <w:lang w:eastAsia="it-IT"/>
+        </w:rPr>
+        <w:t xml:space="preserve"> → Invia stato tensione</w:t>
+      </w:r>
+    </w:p>
+    <w:p>
+      <w:pPr>
+        <w:spacing w:after="0" w:line="330" w:lineRule="atLeast"/>
+        <w:ind w:left="708"/>
+        <w:rPr>
+          <w:rFonts w:ascii="Arial" w:eastAsia="Times New Roman" w:hAnsi="Arial" w:cs="Arial"/>
+          <w:color w:val="000000" w:themeColor="text1"/>
+          <w:sz w:val="24"/>
+          <w:szCs w:val="24"/>
+          <w:lang w:eastAsia="it-IT"/>
+        </w:rPr>
+      </w:pPr>
+    </w:p>
+    <w:p>
+      <w:pPr>
+        <w:spacing w:after="0" w:line="330" w:lineRule="atLeast"/>
+        <w:ind w:left="708"/>
+        <w:rPr>
+          <w:rFonts w:ascii="Arial" w:eastAsia="Times New Roman" w:hAnsi="Arial" w:cs="Arial"/>
+          <w:color w:val="000000" w:themeColor="text1"/>
+          <w:sz w:val="24"/>
+          <w:szCs w:val="24"/>
+          <w:lang w:eastAsia="it-IT"/>
+        </w:rPr>
+      </w:pPr>
+      <w:r>
+        <w:rPr>
+          <w:rFonts w:ascii="Arial" w:eastAsia="Times New Roman" w:hAnsi="Arial" w:cs="Arial"/>
+          <w:color w:val="000000" w:themeColor="text1"/>
+          <w:sz w:val="24"/>
+          <w:szCs w:val="24"/>
+          <w:lang w:eastAsia="it-IT"/>
+        </w:rPr>
+        <w:t xml:space="preserve">- </w:t>
+      </w:r>
+      <w:r>
+        <w:rPr>
+          <w:rFonts w:ascii="Arial" w:eastAsia="Times New Roman" w:hAnsi="Arial" w:cs="Arial"/>
+          <w:b/>
+          <w:bCs/>
+          <w:color w:val="000000" w:themeColor="text1"/>
+          <w:sz w:val="24"/>
+          <w:szCs w:val="24"/>
+          <w:lang w:eastAsia="it-IT"/>
+        </w:rPr>
+        <w:t>E</w:t>
+      </w:r>
+      <w:r>
+        <w:rPr>
+          <w:rFonts w:ascii="Arial" w:eastAsia="Times New Roman" w:hAnsi="Arial" w:cs="Arial"/>
+          <w:color w:val="000000" w:themeColor="text1"/>
+          <w:sz w:val="24"/>
+          <w:szCs w:val="24"/>
+          <w:lang w:eastAsia="it-IT"/>
+        </w:rPr>
+        <w:t xml:space="preserve"> → Comando riservato, cancella tutti i numeri</w:t>
+      </w:r>
+    </w:p>
+    <w:p>
+      <w:pPr>
+        <w:spacing w:after="0" w:line="330" w:lineRule="atLeast"/>
+        <w:ind w:left="708"/>
+        <w:rPr>
+          <w:rFonts w:ascii="Arial" w:eastAsia="Times New Roman" w:hAnsi="Arial" w:cs="Arial"/>
+          <w:color w:val="000000" w:themeColor="text1"/>
+          <w:sz w:val="24"/>
+          <w:szCs w:val="24"/>
+          <w:lang w:eastAsia="it-IT"/>
+        </w:rPr>
+      </w:pPr>
+    </w:p>
+    <w:p>
+      <w:pPr>
+        <w:spacing w:after="0" w:line="330" w:lineRule="atLeast"/>
+        <w:ind w:left="708"/>
+        <w:rPr>
+          <w:rFonts w:ascii="Arial" w:eastAsia="Times New Roman" w:hAnsi="Arial" w:cs="Arial"/>
+          <w:color w:val="000000" w:themeColor="text1"/>
+          <w:sz w:val="24"/>
+          <w:szCs w:val="24"/>
+          <w:lang w:eastAsia="it-IT"/>
+        </w:rPr>
+      </w:pPr>
+      <w:r>
+        <w:rPr>
+          <w:rFonts w:ascii="Arial" w:eastAsia="Times New Roman" w:hAnsi="Arial" w:cs="Arial"/>
+          <w:color w:val="000000" w:themeColor="text1"/>
+          <w:sz w:val="24"/>
+          <w:szCs w:val="24"/>
+          <w:lang w:eastAsia="it-IT"/>
+        </w:rPr>
+        <w:t>- Salva e legge i numeri autorizzati su EEPROM per persistenza</w:t>
+      </w:r>
+      <w:r>
+        <w:rPr>
+          <w:rFonts w:ascii="Arial" w:eastAsia="Times New Roman" w:hAnsi="Arial" w:cs="Arial"/>
+          <w:color w:val="000000" w:themeColor="text1"/>
+          <w:sz w:val="24"/>
+          <w:szCs w:val="24"/>
+          <w:lang w:eastAsia="it-IT"/>
+        </w:rPr>
+        <w:t>,</w:t>
+      </w:r>
+    </w:p>
+    <w:p>
+      <w:pPr>
+        <w:spacing w:after="0" w:line="330" w:lineRule="atLeast"/>
+        <w:rPr>
+          <w:rFonts w:ascii="Arial" w:eastAsia="Times New Roman" w:hAnsi="Arial" w:cs="Arial"/>
+          <w:color w:val="000000" w:themeColor="text1"/>
+          <w:sz w:val="24"/>
+          <w:szCs w:val="24"/>
+          <w:lang w:eastAsia="it-IT"/>
+        </w:rPr>
+      </w:pPr>
+      <w:r>
+        <w:rPr>
+          <w:rFonts w:ascii="Arial" w:eastAsia="Times New Roman" w:hAnsi="Arial" w:cs="Arial"/>
+          <w:color w:val="000000" w:themeColor="text1"/>
+          <w:sz w:val="24"/>
+          <w:szCs w:val="24"/>
+          <w:lang w:eastAsia="it-IT"/>
+        </w:rPr>
+        <w:t>.</w:t>
+      </w:r>
+    </w:p>
+    <w:p>
+      <w:pPr>
+        <w:spacing w:after="0" w:line="330" w:lineRule="atLeast"/>
+        <w:ind w:left="2832" w:firstLine="708"/>
+        <w:rPr>
+          <w:rFonts w:ascii="Arial" w:eastAsia="Times New Roman" w:hAnsi="Arial" w:cs="Arial"/>
+          <w:color w:val="000000" w:themeColor="text1"/>
+          <w:sz w:val="24"/>
+          <w:szCs w:val="24"/>
+          <w:u w:val="single"/>
+          <w:lang w:eastAsia="it-IT"/>
+        </w:rPr>
+      </w:pPr>
+      <w:r>
+        <w:rPr>
+          <w:rFonts w:ascii="Arial" w:eastAsia="Times New Roman" w:hAnsi="Arial" w:cs="Arial"/>
+          <w:b/>
+          <w:bCs/>
+          <w:color w:val="000000" w:themeColor="text1"/>
+          <w:sz w:val="24"/>
+          <w:szCs w:val="24"/>
+          <w:lang w:eastAsia="it-IT"/>
+        </w:rPr>
+        <w:t>RIEPILOGO</w:t>
+      </w:r>
+    </w:p>
+    <w:tbl>
+      <w:tblPr>
+        <w:tblStyle w:val="Grigliatabella"/>
+        <w:tblW w:w="0" w:type="auto"/>
+        <w:tblLook w:val="04A0" w:firstRow="1" w:lastRow="0" w:firstColumn="1" w:lastColumn="0" w:noHBand="0" w:noVBand="1"/>
+      </w:tblPr>
+      <w:tblGrid>
+        <w:gridCol w:w="1324"/>
+        <w:gridCol w:w="1365"/>
+        <w:gridCol w:w="1559"/>
+        <w:gridCol w:w="1276"/>
+        <w:gridCol w:w="4104"/>
+      </w:tblGrid>
+      <w:tr>
+        <w:tc>
+          <w:tcPr>
+            <w:tcW w:w="1324" w:type="dxa"/>
+            <w:shd w:val="clear" w:color="auto" w:fill="4472C4" w:themeFill="accent1"/>
+          </w:tcPr>
+          <w:p>
+            <w:pPr>
+              <w:spacing w:line="330" w:lineRule="atLeast"/>
+              <w:jc w:val="center"/>
+              <w:rPr>
+                <w:rFonts w:ascii="Arial" w:eastAsia="Times New Roman" w:hAnsi="Arial" w:cs="Arial"/>
+                <w:color w:val="FFFFFF" w:themeColor="background1"/>
+                <w:sz w:val="24"/>
+                <w:szCs w:val="24"/>
+                <w:lang w:eastAsia="it-IT"/>
+              </w:rPr>
+            </w:pPr>
+            <w:r>
+              <w:rPr>
+                <w:rFonts w:ascii="Arial" w:eastAsia="Times New Roman" w:hAnsi="Arial" w:cs="Arial"/>
+                <w:color w:val="FFFFFF" w:themeColor="background1"/>
+                <w:sz w:val="24"/>
+                <w:szCs w:val="24"/>
+                <w:lang w:eastAsia="it-IT"/>
+              </w:rPr>
+              <w:t>Command</w:t>
+            </w:r>
+          </w:p>
+        </w:tc>
+        <w:tc>
+          <w:tcPr>
+            <w:tcW w:w="1365" w:type="dxa"/>
+            <w:shd w:val="clear" w:color="auto" w:fill="4472C4" w:themeFill="accent1"/>
+          </w:tcPr>
+          <w:p>
+            <w:pPr>
+              <w:spacing w:line="330" w:lineRule="atLeast"/>
+              <w:jc w:val="center"/>
+              <w:rPr>
+                <w:rFonts w:ascii="Arial" w:eastAsia="Times New Roman" w:hAnsi="Arial" w:cs="Arial"/>
+                <w:color w:val="FFFFFF" w:themeColor="background1"/>
+                <w:sz w:val="24"/>
+                <w:szCs w:val="24"/>
+                <w:lang w:eastAsia="it-IT"/>
+              </w:rPr>
+            </w:pPr>
+            <w:r>
+              <w:rPr>
+                <w:rFonts w:ascii="Arial" w:eastAsia="Times New Roman" w:hAnsi="Arial" w:cs="Arial"/>
+                <w:color w:val="FFFFFF" w:themeColor="background1"/>
+                <w:sz w:val="24"/>
+                <w:szCs w:val="24"/>
+                <w:lang w:eastAsia="it-IT"/>
+              </w:rPr>
+              <w:t>MASTER</w:t>
+            </w:r>
+          </w:p>
+        </w:tc>
+        <w:tc>
+          <w:tcPr>
+            <w:tcW w:w="1559" w:type="dxa"/>
+            <w:shd w:val="clear" w:color="auto" w:fill="4472C4" w:themeFill="accent1"/>
+          </w:tcPr>
+          <w:p>
+            <w:pPr>
+              <w:spacing w:line="330" w:lineRule="atLeast"/>
+              <w:jc w:val="center"/>
+              <w:rPr>
+                <w:rFonts w:ascii="Arial" w:eastAsia="Times New Roman" w:hAnsi="Arial" w:cs="Arial"/>
+                <w:color w:val="FFFFFF" w:themeColor="background1"/>
+                <w:sz w:val="24"/>
+                <w:szCs w:val="24"/>
+                <w:lang w:eastAsia="it-IT"/>
+              </w:rPr>
+            </w:pPr>
+            <w:r>
+              <w:rPr>
+                <w:rFonts w:ascii="Arial" w:eastAsia="Times New Roman" w:hAnsi="Arial" w:cs="Arial"/>
+                <w:color w:val="FFFFFF" w:themeColor="background1"/>
+                <w:sz w:val="24"/>
+                <w:szCs w:val="24"/>
+                <w:lang w:eastAsia="it-IT"/>
+              </w:rPr>
+              <w:t>AUXILIARY</w:t>
+            </w:r>
+          </w:p>
+        </w:tc>
+        <w:tc>
+          <w:tcPr>
+            <w:tcW w:w="1276" w:type="dxa"/>
+            <w:shd w:val="clear" w:color="auto" w:fill="4472C4" w:themeFill="accent1"/>
+          </w:tcPr>
+          <w:p>
+            <w:pPr>
+              <w:spacing w:line="330" w:lineRule="atLeast"/>
+              <w:jc w:val="center"/>
+              <w:rPr>
+                <w:rFonts w:ascii="Arial" w:eastAsia="Times New Roman" w:hAnsi="Arial" w:cs="Arial"/>
+                <w:color w:val="FFFFFF" w:themeColor="background1"/>
+                <w:sz w:val="24"/>
+                <w:szCs w:val="24"/>
+                <w:lang w:eastAsia="it-IT"/>
+              </w:rPr>
+            </w:pPr>
+            <w:r>
+              <w:rPr>
+                <w:rFonts w:ascii="Arial" w:eastAsia="Times New Roman" w:hAnsi="Arial" w:cs="Arial"/>
+                <w:color w:val="FFFFFF" w:themeColor="background1"/>
+                <w:sz w:val="24"/>
+                <w:szCs w:val="24"/>
+                <w:lang w:eastAsia="it-IT"/>
+              </w:rPr>
+              <w:t>VUOTO</w:t>
+            </w:r>
+          </w:p>
+        </w:tc>
+        <w:tc>
+          <w:tcPr>
+            <w:tcW w:w="4104" w:type="dxa"/>
+            <w:shd w:val="clear" w:color="auto" w:fill="4472C4" w:themeFill="accent1"/>
+          </w:tcPr>
+          <w:p>
+            <w:pPr>
+              <w:spacing w:line="330" w:lineRule="atLeast"/>
+              <w:jc w:val="center"/>
+              <w:rPr>
+                <w:rFonts w:ascii="Arial" w:eastAsia="Times New Roman" w:hAnsi="Arial" w:cs="Arial"/>
+                <w:color w:val="FFFFFF" w:themeColor="background1"/>
+                <w:sz w:val="24"/>
+                <w:szCs w:val="24"/>
+                <w:lang w:eastAsia="it-IT"/>
+              </w:rPr>
+            </w:pPr>
+            <w:r>
+              <w:rPr>
+                <w:rFonts w:ascii="Arial" w:eastAsia="Times New Roman" w:hAnsi="Arial" w:cs="Arial"/>
+                <w:color w:val="FFFFFF" w:themeColor="background1"/>
+                <w:sz w:val="24"/>
+                <w:szCs w:val="24"/>
+                <w:lang w:eastAsia="it-IT"/>
+              </w:rPr>
+              <w:t>Operazione</w:t>
+            </w:r>
+          </w:p>
+        </w:tc>
+      </w:tr>
+      <w:tr>
+        <w:trPr>
+          <w:trHeight w:val="785"/>
+        </w:trPr>
+        <w:tc>
+          <w:tcPr>
+            <w:tcW w:w="1324" w:type="dxa"/>
+            <w:vAlign w:val="center"/>
+          </w:tcPr>
+          <w:p>
+            <w:pPr>
+              <w:spacing w:line="330" w:lineRule="atLeast"/>
+              <w:jc w:val="center"/>
+              <w:rPr>
+                <w:rFonts w:ascii="Arial" w:eastAsia="Times New Roman" w:hAnsi="Arial" w:cs="Arial"/>
+                <w:b/>
+                <w:bCs/>
+                <w:color w:val="000000" w:themeColor="text1"/>
+                <w:sz w:val="32"/>
+                <w:szCs w:val="32"/>
+                <w:lang w:eastAsia="it-IT"/>
+              </w:rPr>
+            </w:pPr>
+            <w:r>
+              <w:rPr>
+                <w:rFonts w:ascii="Arial" w:eastAsia="Times New Roman" w:hAnsi="Arial" w:cs="Arial"/>
+                <w:b/>
+                <w:bCs/>
+                <w:color w:val="000000" w:themeColor="text1"/>
+                <w:sz w:val="32"/>
+                <w:szCs w:val="32"/>
+                <w:lang w:eastAsia="it-IT"/>
+              </w:rPr>
+              <w:t>M</w:t>
+            </w:r>
+          </w:p>
+        </w:tc>
+        <w:tc>
+          <w:tcPr>
+            <w:tcW w:w="1365" w:type="dxa"/>
+            <w:vAlign w:val="center"/>
+          </w:tcPr>
+          <w:p>
+            <w:pPr>
+              <w:spacing w:line="330" w:lineRule="atLeast"/>
+              <w:jc w:val="center"/>
+              <w:rPr>
+                <w:rFonts w:ascii="Arial" w:eastAsia="Times New Roman" w:hAnsi="Arial" w:cs="Arial"/>
+                <w:b/>
+                <w:bCs/>
+                <w:color w:val="000000" w:themeColor="text1"/>
+                <w:sz w:val="24"/>
+                <w:szCs w:val="24"/>
+                <w:lang w:eastAsia="it-IT"/>
+              </w:rPr>
+            </w:pPr>
+            <w:r>
+              <w:rPr>
+                <w:rFonts w:ascii="Arial" w:eastAsia="Times New Roman" w:hAnsi="Arial" w:cs="Arial"/>
+                <w:b/>
+                <w:bCs/>
+                <w:color w:val="000000" w:themeColor="text1"/>
+                <w:sz w:val="24"/>
+                <w:szCs w:val="24"/>
+                <w:lang w:eastAsia="it-IT"/>
+              </w:rPr>
+              <w:t>x</w:t>
+            </w:r>
+          </w:p>
+        </w:tc>
+        <w:tc>
+          <w:tcPr>
+            <w:tcW w:w="1559" w:type="dxa"/>
+            <w:vAlign w:val="center"/>
+          </w:tcPr>
+          <w:p>
+            <w:pPr>
+              <w:spacing w:line="330" w:lineRule="atLeast"/>
+              <w:jc w:val="center"/>
+              <w:rPr>
+                <w:rFonts w:ascii="Arial" w:eastAsia="Times New Roman" w:hAnsi="Arial" w:cs="Arial"/>
+                <w:b/>
+                <w:bCs/>
+                <w:color w:val="000000" w:themeColor="text1"/>
+                <w:sz w:val="24"/>
+                <w:szCs w:val="24"/>
+                <w:lang w:eastAsia="it-IT"/>
+              </w:rPr>
+            </w:pPr>
+            <w:r>
+              <w:rPr>
+                <w:rFonts w:ascii="Arial" w:eastAsia="Times New Roman" w:hAnsi="Arial" w:cs="Arial"/>
+                <w:b/>
+                <w:bCs/>
+                <w:color w:val="000000" w:themeColor="text1"/>
+                <w:sz w:val="24"/>
+                <w:szCs w:val="24"/>
+                <w:lang w:eastAsia="it-IT"/>
+              </w:rPr>
+              <w:t>x</w:t>
+            </w:r>
+          </w:p>
+        </w:tc>
+        <w:tc>
+          <w:tcPr>
+            <w:tcW w:w="1276" w:type="dxa"/>
+            <w:vAlign w:val="center"/>
+          </w:tcPr>
+          <w:p>
+            <w:pPr>
+              <w:spacing w:line="330" w:lineRule="atLeast"/>
+              <w:jc w:val="center"/>
+              <w:rPr>
+                <w:rFonts w:ascii="Arial" w:eastAsia="Times New Roman" w:hAnsi="Arial" w:cs="Arial"/>
+                <w:b/>
+                <w:bCs/>
+                <w:color w:val="000000" w:themeColor="text1"/>
+                <w:sz w:val="24"/>
+                <w:szCs w:val="24"/>
+                <w:lang w:eastAsia="it-IT"/>
+              </w:rPr>
+            </w:pPr>
+            <w:r>
+              <w:rPr>
+                <w:rFonts w:ascii="Arial" w:eastAsia="Times New Roman" w:hAnsi="Arial" w:cs="Arial"/>
+                <w:b/>
+                <w:bCs/>
+                <w:color w:val="000000" w:themeColor="text1"/>
+                <w:sz w:val="24"/>
+                <w:szCs w:val="24"/>
+                <w:lang w:eastAsia="it-IT"/>
+              </w:rPr>
+              <w:t>x</w:t>
+            </w:r>
+          </w:p>
+        </w:tc>
+        <w:tc>
+          <w:tcPr>
+            <w:tcW w:w="4104" w:type="dxa"/>
+          </w:tcPr>
+          <w:p>
+            <w:pPr>
+              <w:spacing w:line="330" w:lineRule="atLeast"/>
+              <w:jc w:val="center"/>
+              <w:rPr>
+                <w:rFonts w:ascii="Arial" w:eastAsia="Times New Roman" w:hAnsi="Arial" w:cs="Arial"/>
+                <w:sz w:val="24"/>
+                <w:szCs w:val="24"/>
+                <w:lang w:eastAsia="it-IT"/>
+              </w:rPr>
+            </w:pPr>
+            <w:r>
+              <w:rPr>
+                <w:rFonts w:ascii="Arial" w:eastAsia="Times New Roman" w:hAnsi="Arial" w:cs="Arial"/>
+                <w:color w:val="000000" w:themeColor="text1"/>
+                <w:sz w:val="24"/>
+                <w:szCs w:val="24"/>
+                <w:lang w:eastAsia="it-IT"/>
+              </w:rPr>
+              <w:t>Sostituisce o Imposta cellulare Autorizzato MASTER</w:t>
+            </w:r>
+          </w:p>
+        </w:tc>
+      </w:tr>
+      <w:tr>
+        <w:trPr>
+          <w:trHeight w:val="1066"/>
+        </w:trPr>
+        <w:tc>
+          <w:tcPr>
+            <w:tcW w:w="1324" w:type="dxa"/>
+            <w:vAlign w:val="center"/>
+          </w:tcPr>
+          <w:p>
+            <w:pPr>
+              <w:spacing w:line="330" w:lineRule="atLeast"/>
+              <w:jc w:val="center"/>
+              <w:rPr>
+                <w:rFonts w:ascii="Arial" w:eastAsia="Times New Roman" w:hAnsi="Arial" w:cs="Arial"/>
+                <w:b/>
+                <w:bCs/>
+                <w:color w:val="000000" w:themeColor="text1"/>
+                <w:sz w:val="32"/>
+                <w:szCs w:val="32"/>
+                <w:lang w:eastAsia="it-IT"/>
+              </w:rPr>
+            </w:pPr>
+            <w:r>
+              <w:rPr>
+                <w:rFonts w:ascii="Arial" w:eastAsia="Times New Roman" w:hAnsi="Arial" w:cs="Arial"/>
+                <w:b/>
+                <w:bCs/>
+                <w:color w:val="000000" w:themeColor="text1"/>
+                <w:sz w:val="32"/>
+                <w:szCs w:val="32"/>
+                <w:lang w:eastAsia="it-IT"/>
+              </w:rPr>
+              <w:t>D</w:t>
+            </w:r>
+          </w:p>
+        </w:tc>
+        <w:tc>
+          <w:tcPr>
+            <w:tcW w:w="1365" w:type="dxa"/>
+            <w:vAlign w:val="center"/>
+          </w:tcPr>
+          <w:p>
+            <w:pPr>
+              <w:spacing w:line="330" w:lineRule="atLeast"/>
+              <w:jc w:val="center"/>
+              <w:rPr>
+                <w:rFonts w:ascii="Arial" w:eastAsia="Times New Roman" w:hAnsi="Arial" w:cs="Arial"/>
+                <w:b/>
+                <w:bCs/>
+                <w:color w:val="000000" w:themeColor="text1"/>
+                <w:sz w:val="24"/>
+                <w:szCs w:val="24"/>
+                <w:lang w:eastAsia="it-IT"/>
+              </w:rPr>
+            </w:pPr>
+            <w:r>
+              <w:rPr>
+                <w:rFonts w:ascii="Arial" w:eastAsia="Times New Roman" w:hAnsi="Arial" w:cs="Arial"/>
+                <w:b/>
+                <w:bCs/>
+                <w:color w:val="000000" w:themeColor="text1"/>
+                <w:sz w:val="24"/>
+                <w:szCs w:val="24"/>
+                <w:lang w:eastAsia="it-IT"/>
+              </w:rPr>
+              <w:t>x</w:t>
+            </w:r>
+          </w:p>
+        </w:tc>
+        <w:tc>
+          <w:tcPr>
+            <w:tcW w:w="1559" w:type="dxa"/>
+            <w:vAlign w:val="center"/>
+          </w:tcPr>
+          <w:p>
+            <w:pPr>
+              <w:spacing w:line="330" w:lineRule="atLeast"/>
+              <w:jc w:val="center"/>
+              <w:rPr>
+                <w:rFonts w:ascii="Arial" w:eastAsia="Times New Roman" w:hAnsi="Arial" w:cs="Arial"/>
+                <w:b/>
+                <w:bCs/>
+                <w:color w:val="000000" w:themeColor="text1"/>
+                <w:sz w:val="24"/>
+                <w:szCs w:val="24"/>
+                <w:lang w:eastAsia="it-IT"/>
+              </w:rPr>
+            </w:pPr>
+          </w:p>
+        </w:tc>
+        <w:tc>
+          <w:tcPr>
+            <w:tcW w:w="1276" w:type="dxa"/>
+            <w:vAlign w:val="center"/>
+          </w:tcPr>
+          <w:p>
+            <w:pPr>
+              <w:spacing w:line="330" w:lineRule="atLeast"/>
+              <w:jc w:val="center"/>
+              <w:rPr>
+                <w:rFonts w:ascii="Arial" w:eastAsia="Times New Roman" w:hAnsi="Arial" w:cs="Arial"/>
+                <w:b/>
+                <w:bCs/>
+                <w:color w:val="000000" w:themeColor="text1"/>
+                <w:sz w:val="24"/>
+                <w:szCs w:val="24"/>
+                <w:lang w:eastAsia="it-IT"/>
+              </w:rPr>
+            </w:pPr>
+          </w:p>
+        </w:tc>
+        <w:tc>
+          <w:tcPr>
+            <w:tcW w:w="4104" w:type="dxa"/>
+            <w:vAlign w:val="center"/>
+          </w:tcPr>
+          <w:p>
+            <w:pPr>
+              <w:spacing w:line="330" w:lineRule="atLeast"/>
+              <w:jc w:val="center"/>
+              <w:rPr>
+                <w:rFonts w:ascii="Arial" w:eastAsia="Times New Roman" w:hAnsi="Arial" w:cs="Arial"/>
+                <w:color w:val="000000" w:themeColor="text1"/>
+                <w:sz w:val="24"/>
+                <w:szCs w:val="24"/>
+                <w:lang w:val="en-US" w:eastAsia="it-IT"/>
+              </w:rPr>
+            </w:pPr>
+            <w:r>
+              <w:rPr>
+                <w:rFonts w:ascii="Arial" w:eastAsia="Times New Roman" w:hAnsi="Arial" w:cs="Arial"/>
+                <w:color w:val="000000" w:themeColor="text1"/>
+                <w:sz w:val="24"/>
+                <w:szCs w:val="24"/>
+                <w:lang w:val="en-US" w:eastAsia="it-IT"/>
+              </w:rPr>
+              <w:t>Delete in EEPROM and phoneAut auxiliaries phone numbers except the Authorized MASTER[0]</w:t>
+            </w:r>
+          </w:p>
+          <w:p>
+            <w:pPr>
+              <w:spacing w:line="330" w:lineRule="atLeast"/>
+              <w:jc w:val="center"/>
+              <w:rPr>
+                <w:rFonts w:ascii="Arial" w:eastAsia="Times New Roman" w:hAnsi="Arial" w:cs="Arial"/>
+                <w:color w:val="000000" w:themeColor="text1"/>
+                <w:sz w:val="24"/>
+                <w:szCs w:val="24"/>
+                <w:lang w:val="en-US" w:eastAsia="it-IT"/>
+              </w:rPr>
+            </w:pPr>
+          </w:p>
+        </w:tc>
+      </w:tr>
+      <w:tr>
+        <w:tc>
+          <w:tcPr>
+            <w:tcW w:w="1324" w:type="dxa"/>
+            <w:vAlign w:val="center"/>
+          </w:tcPr>
+          <w:p>
+            <w:pPr>
+              <w:spacing w:line="330" w:lineRule="atLeast"/>
+              <w:jc w:val="center"/>
+              <w:rPr>
+                <w:rFonts w:ascii="Arial" w:eastAsia="Times New Roman" w:hAnsi="Arial" w:cs="Arial"/>
+                <w:b/>
+                <w:bCs/>
+                <w:color w:val="000000" w:themeColor="text1"/>
+                <w:sz w:val="32"/>
+                <w:szCs w:val="32"/>
+                <w:u w:val="single"/>
+                <w:lang w:eastAsia="it-IT"/>
+              </w:rPr>
+            </w:pPr>
+            <w:r>
+              <w:rPr>
+                <w:rFonts w:ascii="Arial" w:eastAsia="Times New Roman" w:hAnsi="Arial" w:cs="Arial"/>
+                <w:b/>
+                <w:bCs/>
+                <w:color w:val="000000" w:themeColor="text1"/>
+                <w:sz w:val="32"/>
+                <w:szCs w:val="32"/>
+                <w:lang w:eastAsia="it-IT"/>
+              </w:rPr>
+              <w:t>A</w:t>
+            </w:r>
+          </w:p>
+        </w:tc>
+        <w:tc>
+          <w:tcPr>
+            <w:tcW w:w="1365" w:type="dxa"/>
+            <w:vAlign w:val="center"/>
+          </w:tcPr>
+          <w:p>
+            <w:pPr>
+              <w:spacing w:line="330" w:lineRule="atLeast"/>
+              <w:jc w:val="center"/>
+              <w:rPr>
+                <w:rFonts w:ascii="Arial" w:eastAsia="Times New Roman" w:hAnsi="Arial" w:cs="Arial"/>
+                <w:b/>
+                <w:bCs/>
+                <w:color w:val="000000" w:themeColor="text1"/>
+                <w:sz w:val="24"/>
+                <w:szCs w:val="24"/>
+                <w:lang w:eastAsia="it-IT"/>
+              </w:rPr>
+            </w:pPr>
+            <w:r>
+              <w:rPr>
+                <w:rFonts w:ascii="Arial" w:eastAsia="Times New Roman" w:hAnsi="Arial" w:cs="Arial"/>
+                <w:b/>
+                <w:bCs/>
+                <w:color w:val="000000" w:themeColor="text1"/>
+                <w:sz w:val="24"/>
+                <w:szCs w:val="24"/>
+                <w:lang w:eastAsia="it-IT"/>
+              </w:rPr>
+              <w:t>x</w:t>
+            </w:r>
+          </w:p>
+        </w:tc>
+        <w:tc>
+          <w:tcPr>
+            <w:tcW w:w="1559" w:type="dxa"/>
+            <w:vAlign w:val="center"/>
+          </w:tcPr>
+          <w:p>
+            <w:pPr>
+              <w:spacing w:line="330" w:lineRule="atLeast"/>
+              <w:jc w:val="center"/>
+              <w:rPr>
+                <w:rFonts w:ascii="Arial" w:eastAsia="Times New Roman" w:hAnsi="Arial" w:cs="Arial"/>
+                <w:b/>
+                <w:bCs/>
+                <w:color w:val="000000" w:themeColor="text1"/>
+                <w:sz w:val="24"/>
+                <w:szCs w:val="24"/>
+                <w:lang w:eastAsia="it-IT"/>
+              </w:rPr>
+            </w:pPr>
+          </w:p>
+        </w:tc>
+        <w:tc>
+          <w:tcPr>
+            <w:tcW w:w="1276" w:type="dxa"/>
+            <w:vAlign w:val="center"/>
+          </w:tcPr>
+          <w:p>
+            <w:pPr>
+              <w:spacing w:line="330" w:lineRule="atLeast"/>
+              <w:jc w:val="center"/>
+              <w:rPr>
+                <w:rFonts w:ascii="Arial" w:eastAsia="Times New Roman" w:hAnsi="Arial" w:cs="Arial"/>
+                <w:b/>
+                <w:bCs/>
+                <w:color w:val="000000" w:themeColor="text1"/>
+                <w:sz w:val="24"/>
+                <w:szCs w:val="24"/>
+                <w:lang w:eastAsia="it-IT"/>
+              </w:rPr>
+            </w:pPr>
+          </w:p>
+        </w:tc>
+        <w:tc>
+          <w:tcPr>
+            <w:tcW w:w="4104" w:type="dxa"/>
+            <w:vAlign w:val="center"/>
+          </w:tcPr>
+          <w:p>
+            <w:pPr>
+              <w:spacing w:line="330" w:lineRule="atLeast"/>
+              <w:jc w:val="center"/>
+              <w:rPr>
+                <w:rFonts w:ascii="Arial" w:eastAsia="Times New Roman" w:hAnsi="Arial" w:cs="Arial"/>
+                <w:color w:val="000000" w:themeColor="text1"/>
+                <w:sz w:val="24"/>
+                <w:szCs w:val="24"/>
+                <w:lang w:eastAsia="it-IT"/>
+              </w:rPr>
+            </w:pPr>
+            <w:r>
+              <w:rPr>
+                <w:rFonts w:ascii="Arial" w:eastAsia="Times New Roman" w:hAnsi="Arial" w:cs="Arial"/>
+                <w:color w:val="000000" w:themeColor="text1"/>
+                <w:sz w:val="24"/>
+                <w:szCs w:val="24"/>
+                <w:lang w:eastAsia="it-IT"/>
+              </w:rPr>
+              <w:t>AGGIUNGI/SOSTITUISCI cellulare AUSILIARIO in posizione....</w:t>
+            </w:r>
+          </w:p>
+        </w:tc>
+      </w:tr>
+      <w:tr>
+        <w:tc>
+          <w:tcPr>
+            <w:tcW w:w="1324" w:type="dxa"/>
+            <w:vAlign w:val="center"/>
+          </w:tcPr>
+          <w:p>
+            <w:pPr>
+              <w:spacing w:line="330" w:lineRule="atLeast"/>
+              <w:jc w:val="center"/>
+              <w:rPr>
+                <w:rFonts w:ascii="Arial" w:eastAsia="Times New Roman" w:hAnsi="Arial" w:cs="Arial"/>
+                <w:b/>
+                <w:bCs/>
+                <w:color w:val="000000" w:themeColor="text1"/>
+                <w:sz w:val="32"/>
+                <w:szCs w:val="32"/>
+                <w:lang w:eastAsia="it-IT"/>
+              </w:rPr>
+            </w:pPr>
+            <w:r>
+              <w:rPr>
+                <w:rFonts w:ascii="Arial" w:eastAsia="Times New Roman" w:hAnsi="Arial" w:cs="Arial"/>
+                <w:b/>
+                <w:bCs/>
+                <w:color w:val="000000" w:themeColor="text1"/>
+                <w:sz w:val="32"/>
+                <w:szCs w:val="32"/>
+                <w:lang w:eastAsia="it-IT"/>
+              </w:rPr>
+              <w:t>N</w:t>
+            </w:r>
+          </w:p>
+        </w:tc>
+        <w:tc>
+          <w:tcPr>
+            <w:tcW w:w="1365" w:type="dxa"/>
+            <w:vAlign w:val="center"/>
+          </w:tcPr>
+          <w:p>
+            <w:pPr>
+              <w:spacing w:line="330" w:lineRule="atLeast"/>
+              <w:jc w:val="center"/>
+              <w:rPr>
+                <w:rFonts w:ascii="Arial" w:eastAsia="Times New Roman" w:hAnsi="Arial" w:cs="Arial"/>
+                <w:b/>
+                <w:bCs/>
+                <w:color w:val="000000" w:themeColor="text1"/>
+                <w:sz w:val="24"/>
+                <w:szCs w:val="24"/>
+                <w:lang w:eastAsia="it-IT"/>
+              </w:rPr>
+            </w:pPr>
+            <w:r>
+              <w:rPr>
+                <w:rFonts w:ascii="Arial" w:eastAsia="Times New Roman" w:hAnsi="Arial" w:cs="Arial"/>
+                <w:b/>
+                <w:bCs/>
+                <w:color w:val="000000" w:themeColor="text1"/>
+                <w:sz w:val="24"/>
+                <w:szCs w:val="24"/>
+                <w:lang w:eastAsia="it-IT"/>
+              </w:rPr>
+              <w:t>x</w:t>
+            </w:r>
+          </w:p>
+        </w:tc>
+        <w:tc>
+          <w:tcPr>
+            <w:tcW w:w="1559" w:type="dxa"/>
+            <w:vAlign w:val="center"/>
+          </w:tcPr>
+          <w:p>
+            <w:pPr>
+              <w:spacing w:line="330" w:lineRule="atLeast"/>
+              <w:jc w:val="center"/>
+              <w:rPr>
+                <w:rFonts w:ascii="Arial" w:eastAsia="Times New Roman" w:hAnsi="Arial" w:cs="Arial"/>
+                <w:b/>
+                <w:bCs/>
+                <w:color w:val="000000" w:themeColor="text1"/>
+                <w:sz w:val="24"/>
+                <w:szCs w:val="24"/>
+                <w:lang w:eastAsia="it-IT"/>
+              </w:rPr>
+            </w:pPr>
+          </w:p>
+        </w:tc>
+        <w:tc>
+          <w:tcPr>
+            <w:tcW w:w="1276" w:type="dxa"/>
+            <w:vAlign w:val="center"/>
+          </w:tcPr>
+          <w:p>
+            <w:pPr>
+              <w:spacing w:line="330" w:lineRule="atLeast"/>
+              <w:jc w:val="center"/>
+              <w:rPr>
+                <w:rFonts w:ascii="Arial" w:eastAsia="Times New Roman" w:hAnsi="Arial" w:cs="Arial"/>
+                <w:b/>
+                <w:bCs/>
+                <w:color w:val="000000" w:themeColor="text1"/>
+                <w:sz w:val="24"/>
+                <w:szCs w:val="24"/>
+                <w:lang w:eastAsia="it-IT"/>
+              </w:rPr>
+            </w:pPr>
+          </w:p>
+        </w:tc>
+        <w:tc>
+          <w:tcPr>
+            <w:tcW w:w="4104" w:type="dxa"/>
+            <w:vAlign w:val="center"/>
+          </w:tcPr>
+          <w:p>
+            <w:pPr>
+              <w:spacing w:line="330" w:lineRule="atLeast"/>
+              <w:jc w:val="center"/>
+              <w:rPr>
+                <w:rFonts w:ascii="Arial" w:eastAsia="Times New Roman" w:hAnsi="Arial" w:cs="Arial"/>
+                <w:color w:val="000000" w:themeColor="text1"/>
+                <w:sz w:val="24"/>
+                <w:szCs w:val="24"/>
+                <w:lang w:eastAsia="it-IT"/>
+              </w:rPr>
+            </w:pPr>
+            <w:r>
+              <w:rPr>
+                <w:rFonts w:ascii="Arial" w:eastAsia="Times New Roman" w:hAnsi="Arial" w:cs="Arial"/>
+                <w:color w:val="000000" w:themeColor="text1"/>
+                <w:sz w:val="24"/>
+                <w:szCs w:val="24"/>
+                <w:lang w:eastAsia="it-IT"/>
+              </w:rPr>
+              <w:t>Ritorna i numeri autorizzati</w:t>
+            </w:r>
+          </w:p>
+        </w:tc>
+      </w:tr>
+      <w:tr>
+        <w:tc>
+          <w:tcPr>
+            <w:tcW w:w="1324" w:type="dxa"/>
+            <w:vAlign w:val="center"/>
+          </w:tcPr>
+          <w:p>
+            <w:pPr>
+              <w:spacing w:line="330" w:lineRule="atLeast"/>
+              <w:jc w:val="center"/>
+              <w:rPr>
+                <w:rFonts w:ascii="Arial" w:eastAsia="Times New Roman" w:hAnsi="Arial" w:cs="Arial"/>
+                <w:b/>
+                <w:bCs/>
+                <w:color w:val="000000" w:themeColor="text1"/>
+                <w:sz w:val="32"/>
+                <w:szCs w:val="32"/>
+                <w:lang w:eastAsia="it-IT"/>
+              </w:rPr>
+            </w:pPr>
+            <w:r>
+              <w:rPr>
+                <w:rFonts w:ascii="Arial" w:eastAsia="Times New Roman" w:hAnsi="Arial" w:cs="Arial"/>
+                <w:b/>
+                <w:bCs/>
+                <w:color w:val="000000" w:themeColor="text1"/>
+                <w:sz w:val="32"/>
+                <w:szCs w:val="32"/>
+                <w:lang w:eastAsia="it-IT"/>
+              </w:rPr>
+              <w:t>E</w:t>
+            </w:r>
+          </w:p>
+        </w:tc>
+        <w:tc>
+          <w:tcPr>
+            <w:tcW w:w="1365" w:type="dxa"/>
+            <w:vAlign w:val="center"/>
+          </w:tcPr>
+          <w:p>
+            <w:pPr>
+              <w:spacing w:line="330" w:lineRule="atLeast"/>
+              <w:jc w:val="center"/>
+              <w:rPr>
+                <w:rFonts w:ascii="Arial" w:eastAsia="Times New Roman" w:hAnsi="Arial" w:cs="Arial"/>
+                <w:b/>
+                <w:bCs/>
+                <w:color w:val="000000" w:themeColor="text1"/>
+                <w:sz w:val="24"/>
+                <w:szCs w:val="24"/>
+                <w:lang w:eastAsia="it-IT"/>
+              </w:rPr>
+            </w:pPr>
+            <w:r>
+              <w:rPr>
+                <w:rFonts w:ascii="Arial" w:eastAsia="Times New Roman" w:hAnsi="Arial" w:cs="Arial"/>
+                <w:b/>
+                <w:bCs/>
+                <w:color w:val="000000" w:themeColor="text1"/>
+                <w:sz w:val="24"/>
+                <w:szCs w:val="24"/>
+                <w:lang w:eastAsia="it-IT"/>
+              </w:rPr>
+              <w:t>x</w:t>
+            </w:r>
+          </w:p>
+        </w:tc>
+        <w:tc>
+          <w:tcPr>
+            <w:tcW w:w="1559" w:type="dxa"/>
+            <w:vAlign w:val="center"/>
+          </w:tcPr>
+          <w:p>
+            <w:pPr>
+              <w:spacing w:line="330" w:lineRule="atLeast"/>
+              <w:jc w:val="center"/>
+              <w:rPr>
+                <w:rFonts w:ascii="Arial" w:eastAsia="Times New Roman" w:hAnsi="Arial" w:cs="Arial"/>
+                <w:b/>
+                <w:bCs/>
+                <w:color w:val="000000" w:themeColor="text1"/>
+                <w:sz w:val="24"/>
+                <w:szCs w:val="24"/>
+                <w:lang w:eastAsia="it-IT"/>
+              </w:rPr>
+            </w:pPr>
+            <w:r>
+              <w:rPr>
+                <w:rFonts w:ascii="Arial" w:eastAsia="Times New Roman" w:hAnsi="Arial" w:cs="Arial"/>
+                <w:b/>
+                <w:bCs/>
+                <w:color w:val="000000" w:themeColor="text1"/>
+                <w:sz w:val="24"/>
+                <w:szCs w:val="24"/>
+                <w:lang w:eastAsia="it-IT"/>
+              </w:rPr>
+              <w:t>x</w:t>
+            </w:r>
+          </w:p>
+        </w:tc>
+        <w:tc>
+          <w:tcPr>
+            <w:tcW w:w="1276" w:type="dxa"/>
+            <w:vAlign w:val="center"/>
+          </w:tcPr>
+          <w:p>
+            <w:pPr>
+              <w:spacing w:line="330" w:lineRule="atLeast"/>
+              <w:jc w:val="center"/>
+              <w:rPr>
+                <w:rFonts w:ascii="Arial" w:eastAsia="Times New Roman" w:hAnsi="Arial" w:cs="Arial"/>
+                <w:b/>
+                <w:bCs/>
+                <w:color w:val="000000" w:themeColor="text1"/>
+                <w:sz w:val="24"/>
+                <w:szCs w:val="24"/>
+                <w:lang w:eastAsia="it-IT"/>
+              </w:rPr>
+            </w:pPr>
+            <w:r>
+              <w:rPr>
+                <w:rFonts w:ascii="Arial" w:eastAsia="Times New Roman" w:hAnsi="Arial" w:cs="Arial"/>
+                <w:b/>
+                <w:bCs/>
+                <w:color w:val="000000" w:themeColor="text1"/>
+                <w:sz w:val="24"/>
+                <w:szCs w:val="24"/>
+                <w:lang w:eastAsia="it-IT"/>
+              </w:rPr>
+              <w:t>x</w:t>
+            </w:r>
+          </w:p>
+        </w:tc>
+        <w:tc>
+          <w:tcPr>
+            <w:tcW w:w="4104" w:type="dxa"/>
+            <w:vAlign w:val="center"/>
+          </w:tcPr>
+          <w:p>
+            <w:pPr>
+              <w:spacing w:line="330" w:lineRule="atLeast"/>
+              <w:jc w:val="center"/>
+              <w:rPr>
+                <w:rFonts w:ascii="Arial" w:eastAsia="Times New Roman" w:hAnsi="Arial" w:cs="Arial"/>
+                <w:color w:val="000000" w:themeColor="text1"/>
+                <w:sz w:val="24"/>
+                <w:szCs w:val="24"/>
+                <w:lang w:eastAsia="it-IT"/>
+              </w:rPr>
+            </w:pPr>
+            <w:r>
+              <w:rPr>
+                <w:rFonts w:ascii="Arial" w:eastAsia="Times New Roman" w:hAnsi="Arial" w:cs="Arial"/>
+                <w:color w:val="000000" w:themeColor="text1"/>
+                <w:sz w:val="24"/>
+                <w:szCs w:val="24"/>
+                <w:lang w:eastAsia="it-IT"/>
+              </w:rPr>
+              <w:t xml:space="preserve"> </w:t>
+            </w:r>
+            <w:r>
+              <w:rPr>
+                <w:rFonts w:ascii="Arial" w:eastAsia="Times New Roman" w:hAnsi="Arial" w:cs="Arial"/>
+                <w:color w:val="000000" w:themeColor="text1"/>
+                <w:sz w:val="24"/>
+                <w:szCs w:val="24"/>
+                <w:lang w:eastAsia="it-IT"/>
+              </w:rPr>
+              <w:t>Cancella tutti i numeri</w:t>
+            </w:r>
+          </w:p>
+          <w:p>
+            <w:pPr>
+              <w:spacing w:line="330" w:lineRule="atLeast"/>
+              <w:jc w:val="center"/>
+              <w:rPr>
+                <w:rFonts w:ascii="Arial" w:eastAsia="Times New Roman" w:hAnsi="Arial" w:cs="Arial"/>
+                <w:color w:val="000000" w:themeColor="text1"/>
+                <w:sz w:val="24"/>
+                <w:szCs w:val="24"/>
+                <w:lang w:eastAsia="it-IT"/>
+              </w:rPr>
+            </w:pPr>
+            <w:r>
+              <w:rPr>
+                <w:rFonts w:ascii="Arial" w:eastAsia="Times New Roman" w:hAnsi="Arial" w:cs="Arial"/>
+                <w:color w:val="000000" w:themeColor="text1"/>
+                <w:sz w:val="24"/>
+                <w:szCs w:val="24"/>
+                <w:lang w:eastAsia="it-IT"/>
+              </w:rPr>
+              <w:t>COMANDO NON DOCUMENTATO</w:t>
+            </w:r>
+          </w:p>
+        </w:tc>
+      </w:tr>
+      <w:tr>
+        <w:tc>
+          <w:tcPr>
+            <w:tcW w:w="1324" w:type="dxa"/>
+            <w:vAlign w:val="center"/>
+          </w:tcPr>
+          <w:p>
+            <w:pPr>
+              <w:spacing w:line="330" w:lineRule="atLeast"/>
+              <w:jc w:val="center"/>
+              <w:rPr>
+                <w:rFonts w:ascii="Arial" w:eastAsia="Times New Roman" w:hAnsi="Arial" w:cs="Arial"/>
+                <w:b/>
+                <w:bCs/>
+                <w:color w:val="000000" w:themeColor="text1"/>
+                <w:sz w:val="32"/>
+                <w:szCs w:val="32"/>
+                <w:lang w:eastAsia="it-IT"/>
+              </w:rPr>
+            </w:pPr>
+            <w:r>
+              <w:rPr>
+                <w:rFonts w:ascii="Arial" w:eastAsia="Times New Roman" w:hAnsi="Arial" w:cs="Arial"/>
+                <w:b/>
+                <w:bCs/>
+                <w:color w:val="000000" w:themeColor="text1"/>
+                <w:sz w:val="32"/>
+                <w:szCs w:val="32"/>
+                <w:lang w:eastAsia="it-IT"/>
+              </w:rPr>
+              <w:t>S</w:t>
+            </w:r>
+          </w:p>
+        </w:tc>
+        <w:tc>
+          <w:tcPr>
+            <w:tcW w:w="1365" w:type="dxa"/>
+            <w:vAlign w:val="center"/>
+          </w:tcPr>
+          <w:p>
+            <w:pPr>
+              <w:spacing w:line="330" w:lineRule="atLeast"/>
+              <w:jc w:val="center"/>
+              <w:rPr>
+                <w:rFonts w:ascii="Arial" w:eastAsia="Times New Roman" w:hAnsi="Arial" w:cs="Arial"/>
+                <w:b/>
+                <w:bCs/>
+                <w:color w:val="000000" w:themeColor="text1"/>
+                <w:sz w:val="24"/>
+                <w:szCs w:val="24"/>
+                <w:lang w:eastAsia="it-IT"/>
+              </w:rPr>
+            </w:pPr>
+            <w:r>
+              <w:rPr>
+                <w:rFonts w:ascii="Arial" w:eastAsia="Times New Roman" w:hAnsi="Arial" w:cs="Arial"/>
+                <w:b/>
+                <w:bCs/>
+                <w:color w:val="000000" w:themeColor="text1"/>
+                <w:sz w:val="24"/>
+                <w:szCs w:val="24"/>
+                <w:lang w:eastAsia="it-IT"/>
+              </w:rPr>
+              <w:t>x</w:t>
+            </w:r>
+          </w:p>
+        </w:tc>
+        <w:tc>
+          <w:tcPr>
+            <w:tcW w:w="1559" w:type="dxa"/>
+            <w:vAlign w:val="center"/>
+          </w:tcPr>
+          <w:p>
+            <w:pPr>
+              <w:spacing w:line="330" w:lineRule="atLeast"/>
+              <w:jc w:val="center"/>
+              <w:rPr>
+                <w:rFonts w:ascii="Arial" w:eastAsia="Times New Roman" w:hAnsi="Arial" w:cs="Arial"/>
+                <w:b/>
+                <w:bCs/>
+                <w:color w:val="000000" w:themeColor="text1"/>
+                <w:sz w:val="24"/>
+                <w:szCs w:val="24"/>
+                <w:lang w:eastAsia="it-IT"/>
+              </w:rPr>
+            </w:pPr>
+            <w:r>
+              <w:rPr>
+                <w:rFonts w:ascii="Arial" w:eastAsia="Times New Roman" w:hAnsi="Arial" w:cs="Arial"/>
+                <w:b/>
+                <w:bCs/>
+                <w:color w:val="000000" w:themeColor="text1"/>
+                <w:sz w:val="24"/>
+                <w:szCs w:val="24"/>
+                <w:lang w:eastAsia="it-IT"/>
+              </w:rPr>
+              <w:t>x</w:t>
+            </w:r>
+          </w:p>
+        </w:tc>
+        <w:tc>
+          <w:tcPr>
+            <w:tcW w:w="1276" w:type="dxa"/>
+            <w:vAlign w:val="center"/>
+          </w:tcPr>
+          <w:p>
+            <w:pPr>
+              <w:spacing w:line="330" w:lineRule="atLeast"/>
+              <w:jc w:val="center"/>
+              <w:rPr>
+                <w:rFonts w:ascii="Arial" w:eastAsia="Times New Roman" w:hAnsi="Arial" w:cs="Arial"/>
+                <w:b/>
+                <w:bCs/>
+                <w:color w:val="000000" w:themeColor="text1"/>
+                <w:sz w:val="24"/>
+                <w:szCs w:val="24"/>
+                <w:lang w:eastAsia="it-IT"/>
+              </w:rPr>
+            </w:pPr>
+          </w:p>
+        </w:tc>
+        <w:tc>
+          <w:tcPr>
+            <w:tcW w:w="4104" w:type="dxa"/>
+            <w:vAlign w:val="center"/>
+          </w:tcPr>
+          <w:p>
+            <w:pPr>
+              <w:spacing w:line="330" w:lineRule="atLeast"/>
+              <w:jc w:val="center"/>
+              <w:rPr>
+                <w:rFonts w:ascii="Arial" w:eastAsia="Times New Roman" w:hAnsi="Arial" w:cs="Arial"/>
+                <w:b/>
+                <w:bCs/>
+                <w:color w:val="000000" w:themeColor="text1"/>
+                <w:sz w:val="24"/>
+                <w:szCs w:val="24"/>
+                <w:lang w:eastAsia="it-IT"/>
+              </w:rPr>
+            </w:pPr>
+            <w:r>
+              <w:rPr>
+                <w:rFonts w:ascii="Arial" w:eastAsia="Times New Roman" w:hAnsi="Arial" w:cs="Arial"/>
+                <w:color w:val="000000" w:themeColor="text1"/>
+                <w:sz w:val="24"/>
+                <w:szCs w:val="24"/>
+                <w:lang w:eastAsia="it-IT"/>
+              </w:rPr>
+              <w:t>Ritorna lo stato della tensione di rete</w:t>
+            </w:r>
+          </w:p>
+        </w:tc>
+      </w:tr>
+      <w:tr>
+        <w:tc>
+          <w:tcPr>
+            <w:tcW w:w="1324" w:type="dxa"/>
+            <w:vAlign w:val="center"/>
+          </w:tcPr>
+          <w:p>
+            <w:pPr>
+              <w:spacing w:line="330" w:lineRule="atLeast"/>
+              <w:jc w:val="center"/>
+              <w:rPr>
+                <w:rFonts w:ascii="Arial" w:eastAsia="Times New Roman" w:hAnsi="Arial" w:cs="Arial"/>
+                <w:b/>
+                <w:bCs/>
+                <w:color w:val="000000" w:themeColor="text1"/>
+                <w:sz w:val="32"/>
+                <w:szCs w:val="32"/>
+                <w:lang w:eastAsia="it-IT"/>
+              </w:rPr>
+            </w:pPr>
+          </w:p>
+        </w:tc>
+        <w:tc>
+          <w:tcPr>
+            <w:tcW w:w="1365" w:type="dxa"/>
+            <w:vAlign w:val="center"/>
+          </w:tcPr>
+          <w:p>
+            <w:pPr>
+              <w:spacing w:line="330" w:lineRule="atLeast"/>
+              <w:jc w:val="center"/>
+              <w:rPr>
+                <w:rFonts w:ascii="Arial" w:eastAsia="Times New Roman" w:hAnsi="Arial" w:cs="Arial"/>
+                <w:b/>
+                <w:bCs/>
+                <w:color w:val="000000" w:themeColor="text1"/>
+                <w:sz w:val="24"/>
+                <w:szCs w:val="24"/>
+                <w:lang w:eastAsia="it-IT"/>
+              </w:rPr>
+            </w:pPr>
+          </w:p>
+        </w:tc>
+        <w:tc>
+          <w:tcPr>
+            <w:tcW w:w="1559" w:type="dxa"/>
+            <w:vAlign w:val="center"/>
+          </w:tcPr>
+          <w:p>
+            <w:pPr>
+              <w:spacing w:line="330" w:lineRule="atLeast"/>
+              <w:jc w:val="center"/>
+              <w:rPr>
+                <w:rFonts w:ascii="Arial" w:eastAsia="Times New Roman" w:hAnsi="Arial" w:cs="Arial"/>
+                <w:b/>
+                <w:bCs/>
+                <w:color w:val="000000" w:themeColor="text1"/>
+                <w:sz w:val="24"/>
+                <w:szCs w:val="24"/>
+                <w:lang w:eastAsia="it-IT"/>
+              </w:rPr>
+            </w:pPr>
+          </w:p>
+        </w:tc>
+        <w:tc>
+          <w:tcPr>
+            <w:tcW w:w="1276" w:type="dxa"/>
+            <w:vAlign w:val="center"/>
+          </w:tcPr>
+          <w:p>
+            <w:pPr>
+              <w:spacing w:line="330" w:lineRule="atLeast"/>
+              <w:jc w:val="center"/>
+              <w:rPr>
+                <w:rFonts w:ascii="Arial" w:eastAsia="Times New Roman" w:hAnsi="Arial" w:cs="Arial"/>
+                <w:b/>
+                <w:bCs/>
+                <w:color w:val="000000" w:themeColor="text1"/>
+                <w:sz w:val="24"/>
+                <w:szCs w:val="24"/>
+                <w:lang w:eastAsia="it-IT"/>
+              </w:rPr>
+            </w:pPr>
+          </w:p>
+        </w:tc>
+        <w:tc>
+          <w:tcPr>
+            <w:tcW w:w="4104" w:type="dxa"/>
+            <w:vAlign w:val="center"/>
+          </w:tcPr>
+          <w:p>
+            <w:pPr>
+              <w:spacing w:line="330" w:lineRule="atLeast"/>
+              <w:jc w:val="center"/>
+              <w:rPr>
+                <w:rFonts w:ascii="Arial" w:eastAsia="Times New Roman" w:hAnsi="Arial" w:cs="Arial"/>
+                <w:b/>
+                <w:bCs/>
+                <w:color w:val="000000" w:themeColor="text1"/>
+                <w:sz w:val="24"/>
+                <w:szCs w:val="24"/>
+                <w:lang w:eastAsia="it-IT"/>
+              </w:rPr>
+            </w:pPr>
+          </w:p>
+        </w:tc>
+      </w:tr>
+      <w:tr>
+        <w:tc>
+          <w:tcPr>
+            <w:tcW w:w="1324" w:type="dxa"/>
+            <w:vAlign w:val="center"/>
+          </w:tcPr>
+          <w:p>
+            <w:pPr>
+              <w:spacing w:line="330" w:lineRule="atLeast"/>
+              <w:jc w:val="center"/>
+              <w:rPr>
+                <w:rFonts w:ascii="Arial" w:eastAsia="Times New Roman" w:hAnsi="Arial" w:cs="Arial"/>
+                <w:b/>
+                <w:bCs/>
+                <w:color w:val="000000" w:themeColor="text1"/>
+                <w:sz w:val="32"/>
+                <w:szCs w:val="32"/>
+                <w:lang w:eastAsia="it-IT"/>
+              </w:rPr>
+            </w:pPr>
+          </w:p>
+        </w:tc>
+        <w:tc>
+          <w:tcPr>
+            <w:tcW w:w="1365" w:type="dxa"/>
+            <w:vAlign w:val="center"/>
+          </w:tcPr>
+          <w:p>
+            <w:pPr>
+              <w:spacing w:line="330" w:lineRule="atLeast"/>
+              <w:jc w:val="center"/>
+              <w:rPr>
+                <w:rFonts w:ascii="Arial" w:eastAsia="Times New Roman" w:hAnsi="Arial" w:cs="Arial"/>
+                <w:b/>
+                <w:bCs/>
+                <w:color w:val="000000" w:themeColor="text1"/>
+                <w:sz w:val="24"/>
+                <w:szCs w:val="24"/>
+                <w:lang w:eastAsia="it-IT"/>
+              </w:rPr>
+            </w:pPr>
+          </w:p>
+        </w:tc>
+        <w:tc>
+          <w:tcPr>
+            <w:tcW w:w="1559" w:type="dxa"/>
+            <w:vAlign w:val="center"/>
+          </w:tcPr>
+          <w:p>
+            <w:pPr>
+              <w:spacing w:line="330" w:lineRule="atLeast"/>
+              <w:jc w:val="center"/>
+              <w:rPr>
+                <w:rFonts w:ascii="Arial" w:eastAsia="Times New Roman" w:hAnsi="Arial" w:cs="Arial"/>
+                <w:b/>
+                <w:bCs/>
+                <w:color w:val="000000" w:themeColor="text1"/>
+                <w:sz w:val="24"/>
+                <w:szCs w:val="24"/>
+                <w:lang w:eastAsia="it-IT"/>
+              </w:rPr>
+            </w:pPr>
+          </w:p>
+        </w:tc>
+        <w:tc>
+          <w:tcPr>
+            <w:tcW w:w="1276" w:type="dxa"/>
+            <w:vAlign w:val="center"/>
+          </w:tcPr>
+          <w:p>
+            <w:pPr>
+              <w:spacing w:line="330" w:lineRule="atLeast"/>
+              <w:jc w:val="center"/>
+              <w:rPr>
+                <w:rFonts w:ascii="Arial" w:eastAsia="Times New Roman" w:hAnsi="Arial" w:cs="Arial"/>
+                <w:b/>
+                <w:bCs/>
+                <w:color w:val="000000" w:themeColor="text1"/>
+                <w:sz w:val="24"/>
+                <w:szCs w:val="24"/>
+                <w:lang w:eastAsia="it-IT"/>
+              </w:rPr>
+            </w:pPr>
+          </w:p>
+        </w:tc>
+        <w:tc>
+          <w:tcPr>
+            <w:tcW w:w="4104" w:type="dxa"/>
+            <w:vAlign w:val="center"/>
+          </w:tcPr>
+          <w:p>
+            <w:pPr>
+              <w:spacing w:line="330" w:lineRule="atLeast"/>
+              <w:jc w:val="center"/>
+              <w:rPr>
+                <w:rFonts w:ascii="Arial" w:eastAsia="Times New Roman" w:hAnsi="Arial" w:cs="Arial"/>
+                <w:b/>
+                <w:bCs/>
+                <w:color w:val="000000" w:themeColor="text1"/>
+                <w:sz w:val="24"/>
+                <w:szCs w:val="24"/>
+                <w:lang w:eastAsia="it-IT"/>
+              </w:rPr>
+            </w:pPr>
+          </w:p>
+        </w:tc>
+      </w:tr>
+    </w:tbl>
+    <w:p>
+      <w:pPr>
+        <w:spacing w:after="0" w:line="330" w:lineRule="atLeast"/>
+        <w:rPr>
+          <w:rFonts w:ascii="Arial" w:eastAsia="Times New Roman" w:hAnsi="Arial" w:cs="Arial"/>
+          <w:color w:val="000000" w:themeColor="text1"/>
+          <w:sz w:val="24"/>
+          <w:szCs w:val="24"/>
+          <w:lang w:eastAsia="it-IT"/>
+        </w:rPr>
+      </w:pPr>
+    </w:p>
+    <w:p>
+      <w:pPr>
+        <w:spacing w:after="240" w:line="330" w:lineRule="atLeast"/>
+        <w:rPr>
+          <w:rFonts w:ascii="Arial" w:eastAsia="Times New Roman" w:hAnsi="Arial" w:cs="Arial"/>
+          <w:color w:val="000000" w:themeColor="text1"/>
+          <w:sz w:val="24"/>
+          <w:szCs w:val="24"/>
+          <w:lang w:eastAsia="it-IT"/>
+        </w:rPr>
+      </w:pPr>
+    </w:p>
+    <w:p>
+      <w:pPr>
+        <w:spacing w:after="0" w:line="330" w:lineRule="atLeast"/>
+        <w:jc w:val="center"/>
+        <w:rPr>
+          <w:rFonts w:ascii="Arial" w:eastAsia="Times New Roman" w:hAnsi="Arial" w:cs="Arial"/>
+          <w:b/>
+          <w:bCs/>
           <w:color w:val="000000" w:themeColor="text1"/>
           <w:sz w:val="28"/>
           <w:szCs w:val="28"/>
@@ -1985,13 +3476,13 @@
           <w:color w:val="000000" w:themeColor="text1"/>
           <w:sz w:val="24"/>
           <w:szCs w:val="24"/>
-          <w:lang w:eastAsia="it-IT"/>
-        </w:rPr>
-      </w:pPr>
-    </w:p>
-    <w:p>
-      <w:pPr>
-        <w:spacing w:after="0" w:line="330" w:lineRule="atLeast"/>
+          <w:u w:val="single"/>
+          <w:lang w:eastAsia="it-IT"/>
+        </w:rPr>
+      </w:pPr>
+    </w:p>
+    <w:p>
+      <w:pPr>
         <w:rPr>
           <w:rFonts w:ascii="Arial" w:eastAsia="Times New Roman" w:hAnsi="Arial" w:cs="Arial"/>
           <w:b/>
@@ -2068,7 +3559,6 @@
           <w:szCs w:val="20"/>
           <w:lang w:eastAsia="it-IT"/>
         </w:rPr>
-        <w:lastRenderedPageBreak/>
         <w:t>inizializza reset pin</w:t>
       </w:r>
     </w:p>
@@ -3472,7 +4962,7 @@
   <w:style w:type="paragraph" w:default="1" w:styleId="Normale">
     <w:name w:val="Normal"/>
     <w:qFormat/>
-    <w:rsid w:val="00077872"/>
+    <w:rsid w:val="0029255E"/>
   </w:style>
   <w:style w:type="paragraph" w:styleId="Titolo3">
     <w:name w:val="heading 3"/>
@@ -3581,6 +5071,25 @@
       <w:ind w:left="720"/>
       <w:contextualSpacing/>
     </w:pPr>
+  </w:style>
+  <w:style w:type="table" w:styleId="Grigliatabella">
+    <w:name w:val="Table Grid"/>
+    <w:basedOn w:val="Tabellanormale"/>
+    <w:uiPriority w:val="39"/>
+    <w:rsid w:val="009B79FF"/>
+    <w:pPr>
+      <w:spacing w:after="0" w:line="240" w:lineRule="auto"/>
+    </w:pPr>
+    <w:tblPr>
+      <w:tblBorders>
+        <w:top w:val="single" w:sz="4" w:space="0" w:color="auto"/>
+        <w:left w:val="single" w:sz="4" w:space="0" w:color="auto"/>
+        <w:bottom w:val="single" w:sz="4" w:space="0" w:color="auto"/>
+        <w:right w:val="single" w:sz="4" w:space="0" w:color="auto"/>
+        <w:insideH w:val="single" w:sz="4" w:space="0" w:color="auto"/>
+        <w:insideV w:val="single" w:sz="4" w:space="0" w:color="auto"/>
+      </w:tblBorders>
+    </w:tblPr>
   </w:style>
 </w:styles>
 </file>

</xml_diff>

<commit_message>
Parser 1.6 + Doc Editing
</commit_message>
<xml_diff>
--- a/SMS Manager for Power monitoring.docx
+++ b/SMS Manager for Power monitoring.docx
@@ -66,6 +66,7 @@
         </w:rPr>
         <w:t xml:space="preserve">  </w:t>
       </w:r>
+      <w:proofErr w:type="spellStart"/>
       <w:r>
         <w:rPr>
           <w:rFonts w:ascii="Arial" w:eastAsia="Times New Roman" w:hAnsi="Arial" w:cs="Arial"/>
@@ -76,28 +77,41 @@
           <w:szCs w:val="28"/>
           <w:lang w:val="en-US" w:eastAsia="it-IT"/>
         </w:rPr>
-        <w:t>Specifiche:</w:t>
-      </w:r>
-    </w:p>
-    <w:p>
-      <w:pPr>
-        <w:spacing w:after="0" w:line="330" w:lineRule="atLeast"/>
-        <w:rPr>
-          <w:rFonts w:ascii="Arial" w:eastAsia="Times New Roman" w:hAnsi="Arial" w:cs="Arial"/>
-          <w:color w:val="000000" w:themeColor="text1"/>
-          <w:sz w:val="24"/>
-          <w:szCs w:val="24"/>
-          <w:lang w:eastAsia="it-IT"/>
-        </w:rPr>
-      </w:pPr>
-      <w:r>
-        <w:rPr>
-          <w:rFonts w:ascii="Arial" w:eastAsia="Times New Roman" w:hAnsi="Arial" w:cs="Arial"/>
-          <w:color w:val="000000" w:themeColor="text1"/>
-          <w:sz w:val="24"/>
-          <w:szCs w:val="24"/>
+        <w:t>Specifiche</w:t>
+      </w:r>
+      <w:proofErr w:type="spellEnd"/>
+      <w:r>
+        <w:rPr>
+          <w:rFonts w:ascii="Arial" w:eastAsia="Times New Roman" w:hAnsi="Arial" w:cs="Arial"/>
+          <w:b/>
+          <w:bCs/>
+          <w:color w:val="000000" w:themeColor="text1"/>
+          <w:sz w:val="28"/>
+          <w:szCs w:val="28"/>
           <w:lang w:val="en-US" w:eastAsia="it-IT"/>
         </w:rPr>
+        <w:t>:</w:t>
+      </w:r>
+    </w:p>
+    <w:p>
+      <w:pPr>
+        <w:spacing w:after="0" w:line="330" w:lineRule="atLeast"/>
+        <w:rPr>
+          <w:rFonts w:ascii="Arial" w:eastAsia="Times New Roman" w:hAnsi="Arial" w:cs="Arial"/>
+          <w:color w:val="000000" w:themeColor="text1"/>
+          <w:sz w:val="24"/>
+          <w:szCs w:val="24"/>
+          <w:lang w:eastAsia="it-IT"/>
+        </w:rPr>
+      </w:pPr>
+      <w:r>
+        <w:rPr>
+          <w:rFonts w:ascii="Arial" w:eastAsia="Times New Roman" w:hAnsi="Arial" w:cs="Arial"/>
+          <w:color w:val="000000" w:themeColor="text1"/>
+          <w:sz w:val="24"/>
+          <w:szCs w:val="24"/>
+          <w:lang w:val="en-US" w:eastAsia="it-IT"/>
+        </w:rPr>
         <w:t xml:space="preserve">  </w:t>
       </w:r>
       <w:r>
@@ -130,7 +144,29 @@
           <w:szCs w:val="24"/>
           <w:lang w:eastAsia="it-IT"/>
         </w:rPr>
-        <w:t>  - OK    Reinizializzazione ogni 24 ore (ogni giorno) ad ora prestabilita</w:t>
+        <w:t>  - OK    </w:t>
+      </w:r>
+      <w:proofErr w:type="spellStart"/>
+      <w:r>
+        <w:rPr>
+          <w:rFonts w:ascii="Arial" w:eastAsia="Times New Roman" w:hAnsi="Arial" w:cs="Arial"/>
+          <w:color w:val="000000" w:themeColor="text1"/>
+          <w:sz w:val="24"/>
+          <w:szCs w:val="24"/>
+          <w:lang w:eastAsia="it-IT"/>
+        </w:rPr>
+        <w:t>Reinizializzazione</w:t>
+      </w:r>
+      <w:proofErr w:type="spellEnd"/>
+      <w:r>
+        <w:rPr>
+          <w:rFonts w:ascii="Arial" w:eastAsia="Times New Roman" w:hAnsi="Arial" w:cs="Arial"/>
+          <w:color w:val="000000" w:themeColor="text1"/>
+          <w:sz w:val="24"/>
+          <w:szCs w:val="24"/>
+          <w:lang w:eastAsia="it-IT"/>
+        </w:rPr>
+        <w:t xml:space="preserve"> ogni 24 ore (ogni giorno) ad ora prestabilita</w:t>
       </w:r>
     </w:p>
     <w:p>
@@ -265,6 +301,7 @@
         </w:rPr>
         <w:t xml:space="preserve">- OK </w:t>
       </w:r>
+      <w:proofErr w:type="gramStart"/>
       <w:r>
         <w:rPr>
           <w:rFonts w:ascii="Arial" w:eastAsia="Times New Roman" w:hAnsi="Arial" w:cs="Arial"/>
@@ -284,7 +321,18 @@
           <w:szCs w:val="24"/>
           <w:lang w:eastAsia="it-IT"/>
         </w:rPr>
-        <w:t>da Master</w:t>
+        <w:t>da</w:t>
+      </w:r>
+      <w:proofErr w:type="gramEnd"/>
+      <w:r>
+        <w:rPr>
+          <w:rFonts w:ascii="Arial" w:eastAsia="Times New Roman" w:hAnsi="Arial" w:cs="Arial"/>
+          <w:color w:val="000000" w:themeColor="text1"/>
+          <w:sz w:val="24"/>
+          <w:szCs w:val="24"/>
+          <w:lang w:eastAsia="it-IT"/>
+        </w:rPr>
+        <w:t xml:space="preserve"> Master</w:t>
       </w:r>
       <w:r>
         <w:rPr>
@@ -306,6 +354,7 @@
         </w:rPr>
         <w:t xml:space="preserve">Prevedere la richiesta SMS (CMD N) per vedere quanti e quali numeri </w:t>
       </w:r>
+      <w:proofErr w:type="gramStart"/>
       <w:r>
         <w:rPr>
           <w:rFonts w:ascii="Arial" w:eastAsia="Times New Roman" w:hAnsi="Arial" w:cs="Arial"/>
@@ -325,7 +374,18 @@
           <w:szCs w:val="24"/>
           <w:lang w:eastAsia="it-IT"/>
         </w:rPr>
-        <w:t xml:space="preserve">sono impostati + Messaggio SMS per richiedente non autorizzato </w:t>
+        <w:t>sono</w:t>
+      </w:r>
+      <w:proofErr w:type="gramEnd"/>
+      <w:r>
+        <w:rPr>
+          <w:rFonts w:ascii="Arial" w:eastAsia="Times New Roman" w:hAnsi="Arial" w:cs="Arial"/>
+          <w:color w:val="000000" w:themeColor="text1"/>
+          <w:sz w:val="24"/>
+          <w:szCs w:val="24"/>
+          <w:lang w:eastAsia="it-IT"/>
+        </w:rPr>
+        <w:t xml:space="preserve"> impostati + Messaggio SMS per richiedente non autorizzato </w:t>
       </w:r>
     </w:p>
     <w:p>
@@ -554,19 +614,19 @@
           <w:b/>
           <w:bCs/>
           <w:color w:val="000000" w:themeColor="text1"/>
-          <w:sz w:val="28"/>
-          <w:szCs w:val="28"/>
-          <w:lang w:eastAsia="it-IT"/>
-        </w:rPr>
-      </w:pPr>
-      <w:r>
-        <w:rPr>
-          <w:rFonts w:ascii="Arial" w:eastAsia="Times New Roman" w:hAnsi="Arial" w:cs="Arial"/>
-          <w:b/>
-          <w:bCs/>
-          <w:color w:val="000000" w:themeColor="text1"/>
-          <w:sz w:val="28"/>
-          <w:szCs w:val="28"/>
+          <w:sz w:val="32"/>
+          <w:szCs w:val="32"/>
+          <w:lang w:eastAsia="it-IT"/>
+        </w:rPr>
+      </w:pPr>
+      <w:r>
+        <w:rPr>
+          <w:rFonts w:ascii="Arial" w:eastAsia="Times New Roman" w:hAnsi="Arial" w:cs="Arial"/>
+          <w:b/>
+          <w:bCs/>
+          <w:color w:val="000000" w:themeColor="text1"/>
+          <w:sz w:val="32"/>
+          <w:szCs w:val="32"/>
           <w:lang w:eastAsia="it-IT"/>
         </w:rPr>
         <w:t>Scopo del codice</w:t>
@@ -614,18 +674,6 @@
           <w:color w:val="000000" w:themeColor="text1"/>
           <w:sz w:val="24"/>
           <w:szCs w:val="24"/>
-          <w:lang w:eastAsia="it-IT"/>
-        </w:rPr>
-      </w:pPr>
-    </w:p>
-    <w:p>
-      <w:pPr>
-        <w:spacing w:after="0" w:line="330" w:lineRule="atLeast"/>
-        <w:rPr>
-          <w:rFonts w:ascii="Arial" w:eastAsia="Times New Roman" w:hAnsi="Arial" w:cs="Arial"/>
-          <w:color w:val="000000" w:themeColor="text1"/>
-          <w:sz w:val="24"/>
-          <w:szCs w:val="24"/>
           <w:u w:val="single"/>
           <w:lang w:eastAsia="it-IT"/>
         </w:rPr>
@@ -639,7 +687,31 @@
           <w:u w:val="single"/>
           <w:lang w:eastAsia="it-IT"/>
         </w:rPr>
-        <w:t>Monitora la tensione di rete tramite un trasformatore e la libreria EmonLib.</w:t>
+        <w:t xml:space="preserve">Monitora la tensione di rete tramite un trasformatore e la libreria </w:t>
+      </w:r>
+      <w:proofErr w:type="spellStart"/>
+      <w:r>
+        <w:rPr>
+          <w:rFonts w:ascii="Arial" w:eastAsia="Times New Roman" w:hAnsi="Arial" w:cs="Arial"/>
+          <w:color w:val="000000" w:themeColor="text1"/>
+          <w:sz w:val="24"/>
+          <w:szCs w:val="24"/>
+          <w:u w:val="single"/>
+          <w:lang w:eastAsia="it-IT"/>
+        </w:rPr>
+        <w:t>EmonLib</w:t>
+      </w:r>
+      <w:proofErr w:type="spellEnd"/>
+      <w:r>
+        <w:rPr>
+          <w:rFonts w:ascii="Arial" w:eastAsia="Times New Roman" w:hAnsi="Arial" w:cs="Arial"/>
+          <w:color w:val="000000" w:themeColor="text1"/>
+          <w:sz w:val="24"/>
+          <w:szCs w:val="24"/>
+          <w:u w:val="single"/>
+          <w:lang w:eastAsia="it-IT"/>
+        </w:rPr>
+        <w:t>.</w:t>
       </w:r>
     </w:p>
     <w:p>
@@ -680,6 +752,100 @@
     <w:p>
       <w:pPr>
         <w:spacing w:after="0" w:line="330" w:lineRule="atLeast"/>
+        <w:ind w:left="1416"/>
+        <w:rPr>
+          <w:rFonts w:ascii="Arial" w:eastAsia="Times New Roman" w:hAnsi="Arial" w:cs="Arial"/>
+          <w:color w:val="000000" w:themeColor="text1"/>
+          <w:sz w:val="24"/>
+          <w:szCs w:val="24"/>
+          <w:lang w:eastAsia="it-IT"/>
+        </w:rPr>
+      </w:pPr>
+      <w:r>
+        <w:rPr>
+          <w:rFonts w:ascii="Arial" w:eastAsia="Times New Roman" w:hAnsi="Arial" w:cs="Arial"/>
+          <w:color w:val="000000" w:themeColor="text1"/>
+          <w:sz w:val="24"/>
+          <w:szCs w:val="24"/>
+          <w:lang w:eastAsia="it-IT"/>
+        </w:rPr>
+        <w:t>- Mancanza di rete (tensione &lt; 180V)</w:t>
+      </w:r>
+    </w:p>
+    <w:p>
+      <w:pPr>
+        <w:spacing w:after="0" w:line="330" w:lineRule="atLeast"/>
+        <w:ind w:left="1416"/>
+        <w:rPr>
+          <w:rFonts w:ascii="Arial" w:eastAsia="Times New Roman" w:hAnsi="Arial" w:cs="Arial"/>
+          <w:color w:val="000000" w:themeColor="text1"/>
+          <w:sz w:val="24"/>
+          <w:szCs w:val="24"/>
+          <w:lang w:eastAsia="it-IT"/>
+        </w:rPr>
+      </w:pPr>
+      <w:r>
+        <w:rPr>
+          <w:rFonts w:ascii="Arial" w:eastAsia="Times New Roman" w:hAnsi="Arial" w:cs="Arial"/>
+          <w:color w:val="000000" w:themeColor="text1"/>
+          <w:sz w:val="24"/>
+          <w:szCs w:val="24"/>
+          <w:lang w:eastAsia="it-IT"/>
+        </w:rPr>
+        <w:t>- Ripresa rete (tensione &gt; 200V)</w:t>
+      </w:r>
+    </w:p>
+    <w:p>
+      <w:pPr>
+        <w:spacing w:after="0" w:line="330" w:lineRule="atLeast"/>
+        <w:rPr>
+          <w:rFonts w:ascii="Arial" w:eastAsia="Times New Roman" w:hAnsi="Arial" w:cs="Arial"/>
+          <w:color w:val="000000" w:themeColor="text1"/>
+          <w:sz w:val="24"/>
+          <w:szCs w:val="24"/>
+          <w:lang w:eastAsia="it-IT"/>
+        </w:rPr>
+      </w:pPr>
+    </w:p>
+    <w:p>
+      <w:pPr>
+        <w:spacing w:after="0" w:line="330" w:lineRule="atLeast"/>
+        <w:rPr>
+          <w:rFonts w:ascii="Arial" w:eastAsia="Times New Roman" w:hAnsi="Arial" w:cs="Arial"/>
+          <w:color w:val="000000" w:themeColor="text1"/>
+          <w:sz w:val="24"/>
+          <w:szCs w:val="24"/>
+          <w:u w:val="single"/>
+          <w:lang w:eastAsia="it-IT"/>
+        </w:rPr>
+      </w:pPr>
+      <w:r>
+        <w:rPr>
+          <w:rFonts w:ascii="Arial" w:eastAsia="Times New Roman" w:hAnsi="Arial" w:cs="Arial"/>
+          <w:color w:val="000000" w:themeColor="text1"/>
+          <w:sz w:val="24"/>
+          <w:szCs w:val="24"/>
+          <w:u w:val="single"/>
+          <w:lang w:eastAsia="it-IT"/>
+        </w:rPr>
+        <w:t>Gestisce comandi via SMS:</w:t>
+      </w:r>
+    </w:p>
+    <w:p>
+      <w:pPr>
+        <w:spacing w:after="0" w:line="330" w:lineRule="atLeast"/>
+        <w:rPr>
+          <w:rFonts w:ascii="Arial" w:eastAsia="Times New Roman" w:hAnsi="Arial" w:cs="Arial"/>
+          <w:color w:val="000000" w:themeColor="text1"/>
+          <w:sz w:val="24"/>
+          <w:szCs w:val="24"/>
+          <w:lang w:eastAsia="it-IT"/>
+        </w:rPr>
+      </w:pPr>
+    </w:p>
+    <w:p>
+      <w:pPr>
+        <w:spacing w:after="0" w:line="330" w:lineRule="atLeast"/>
         <w:ind w:left="708"/>
         <w:rPr>
           <w:rFonts w:ascii="Arial" w:eastAsia="Times New Roman" w:hAnsi="Arial" w:cs="Arial"/>
@@ -689,6 +855,40 @@
           <w:lang w:eastAsia="it-IT"/>
         </w:rPr>
       </w:pPr>
+      <w:r>
+        <w:rPr>
+          <w:rFonts w:ascii="Arial" w:eastAsia="Times New Roman" w:hAnsi="Arial" w:cs="Arial"/>
+          <w:color w:val="000000" w:themeColor="text1"/>
+          <w:sz w:val="24"/>
+          <w:szCs w:val="24"/>
+          <w:lang w:eastAsia="it-IT"/>
+        </w:rPr>
+        <w:t xml:space="preserve">- </w:t>
+      </w:r>
+      <w:proofErr w:type="spellStart"/>
+      <w:r>
+        <w:rPr>
+          <w:rFonts w:ascii="Arial" w:eastAsia="Times New Roman" w:hAnsi="Arial" w:cs="Arial"/>
+          <w:b/>
+          <w:bCs/>
+          <w:color w:val="000000" w:themeColor="text1"/>
+          <w:sz w:val="24"/>
+          <w:szCs w:val="24"/>
+          <w:lang w:eastAsia="it-IT"/>
+        </w:rPr>
+        <w:t>M+numero</w:t>
+      </w:r>
+      <w:proofErr w:type="spellEnd"/>
+      <w:r>
+        <w:rPr>
+          <w:rFonts w:ascii="Arial" w:eastAsia="Times New Roman" w:hAnsi="Arial" w:cs="Arial"/>
+          <w:color w:val="000000" w:themeColor="text1"/>
+          <w:sz w:val="24"/>
+          <w:szCs w:val="24"/>
+          <w:lang w:eastAsia="it-IT"/>
+        </w:rPr>
+        <w:t xml:space="preserve"> → Modifica numero Master</w:t>
+      </w:r>
     </w:p>
     <w:p>
       <w:pPr>
@@ -696,21 +896,73 @@
         <w:ind w:left="708"/>
         <w:rPr>
           <w:rFonts w:ascii="Arial" w:eastAsia="Times New Roman" w:hAnsi="Arial" w:cs="Arial"/>
-          <w:color w:val="000000" w:themeColor="text1"/>
-          <w:sz w:val="24"/>
-          <w:szCs w:val="24"/>
-          <w:lang w:eastAsia="it-IT"/>
-        </w:rPr>
-      </w:pPr>
-      <w:r>
-        <w:rPr>
-          <w:rFonts w:ascii="Arial" w:eastAsia="Times New Roman" w:hAnsi="Arial" w:cs="Arial"/>
-          <w:color w:val="000000" w:themeColor="text1"/>
-          <w:sz w:val="24"/>
-          <w:szCs w:val="24"/>
-          <w:lang w:eastAsia="it-IT"/>
-        </w:rPr>
-        <w:t>- Mancanza di rete (tensione &lt; 180V)</w:t>
+          <w:b/>
+          <w:bCs/>
+          <w:color w:val="00B050"/>
+          <w:sz w:val="24"/>
+          <w:szCs w:val="24"/>
+          <w:lang w:eastAsia="it-IT"/>
+        </w:rPr>
+      </w:pPr>
+      <w:r>
+        <w:rPr>
+          <w:rFonts w:ascii="Arial" w:eastAsia="Times New Roman" w:hAnsi="Arial" w:cs="Arial"/>
+          <w:b/>
+          <w:bCs/>
+          <w:color w:val="00B050"/>
+          <w:sz w:val="24"/>
+          <w:szCs w:val="24"/>
+          <w:lang w:eastAsia="it-IT"/>
+        </w:rPr>
+        <w:t xml:space="preserve"> - </w:t>
+      </w:r>
+      <w:r>
+        <w:rPr>
+          <w:rFonts w:ascii="Arial" w:eastAsia="Times New Roman" w:hAnsi="Arial" w:cs="Arial"/>
+          <w:b/>
+          <w:bCs/>
+          <w:color w:val="00B050"/>
+          <w:sz w:val="24"/>
+          <w:szCs w:val="24"/>
+          <w:lang w:eastAsia="it-IT"/>
+        </w:rPr>
+        <w:t>S</w:t>
+      </w:r>
+      <w:r>
+        <w:rPr>
+          <w:rFonts w:ascii="Arial" w:eastAsia="Times New Roman" w:hAnsi="Arial" w:cs="Arial"/>
+          <w:b/>
+          <w:bCs/>
+          <w:color w:val="00B050"/>
+          <w:sz w:val="24"/>
+          <w:szCs w:val="24"/>
+          <w:lang w:eastAsia="it-IT"/>
+        </w:rPr>
+        <w:t xml:space="preserve">olo se numero </w:t>
+      </w:r>
+      <w:r>
+        <w:rPr>
+          <w:rFonts w:ascii="Arial" w:eastAsia="Times New Roman" w:hAnsi="Arial" w:cs="Arial"/>
+          <w:b/>
+          <w:bCs/>
+          <w:color w:val="00B050"/>
+          <w:sz w:val="24"/>
+          <w:szCs w:val="24"/>
+          <w:lang w:eastAsia="it-IT"/>
+        </w:rPr>
+        <w:t>M</w:t>
+      </w:r>
+      <w:r>
+        <w:rPr>
+          <w:rFonts w:ascii="Arial" w:eastAsia="Times New Roman" w:hAnsi="Arial" w:cs="Arial"/>
+          <w:b/>
+          <w:bCs/>
+          <w:color w:val="00B050"/>
+          <w:sz w:val="24"/>
+          <w:szCs w:val="24"/>
+          <w:lang w:eastAsia="it-IT"/>
+        </w:rPr>
+        <w:t>aster o nessun numero</w:t>
       </w:r>
     </w:p>
     <w:p>
@@ -719,12 +971,62 @@
         <w:ind w:left="708"/>
         <w:rPr>
           <w:rFonts w:ascii="Arial" w:eastAsia="Times New Roman" w:hAnsi="Arial" w:cs="Arial"/>
-          <w:color w:val="000000" w:themeColor="text1"/>
-          <w:sz w:val="24"/>
-          <w:szCs w:val="24"/>
-          <w:lang w:eastAsia="it-IT"/>
-        </w:rPr>
-      </w:pPr>
+          <w:b/>
+          <w:bCs/>
+          <w:color w:val="00B050"/>
+          <w:sz w:val="24"/>
+          <w:szCs w:val="24"/>
+          <w:lang w:eastAsia="it-IT"/>
+        </w:rPr>
+      </w:pPr>
+      <w:r>
+        <w:rPr>
+          <w:rFonts w:ascii="Arial" w:eastAsia="Times New Roman" w:hAnsi="Arial" w:cs="Arial"/>
+          <w:b/>
+          <w:bCs/>
+          <w:color w:val="00B050"/>
+          <w:sz w:val="24"/>
+          <w:szCs w:val="24"/>
+          <w:lang w:eastAsia="it-IT"/>
+        </w:rPr>
+        <w:t xml:space="preserve"> </w:t>
+      </w:r>
+      <w:r>
+        <w:rPr>
+          <w:rFonts w:ascii="Arial" w:eastAsia="Times New Roman" w:hAnsi="Arial" w:cs="Arial"/>
+          <w:b/>
+          <w:bCs/>
+          <w:color w:val="00B050"/>
+          <w:sz w:val="24"/>
+          <w:szCs w:val="24"/>
+          <w:lang w:eastAsia="it-IT"/>
+        </w:rPr>
+        <w:t xml:space="preserve">- </w:t>
+      </w:r>
+      <w:r>
+        <w:rPr>
+          <w:rFonts w:ascii="Arial" w:eastAsia="Times New Roman" w:hAnsi="Arial" w:cs="Arial"/>
+          <w:b/>
+          <w:bCs/>
+          <w:color w:val="00B050"/>
+          <w:sz w:val="24"/>
+          <w:szCs w:val="24"/>
+          <w:lang w:eastAsia="it-IT"/>
+        </w:rPr>
+        <w:t>V</w:t>
+      </w:r>
+      <w:r>
+        <w:rPr>
+          <w:rFonts w:ascii="Arial" w:eastAsia="Times New Roman" w:hAnsi="Arial" w:cs="Arial"/>
+          <w:b/>
+          <w:bCs/>
+          <w:color w:val="00B050"/>
+          <w:sz w:val="24"/>
+          <w:szCs w:val="24"/>
+          <w:lang w:eastAsia="it-IT"/>
+        </w:rPr>
+        <w:t>alida il numero richiedente se lunghezza numero è compresa tra 10 e 13</w:t>
+      </w:r>
     </w:p>
     <w:p>
       <w:pPr>
@@ -738,32 +1040,789 @@
           <w:lang w:eastAsia="it-IT"/>
         </w:rPr>
       </w:pPr>
-      <w:r>
-        <w:rPr>
-          <w:rFonts w:ascii="Arial" w:eastAsia="Times New Roman" w:hAnsi="Arial" w:cs="Arial"/>
-          <w:color w:val="000000" w:themeColor="text1"/>
-          <w:sz w:val="24"/>
-          <w:szCs w:val="24"/>
-          <w:lang w:eastAsia="it-IT"/>
-        </w:rPr>
-        <w:t>- Ripresa rete (tensione &gt; 200V)</w:t>
-      </w:r>
-    </w:p>
-    <w:p>
-      <w:pPr>
-        <w:spacing w:after="0" w:line="330" w:lineRule="atLeast"/>
-        <w:rPr>
-          <w:rFonts w:ascii="Arial" w:eastAsia="Times New Roman" w:hAnsi="Arial" w:cs="Arial"/>
-          <w:color w:val="000000" w:themeColor="text1"/>
-          <w:sz w:val="24"/>
-          <w:szCs w:val="24"/>
-          <w:lang w:eastAsia="it-IT"/>
-        </w:rPr>
-      </w:pPr>
-    </w:p>
-    <w:p>
-      <w:pPr>
-        <w:spacing w:after="0" w:line="330" w:lineRule="atLeast"/>
+    </w:p>
+    <w:p>
+      <w:pPr>
+        <w:spacing w:after="0" w:line="330" w:lineRule="atLeast"/>
+        <w:ind w:left="708"/>
+        <w:rPr>
+          <w:rFonts w:ascii="Arial" w:eastAsia="Times New Roman" w:hAnsi="Arial" w:cs="Arial"/>
+          <w:color w:val="000000" w:themeColor="text1"/>
+          <w:sz w:val="24"/>
+          <w:szCs w:val="24"/>
+          <w:lang w:eastAsia="it-IT"/>
+        </w:rPr>
+      </w:pPr>
+    </w:p>
+    <w:p>
+      <w:pPr>
+        <w:spacing w:after="0" w:line="330" w:lineRule="atLeast"/>
+        <w:ind w:left="708"/>
+        <w:rPr>
+          <w:rFonts w:ascii="Arial" w:eastAsia="Times New Roman" w:hAnsi="Arial" w:cs="Arial"/>
+          <w:color w:val="000000" w:themeColor="text1"/>
+          <w:sz w:val="24"/>
+          <w:szCs w:val="24"/>
+          <w:lang w:eastAsia="it-IT"/>
+        </w:rPr>
+      </w:pPr>
+      <w:r>
+        <w:rPr>
+          <w:rFonts w:ascii="Arial" w:eastAsia="Times New Roman" w:hAnsi="Arial" w:cs="Arial"/>
+          <w:color w:val="000000" w:themeColor="text1"/>
+          <w:sz w:val="24"/>
+          <w:szCs w:val="24"/>
+          <w:lang w:eastAsia="it-IT"/>
+        </w:rPr>
+        <w:t xml:space="preserve">- </w:t>
+      </w:r>
+      <w:r>
+        <w:rPr>
+          <w:rFonts w:ascii="Arial" w:eastAsia="Times New Roman" w:hAnsi="Arial" w:cs="Arial"/>
+          <w:b/>
+          <w:bCs/>
+          <w:color w:val="000000" w:themeColor="text1"/>
+          <w:sz w:val="24"/>
+          <w:szCs w:val="24"/>
+          <w:lang w:eastAsia="it-IT"/>
+        </w:rPr>
+        <w:t>A[n]+numero</w:t>
+      </w:r>
+      <w:r>
+        <w:rPr>
+          <w:rFonts w:ascii="Arial" w:eastAsia="Times New Roman" w:hAnsi="Arial" w:cs="Arial"/>
+          <w:color w:val="000000" w:themeColor="text1"/>
+          <w:sz w:val="24"/>
+          <w:szCs w:val="24"/>
+          <w:lang w:eastAsia="it-IT"/>
+        </w:rPr>
+        <w:t xml:space="preserve"> → Aggiunge/Sostituisce numero ausiliario</w:t>
+      </w:r>
+    </w:p>
+    <w:p>
+      <w:pPr>
+        <w:spacing w:after="0" w:line="330" w:lineRule="atLeast"/>
+        <w:ind w:left="708"/>
+        <w:rPr>
+          <w:rFonts w:ascii="Arial" w:eastAsia="Times New Roman" w:hAnsi="Arial" w:cs="Arial"/>
+          <w:b/>
+          <w:bCs/>
+          <w:color w:val="00B050"/>
+          <w:sz w:val="24"/>
+          <w:szCs w:val="24"/>
+          <w:lang w:eastAsia="it-IT"/>
+        </w:rPr>
+      </w:pPr>
+      <w:r>
+        <w:rPr>
+          <w:rFonts w:ascii="Arial" w:eastAsia="Times New Roman" w:hAnsi="Arial" w:cs="Arial"/>
+          <w:b/>
+          <w:bCs/>
+          <w:color w:val="00B050"/>
+          <w:sz w:val="24"/>
+          <w:szCs w:val="24"/>
+          <w:lang w:eastAsia="it-IT"/>
+        </w:rPr>
+        <w:t xml:space="preserve">- </w:t>
+      </w:r>
+      <w:r>
+        <w:rPr>
+          <w:rFonts w:ascii="Arial" w:eastAsia="Times New Roman" w:hAnsi="Arial" w:cs="Arial"/>
+          <w:b/>
+          <w:bCs/>
+          <w:color w:val="00B050"/>
+          <w:sz w:val="24"/>
+          <w:szCs w:val="24"/>
+          <w:lang w:eastAsia="it-IT"/>
+        </w:rPr>
+        <w:t>S</w:t>
+      </w:r>
+      <w:r>
+        <w:rPr>
+          <w:rFonts w:ascii="Arial" w:eastAsia="Times New Roman" w:hAnsi="Arial" w:cs="Arial"/>
+          <w:b/>
+          <w:bCs/>
+          <w:color w:val="00B050"/>
+          <w:sz w:val="24"/>
+          <w:szCs w:val="24"/>
+          <w:lang w:eastAsia="it-IT"/>
+        </w:rPr>
+        <w:t xml:space="preserve">olo se numero </w:t>
+      </w:r>
+      <w:r>
+        <w:rPr>
+          <w:rFonts w:ascii="Arial" w:eastAsia="Times New Roman" w:hAnsi="Arial" w:cs="Arial"/>
+          <w:b/>
+          <w:bCs/>
+          <w:color w:val="00B050"/>
+          <w:sz w:val="24"/>
+          <w:szCs w:val="24"/>
+          <w:lang w:eastAsia="it-IT"/>
+        </w:rPr>
+        <w:t>M</w:t>
+      </w:r>
+      <w:r>
+        <w:rPr>
+          <w:rFonts w:ascii="Arial" w:eastAsia="Times New Roman" w:hAnsi="Arial" w:cs="Arial"/>
+          <w:b/>
+          <w:bCs/>
+          <w:color w:val="00B050"/>
+          <w:sz w:val="24"/>
+          <w:szCs w:val="24"/>
+          <w:lang w:eastAsia="it-IT"/>
+        </w:rPr>
+        <w:t>aster</w:t>
+      </w:r>
+    </w:p>
+    <w:p>
+      <w:pPr>
+        <w:spacing w:after="0" w:line="330" w:lineRule="atLeast"/>
+        <w:ind w:left="708"/>
+        <w:rPr>
+          <w:rFonts w:ascii="Arial" w:eastAsia="Times New Roman" w:hAnsi="Arial" w:cs="Arial"/>
+          <w:b/>
+          <w:bCs/>
+          <w:color w:val="00B050"/>
+          <w:sz w:val="24"/>
+          <w:szCs w:val="24"/>
+          <w:lang w:eastAsia="it-IT"/>
+        </w:rPr>
+      </w:pPr>
+      <w:r>
+        <w:rPr>
+          <w:rFonts w:ascii="Arial" w:eastAsia="Times New Roman" w:hAnsi="Arial" w:cs="Arial"/>
+          <w:b/>
+          <w:bCs/>
+          <w:color w:val="00B050"/>
+          <w:sz w:val="24"/>
+          <w:szCs w:val="24"/>
+          <w:lang w:eastAsia="it-IT"/>
+        </w:rPr>
+        <w:t xml:space="preserve">- </w:t>
+      </w:r>
+      <w:r>
+        <w:rPr>
+          <w:rFonts w:ascii="Arial" w:eastAsia="Times New Roman" w:hAnsi="Arial" w:cs="Arial"/>
+          <w:b/>
+          <w:bCs/>
+          <w:color w:val="00B050"/>
+          <w:sz w:val="24"/>
+          <w:szCs w:val="24"/>
+          <w:lang w:eastAsia="it-IT"/>
+        </w:rPr>
+        <w:t>V</w:t>
+      </w:r>
+      <w:r>
+        <w:rPr>
+          <w:rFonts w:ascii="Arial" w:eastAsia="Times New Roman" w:hAnsi="Arial" w:cs="Arial"/>
+          <w:b/>
+          <w:bCs/>
+          <w:color w:val="00B050"/>
+          <w:sz w:val="24"/>
+          <w:szCs w:val="24"/>
+          <w:lang w:eastAsia="it-IT"/>
+        </w:rPr>
+        <w:t>alida il numero richiedente se lunghezza numero è compresa tra 10 e 13</w:t>
+      </w:r>
+    </w:p>
+    <w:p>
+      <w:pPr>
+        <w:spacing w:after="0" w:line="330" w:lineRule="atLeast"/>
+        <w:ind w:left="708"/>
+        <w:rPr>
+          <w:rFonts w:ascii="Arial" w:eastAsia="Times New Roman" w:hAnsi="Arial" w:cs="Arial"/>
+          <w:color w:val="000000" w:themeColor="text1"/>
+          <w:sz w:val="24"/>
+          <w:szCs w:val="24"/>
+          <w:lang w:eastAsia="it-IT"/>
+        </w:rPr>
+      </w:pPr>
+    </w:p>
+    <w:p>
+      <w:pPr>
+        <w:spacing w:after="0" w:line="330" w:lineRule="atLeast"/>
+        <w:ind w:left="708"/>
+        <w:rPr>
+          <w:rFonts w:ascii="Arial" w:eastAsia="Times New Roman" w:hAnsi="Arial" w:cs="Arial"/>
+          <w:color w:val="000000" w:themeColor="text1"/>
+          <w:sz w:val="24"/>
+          <w:szCs w:val="24"/>
+          <w:lang w:eastAsia="it-IT"/>
+        </w:rPr>
+      </w:pPr>
+      <w:r>
+        <w:rPr>
+          <w:rFonts w:ascii="Arial" w:eastAsia="Times New Roman" w:hAnsi="Arial" w:cs="Arial"/>
+          <w:color w:val="000000" w:themeColor="text1"/>
+          <w:sz w:val="24"/>
+          <w:szCs w:val="24"/>
+          <w:lang w:eastAsia="it-IT"/>
+        </w:rPr>
+        <w:t xml:space="preserve">- </w:t>
+      </w:r>
+      <w:r>
+        <w:rPr>
+          <w:rFonts w:ascii="Arial" w:eastAsia="Times New Roman" w:hAnsi="Arial" w:cs="Arial"/>
+          <w:b/>
+          <w:bCs/>
+          <w:color w:val="000000" w:themeColor="text1"/>
+          <w:sz w:val="24"/>
+          <w:szCs w:val="24"/>
+          <w:lang w:eastAsia="it-IT"/>
+        </w:rPr>
+        <w:t>D</w:t>
+      </w:r>
+      <w:r>
+        <w:rPr>
+          <w:rFonts w:ascii="Arial" w:eastAsia="Times New Roman" w:hAnsi="Arial" w:cs="Arial"/>
+          <w:color w:val="000000" w:themeColor="text1"/>
+          <w:sz w:val="24"/>
+          <w:szCs w:val="24"/>
+          <w:lang w:eastAsia="it-IT"/>
+        </w:rPr>
+        <w:t xml:space="preserve"> → Cancella numeri ausiliari</w:t>
+      </w:r>
+    </w:p>
+    <w:p>
+      <w:pPr>
+        <w:spacing w:after="0" w:line="330" w:lineRule="atLeast"/>
+        <w:ind w:left="708"/>
+        <w:rPr>
+          <w:rFonts w:ascii="Arial" w:eastAsia="Times New Roman" w:hAnsi="Arial" w:cs="Arial"/>
+          <w:b/>
+          <w:bCs/>
+          <w:color w:val="00B050"/>
+          <w:sz w:val="24"/>
+          <w:szCs w:val="24"/>
+          <w:lang w:eastAsia="it-IT"/>
+        </w:rPr>
+      </w:pPr>
+      <w:r>
+        <w:rPr>
+          <w:rFonts w:ascii="Arial" w:eastAsia="Times New Roman" w:hAnsi="Arial" w:cs="Arial"/>
+          <w:b/>
+          <w:bCs/>
+          <w:color w:val="00B050"/>
+          <w:sz w:val="24"/>
+          <w:szCs w:val="24"/>
+          <w:lang w:eastAsia="it-IT"/>
+        </w:rPr>
+        <w:t xml:space="preserve">- </w:t>
+      </w:r>
+      <w:r>
+        <w:rPr>
+          <w:rFonts w:ascii="Arial" w:eastAsia="Times New Roman" w:hAnsi="Arial" w:cs="Arial"/>
+          <w:b/>
+          <w:bCs/>
+          <w:color w:val="00B050"/>
+          <w:sz w:val="24"/>
+          <w:szCs w:val="24"/>
+          <w:lang w:eastAsia="it-IT"/>
+        </w:rPr>
+        <w:t>S</w:t>
+      </w:r>
+      <w:r>
+        <w:rPr>
+          <w:rFonts w:ascii="Arial" w:eastAsia="Times New Roman" w:hAnsi="Arial" w:cs="Arial"/>
+          <w:b/>
+          <w:bCs/>
+          <w:color w:val="00B050"/>
+          <w:sz w:val="24"/>
+          <w:szCs w:val="24"/>
+          <w:lang w:eastAsia="it-IT"/>
+        </w:rPr>
+        <w:t xml:space="preserve">olo se numero </w:t>
+      </w:r>
+      <w:r>
+        <w:rPr>
+          <w:rFonts w:ascii="Arial" w:eastAsia="Times New Roman" w:hAnsi="Arial" w:cs="Arial"/>
+          <w:b/>
+          <w:bCs/>
+          <w:color w:val="00B050"/>
+          <w:sz w:val="24"/>
+          <w:szCs w:val="24"/>
+          <w:lang w:eastAsia="it-IT"/>
+        </w:rPr>
+        <w:t>M</w:t>
+      </w:r>
+      <w:r>
+        <w:rPr>
+          <w:rFonts w:ascii="Arial" w:eastAsia="Times New Roman" w:hAnsi="Arial" w:cs="Arial"/>
+          <w:b/>
+          <w:bCs/>
+          <w:color w:val="00B050"/>
+          <w:sz w:val="24"/>
+          <w:szCs w:val="24"/>
+          <w:lang w:eastAsia="it-IT"/>
+        </w:rPr>
+        <w:t>aster</w:t>
+      </w:r>
+    </w:p>
+    <w:p>
+      <w:pPr>
+        <w:spacing w:after="0" w:line="330" w:lineRule="atLeast"/>
+        <w:ind w:left="708"/>
+        <w:rPr>
+          <w:rFonts w:ascii="Arial" w:eastAsia="Times New Roman" w:hAnsi="Arial" w:cs="Arial"/>
+          <w:color w:val="000000" w:themeColor="text1"/>
+          <w:sz w:val="24"/>
+          <w:szCs w:val="24"/>
+          <w:lang w:eastAsia="it-IT"/>
+        </w:rPr>
+      </w:pPr>
+    </w:p>
+    <w:p>
+      <w:pPr>
+        <w:spacing w:after="0" w:line="330" w:lineRule="atLeast"/>
+        <w:ind w:left="708"/>
+        <w:rPr>
+          <w:rFonts w:ascii="Arial" w:eastAsia="Times New Roman" w:hAnsi="Arial" w:cs="Arial"/>
+          <w:color w:val="000000" w:themeColor="text1"/>
+          <w:sz w:val="24"/>
+          <w:szCs w:val="24"/>
+          <w:lang w:eastAsia="it-IT"/>
+        </w:rPr>
+      </w:pPr>
+      <w:r>
+        <w:rPr>
+          <w:rFonts w:ascii="Arial" w:eastAsia="Times New Roman" w:hAnsi="Arial" w:cs="Arial"/>
+          <w:color w:val="000000" w:themeColor="text1"/>
+          <w:sz w:val="24"/>
+          <w:szCs w:val="24"/>
+          <w:lang w:eastAsia="it-IT"/>
+        </w:rPr>
+        <w:t xml:space="preserve">- </w:t>
+      </w:r>
+      <w:r>
+        <w:rPr>
+          <w:rFonts w:ascii="Arial" w:eastAsia="Times New Roman" w:hAnsi="Arial" w:cs="Arial"/>
+          <w:b/>
+          <w:bCs/>
+          <w:color w:val="000000" w:themeColor="text1"/>
+          <w:sz w:val="24"/>
+          <w:szCs w:val="24"/>
+          <w:lang w:eastAsia="it-IT"/>
+        </w:rPr>
+        <w:t>N</w:t>
+      </w:r>
+      <w:r>
+        <w:rPr>
+          <w:rFonts w:ascii="Arial" w:eastAsia="Times New Roman" w:hAnsi="Arial" w:cs="Arial"/>
+          <w:color w:val="000000" w:themeColor="text1"/>
+          <w:sz w:val="24"/>
+          <w:szCs w:val="24"/>
+          <w:lang w:eastAsia="it-IT"/>
+        </w:rPr>
+        <w:t xml:space="preserve"> → Elenca numeri autorizzati</w:t>
+      </w:r>
+    </w:p>
+    <w:p>
+      <w:pPr>
+        <w:spacing w:after="0" w:line="330" w:lineRule="atLeast"/>
+        <w:ind w:left="708"/>
+        <w:rPr>
+          <w:rFonts w:ascii="Arial" w:eastAsia="Times New Roman" w:hAnsi="Arial" w:cs="Arial"/>
+          <w:b/>
+          <w:bCs/>
+          <w:color w:val="00B050"/>
+          <w:sz w:val="24"/>
+          <w:szCs w:val="24"/>
+          <w:lang w:eastAsia="it-IT"/>
+        </w:rPr>
+      </w:pPr>
+      <w:r>
+        <w:rPr>
+          <w:rFonts w:ascii="Arial" w:eastAsia="Times New Roman" w:hAnsi="Arial" w:cs="Arial"/>
+          <w:b/>
+          <w:bCs/>
+          <w:color w:val="00B050"/>
+          <w:sz w:val="24"/>
+          <w:szCs w:val="24"/>
+          <w:lang w:eastAsia="it-IT"/>
+        </w:rPr>
+        <w:t xml:space="preserve">- </w:t>
+      </w:r>
+      <w:r>
+        <w:rPr>
+          <w:rFonts w:ascii="Arial" w:eastAsia="Times New Roman" w:hAnsi="Arial" w:cs="Arial"/>
+          <w:b/>
+          <w:bCs/>
+          <w:color w:val="00B050"/>
+          <w:sz w:val="24"/>
+          <w:szCs w:val="24"/>
+          <w:lang w:eastAsia="it-IT"/>
+        </w:rPr>
+        <w:t>S</w:t>
+      </w:r>
+      <w:r>
+        <w:rPr>
+          <w:rFonts w:ascii="Arial" w:eastAsia="Times New Roman" w:hAnsi="Arial" w:cs="Arial"/>
+          <w:b/>
+          <w:bCs/>
+          <w:color w:val="00B050"/>
+          <w:sz w:val="24"/>
+          <w:szCs w:val="24"/>
+          <w:lang w:eastAsia="it-IT"/>
+        </w:rPr>
+        <w:t xml:space="preserve">olo se numero </w:t>
+      </w:r>
+      <w:r>
+        <w:rPr>
+          <w:rFonts w:ascii="Arial" w:eastAsia="Times New Roman" w:hAnsi="Arial" w:cs="Arial"/>
+          <w:b/>
+          <w:bCs/>
+          <w:color w:val="00B050"/>
+          <w:sz w:val="24"/>
+          <w:szCs w:val="24"/>
+          <w:lang w:eastAsia="it-IT"/>
+        </w:rPr>
+        <w:t>M</w:t>
+      </w:r>
+      <w:r>
+        <w:rPr>
+          <w:rFonts w:ascii="Arial" w:eastAsia="Times New Roman" w:hAnsi="Arial" w:cs="Arial"/>
+          <w:b/>
+          <w:bCs/>
+          <w:color w:val="00B050"/>
+          <w:sz w:val="24"/>
+          <w:szCs w:val="24"/>
+          <w:lang w:eastAsia="it-IT"/>
+        </w:rPr>
+        <w:t>aster</w:t>
+      </w:r>
+    </w:p>
+    <w:p>
+      <w:pPr>
+        <w:spacing w:after="0" w:line="330" w:lineRule="atLeast"/>
+        <w:ind w:left="708"/>
+        <w:rPr>
+          <w:rFonts w:ascii="Arial" w:eastAsia="Times New Roman" w:hAnsi="Arial" w:cs="Arial"/>
+          <w:color w:val="000000" w:themeColor="text1"/>
+          <w:sz w:val="24"/>
+          <w:szCs w:val="24"/>
+          <w:lang w:eastAsia="it-IT"/>
+        </w:rPr>
+      </w:pPr>
+    </w:p>
+    <w:p>
+      <w:pPr>
+        <w:spacing w:after="0" w:line="330" w:lineRule="atLeast"/>
+        <w:ind w:left="708"/>
+        <w:rPr>
+          <w:rFonts w:ascii="Arial" w:eastAsia="Times New Roman" w:hAnsi="Arial" w:cs="Arial"/>
+          <w:color w:val="000000" w:themeColor="text1"/>
+          <w:sz w:val="24"/>
+          <w:szCs w:val="24"/>
+          <w:lang w:eastAsia="it-IT"/>
+        </w:rPr>
+      </w:pPr>
+      <w:r>
+        <w:rPr>
+          <w:rFonts w:ascii="Arial" w:eastAsia="Times New Roman" w:hAnsi="Arial" w:cs="Arial"/>
+          <w:color w:val="000000" w:themeColor="text1"/>
+          <w:sz w:val="24"/>
+          <w:szCs w:val="24"/>
+          <w:lang w:eastAsia="it-IT"/>
+        </w:rPr>
+        <w:t xml:space="preserve">- </w:t>
+      </w:r>
+      <w:r>
+        <w:rPr>
+          <w:rFonts w:ascii="Arial" w:eastAsia="Times New Roman" w:hAnsi="Arial" w:cs="Arial"/>
+          <w:b/>
+          <w:bCs/>
+          <w:color w:val="000000" w:themeColor="text1"/>
+          <w:sz w:val="24"/>
+          <w:szCs w:val="24"/>
+          <w:lang w:eastAsia="it-IT"/>
+        </w:rPr>
+        <w:t>S</w:t>
+      </w:r>
+      <w:r>
+        <w:rPr>
+          <w:rFonts w:ascii="Arial" w:eastAsia="Times New Roman" w:hAnsi="Arial" w:cs="Arial"/>
+          <w:color w:val="000000" w:themeColor="text1"/>
+          <w:sz w:val="24"/>
+          <w:szCs w:val="24"/>
+          <w:lang w:eastAsia="it-IT"/>
+        </w:rPr>
+        <w:t xml:space="preserve"> → Invia stato tensione</w:t>
+      </w:r>
+    </w:p>
+    <w:p>
+      <w:pPr>
+        <w:spacing w:after="0" w:line="330" w:lineRule="atLeast"/>
+        <w:ind w:left="708"/>
+        <w:rPr>
+          <w:rFonts w:ascii="Arial" w:eastAsia="Times New Roman" w:hAnsi="Arial" w:cs="Arial"/>
+          <w:b/>
+          <w:bCs/>
+          <w:color w:val="00B050"/>
+          <w:sz w:val="24"/>
+          <w:szCs w:val="24"/>
+          <w:lang w:eastAsia="it-IT"/>
+        </w:rPr>
+      </w:pPr>
+      <w:r>
+        <w:rPr>
+          <w:rFonts w:ascii="Arial" w:eastAsia="Times New Roman" w:hAnsi="Arial" w:cs="Arial"/>
+          <w:b/>
+          <w:bCs/>
+          <w:color w:val="00B050"/>
+          <w:sz w:val="24"/>
+          <w:szCs w:val="24"/>
+          <w:lang w:eastAsia="it-IT"/>
+        </w:rPr>
+        <w:t xml:space="preserve">- </w:t>
+      </w:r>
+      <w:r>
+        <w:rPr>
+          <w:rFonts w:ascii="Arial" w:eastAsia="Times New Roman" w:hAnsi="Arial" w:cs="Arial"/>
+          <w:b/>
+          <w:bCs/>
+          <w:color w:val="00B050"/>
+          <w:sz w:val="24"/>
+          <w:szCs w:val="24"/>
+          <w:lang w:eastAsia="it-IT"/>
+        </w:rPr>
+        <w:t>S</w:t>
+      </w:r>
+      <w:r>
+        <w:rPr>
+          <w:rFonts w:ascii="Arial" w:eastAsia="Times New Roman" w:hAnsi="Arial" w:cs="Arial"/>
+          <w:b/>
+          <w:bCs/>
+          <w:color w:val="00B050"/>
+          <w:sz w:val="24"/>
+          <w:szCs w:val="24"/>
+          <w:lang w:eastAsia="it-IT"/>
+        </w:rPr>
+        <w:t xml:space="preserve">olo se numero </w:t>
+      </w:r>
+      <w:r>
+        <w:rPr>
+          <w:rFonts w:ascii="Arial" w:eastAsia="Times New Roman" w:hAnsi="Arial" w:cs="Arial"/>
+          <w:b/>
+          <w:bCs/>
+          <w:color w:val="00B050"/>
+          <w:sz w:val="24"/>
+          <w:szCs w:val="24"/>
+          <w:lang w:eastAsia="it-IT"/>
+        </w:rPr>
+        <w:t>M</w:t>
+      </w:r>
+      <w:r>
+        <w:rPr>
+          <w:rFonts w:ascii="Arial" w:eastAsia="Times New Roman" w:hAnsi="Arial" w:cs="Arial"/>
+          <w:b/>
+          <w:bCs/>
+          <w:color w:val="00B050"/>
+          <w:sz w:val="24"/>
+          <w:szCs w:val="24"/>
+          <w:lang w:eastAsia="it-IT"/>
+        </w:rPr>
+        <w:t>aster</w:t>
+      </w:r>
+      <w:r>
+        <w:rPr>
+          <w:rFonts w:ascii="Arial" w:eastAsia="Times New Roman" w:hAnsi="Arial" w:cs="Arial"/>
+          <w:b/>
+          <w:bCs/>
+          <w:color w:val="00B050"/>
+          <w:sz w:val="24"/>
+          <w:szCs w:val="24"/>
+          <w:lang w:eastAsia="it-IT"/>
+        </w:rPr>
+        <w:t xml:space="preserve"> o Ausiliario</w:t>
+      </w:r>
+    </w:p>
+    <w:p>
+      <w:pPr>
+        <w:spacing w:after="0" w:line="330" w:lineRule="atLeast"/>
+        <w:ind w:left="708"/>
+        <w:rPr>
+          <w:rFonts w:ascii="Arial" w:eastAsia="Times New Roman" w:hAnsi="Arial" w:cs="Arial"/>
+          <w:color w:val="000000" w:themeColor="text1"/>
+          <w:sz w:val="24"/>
+          <w:szCs w:val="24"/>
+          <w:lang w:eastAsia="it-IT"/>
+        </w:rPr>
+      </w:pPr>
+    </w:p>
+    <w:p>
+      <w:pPr>
+        <w:spacing w:after="0" w:line="330" w:lineRule="atLeast"/>
+        <w:ind w:left="708"/>
+        <w:rPr>
+          <w:rFonts w:ascii="Arial" w:eastAsia="Times New Roman" w:hAnsi="Arial" w:cs="Arial"/>
+          <w:color w:val="A6A6A6" w:themeColor="background1" w:themeShade="A6"/>
+          <w:sz w:val="24"/>
+          <w:szCs w:val="24"/>
+          <w:lang w:eastAsia="it-IT"/>
+        </w:rPr>
+      </w:pPr>
+      <w:r>
+        <w:rPr>
+          <w:rFonts w:ascii="Arial" w:eastAsia="Times New Roman" w:hAnsi="Arial" w:cs="Arial"/>
+          <w:color w:val="A6A6A6" w:themeColor="background1" w:themeShade="A6"/>
+          <w:sz w:val="24"/>
+          <w:szCs w:val="24"/>
+          <w:lang w:eastAsia="it-IT"/>
+        </w:rPr>
+        <w:t xml:space="preserve">- </w:t>
+      </w:r>
+      <w:r>
+        <w:rPr>
+          <w:rFonts w:ascii="Arial" w:eastAsia="Times New Roman" w:hAnsi="Arial" w:cs="Arial"/>
+          <w:b/>
+          <w:bCs/>
+          <w:color w:val="A6A6A6" w:themeColor="background1" w:themeShade="A6"/>
+          <w:sz w:val="24"/>
+          <w:szCs w:val="24"/>
+          <w:lang w:eastAsia="it-IT"/>
+        </w:rPr>
+        <w:t>E</w:t>
+      </w:r>
+      <w:r>
+        <w:rPr>
+          <w:rFonts w:ascii="Arial" w:eastAsia="Times New Roman" w:hAnsi="Arial" w:cs="Arial"/>
+          <w:color w:val="A6A6A6" w:themeColor="background1" w:themeShade="A6"/>
+          <w:sz w:val="24"/>
+          <w:szCs w:val="24"/>
+          <w:lang w:eastAsia="it-IT"/>
+        </w:rPr>
+        <w:t xml:space="preserve"> → </w:t>
+      </w:r>
+      <w:r>
+        <w:rPr>
+          <w:rFonts w:ascii="Arial" w:eastAsia="Times New Roman" w:hAnsi="Arial" w:cs="Arial"/>
+          <w:b/>
+          <w:bCs/>
+          <w:color w:val="A6A6A6" w:themeColor="background1" w:themeShade="A6"/>
+          <w:sz w:val="24"/>
+          <w:szCs w:val="24"/>
+          <w:lang w:eastAsia="it-IT"/>
+        </w:rPr>
+        <w:t>Comando riservato</w:t>
+      </w:r>
+      <w:r>
+        <w:rPr>
+          <w:rFonts w:ascii="Arial" w:eastAsia="Times New Roman" w:hAnsi="Arial" w:cs="Arial"/>
+          <w:color w:val="A6A6A6" w:themeColor="background1" w:themeShade="A6"/>
+          <w:sz w:val="24"/>
+          <w:szCs w:val="24"/>
+          <w:lang w:eastAsia="it-IT"/>
+        </w:rPr>
+        <w:t>, cancella tutti i numeri</w:t>
+      </w:r>
+      <w:r>
+        <w:rPr>
+          <w:rFonts w:ascii="Arial" w:eastAsia="Times New Roman" w:hAnsi="Arial" w:cs="Arial"/>
+          <w:color w:val="A6A6A6" w:themeColor="background1" w:themeShade="A6"/>
+          <w:sz w:val="24"/>
+          <w:szCs w:val="24"/>
+          <w:lang w:eastAsia="it-IT"/>
+        </w:rPr>
+        <w:t xml:space="preserve"> incluso il Master</w:t>
+      </w:r>
+    </w:p>
+    <w:p>
+      <w:pPr>
+        <w:spacing w:after="0" w:line="330" w:lineRule="atLeast"/>
+        <w:ind w:left="708"/>
+        <w:rPr>
+          <w:rFonts w:ascii="Arial" w:eastAsia="Times New Roman" w:hAnsi="Arial" w:cs="Arial"/>
+          <w:b/>
+          <w:bCs/>
+          <w:color w:val="A8D08D" w:themeColor="accent6" w:themeTint="99"/>
+          <w:sz w:val="24"/>
+          <w:szCs w:val="24"/>
+          <w:lang w:eastAsia="it-IT"/>
+        </w:rPr>
+      </w:pPr>
+      <w:r>
+        <w:rPr>
+          <w:rFonts w:ascii="Arial" w:eastAsia="Times New Roman" w:hAnsi="Arial" w:cs="Arial"/>
+          <w:b/>
+          <w:bCs/>
+          <w:color w:val="A8D08D" w:themeColor="accent6" w:themeTint="99"/>
+          <w:sz w:val="24"/>
+          <w:szCs w:val="24"/>
+          <w:lang w:eastAsia="it-IT"/>
+        </w:rPr>
+        <w:t xml:space="preserve">- </w:t>
+      </w:r>
+      <w:r>
+        <w:rPr>
+          <w:rFonts w:ascii="Arial" w:eastAsia="Times New Roman" w:hAnsi="Arial" w:cs="Arial"/>
+          <w:b/>
+          <w:bCs/>
+          <w:color w:val="A8D08D" w:themeColor="accent6" w:themeTint="99"/>
+          <w:sz w:val="24"/>
+          <w:szCs w:val="24"/>
+          <w:lang w:eastAsia="it-IT"/>
+        </w:rPr>
+        <w:t>Accetta qualsiasi numero</w:t>
+      </w:r>
+    </w:p>
+    <w:p>
+      <w:pPr>
+        <w:spacing w:after="0" w:line="330" w:lineRule="atLeast"/>
+        <w:ind w:left="708"/>
+        <w:rPr>
+          <w:rFonts w:ascii="Arial" w:eastAsia="Times New Roman" w:hAnsi="Arial" w:cs="Arial"/>
+          <w:color w:val="000000" w:themeColor="text1"/>
+          <w:sz w:val="24"/>
+          <w:szCs w:val="24"/>
+          <w:lang w:eastAsia="it-IT"/>
+        </w:rPr>
+      </w:pPr>
+    </w:p>
+    <w:p>
+      <w:pPr>
+        <w:spacing w:after="0" w:line="330" w:lineRule="atLeast"/>
+        <w:ind w:left="708"/>
+        <w:rPr>
+          <w:rFonts w:ascii="Arial" w:eastAsia="Times New Roman" w:hAnsi="Arial" w:cs="Arial"/>
+          <w:color w:val="000000" w:themeColor="text1"/>
+          <w:sz w:val="24"/>
+          <w:szCs w:val="24"/>
+          <w:lang w:eastAsia="it-IT"/>
+        </w:rPr>
+      </w:pPr>
+      <w:r>
+        <w:rPr>
+          <w:rFonts w:ascii="Arial" w:eastAsia="Times New Roman" w:hAnsi="Arial" w:cs="Arial"/>
+          <w:color w:val="000000" w:themeColor="text1"/>
+          <w:sz w:val="24"/>
+          <w:szCs w:val="24"/>
+          <w:lang w:eastAsia="it-IT"/>
+        </w:rPr>
+        <w:t>- Salva e legge i numeri autorizzati su EEPROM per persistenza</w:t>
+      </w:r>
+      <w:r>
+        <w:rPr>
+          <w:rFonts w:ascii="Arial" w:eastAsia="Times New Roman" w:hAnsi="Arial" w:cs="Arial"/>
+          <w:color w:val="000000" w:themeColor="text1"/>
+          <w:sz w:val="24"/>
+          <w:szCs w:val="24"/>
+          <w:lang w:eastAsia="it-IT"/>
+        </w:rPr>
+        <w:t xml:space="preserve"> dopo Power Off</w:t>
+      </w:r>
+      <w:r>
+        <w:rPr>
+          <w:rFonts w:ascii="Arial" w:eastAsia="Times New Roman" w:hAnsi="Arial" w:cs="Arial"/>
+          <w:color w:val="000000" w:themeColor="text1"/>
+          <w:sz w:val="24"/>
+          <w:szCs w:val="24"/>
+          <w:lang w:eastAsia="it-IT"/>
+        </w:rPr>
+        <w:t>,</w:t>
+      </w:r>
+    </w:p>
+    <w:p>
+      <w:pPr>
         <w:rPr>
           <w:rFonts w:ascii="Arial" w:eastAsia="Times New Roman" w:hAnsi="Arial" w:cs="Arial"/>
           <w:color w:val="000000" w:themeColor="text1"/>
@@ -779,718 +1838,221 @@
           <w:color w:val="000000" w:themeColor="text1"/>
           <w:sz w:val="24"/>
           <w:szCs w:val="24"/>
-          <w:u w:val="single"/>
-          <w:lang w:eastAsia="it-IT"/>
-        </w:rPr>
-        <w:t>Gestisce comandi via SMS:</w:t>
-      </w:r>
-    </w:p>
-    <w:p>
-      <w:pPr>
-        <w:spacing w:after="0" w:line="330" w:lineRule="atLeast"/>
-        <w:rPr>
-          <w:rFonts w:ascii="Arial" w:eastAsia="Times New Roman" w:hAnsi="Arial" w:cs="Arial"/>
-          <w:color w:val="000000" w:themeColor="text1"/>
-          <w:sz w:val="24"/>
-          <w:szCs w:val="24"/>
-          <w:lang w:eastAsia="it-IT"/>
-        </w:rPr>
-      </w:pPr>
-    </w:p>
-    <w:p>
-      <w:pPr>
-        <w:spacing w:after="0" w:line="330" w:lineRule="atLeast"/>
-        <w:ind w:left="708"/>
-        <w:rPr>
-          <w:rFonts w:ascii="Arial" w:eastAsia="Times New Roman" w:hAnsi="Arial" w:cs="Arial"/>
-          <w:color w:val="000000" w:themeColor="text1"/>
-          <w:sz w:val="24"/>
-          <w:szCs w:val="24"/>
-          <w:lang w:eastAsia="it-IT"/>
-        </w:rPr>
-      </w:pPr>
-      <w:r>
-        <w:rPr>
-          <w:rFonts w:ascii="Arial" w:eastAsia="Times New Roman" w:hAnsi="Arial" w:cs="Arial"/>
-          <w:color w:val="000000" w:themeColor="text1"/>
-          <w:sz w:val="24"/>
-          <w:szCs w:val="24"/>
-          <w:lang w:eastAsia="it-IT"/>
-        </w:rPr>
-        <w:t xml:space="preserve">- </w:t>
-      </w:r>
-      <w:r>
-        <w:rPr>
-          <w:rFonts w:ascii="Arial" w:eastAsia="Times New Roman" w:hAnsi="Arial" w:cs="Arial"/>
-          <w:b/>
-          <w:bCs/>
-          <w:color w:val="000000" w:themeColor="text1"/>
-          <w:sz w:val="24"/>
-          <w:szCs w:val="24"/>
-          <w:lang w:eastAsia="it-IT"/>
-        </w:rPr>
-        <w:t>M+numero</w:t>
-      </w:r>
-      <w:r>
-        <w:rPr>
-          <w:rFonts w:ascii="Arial" w:eastAsia="Times New Roman" w:hAnsi="Arial" w:cs="Arial"/>
-          <w:color w:val="000000" w:themeColor="text1"/>
-          <w:sz w:val="24"/>
-          <w:szCs w:val="24"/>
-          <w:lang w:eastAsia="it-IT"/>
-        </w:rPr>
-        <w:t xml:space="preserve"> → Modifica numero Master</w:t>
-      </w:r>
-    </w:p>
-    <w:p>
-      <w:pPr>
-        <w:spacing w:after="0" w:line="330" w:lineRule="atLeast"/>
-        <w:ind w:left="708"/>
-        <w:rPr>
-          <w:rFonts w:ascii="Arial" w:eastAsia="Times New Roman" w:hAnsi="Arial" w:cs="Arial"/>
-          <w:b/>
-          <w:bCs/>
-          <w:color w:val="00B050"/>
-          <w:sz w:val="24"/>
-          <w:szCs w:val="24"/>
-          <w:lang w:eastAsia="it-IT"/>
-        </w:rPr>
-      </w:pPr>
-      <w:r>
-        <w:rPr>
-          <w:rFonts w:ascii="Arial" w:eastAsia="Times New Roman" w:hAnsi="Arial" w:cs="Arial"/>
-          <w:b/>
-          <w:bCs/>
-          <w:color w:val="00B050"/>
-          <w:sz w:val="24"/>
-          <w:szCs w:val="24"/>
-          <w:lang w:eastAsia="it-IT"/>
-        </w:rPr>
-        <w:t xml:space="preserve"> - </w:t>
-      </w:r>
-      <w:r>
-        <w:rPr>
-          <w:rFonts w:ascii="Arial" w:eastAsia="Times New Roman" w:hAnsi="Arial" w:cs="Arial"/>
-          <w:b/>
-          <w:bCs/>
-          <w:color w:val="00B050"/>
-          <w:sz w:val="24"/>
-          <w:szCs w:val="24"/>
-          <w:lang w:eastAsia="it-IT"/>
-        </w:rPr>
-        <w:t>S</w:t>
-      </w:r>
-      <w:r>
-        <w:rPr>
-          <w:rFonts w:ascii="Arial" w:eastAsia="Times New Roman" w:hAnsi="Arial" w:cs="Arial"/>
-          <w:b/>
-          <w:bCs/>
-          <w:color w:val="00B050"/>
-          <w:sz w:val="24"/>
-          <w:szCs w:val="24"/>
-          <w:lang w:eastAsia="it-IT"/>
-        </w:rPr>
-        <w:t xml:space="preserve">olo se numero </w:t>
-      </w:r>
-      <w:r>
-        <w:rPr>
-          <w:rFonts w:ascii="Arial" w:eastAsia="Times New Roman" w:hAnsi="Arial" w:cs="Arial"/>
-          <w:b/>
-          <w:bCs/>
-          <w:color w:val="00B050"/>
-          <w:sz w:val="24"/>
-          <w:szCs w:val="24"/>
-          <w:lang w:eastAsia="it-IT"/>
-        </w:rPr>
-        <w:t>M</w:t>
-      </w:r>
-      <w:r>
-        <w:rPr>
-          <w:rFonts w:ascii="Arial" w:eastAsia="Times New Roman" w:hAnsi="Arial" w:cs="Arial"/>
-          <w:b/>
-          <w:bCs/>
-          <w:color w:val="00B050"/>
-          <w:sz w:val="24"/>
-          <w:szCs w:val="24"/>
-          <w:lang w:eastAsia="it-IT"/>
-        </w:rPr>
-        <w:t>aster o nessun numero</w:t>
-      </w:r>
-    </w:p>
-    <w:p>
-      <w:pPr>
-        <w:spacing w:after="0" w:line="330" w:lineRule="atLeast"/>
-        <w:ind w:left="708"/>
-        <w:rPr>
-          <w:rFonts w:ascii="Arial" w:eastAsia="Times New Roman" w:hAnsi="Arial" w:cs="Arial"/>
-          <w:b/>
-          <w:bCs/>
-          <w:color w:val="00B050"/>
-          <w:sz w:val="24"/>
-          <w:szCs w:val="24"/>
-          <w:lang w:eastAsia="it-IT"/>
-        </w:rPr>
-      </w:pPr>
-      <w:r>
-        <w:rPr>
-          <w:rFonts w:ascii="Arial" w:eastAsia="Times New Roman" w:hAnsi="Arial" w:cs="Arial"/>
-          <w:b/>
-          <w:bCs/>
-          <w:color w:val="00B050"/>
-          <w:sz w:val="24"/>
-          <w:szCs w:val="24"/>
-          <w:lang w:eastAsia="it-IT"/>
-        </w:rPr>
-        <w:t xml:space="preserve"> </w:t>
-      </w:r>
-      <w:r>
-        <w:rPr>
-          <w:rFonts w:ascii="Arial" w:eastAsia="Times New Roman" w:hAnsi="Arial" w:cs="Arial"/>
-          <w:b/>
-          <w:bCs/>
-          <w:color w:val="00B050"/>
-          <w:sz w:val="24"/>
-          <w:szCs w:val="24"/>
-          <w:lang w:eastAsia="it-IT"/>
-        </w:rPr>
-        <w:t xml:space="preserve">- </w:t>
-      </w:r>
-      <w:r>
-        <w:rPr>
-          <w:rFonts w:ascii="Arial" w:eastAsia="Times New Roman" w:hAnsi="Arial" w:cs="Arial"/>
-          <w:b/>
-          <w:bCs/>
-          <w:color w:val="00B050"/>
-          <w:sz w:val="24"/>
-          <w:szCs w:val="24"/>
-          <w:lang w:eastAsia="it-IT"/>
-        </w:rPr>
-        <w:t>V</w:t>
-      </w:r>
-      <w:r>
-        <w:rPr>
-          <w:rFonts w:ascii="Arial" w:eastAsia="Times New Roman" w:hAnsi="Arial" w:cs="Arial"/>
-          <w:b/>
-          <w:bCs/>
-          <w:color w:val="00B050"/>
-          <w:sz w:val="24"/>
-          <w:szCs w:val="24"/>
-          <w:lang w:eastAsia="it-IT"/>
-        </w:rPr>
-        <w:t>alida il numero richiedente se lunghezza numero è compresa tra 10 e 13</w:t>
-      </w:r>
-    </w:p>
-    <w:p>
-      <w:pPr>
-        <w:spacing w:after="0" w:line="330" w:lineRule="atLeast"/>
-        <w:ind w:left="708"/>
-        <w:rPr>
-          <w:rFonts w:ascii="Arial" w:eastAsia="Times New Roman" w:hAnsi="Arial" w:cs="Arial"/>
-          <w:color w:val="000000" w:themeColor="text1"/>
-          <w:sz w:val="24"/>
-          <w:szCs w:val="24"/>
-          <w:lang w:eastAsia="it-IT"/>
-        </w:rPr>
-      </w:pPr>
-    </w:p>
-    <w:p>
-      <w:pPr>
-        <w:spacing w:after="0" w:line="330" w:lineRule="atLeast"/>
-        <w:ind w:left="708"/>
-        <w:rPr>
-          <w:rFonts w:ascii="Arial" w:eastAsia="Times New Roman" w:hAnsi="Arial" w:cs="Arial"/>
-          <w:color w:val="000000" w:themeColor="text1"/>
-          <w:sz w:val="24"/>
-          <w:szCs w:val="24"/>
-          <w:lang w:eastAsia="it-IT"/>
-        </w:rPr>
-      </w:pPr>
-    </w:p>
-    <w:p>
-      <w:pPr>
-        <w:spacing w:after="0" w:line="330" w:lineRule="atLeast"/>
-        <w:ind w:left="708"/>
-        <w:rPr>
-          <w:rFonts w:ascii="Arial" w:eastAsia="Times New Roman" w:hAnsi="Arial" w:cs="Arial"/>
-          <w:color w:val="000000" w:themeColor="text1"/>
-          <w:sz w:val="24"/>
-          <w:szCs w:val="24"/>
-          <w:lang w:eastAsia="it-IT"/>
-        </w:rPr>
-      </w:pPr>
-      <w:r>
-        <w:rPr>
-          <w:rFonts w:ascii="Arial" w:eastAsia="Times New Roman" w:hAnsi="Arial" w:cs="Arial"/>
-          <w:color w:val="000000" w:themeColor="text1"/>
-          <w:sz w:val="24"/>
-          <w:szCs w:val="24"/>
+          <w:lang w:eastAsia="it-IT"/>
+        </w:rPr>
+        <w:br w:type="page"/>
+      </w:r>
+    </w:p>
+    <w:p>
+      <w:pPr>
+        <w:spacing w:after="0" w:line="330" w:lineRule="atLeast"/>
+        <w:jc w:val="center"/>
+        <w:rPr>
+          <w:rFonts w:ascii="Arial" w:eastAsia="Times New Roman" w:hAnsi="Arial" w:cs="Arial"/>
+          <w:b/>
+          <w:bCs/>
+          <w:color w:val="000000" w:themeColor="text1"/>
+          <w:sz w:val="32"/>
+          <w:szCs w:val="32"/>
+          <w:lang w:eastAsia="it-IT"/>
+        </w:rPr>
+      </w:pPr>
+      <w:r>
+        <w:rPr>
+          <w:rFonts w:ascii="Arial" w:eastAsia="Times New Roman" w:hAnsi="Arial" w:cs="Arial"/>
+          <w:b/>
+          <w:bCs/>
+          <w:color w:val="000000" w:themeColor="text1"/>
+          <w:sz w:val="32"/>
+          <w:szCs w:val="32"/>
           <w:lang w:eastAsia="it-IT"/>
         </w:rPr>
         <w:lastRenderedPageBreak/>
-        <w:t xml:space="preserve">- </w:t>
-      </w:r>
-      <w:r>
-        <w:rPr>
-          <w:rFonts w:ascii="Arial" w:eastAsia="Times New Roman" w:hAnsi="Arial" w:cs="Arial"/>
-          <w:b/>
-          <w:bCs/>
-          <w:color w:val="000000" w:themeColor="text1"/>
-          <w:sz w:val="24"/>
-          <w:szCs w:val="24"/>
-          <w:lang w:eastAsia="it-IT"/>
-        </w:rPr>
-        <w:t>A[n]+numero</w:t>
-      </w:r>
-      <w:r>
-        <w:rPr>
-          <w:rFonts w:ascii="Arial" w:eastAsia="Times New Roman" w:hAnsi="Arial" w:cs="Arial"/>
-          <w:color w:val="000000" w:themeColor="text1"/>
-          <w:sz w:val="24"/>
-          <w:szCs w:val="24"/>
-          <w:lang w:eastAsia="it-IT"/>
-        </w:rPr>
-        <w:t xml:space="preserve"> → Aggiunge/Sostituisce numero ausiliario</w:t>
-      </w:r>
-    </w:p>
-    <w:p>
-      <w:pPr>
-        <w:spacing w:after="0" w:line="330" w:lineRule="atLeast"/>
-        <w:ind w:left="708"/>
-        <w:rPr>
-          <w:rFonts w:ascii="Arial" w:eastAsia="Times New Roman" w:hAnsi="Arial" w:cs="Arial"/>
-          <w:b/>
-          <w:bCs/>
-          <w:color w:val="00B050"/>
-          <w:sz w:val="24"/>
-          <w:szCs w:val="24"/>
-          <w:lang w:eastAsia="it-IT"/>
-        </w:rPr>
-      </w:pPr>
-      <w:r>
-        <w:rPr>
-          <w:rFonts w:ascii="Arial" w:eastAsia="Times New Roman" w:hAnsi="Arial" w:cs="Arial"/>
-          <w:b/>
-          <w:bCs/>
-          <w:color w:val="00B050"/>
-          <w:sz w:val="24"/>
-          <w:szCs w:val="24"/>
-          <w:lang w:eastAsia="it-IT"/>
-        </w:rPr>
-        <w:t xml:space="preserve">- </w:t>
-      </w:r>
-      <w:r>
-        <w:rPr>
-          <w:rFonts w:ascii="Arial" w:eastAsia="Times New Roman" w:hAnsi="Arial" w:cs="Arial"/>
-          <w:b/>
-          <w:bCs/>
-          <w:color w:val="00B050"/>
-          <w:sz w:val="24"/>
-          <w:szCs w:val="24"/>
-          <w:lang w:eastAsia="it-IT"/>
-        </w:rPr>
-        <w:t>S</w:t>
-      </w:r>
-      <w:r>
-        <w:rPr>
-          <w:rFonts w:ascii="Arial" w:eastAsia="Times New Roman" w:hAnsi="Arial" w:cs="Arial"/>
-          <w:b/>
-          <w:bCs/>
-          <w:color w:val="00B050"/>
-          <w:sz w:val="24"/>
-          <w:szCs w:val="24"/>
-          <w:lang w:eastAsia="it-IT"/>
-        </w:rPr>
-        <w:t xml:space="preserve">olo se numero </w:t>
-      </w:r>
-      <w:r>
-        <w:rPr>
-          <w:rFonts w:ascii="Arial" w:eastAsia="Times New Roman" w:hAnsi="Arial" w:cs="Arial"/>
-          <w:b/>
-          <w:bCs/>
-          <w:color w:val="00B050"/>
-          <w:sz w:val="24"/>
-          <w:szCs w:val="24"/>
-          <w:lang w:eastAsia="it-IT"/>
-        </w:rPr>
-        <w:t>M</w:t>
-      </w:r>
-      <w:r>
-        <w:rPr>
-          <w:rFonts w:ascii="Arial" w:eastAsia="Times New Roman" w:hAnsi="Arial" w:cs="Arial"/>
-          <w:b/>
-          <w:bCs/>
-          <w:color w:val="00B050"/>
-          <w:sz w:val="24"/>
-          <w:szCs w:val="24"/>
-          <w:lang w:eastAsia="it-IT"/>
-        </w:rPr>
-        <w:t>aster</w:t>
-      </w:r>
-    </w:p>
-    <w:p>
-      <w:pPr>
-        <w:spacing w:after="0" w:line="330" w:lineRule="atLeast"/>
-        <w:ind w:left="708"/>
-        <w:rPr>
-          <w:rFonts w:ascii="Arial" w:eastAsia="Times New Roman" w:hAnsi="Arial" w:cs="Arial"/>
-          <w:color w:val="000000" w:themeColor="text1"/>
-          <w:sz w:val="24"/>
-          <w:szCs w:val="24"/>
-          <w:lang w:eastAsia="it-IT"/>
-        </w:rPr>
-      </w:pPr>
-    </w:p>
-    <w:p>
-      <w:pPr>
-        <w:spacing w:after="0" w:line="330" w:lineRule="atLeast"/>
-        <w:ind w:left="708"/>
-        <w:rPr>
-          <w:rFonts w:ascii="Arial" w:eastAsia="Times New Roman" w:hAnsi="Arial" w:cs="Arial"/>
-          <w:color w:val="000000" w:themeColor="text1"/>
-          <w:sz w:val="24"/>
-          <w:szCs w:val="24"/>
-          <w:lang w:eastAsia="it-IT"/>
-        </w:rPr>
-      </w:pPr>
-      <w:r>
-        <w:rPr>
-          <w:rFonts w:ascii="Arial" w:eastAsia="Times New Roman" w:hAnsi="Arial" w:cs="Arial"/>
-          <w:color w:val="000000" w:themeColor="text1"/>
-          <w:sz w:val="24"/>
-          <w:szCs w:val="24"/>
-          <w:lang w:eastAsia="it-IT"/>
-        </w:rPr>
-        <w:t xml:space="preserve">- </w:t>
-      </w:r>
-      <w:r>
-        <w:rPr>
-          <w:rFonts w:ascii="Arial" w:eastAsia="Times New Roman" w:hAnsi="Arial" w:cs="Arial"/>
-          <w:b/>
-          <w:bCs/>
-          <w:color w:val="000000" w:themeColor="text1"/>
-          <w:sz w:val="24"/>
-          <w:szCs w:val="24"/>
-          <w:lang w:eastAsia="it-IT"/>
-        </w:rPr>
-        <w:t>D</w:t>
-      </w:r>
-      <w:r>
-        <w:rPr>
-          <w:rFonts w:ascii="Arial" w:eastAsia="Times New Roman" w:hAnsi="Arial" w:cs="Arial"/>
-          <w:color w:val="000000" w:themeColor="text1"/>
-          <w:sz w:val="24"/>
-          <w:szCs w:val="24"/>
-          <w:lang w:eastAsia="it-IT"/>
-        </w:rPr>
-        <w:t xml:space="preserve"> → Cancella numeri ausiliari</w:t>
-      </w:r>
-    </w:p>
-    <w:p>
-      <w:pPr>
-        <w:spacing w:after="0" w:line="330" w:lineRule="atLeast"/>
-        <w:ind w:left="708"/>
-        <w:rPr>
-          <w:rFonts w:ascii="Arial" w:eastAsia="Times New Roman" w:hAnsi="Arial" w:cs="Arial"/>
-          <w:b/>
-          <w:bCs/>
-          <w:color w:val="00B050"/>
-          <w:sz w:val="24"/>
-          <w:szCs w:val="24"/>
-          <w:lang w:eastAsia="it-IT"/>
-        </w:rPr>
-      </w:pPr>
-      <w:r>
-        <w:rPr>
-          <w:rFonts w:ascii="Arial" w:eastAsia="Times New Roman" w:hAnsi="Arial" w:cs="Arial"/>
-          <w:b/>
-          <w:bCs/>
-          <w:color w:val="00B050"/>
-          <w:sz w:val="24"/>
-          <w:szCs w:val="24"/>
-          <w:lang w:eastAsia="it-IT"/>
-        </w:rPr>
-        <w:t xml:space="preserve">- </w:t>
-      </w:r>
-      <w:r>
-        <w:rPr>
-          <w:rFonts w:ascii="Arial" w:eastAsia="Times New Roman" w:hAnsi="Arial" w:cs="Arial"/>
-          <w:b/>
-          <w:bCs/>
-          <w:color w:val="00B050"/>
-          <w:sz w:val="24"/>
-          <w:szCs w:val="24"/>
-          <w:lang w:eastAsia="it-IT"/>
-        </w:rPr>
-        <w:t>S</w:t>
-      </w:r>
-      <w:r>
-        <w:rPr>
-          <w:rFonts w:ascii="Arial" w:eastAsia="Times New Roman" w:hAnsi="Arial" w:cs="Arial"/>
-          <w:b/>
-          <w:bCs/>
-          <w:color w:val="00B050"/>
-          <w:sz w:val="24"/>
-          <w:szCs w:val="24"/>
-          <w:lang w:eastAsia="it-IT"/>
-        </w:rPr>
-        <w:t xml:space="preserve">olo se numero </w:t>
-      </w:r>
-      <w:r>
-        <w:rPr>
-          <w:rFonts w:ascii="Arial" w:eastAsia="Times New Roman" w:hAnsi="Arial" w:cs="Arial"/>
-          <w:b/>
-          <w:bCs/>
-          <w:color w:val="00B050"/>
-          <w:sz w:val="24"/>
-          <w:szCs w:val="24"/>
-          <w:lang w:eastAsia="it-IT"/>
-        </w:rPr>
-        <w:t>M</w:t>
-      </w:r>
-      <w:r>
-        <w:rPr>
-          <w:rFonts w:ascii="Arial" w:eastAsia="Times New Roman" w:hAnsi="Arial" w:cs="Arial"/>
-          <w:b/>
-          <w:bCs/>
-          <w:color w:val="00B050"/>
-          <w:sz w:val="24"/>
-          <w:szCs w:val="24"/>
-          <w:lang w:eastAsia="it-IT"/>
-        </w:rPr>
-        <w:t>aster</w:t>
-      </w:r>
-    </w:p>
-    <w:p>
-      <w:pPr>
-        <w:spacing w:after="0" w:line="330" w:lineRule="atLeast"/>
-        <w:ind w:left="708"/>
-        <w:rPr>
-          <w:rFonts w:ascii="Arial" w:eastAsia="Times New Roman" w:hAnsi="Arial" w:cs="Arial"/>
-          <w:color w:val="000000" w:themeColor="text1"/>
-          <w:sz w:val="24"/>
-          <w:szCs w:val="24"/>
-          <w:lang w:eastAsia="it-IT"/>
-        </w:rPr>
-      </w:pPr>
-    </w:p>
-    <w:p>
-      <w:pPr>
-        <w:spacing w:after="0" w:line="330" w:lineRule="atLeast"/>
-        <w:ind w:left="708"/>
-        <w:rPr>
-          <w:rFonts w:ascii="Arial" w:eastAsia="Times New Roman" w:hAnsi="Arial" w:cs="Arial"/>
-          <w:color w:val="000000" w:themeColor="text1"/>
-          <w:sz w:val="24"/>
-          <w:szCs w:val="24"/>
-          <w:lang w:eastAsia="it-IT"/>
-        </w:rPr>
-      </w:pPr>
-    </w:p>
-    <w:p>
-      <w:pPr>
-        <w:spacing w:after="0" w:line="330" w:lineRule="atLeast"/>
-        <w:ind w:left="708"/>
-        <w:rPr>
-          <w:rFonts w:ascii="Arial" w:eastAsia="Times New Roman" w:hAnsi="Arial" w:cs="Arial"/>
-          <w:color w:val="000000" w:themeColor="text1"/>
-          <w:sz w:val="24"/>
-          <w:szCs w:val="24"/>
-          <w:lang w:eastAsia="it-IT"/>
-        </w:rPr>
-      </w:pPr>
-      <w:r>
-        <w:rPr>
-          <w:rFonts w:ascii="Arial" w:eastAsia="Times New Roman" w:hAnsi="Arial" w:cs="Arial"/>
-          <w:color w:val="000000" w:themeColor="text1"/>
-          <w:sz w:val="24"/>
-          <w:szCs w:val="24"/>
-          <w:lang w:eastAsia="it-IT"/>
-        </w:rPr>
-        <w:t xml:space="preserve">- </w:t>
-      </w:r>
-      <w:r>
-        <w:rPr>
-          <w:rFonts w:ascii="Arial" w:eastAsia="Times New Roman" w:hAnsi="Arial" w:cs="Arial"/>
-          <w:b/>
-          <w:bCs/>
-          <w:color w:val="000000" w:themeColor="text1"/>
-          <w:sz w:val="24"/>
-          <w:szCs w:val="24"/>
-          <w:lang w:eastAsia="it-IT"/>
-        </w:rPr>
-        <w:t>N</w:t>
-      </w:r>
-      <w:r>
-        <w:rPr>
-          <w:rFonts w:ascii="Arial" w:eastAsia="Times New Roman" w:hAnsi="Arial" w:cs="Arial"/>
-          <w:color w:val="000000" w:themeColor="text1"/>
-          <w:sz w:val="24"/>
-          <w:szCs w:val="24"/>
-          <w:lang w:eastAsia="it-IT"/>
-        </w:rPr>
-        <w:t xml:space="preserve"> → Elenca numeri autorizzati</w:t>
-      </w:r>
-    </w:p>
-    <w:p>
-      <w:pPr>
-        <w:spacing w:after="0" w:line="330" w:lineRule="atLeast"/>
-        <w:ind w:left="708"/>
-        <w:rPr>
-          <w:rFonts w:ascii="Arial" w:eastAsia="Times New Roman" w:hAnsi="Arial" w:cs="Arial"/>
-          <w:color w:val="000000" w:themeColor="text1"/>
-          <w:sz w:val="24"/>
-          <w:szCs w:val="24"/>
-          <w:lang w:eastAsia="it-IT"/>
-        </w:rPr>
-      </w:pPr>
-    </w:p>
-    <w:p>
-      <w:pPr>
-        <w:spacing w:after="0" w:line="330" w:lineRule="atLeast"/>
-        <w:ind w:left="708"/>
-        <w:rPr>
-          <w:rFonts w:ascii="Arial" w:eastAsia="Times New Roman" w:hAnsi="Arial" w:cs="Arial"/>
-          <w:color w:val="000000" w:themeColor="text1"/>
-          <w:sz w:val="24"/>
-          <w:szCs w:val="24"/>
-          <w:lang w:eastAsia="it-IT"/>
-        </w:rPr>
-      </w:pPr>
-      <w:r>
-        <w:rPr>
-          <w:rFonts w:ascii="Arial" w:eastAsia="Times New Roman" w:hAnsi="Arial" w:cs="Arial"/>
-          <w:color w:val="000000" w:themeColor="text1"/>
-          <w:sz w:val="24"/>
-          <w:szCs w:val="24"/>
-          <w:lang w:eastAsia="it-IT"/>
-        </w:rPr>
-        <w:t xml:space="preserve">- </w:t>
-      </w:r>
-      <w:r>
-        <w:rPr>
-          <w:rFonts w:ascii="Arial" w:eastAsia="Times New Roman" w:hAnsi="Arial" w:cs="Arial"/>
-          <w:b/>
-          <w:bCs/>
-          <w:color w:val="000000" w:themeColor="text1"/>
-          <w:sz w:val="24"/>
-          <w:szCs w:val="24"/>
-          <w:lang w:eastAsia="it-IT"/>
-        </w:rPr>
-        <w:t>S</w:t>
-      </w:r>
-      <w:r>
-        <w:rPr>
-          <w:rFonts w:ascii="Arial" w:eastAsia="Times New Roman" w:hAnsi="Arial" w:cs="Arial"/>
-          <w:color w:val="000000" w:themeColor="text1"/>
-          <w:sz w:val="24"/>
-          <w:szCs w:val="24"/>
-          <w:lang w:eastAsia="it-IT"/>
-        </w:rPr>
-        <w:t xml:space="preserve"> → Invia stato tensione</w:t>
-      </w:r>
-    </w:p>
-    <w:p>
-      <w:pPr>
-        <w:spacing w:after="0" w:line="330" w:lineRule="atLeast"/>
-        <w:ind w:left="708"/>
-        <w:rPr>
-          <w:rFonts w:ascii="Arial" w:eastAsia="Times New Roman" w:hAnsi="Arial" w:cs="Arial"/>
-          <w:color w:val="000000" w:themeColor="text1"/>
-          <w:sz w:val="24"/>
-          <w:szCs w:val="24"/>
-          <w:lang w:eastAsia="it-IT"/>
-        </w:rPr>
-      </w:pPr>
-    </w:p>
-    <w:p>
-      <w:pPr>
-        <w:spacing w:after="0" w:line="330" w:lineRule="atLeast"/>
-        <w:ind w:left="708"/>
-        <w:rPr>
-          <w:rFonts w:ascii="Arial" w:eastAsia="Times New Roman" w:hAnsi="Arial" w:cs="Arial"/>
-          <w:color w:val="000000" w:themeColor="text1"/>
-          <w:sz w:val="24"/>
-          <w:szCs w:val="24"/>
-          <w:lang w:eastAsia="it-IT"/>
-        </w:rPr>
-      </w:pPr>
-      <w:r>
-        <w:rPr>
-          <w:rFonts w:ascii="Arial" w:eastAsia="Times New Roman" w:hAnsi="Arial" w:cs="Arial"/>
-          <w:color w:val="000000" w:themeColor="text1"/>
-          <w:sz w:val="24"/>
-          <w:szCs w:val="24"/>
-          <w:lang w:eastAsia="it-IT"/>
-        </w:rPr>
-        <w:t xml:space="preserve">- </w:t>
-      </w:r>
-      <w:r>
-        <w:rPr>
-          <w:rFonts w:ascii="Arial" w:eastAsia="Times New Roman" w:hAnsi="Arial" w:cs="Arial"/>
-          <w:b/>
-          <w:bCs/>
-          <w:color w:val="000000" w:themeColor="text1"/>
-          <w:sz w:val="24"/>
-          <w:szCs w:val="24"/>
-          <w:lang w:eastAsia="it-IT"/>
-        </w:rPr>
-        <w:t>E</w:t>
-      </w:r>
-      <w:r>
-        <w:rPr>
-          <w:rFonts w:ascii="Arial" w:eastAsia="Times New Roman" w:hAnsi="Arial" w:cs="Arial"/>
-          <w:color w:val="000000" w:themeColor="text1"/>
-          <w:sz w:val="24"/>
-          <w:szCs w:val="24"/>
-          <w:lang w:eastAsia="it-IT"/>
-        </w:rPr>
-        <w:t xml:space="preserve"> → Comando riservato, cancella tutti i numeri</w:t>
-      </w:r>
-    </w:p>
-    <w:p>
-      <w:pPr>
-        <w:spacing w:after="0" w:line="330" w:lineRule="atLeast"/>
-        <w:ind w:left="708"/>
-        <w:rPr>
-          <w:rFonts w:ascii="Arial" w:eastAsia="Times New Roman" w:hAnsi="Arial" w:cs="Arial"/>
-          <w:color w:val="000000" w:themeColor="text1"/>
-          <w:sz w:val="24"/>
-          <w:szCs w:val="24"/>
-          <w:lang w:eastAsia="it-IT"/>
-        </w:rPr>
-      </w:pPr>
-    </w:p>
-    <w:p>
-      <w:pPr>
-        <w:spacing w:after="0" w:line="330" w:lineRule="atLeast"/>
-        <w:ind w:left="708"/>
-        <w:rPr>
-          <w:rFonts w:ascii="Arial" w:eastAsia="Times New Roman" w:hAnsi="Arial" w:cs="Arial"/>
-          <w:color w:val="000000" w:themeColor="text1"/>
-          <w:sz w:val="24"/>
-          <w:szCs w:val="24"/>
-          <w:lang w:eastAsia="it-IT"/>
-        </w:rPr>
-      </w:pPr>
-      <w:r>
-        <w:rPr>
-          <w:rFonts w:ascii="Arial" w:eastAsia="Times New Roman" w:hAnsi="Arial" w:cs="Arial"/>
-          <w:color w:val="000000" w:themeColor="text1"/>
-          <w:sz w:val="24"/>
-          <w:szCs w:val="24"/>
-          <w:lang w:eastAsia="it-IT"/>
-        </w:rPr>
-        <w:t>- Salva e legge i numeri autorizzati su EEPROM per persistenza</w:t>
-      </w:r>
-      <w:r>
-        <w:rPr>
-          <w:rFonts w:ascii="Arial" w:eastAsia="Times New Roman" w:hAnsi="Arial" w:cs="Arial"/>
-          <w:color w:val="000000" w:themeColor="text1"/>
-          <w:sz w:val="24"/>
-          <w:szCs w:val="24"/>
-          <w:lang w:eastAsia="it-IT"/>
-        </w:rPr>
-        <w:t>,</w:t>
+        <w:t>Comandi SMS</w:t>
+      </w:r>
+    </w:p>
+    <w:p>
+      <w:pPr>
+        <w:spacing w:after="0" w:line="330" w:lineRule="atLeast"/>
+        <w:rPr>
+          <w:rFonts w:ascii="Arial" w:eastAsia="Times New Roman" w:hAnsi="Arial" w:cs="Arial"/>
+          <w:b/>
+          <w:bCs/>
+          <w:color w:val="000000" w:themeColor="text1"/>
+          <w:sz w:val="24"/>
+          <w:szCs w:val="24"/>
+          <w:lang w:eastAsia="it-IT"/>
+        </w:rPr>
+      </w:pPr>
+    </w:p>
+    <w:p>
+      <w:pPr>
+        <w:spacing w:after="0" w:line="330" w:lineRule="atLeast"/>
+        <w:rPr>
+          <w:rFonts w:ascii="Arial" w:eastAsia="Times New Roman" w:hAnsi="Arial" w:cs="Arial"/>
+          <w:b/>
+          <w:bCs/>
+          <w:color w:val="000000" w:themeColor="text1"/>
+          <w:sz w:val="24"/>
+          <w:szCs w:val="24"/>
+          <w:lang w:eastAsia="it-IT"/>
+        </w:rPr>
+      </w:pPr>
+      <w:r>
+        <w:rPr>
+          <w:rFonts w:ascii="Arial" w:eastAsia="Times New Roman" w:hAnsi="Arial" w:cs="Arial"/>
+          <w:b/>
+          <w:bCs/>
+          <w:color w:val="000000" w:themeColor="text1"/>
+          <w:sz w:val="24"/>
+          <w:szCs w:val="24"/>
+          <w:lang w:eastAsia="it-IT"/>
+        </w:rPr>
+        <w:t xml:space="preserve">  Numeri GSM </w:t>
+      </w:r>
+    </w:p>
+    <w:p>
+      <w:pPr>
+        <w:spacing w:after="0" w:line="330" w:lineRule="atLeast"/>
+        <w:rPr>
+          <w:rFonts w:ascii="Arial" w:eastAsia="Times New Roman" w:hAnsi="Arial" w:cs="Arial"/>
+          <w:color w:val="000000" w:themeColor="text1"/>
+          <w:sz w:val="24"/>
+          <w:szCs w:val="24"/>
+          <w:lang w:eastAsia="it-IT"/>
+        </w:rPr>
+      </w:pPr>
+      <w:r>
+        <w:rPr>
+          <w:rFonts w:ascii="Arial" w:eastAsia="Times New Roman" w:hAnsi="Arial" w:cs="Arial"/>
+          <w:color w:val="000000" w:themeColor="text1"/>
+          <w:sz w:val="24"/>
+          <w:szCs w:val="24"/>
+          <w:lang w:eastAsia="it-IT"/>
+        </w:rPr>
+        <w:t>  Italia    totale cifre 12 senza +</w:t>
+      </w:r>
+    </w:p>
+    <w:p>
+      <w:pPr>
+        <w:spacing w:after="0" w:line="330" w:lineRule="atLeast"/>
+        <w:rPr>
+          <w:rFonts w:ascii="Arial" w:eastAsia="Times New Roman" w:hAnsi="Arial" w:cs="Arial"/>
+          <w:color w:val="000000" w:themeColor="text1"/>
+          <w:sz w:val="24"/>
+          <w:szCs w:val="24"/>
+          <w:lang w:eastAsia="it-IT"/>
+        </w:rPr>
+      </w:pPr>
+      <w:r>
+        <w:rPr>
+          <w:rFonts w:ascii="Arial" w:eastAsia="Times New Roman" w:hAnsi="Arial" w:cs="Arial"/>
+          <w:color w:val="000000" w:themeColor="text1"/>
+          <w:sz w:val="24"/>
+          <w:szCs w:val="24"/>
+          <w:lang w:eastAsia="it-IT"/>
+        </w:rPr>
+        <w:t xml:space="preserve">  </w:t>
+      </w:r>
+      <w:proofErr w:type="gramStart"/>
+      <w:r>
+        <w:rPr>
+          <w:rFonts w:ascii="Arial" w:eastAsia="Times New Roman" w:hAnsi="Arial" w:cs="Arial"/>
+          <w:color w:val="000000" w:themeColor="text1"/>
+          <w:sz w:val="24"/>
+          <w:szCs w:val="24"/>
+          <w:lang w:eastAsia="it-IT"/>
+        </w:rPr>
+        <w:t>Germania  totale</w:t>
+      </w:r>
+      <w:proofErr w:type="gramEnd"/>
+      <w:r>
+        <w:rPr>
+          <w:rFonts w:ascii="Arial" w:eastAsia="Times New Roman" w:hAnsi="Arial" w:cs="Arial"/>
+          <w:color w:val="000000" w:themeColor="text1"/>
+          <w:sz w:val="24"/>
+          <w:szCs w:val="24"/>
+          <w:lang w:eastAsia="it-IT"/>
+        </w:rPr>
+        <w:t xml:space="preserve"> cifre 13 senza +</w:t>
+      </w:r>
+    </w:p>
+    <w:p>
+      <w:pPr>
+        <w:spacing w:after="0" w:line="330" w:lineRule="atLeast"/>
+        <w:rPr>
+          <w:rFonts w:ascii="Arial" w:eastAsia="Times New Roman" w:hAnsi="Arial" w:cs="Arial"/>
+          <w:color w:val="000000" w:themeColor="text1"/>
+          <w:sz w:val="24"/>
+          <w:szCs w:val="24"/>
+          <w:lang w:eastAsia="it-IT"/>
+        </w:rPr>
+      </w:pPr>
+      <w:r>
+        <w:rPr>
+          <w:rFonts w:ascii="Arial" w:eastAsia="Times New Roman" w:hAnsi="Arial" w:cs="Arial"/>
+          <w:color w:val="000000" w:themeColor="text1"/>
+          <w:sz w:val="24"/>
+          <w:szCs w:val="24"/>
+          <w:lang w:eastAsia="it-IT"/>
+        </w:rPr>
+        <w:t>  Svezia    totale cifre 11 senza +</w:t>
+      </w:r>
+    </w:p>
+    <w:p>
+      <w:pPr>
+        <w:spacing w:after="0" w:line="330" w:lineRule="atLeast"/>
+        <w:rPr>
+          <w:rFonts w:ascii="Arial" w:eastAsia="Times New Roman" w:hAnsi="Arial" w:cs="Arial"/>
+          <w:color w:val="000000" w:themeColor="text1"/>
+          <w:sz w:val="24"/>
+          <w:szCs w:val="24"/>
+          <w:lang w:eastAsia="it-IT"/>
+        </w:rPr>
+      </w:pPr>
+      <w:r>
+        <w:rPr>
+          <w:rFonts w:ascii="Arial" w:eastAsia="Times New Roman" w:hAnsi="Arial" w:cs="Arial"/>
+          <w:color w:val="000000" w:themeColor="text1"/>
+          <w:sz w:val="24"/>
+          <w:szCs w:val="24"/>
+          <w:lang w:eastAsia="it-IT"/>
+        </w:rPr>
+        <w:t>  Finlandia totale cifre 10 senza +</w:t>
+      </w:r>
+    </w:p>
+    <w:p>
+      <w:pPr>
+        <w:spacing w:after="0" w:line="330" w:lineRule="atLeast"/>
+        <w:rPr>
+          <w:rFonts w:ascii="Arial" w:eastAsia="Times New Roman" w:hAnsi="Arial" w:cs="Arial"/>
+          <w:color w:val="000000" w:themeColor="text1"/>
+          <w:sz w:val="24"/>
+          <w:szCs w:val="24"/>
+          <w:lang w:eastAsia="it-IT"/>
+        </w:rPr>
+      </w:pPr>
+    </w:p>
+    <w:p>
+      <w:pPr>
+        <w:spacing w:after="0" w:line="330" w:lineRule="atLeast"/>
+        <w:rPr>
+          <w:rFonts w:ascii="Arial" w:eastAsia="Times New Roman" w:hAnsi="Arial" w:cs="Arial"/>
+          <w:color w:val="000000" w:themeColor="text1"/>
+          <w:sz w:val="24"/>
+          <w:szCs w:val="24"/>
+          <w:lang w:eastAsia="it-IT"/>
+        </w:rPr>
+      </w:pPr>
+      <w:r>
+        <w:rPr>
+          <w:rFonts w:ascii="Arial" w:eastAsia="Times New Roman" w:hAnsi="Arial" w:cs="Arial"/>
+          <w:color w:val="000000" w:themeColor="text1"/>
+          <w:sz w:val="24"/>
+          <w:szCs w:val="24"/>
+          <w:lang w:eastAsia="it-IT"/>
+        </w:rPr>
+        <w:t>Prima di scrivere in EEPROM il numero viene validato per il corretto formato/lunghezza</w:t>
       </w:r>
     </w:p>
     <w:p>
@@ -1572,6 +2134,7 @@
                 <w:lang w:eastAsia="it-IT"/>
               </w:rPr>
             </w:pPr>
+            <w:proofErr w:type="spellStart"/>
             <w:r>
               <w:rPr>
                 <w:rFonts w:ascii="Arial" w:eastAsia="Times New Roman" w:hAnsi="Arial" w:cs="Arial"/>
@@ -1582,6 +2145,7 @@
               </w:rPr>
               <w:t>Command</w:t>
             </w:r>
+            <w:proofErr w:type="spellEnd"/>
           </w:p>
         </w:tc>
         <w:tc>
@@ -1679,7 +2243,6 @@
           <w:p>
             <w:pPr>
               <w:spacing w:line="330" w:lineRule="atLeast"/>
-              <w:jc w:val="center"/>
               <w:rPr>
                 <w:rFonts w:ascii="Arial" w:eastAsia="Times New Roman" w:hAnsi="Arial" w:cs="Arial"/>
                 <w:color w:val="FFFFFF" w:themeColor="background1"/>
@@ -2002,7 +2565,51 @@
                 <w:szCs w:val="24"/>
                 <w:lang w:val="en-US" w:eastAsia="it-IT"/>
               </w:rPr>
-              <w:t>Delete in EEPROM and phoneAut auxiliaries phone numbers except the Authorized MASTER[0]</w:t>
+              <w:t xml:space="preserve">Delete in EEPROM and </w:t>
+            </w:r>
+            <w:proofErr w:type="spellStart"/>
+            <w:r>
+              <w:rPr>
+                <w:rFonts w:ascii="Arial" w:eastAsia="Times New Roman" w:hAnsi="Arial" w:cs="Arial"/>
+                <w:color w:val="000000" w:themeColor="text1"/>
+                <w:sz w:val="24"/>
+                <w:szCs w:val="24"/>
+                <w:lang w:val="en-US" w:eastAsia="it-IT"/>
+              </w:rPr>
+              <w:t>phoneAut</w:t>
+            </w:r>
+            <w:proofErr w:type="spellEnd"/>
+            <w:r>
+              <w:rPr>
+                <w:rFonts w:ascii="Arial" w:eastAsia="Times New Roman" w:hAnsi="Arial" w:cs="Arial"/>
+                <w:color w:val="000000" w:themeColor="text1"/>
+                <w:sz w:val="24"/>
+                <w:szCs w:val="24"/>
+                <w:lang w:val="en-US" w:eastAsia="it-IT"/>
+              </w:rPr>
+              <w:t xml:space="preserve"> auxiliaries phone numbers except the Authorized </w:t>
+            </w:r>
+            <w:proofErr w:type="gramStart"/>
+            <w:r>
+              <w:rPr>
+                <w:rFonts w:ascii="Arial" w:eastAsia="Times New Roman" w:hAnsi="Arial" w:cs="Arial"/>
+                <w:color w:val="000000" w:themeColor="text1"/>
+                <w:sz w:val="24"/>
+                <w:szCs w:val="24"/>
+                <w:lang w:val="en-US" w:eastAsia="it-IT"/>
+              </w:rPr>
+              <w:t>MASTER[</w:t>
+            </w:r>
+            <w:proofErr w:type="gramEnd"/>
+            <w:r>
+              <w:rPr>
+                <w:rFonts w:ascii="Arial" w:eastAsia="Times New Roman" w:hAnsi="Arial" w:cs="Arial"/>
+                <w:color w:val="000000" w:themeColor="text1"/>
+                <w:sz w:val="24"/>
+                <w:szCs w:val="24"/>
+                <w:lang w:val="en-US" w:eastAsia="it-IT"/>
+              </w:rPr>
+              <w:t>0]</w:t>
             </w:r>
           </w:p>
           <w:p>
@@ -2155,8 +2762,20 @@
                 <w:szCs w:val="24"/>
                 <w:lang w:eastAsia="it-IT"/>
               </w:rPr>
-              <w:t>AGGIUNGI/SOSTITUISCI cellulare AUSILIARIO in posizione....</w:t>
+              <w:t xml:space="preserve">AGGIUNGI/SOSTITUISCI cellulare AUSILIARIO in </w:t>
             </w:r>
+            <w:proofErr w:type="gramStart"/>
+            <w:r>
+              <w:rPr>
+                <w:rFonts w:ascii="Arial" w:eastAsia="Times New Roman" w:hAnsi="Arial" w:cs="Arial"/>
+                <w:color w:val="000000" w:themeColor="text1"/>
+                <w:sz w:val="24"/>
+                <w:szCs w:val="24"/>
+                <w:lang w:eastAsia="it-IT"/>
+              </w:rPr>
+              <w:t>posizione....</w:t>
+            </w:r>
+            <w:proofErr w:type="gramEnd"/>
           </w:p>
         </w:tc>
       </w:tr>
@@ -2440,7 +3059,6 @@
           <w:p>
             <w:pPr>
               <w:spacing w:line="330" w:lineRule="atLeast"/>
-              <w:jc w:val="center"/>
               <w:rPr>
                 <w:rFonts w:ascii="Arial" w:eastAsia="Times New Roman" w:hAnsi="Arial" w:cs="Arial"/>
                 <w:color w:val="000000" w:themeColor="text1"/>
@@ -2467,8 +3085,31 @@
                 <w:szCs w:val="24"/>
                 <w:lang w:eastAsia="it-IT"/>
               </w:rPr>
-              <w:t>Cancella tutti i numeri</w:t>
+              <w:t>Cancella tutti i numeri incluso il Master - Accetta qualsiasi numero</w:t>
             </w:r>
+            <w:r>
+              <w:rPr>
+                <w:rFonts w:ascii="Arial" w:eastAsia="Times New Roman" w:hAnsi="Arial" w:cs="Arial"/>
+                <w:color w:val="000000" w:themeColor="text1"/>
+                <w:sz w:val="24"/>
+                <w:szCs w:val="24"/>
+                <w:lang w:eastAsia="it-IT"/>
+              </w:rPr>
+              <w:t xml:space="preserve"> </w:t>
+            </w:r>
+          </w:p>
+          <w:p>
+            <w:pPr>
+              <w:spacing w:line="330" w:lineRule="atLeast"/>
+              <w:jc w:val="center"/>
+              <w:rPr>
+                <w:rFonts w:ascii="Arial" w:eastAsia="Times New Roman" w:hAnsi="Arial" w:cs="Arial"/>
+                <w:color w:val="000000" w:themeColor="text1"/>
+                <w:sz w:val="24"/>
+                <w:szCs w:val="24"/>
+                <w:lang w:eastAsia="it-IT"/>
+              </w:rPr>
+            </w:pPr>
           </w:p>
           <w:p>
             <w:pPr>
@@ -2877,20 +3518,6 @@
     </w:p>
     <w:p>
       <w:pPr>
-        <w:spacing w:after="240" w:line="330" w:lineRule="atLeast"/>
-        <w:rPr>
-          <w:rFonts w:ascii="Arial" w:eastAsia="Times New Roman" w:hAnsi="Arial" w:cs="Arial"/>
-          <w:color w:val="000000" w:themeColor="text1"/>
-          <w:sz w:val="24"/>
-          <w:szCs w:val="24"/>
-          <w:lang w:eastAsia="it-IT"/>
-        </w:rPr>
-      </w:pPr>
-    </w:p>
-    <w:p>
-      <w:pPr>
-        <w:spacing w:after="0" w:line="330" w:lineRule="atLeast"/>
-        <w:jc w:val="center"/>
         <w:rPr>
           <w:rFonts w:ascii="Arial" w:eastAsia="Times New Roman" w:hAnsi="Arial" w:cs="Arial"/>
           <w:b/>
@@ -2911,148 +3538,37 @@
           <w:szCs w:val="28"/>
           <w:lang w:eastAsia="it-IT"/>
         </w:rPr>
-        <w:t>Comandi SMS</w:t>
-      </w:r>
-    </w:p>
-    <w:p>
-      <w:pPr>
-        <w:spacing w:after="0" w:line="330" w:lineRule="atLeast"/>
-        <w:rPr>
-          <w:rFonts w:ascii="Arial" w:eastAsia="Times New Roman" w:hAnsi="Arial" w:cs="Arial"/>
-          <w:b/>
-          <w:bCs/>
-          <w:color w:val="000000" w:themeColor="text1"/>
-          <w:sz w:val="24"/>
-          <w:szCs w:val="24"/>
-          <w:lang w:eastAsia="it-IT"/>
-        </w:rPr>
-      </w:pPr>
-    </w:p>
-    <w:p>
-      <w:pPr>
-        <w:spacing w:after="0" w:line="330" w:lineRule="atLeast"/>
-        <w:rPr>
-          <w:rFonts w:ascii="Arial" w:eastAsia="Times New Roman" w:hAnsi="Arial" w:cs="Arial"/>
-          <w:b/>
-          <w:bCs/>
-          <w:color w:val="000000" w:themeColor="text1"/>
-          <w:sz w:val="24"/>
-          <w:szCs w:val="24"/>
-          <w:lang w:eastAsia="it-IT"/>
-        </w:rPr>
-      </w:pPr>
-      <w:r>
-        <w:rPr>
-          <w:rFonts w:ascii="Arial" w:eastAsia="Times New Roman" w:hAnsi="Arial" w:cs="Arial"/>
-          <w:b/>
-          <w:bCs/>
-          <w:color w:val="000000" w:themeColor="text1"/>
-          <w:sz w:val="24"/>
-          <w:szCs w:val="24"/>
-          <w:lang w:eastAsia="it-IT"/>
-        </w:rPr>
-        <w:t xml:space="preserve">  Numeri GSM </w:t>
-      </w:r>
-    </w:p>
-    <w:p>
-      <w:pPr>
-        <w:spacing w:after="0" w:line="330" w:lineRule="atLeast"/>
-        <w:rPr>
-          <w:rFonts w:ascii="Arial" w:eastAsia="Times New Roman" w:hAnsi="Arial" w:cs="Arial"/>
-          <w:color w:val="000000" w:themeColor="text1"/>
-          <w:sz w:val="24"/>
-          <w:szCs w:val="24"/>
-          <w:lang w:eastAsia="it-IT"/>
-        </w:rPr>
-      </w:pPr>
-      <w:r>
-        <w:rPr>
-          <w:rFonts w:ascii="Arial" w:eastAsia="Times New Roman" w:hAnsi="Arial" w:cs="Arial"/>
-          <w:color w:val="000000" w:themeColor="text1"/>
-          <w:sz w:val="24"/>
-          <w:szCs w:val="24"/>
-          <w:lang w:eastAsia="it-IT"/>
-        </w:rPr>
-        <w:t>  Italia    totale cifre 12 senza +</w:t>
-      </w:r>
-    </w:p>
-    <w:p>
-      <w:pPr>
-        <w:spacing w:after="0" w:line="330" w:lineRule="atLeast"/>
-        <w:rPr>
-          <w:rFonts w:ascii="Arial" w:eastAsia="Times New Roman" w:hAnsi="Arial" w:cs="Arial"/>
-          <w:color w:val="000000" w:themeColor="text1"/>
-          <w:sz w:val="24"/>
-          <w:szCs w:val="24"/>
-          <w:lang w:eastAsia="it-IT"/>
-        </w:rPr>
-      </w:pPr>
-      <w:r>
-        <w:rPr>
-          <w:rFonts w:ascii="Arial" w:eastAsia="Times New Roman" w:hAnsi="Arial" w:cs="Arial"/>
-          <w:color w:val="000000" w:themeColor="text1"/>
-          <w:sz w:val="24"/>
-          <w:szCs w:val="24"/>
-          <w:lang w:eastAsia="it-IT"/>
-        </w:rPr>
-        <w:t>  Germania  totale cifre 13 senza +</w:t>
-      </w:r>
-    </w:p>
-    <w:p>
-      <w:pPr>
-        <w:spacing w:after="0" w:line="330" w:lineRule="atLeast"/>
-        <w:rPr>
-          <w:rFonts w:ascii="Arial" w:eastAsia="Times New Roman" w:hAnsi="Arial" w:cs="Arial"/>
-          <w:color w:val="000000" w:themeColor="text1"/>
-          <w:sz w:val="24"/>
-          <w:szCs w:val="24"/>
-          <w:lang w:eastAsia="it-IT"/>
-        </w:rPr>
-      </w:pPr>
-      <w:r>
-        <w:rPr>
-          <w:rFonts w:ascii="Arial" w:eastAsia="Times New Roman" w:hAnsi="Arial" w:cs="Arial"/>
-          <w:color w:val="000000" w:themeColor="text1"/>
-          <w:sz w:val="24"/>
-          <w:szCs w:val="24"/>
-          <w:lang w:eastAsia="it-IT"/>
-        </w:rPr>
-        <w:t>  Svezia    totale cifre 11 senza +</w:t>
-      </w:r>
-    </w:p>
-    <w:p>
-      <w:pPr>
-        <w:spacing w:after="0" w:line="330" w:lineRule="atLeast"/>
-        <w:rPr>
-          <w:rFonts w:ascii="Arial" w:eastAsia="Times New Roman" w:hAnsi="Arial" w:cs="Arial"/>
-          <w:color w:val="000000" w:themeColor="text1"/>
-          <w:sz w:val="24"/>
-          <w:szCs w:val="24"/>
-          <w:lang w:eastAsia="it-IT"/>
-        </w:rPr>
-      </w:pPr>
-      <w:r>
-        <w:rPr>
-          <w:rFonts w:ascii="Arial" w:eastAsia="Times New Roman" w:hAnsi="Arial" w:cs="Arial"/>
-          <w:color w:val="000000" w:themeColor="text1"/>
-          <w:sz w:val="24"/>
-          <w:szCs w:val="24"/>
-          <w:lang w:eastAsia="it-IT"/>
-        </w:rPr>
-        <w:t>  Finlandia totale cifre 10 senza +</w:t>
-      </w:r>
-    </w:p>
-    <w:p>
-      <w:pPr>
-        <w:spacing w:after="0" w:line="330" w:lineRule="atLeast"/>
-        <w:rPr>
-          <w:rFonts w:ascii="Arial" w:eastAsia="Times New Roman" w:hAnsi="Arial" w:cs="Arial"/>
-          <w:color w:val="000000" w:themeColor="text1"/>
-          <w:sz w:val="24"/>
-          <w:szCs w:val="24"/>
-          <w:lang w:eastAsia="it-IT"/>
-        </w:rPr>
-      </w:pPr>
+        <w:br w:type="page"/>
+      </w:r>
+    </w:p>
+    <w:p>
+      <w:pPr>
+        <w:spacing w:after="0" w:line="330" w:lineRule="atLeast"/>
+        <w:jc w:val="center"/>
+        <w:rPr>
+          <w:rFonts w:ascii="Arial" w:eastAsia="Times New Roman" w:hAnsi="Arial" w:cs="Arial"/>
+          <w:b/>
+          <w:bCs/>
+          <w:color w:val="000000" w:themeColor="text1"/>
+          <w:sz w:val="32"/>
+          <w:szCs w:val="32"/>
+          <w:u w:val="single"/>
+          <w:lang w:eastAsia="it-IT"/>
+        </w:rPr>
+      </w:pPr>
+      <w:r>
+        <w:rPr>
+          <w:rFonts w:ascii="Arial" w:eastAsia="Times New Roman" w:hAnsi="Arial" w:cs="Arial"/>
+          <w:b/>
+          <w:bCs/>
+          <w:color w:val="000000" w:themeColor="text1"/>
+          <w:sz w:val="32"/>
+          <w:szCs w:val="32"/>
+          <w:lang w:eastAsia="it-IT"/>
+        </w:rPr>
+        <w:lastRenderedPageBreak/>
+        <w:t>Indicazioni generali</w:t>
+      </w:r>
     </w:p>
     <w:p>
       <w:pPr>
@@ -3075,249 +3591,39 @@
         </w:rPr>
         <w:t xml:space="preserve">  </w:t>
       </w:r>
-      <w:r>
-        <w:rPr>
-          <w:rFonts w:ascii="Arial" w:eastAsia="Times New Roman" w:hAnsi="Arial" w:cs="Arial"/>
-          <w:b/>
-          <w:bCs/>
-          <w:color w:val="000000" w:themeColor="text1"/>
-          <w:sz w:val="24"/>
-          <w:szCs w:val="24"/>
-          <w:lang w:eastAsia="it-IT"/>
-        </w:rPr>
-        <w:t xml:space="preserve">"M+393391255597" </w:t>
-      </w:r>
-      <w:r>
-        <w:rPr>
-          <w:rFonts w:ascii="Arial" w:eastAsia="Times New Roman" w:hAnsi="Arial" w:cs="Arial"/>
-          <w:color w:val="000000" w:themeColor="text1"/>
-          <w:sz w:val="24"/>
-          <w:szCs w:val="24"/>
-          <w:lang w:eastAsia="it-IT"/>
-        </w:rPr>
-        <w:t>Sostituisci cellulare autorizzato Master con un altro</w:t>
-      </w:r>
-    </w:p>
-    <w:p>
-      <w:pPr>
-        <w:spacing w:after="0" w:line="330" w:lineRule="atLeast"/>
-        <w:rPr>
-          <w:rFonts w:ascii="Arial" w:eastAsia="Times New Roman" w:hAnsi="Arial" w:cs="Arial"/>
-          <w:color w:val="000000" w:themeColor="text1"/>
-          <w:sz w:val="24"/>
-          <w:szCs w:val="24"/>
-          <w:lang w:eastAsia="it-IT"/>
-        </w:rPr>
-      </w:pPr>
-      <w:r>
-        <w:rPr>
-          <w:rFonts w:ascii="Arial" w:eastAsia="Times New Roman" w:hAnsi="Arial" w:cs="Arial"/>
-          <w:color w:val="000000" w:themeColor="text1"/>
-          <w:sz w:val="24"/>
-          <w:szCs w:val="24"/>
-          <w:lang w:eastAsia="it-IT"/>
-        </w:rPr>
-        <w:t xml:space="preserve">  </w:t>
-      </w:r>
-      <w:r>
-        <w:rPr>
-          <w:rFonts w:ascii="Arial" w:eastAsia="Times New Roman" w:hAnsi="Arial" w:cs="Arial"/>
-          <w:b/>
-          <w:bCs/>
-          <w:color w:val="000000" w:themeColor="text1"/>
-          <w:sz w:val="24"/>
-          <w:szCs w:val="24"/>
-          <w:lang w:eastAsia="it-IT"/>
-        </w:rPr>
-        <w:t>"A1+393391255597"</w:t>
-      </w:r>
-      <w:r>
-        <w:rPr>
-          <w:rFonts w:ascii="Arial" w:eastAsia="Times New Roman" w:hAnsi="Arial" w:cs="Arial"/>
-          <w:color w:val="000000" w:themeColor="text1"/>
-          <w:sz w:val="24"/>
-          <w:szCs w:val="24"/>
-          <w:lang w:eastAsia="it-IT"/>
-        </w:rPr>
-        <w:t xml:space="preserve"> AGGIUNGI/SOSTITUISCI cellulare in posizione....</w:t>
-      </w:r>
-    </w:p>
-    <w:p>
-      <w:pPr>
-        <w:spacing w:after="0" w:line="330" w:lineRule="atLeast"/>
-        <w:rPr>
-          <w:rFonts w:ascii="Arial" w:eastAsia="Times New Roman" w:hAnsi="Arial" w:cs="Arial"/>
-          <w:color w:val="000000" w:themeColor="text1"/>
-          <w:sz w:val="24"/>
-          <w:szCs w:val="24"/>
-          <w:lang w:eastAsia="it-IT"/>
-        </w:rPr>
-      </w:pPr>
-      <w:r>
-        <w:rPr>
-          <w:rFonts w:ascii="Arial" w:eastAsia="Times New Roman" w:hAnsi="Arial" w:cs="Arial"/>
-          <w:color w:val="000000" w:themeColor="text1"/>
-          <w:sz w:val="24"/>
-          <w:szCs w:val="24"/>
-          <w:lang w:eastAsia="it-IT"/>
-        </w:rPr>
-        <w:t xml:space="preserve">  </w:t>
-      </w:r>
-      <w:r>
-        <w:rPr>
-          <w:rFonts w:ascii="Arial" w:eastAsia="Times New Roman" w:hAnsi="Arial" w:cs="Arial"/>
-          <w:b/>
-          <w:bCs/>
-          <w:color w:val="000000" w:themeColor="text1"/>
-          <w:sz w:val="24"/>
-          <w:szCs w:val="24"/>
-          <w:lang w:eastAsia="it-IT"/>
-        </w:rPr>
-        <w:t xml:space="preserve">"D" </w:t>
-      </w:r>
-      <w:r>
-        <w:rPr>
-          <w:rFonts w:ascii="Arial" w:eastAsia="Times New Roman" w:hAnsi="Arial" w:cs="Arial"/>
-          <w:color w:val="000000" w:themeColor="text1"/>
-          <w:sz w:val="24"/>
-          <w:szCs w:val="24"/>
-          <w:lang w:eastAsia="it-IT"/>
-        </w:rPr>
-        <w:t>CANCELLA tutti i cellulari ausiliari (non il Master)</w:t>
-      </w:r>
-    </w:p>
-    <w:p>
-      <w:pPr>
-        <w:spacing w:after="0" w:line="330" w:lineRule="atLeast"/>
-        <w:rPr>
-          <w:rFonts w:ascii="Arial" w:eastAsia="Times New Roman" w:hAnsi="Arial" w:cs="Arial"/>
-          <w:color w:val="000000" w:themeColor="text1"/>
-          <w:sz w:val="24"/>
-          <w:szCs w:val="24"/>
-          <w:lang w:eastAsia="it-IT"/>
-        </w:rPr>
-      </w:pPr>
-    </w:p>
-    <w:p>
-      <w:pPr>
-        <w:spacing w:after="0" w:line="330" w:lineRule="atLeast"/>
-        <w:rPr>
-          <w:rFonts w:ascii="Arial" w:eastAsia="Times New Roman" w:hAnsi="Arial" w:cs="Arial"/>
-          <w:color w:val="000000" w:themeColor="text1"/>
-          <w:sz w:val="24"/>
-          <w:szCs w:val="24"/>
-          <w:lang w:eastAsia="it-IT"/>
-        </w:rPr>
-      </w:pPr>
-      <w:r>
-        <w:rPr>
-          <w:rFonts w:ascii="Arial" w:eastAsia="Times New Roman" w:hAnsi="Arial" w:cs="Arial"/>
-          <w:color w:val="000000" w:themeColor="text1"/>
-          <w:sz w:val="24"/>
-          <w:szCs w:val="24"/>
-          <w:lang w:eastAsia="it-IT"/>
-        </w:rPr>
-        <w:t xml:space="preserve">  </w:t>
-      </w:r>
-      <w:r>
-        <w:rPr>
-          <w:rFonts w:ascii="Arial" w:eastAsia="Times New Roman" w:hAnsi="Arial" w:cs="Arial"/>
-          <w:b/>
-          <w:bCs/>
-          <w:color w:val="000000" w:themeColor="text1"/>
-          <w:sz w:val="24"/>
-          <w:szCs w:val="24"/>
-          <w:lang w:eastAsia="it-IT"/>
-        </w:rPr>
-        <w:t xml:space="preserve">"N" </w:t>
-      </w:r>
-      <w:r>
-        <w:rPr>
-          <w:rFonts w:ascii="Arial" w:eastAsia="Times New Roman" w:hAnsi="Arial" w:cs="Arial"/>
-          <w:color w:val="000000" w:themeColor="text1"/>
-          <w:sz w:val="24"/>
-          <w:szCs w:val="24"/>
-          <w:lang w:eastAsia="it-IT"/>
-        </w:rPr>
-        <w:t>Elenca tutti i numeri autorizzati - solo per il Master</w:t>
-      </w:r>
-    </w:p>
-    <w:p>
-      <w:pPr>
-        <w:spacing w:after="0" w:line="330" w:lineRule="atLeast"/>
-        <w:rPr>
-          <w:rFonts w:ascii="Arial" w:eastAsia="Times New Roman" w:hAnsi="Arial" w:cs="Arial"/>
-          <w:color w:val="000000" w:themeColor="text1"/>
-          <w:sz w:val="24"/>
-          <w:szCs w:val="24"/>
-          <w:lang w:eastAsia="it-IT"/>
-        </w:rPr>
-      </w:pPr>
-      <w:r>
-        <w:rPr>
-          <w:rFonts w:ascii="Arial" w:eastAsia="Times New Roman" w:hAnsi="Arial" w:cs="Arial"/>
-          <w:color w:val="000000" w:themeColor="text1"/>
-          <w:sz w:val="24"/>
-          <w:szCs w:val="24"/>
-          <w:lang w:eastAsia="it-IT"/>
-        </w:rPr>
-        <w:t xml:space="preserve">  </w:t>
-      </w:r>
-      <w:r>
-        <w:rPr>
-          <w:rFonts w:ascii="Arial" w:eastAsia="Times New Roman" w:hAnsi="Arial" w:cs="Arial"/>
-          <w:b/>
-          <w:bCs/>
-          <w:color w:val="000000" w:themeColor="text1"/>
-          <w:sz w:val="24"/>
-          <w:szCs w:val="24"/>
-          <w:lang w:eastAsia="it-IT"/>
-        </w:rPr>
-        <w:t>"E"</w:t>
-      </w:r>
-      <w:r>
-        <w:rPr>
-          <w:rFonts w:ascii="Arial" w:eastAsia="Times New Roman" w:hAnsi="Arial" w:cs="Arial"/>
-          <w:color w:val="000000" w:themeColor="text1"/>
-          <w:sz w:val="24"/>
-          <w:szCs w:val="24"/>
-          <w:lang w:eastAsia="it-IT"/>
-        </w:rPr>
-        <w:t xml:space="preserve"> Cancella tutti i numeri incluso il Master - NON DOCUMENTATO. Accetta qualsiasi numero.</w:t>
-      </w:r>
-    </w:p>
-    <w:p>
-      <w:pPr>
-        <w:spacing w:after="0" w:line="330" w:lineRule="atLeast"/>
-        <w:rPr>
-          <w:rFonts w:ascii="Arial" w:eastAsia="Times New Roman" w:hAnsi="Arial" w:cs="Arial"/>
-          <w:color w:val="000000" w:themeColor="text1"/>
-          <w:sz w:val="24"/>
-          <w:szCs w:val="24"/>
-          <w:lang w:eastAsia="it-IT"/>
-        </w:rPr>
-      </w:pPr>
-    </w:p>
-    <w:p>
-      <w:pPr>
-        <w:spacing w:after="0" w:line="330" w:lineRule="atLeast"/>
-        <w:rPr>
-          <w:rFonts w:ascii="Arial" w:eastAsia="Times New Roman" w:hAnsi="Arial" w:cs="Arial"/>
-          <w:color w:val="000000" w:themeColor="text1"/>
-          <w:sz w:val="24"/>
-          <w:szCs w:val="24"/>
-          <w:lang w:eastAsia="it-IT"/>
-        </w:rPr>
-      </w:pPr>
-      <w:r>
-        <w:rPr>
-          <w:rFonts w:ascii="Arial" w:eastAsia="Times New Roman" w:hAnsi="Arial" w:cs="Arial"/>
-          <w:color w:val="000000" w:themeColor="text1"/>
-          <w:sz w:val="24"/>
-          <w:szCs w:val="24"/>
-          <w:lang w:eastAsia="it-IT"/>
-        </w:rPr>
-        <w:t>  EEPROM.read(5) Indicatore Rete presente (0) Rete assente (1)</w:t>
+    </w:p>
+    <w:p>
+      <w:pPr>
+        <w:spacing w:after="0" w:line="330" w:lineRule="atLeast"/>
+        <w:rPr>
+          <w:rFonts w:ascii="Arial" w:eastAsia="Times New Roman" w:hAnsi="Arial" w:cs="Arial"/>
+          <w:color w:val="000000" w:themeColor="text1"/>
+          <w:sz w:val="24"/>
+          <w:szCs w:val="24"/>
+          <w:lang w:eastAsia="it-IT"/>
+        </w:rPr>
+      </w:pPr>
+      <w:proofErr w:type="spellStart"/>
+      <w:r>
+        <w:rPr>
+          <w:rFonts w:ascii="Arial" w:eastAsia="Times New Roman" w:hAnsi="Arial" w:cs="Arial"/>
+          <w:color w:val="000000" w:themeColor="text1"/>
+          <w:sz w:val="24"/>
+          <w:szCs w:val="24"/>
+          <w:lang w:eastAsia="it-IT"/>
+        </w:rPr>
+        <w:t>EEPROM.read</w:t>
+      </w:r>
+      <w:proofErr w:type="spellEnd"/>
+      <w:r>
+        <w:rPr>
+          <w:rFonts w:ascii="Arial" w:eastAsia="Times New Roman" w:hAnsi="Arial" w:cs="Arial"/>
+          <w:color w:val="000000" w:themeColor="text1"/>
+          <w:sz w:val="24"/>
+          <w:szCs w:val="24"/>
+          <w:lang w:eastAsia="it-IT"/>
+        </w:rPr>
+        <w:t>(5) Indicatore Rete presente (0) Rete assente (1)</w:t>
       </w:r>
     </w:p>
     <w:p>
@@ -3377,7 +3683,79 @@
           <w:szCs w:val="24"/>
           <w:lang w:eastAsia="it-IT"/>
         </w:rPr>
-        <w:t xml:space="preserve">  -  inizialmente la EEPROM non ha numeri (tutti "") </w:t>
+        <w:t>  -  inizialmente la EEPROM non ha numeri (tutti "")</w:t>
+      </w:r>
+    </w:p>
+    <w:p>
+      <w:pPr>
+        <w:spacing w:after="0" w:line="330" w:lineRule="atLeast"/>
+        <w:rPr>
+          <w:rFonts w:ascii="Arial" w:eastAsia="Times New Roman" w:hAnsi="Arial" w:cs="Arial"/>
+          <w:color w:val="A6A6A6" w:themeColor="background1" w:themeShade="A6"/>
+          <w:sz w:val="24"/>
+          <w:szCs w:val="24"/>
+          <w:lang w:eastAsia="it-IT"/>
+        </w:rPr>
+      </w:pPr>
+      <w:r>
+        <w:rPr>
+          <w:rFonts w:ascii="Arial" w:eastAsia="Times New Roman" w:hAnsi="Arial" w:cs="Arial"/>
+          <w:color w:val="A6A6A6" w:themeColor="background1" w:themeShade="A6"/>
+          <w:sz w:val="24"/>
+          <w:szCs w:val="24"/>
+          <w:lang w:eastAsia="it-IT"/>
+        </w:rPr>
+        <w:t>  -  Eventualmente dare</w:t>
+      </w:r>
+      <w:r>
+        <w:rPr>
+          <w:rFonts w:ascii="Arial" w:eastAsia="Times New Roman" w:hAnsi="Arial" w:cs="Arial"/>
+          <w:color w:val="A6A6A6" w:themeColor="background1" w:themeShade="A6"/>
+          <w:sz w:val="24"/>
+          <w:szCs w:val="24"/>
+          <w:lang w:eastAsia="it-IT"/>
+        </w:rPr>
+        <w:t xml:space="preserve"> </w:t>
+      </w:r>
+      <w:r>
+        <w:rPr>
+          <w:rFonts w:ascii="Arial" w:eastAsia="Times New Roman" w:hAnsi="Arial" w:cs="Arial"/>
+          <w:color w:val="A6A6A6" w:themeColor="background1" w:themeShade="A6"/>
+          <w:sz w:val="24"/>
+          <w:szCs w:val="24"/>
+          <w:lang w:eastAsia="it-IT"/>
+        </w:rPr>
+        <w:t>Comando E per ca</w:t>
+      </w:r>
+      <w:r>
+        <w:rPr>
+          <w:rFonts w:ascii="Arial" w:eastAsia="Times New Roman" w:hAnsi="Arial" w:cs="Arial"/>
+          <w:color w:val="A6A6A6" w:themeColor="background1" w:themeShade="A6"/>
+          <w:sz w:val="24"/>
+          <w:szCs w:val="24"/>
+          <w:lang w:eastAsia="it-IT"/>
+        </w:rPr>
+        <w:t>n</w:t>
+      </w:r>
+      <w:r>
+        <w:rPr>
+          <w:rFonts w:ascii="Arial" w:eastAsia="Times New Roman" w:hAnsi="Arial" w:cs="Arial"/>
+          <w:color w:val="A6A6A6" w:themeColor="background1" w:themeShade="A6"/>
+          <w:sz w:val="24"/>
+          <w:szCs w:val="24"/>
+          <w:lang w:eastAsia="it-IT"/>
+        </w:rPr>
+        <w:t>cellare tutti i numeri (Non documentato</w:t>
+      </w:r>
+      <w:r>
+        <w:rPr>
+          <w:rFonts w:ascii="Arial" w:eastAsia="Times New Roman" w:hAnsi="Arial" w:cs="Arial"/>
+          <w:color w:val="A6A6A6" w:themeColor="background1" w:themeShade="A6"/>
+          <w:sz w:val="24"/>
+          <w:szCs w:val="24"/>
+          <w:lang w:eastAsia="it-IT"/>
+        </w:rPr>
+        <w:t>)</w:t>
       </w:r>
     </w:p>
     <w:p>
@@ -3522,6 +3900,7 @@
         </w:rPr>
       </w:pPr>
       <w:hyperlink r:id="rId5" w:history="1">
+        <w:proofErr w:type="gramStart"/>
         <w:r>
           <w:rPr>
             <w:rFonts w:ascii="Segoe UI" w:eastAsia="Times New Roman" w:hAnsi="Segoe UI" w:cs="Segoe UI"/>
@@ -3532,169 +3911,9 @@
             <w:bdr w:val="single" w:sz="4" w:space="1" w:color="auto" w:frame="1"/>
             <w:lang w:eastAsia="it-IT"/>
           </w:rPr>
-          <w:t>setup()</w:t>
+          <w:t>setup(</w:t>
         </w:r>
-      </w:hyperlink>
-    </w:p>
-    <w:p>
-      <w:pPr>
-        <w:numPr>
-          <w:ilvl w:val="1"/>
-          <w:numId w:val="1"/>
-        </w:numPr>
-        <w:spacing w:before="60" w:after="60" w:line="240" w:lineRule="auto"/>
-        <w:rPr>
-          <w:rFonts w:ascii="Segoe UI" w:eastAsia="Times New Roman" w:hAnsi="Segoe UI" w:cs="Segoe UI"/>
-          <w:color w:val="000000" w:themeColor="text1"/>
-          <w:sz w:val="20"/>
-          <w:szCs w:val="20"/>
-          <w:lang w:eastAsia="it-IT"/>
-        </w:rPr>
-      </w:pPr>
-      <w:r>
-        <w:rPr>
-          <w:rFonts w:ascii="Segoe UI" w:eastAsia="Times New Roman" w:hAnsi="Segoe UI" w:cs="Segoe UI"/>
-          <w:color w:val="000000" w:themeColor="text1"/>
-          <w:sz w:val="20"/>
-          <w:szCs w:val="20"/>
-          <w:lang w:eastAsia="it-IT"/>
-        </w:rPr>
-        <w:t>inizializza reset pin</w:t>
-      </w:r>
-    </w:p>
-    <w:p>
-      <w:pPr>
-        <w:numPr>
-          <w:ilvl w:val="1"/>
-          <w:numId w:val="1"/>
-        </w:numPr>
-        <w:spacing w:after="0" w:line="240" w:lineRule="auto"/>
-        <w:rPr>
-          <w:rFonts w:ascii="Segoe UI" w:eastAsia="Times New Roman" w:hAnsi="Segoe UI" w:cs="Segoe UI"/>
-          <w:color w:val="000000" w:themeColor="text1"/>
-          <w:sz w:val="20"/>
-          <w:szCs w:val="20"/>
-          <w:lang w:eastAsia="it-IT"/>
-        </w:rPr>
-      </w:pPr>
-      <w:r>
-        <w:rPr>
-          <w:rFonts w:ascii="Segoe UI" w:eastAsia="Times New Roman" w:hAnsi="Segoe UI" w:cs="Segoe UI"/>
-          <w:color w:val="000000" w:themeColor="text1"/>
-          <w:sz w:val="20"/>
-          <w:szCs w:val="20"/>
-          <w:lang w:eastAsia="it-IT"/>
-        </w:rPr>
-        <w:t>chiama </w:t>
-      </w:r>
-      <w:hyperlink r:id="rId6" w:history="1">
-        <w:r>
-          <w:rPr>
-            <w:rFonts w:ascii="Segoe UI" w:eastAsia="Times New Roman" w:hAnsi="Segoe UI" w:cs="Segoe UI"/>
-            <w:color w:val="000000" w:themeColor="text1"/>
-            <w:sz w:val="18"/>
-            <w:szCs w:val="18"/>
-            <w:bdr w:val="single" w:sz="4" w:space="1" w:color="auto" w:frame="1"/>
-            <w:lang w:eastAsia="it-IT"/>
-          </w:rPr>
-          <w:t>initgsm()</w:t>
-        </w:r>
-      </w:hyperlink>
-    </w:p>
-    <w:p>
-      <w:pPr>
-        <w:numPr>
-          <w:ilvl w:val="1"/>
-          <w:numId w:val="1"/>
-        </w:numPr>
-        <w:spacing w:after="0" w:line="240" w:lineRule="auto"/>
-        <w:rPr>
-          <w:rFonts w:ascii="Segoe UI" w:eastAsia="Times New Roman" w:hAnsi="Segoe UI" w:cs="Segoe UI"/>
-          <w:color w:val="000000" w:themeColor="text1"/>
-          <w:sz w:val="20"/>
-          <w:szCs w:val="20"/>
-          <w:lang w:eastAsia="it-IT"/>
-        </w:rPr>
-      </w:pPr>
-      <w:r>
-        <w:rPr>
-          <w:rFonts w:ascii="Segoe UI" w:eastAsia="Times New Roman" w:hAnsi="Segoe UI" w:cs="Segoe UI"/>
-          <w:color w:val="000000" w:themeColor="text1"/>
-          <w:sz w:val="20"/>
-          <w:szCs w:val="20"/>
-          <w:lang w:eastAsia="it-IT"/>
-        </w:rPr>
-        <w:t>imposta </w:t>
-      </w:r>
-      <w:hyperlink r:id="rId7" w:history="1">
-        <w:r>
-          <w:rPr>
-            <w:rFonts w:ascii="Segoe UI" w:eastAsia="Times New Roman" w:hAnsi="Segoe UI" w:cs="Segoe UI"/>
-            <w:color w:val="000000" w:themeColor="text1"/>
-            <w:sz w:val="18"/>
-            <w:szCs w:val="18"/>
-            <w:bdr w:val="single" w:sz="4" w:space="1" w:color="auto" w:frame="1"/>
-            <w:lang w:eastAsia="it-IT"/>
-          </w:rPr>
-          <w:t>EEPROM.update(5, 0)</w:t>
-        </w:r>
-      </w:hyperlink>
-    </w:p>
-    <w:p>
-      <w:pPr>
-        <w:numPr>
-          <w:ilvl w:val="1"/>
-          <w:numId w:val="1"/>
-        </w:numPr>
-        <w:spacing w:after="0" w:line="240" w:lineRule="auto"/>
-        <w:rPr>
-          <w:rFonts w:ascii="Segoe UI" w:eastAsia="Times New Roman" w:hAnsi="Segoe UI" w:cs="Segoe UI"/>
-          <w:color w:val="000000" w:themeColor="text1"/>
-          <w:sz w:val="20"/>
-          <w:szCs w:val="20"/>
-          <w:lang w:eastAsia="it-IT"/>
-        </w:rPr>
-      </w:pPr>
-      <w:r>
-        <w:rPr>
-          <w:rFonts w:ascii="Segoe UI" w:eastAsia="Times New Roman" w:hAnsi="Segoe UI" w:cs="Segoe UI"/>
-          <w:color w:val="000000" w:themeColor="text1"/>
-          <w:sz w:val="20"/>
-          <w:szCs w:val="20"/>
-          <w:lang w:eastAsia="it-IT"/>
-        </w:rPr>
-        <w:t>carica numeri autorizzati con </w:t>
-      </w:r>
-      <w:hyperlink r:id="rId8" w:history="1">
-        <w:r>
-          <w:rPr>
-            <w:rFonts w:ascii="Segoe UI" w:eastAsia="Times New Roman" w:hAnsi="Segoe UI" w:cs="Segoe UI"/>
-            <w:color w:val="000000" w:themeColor="text1"/>
-            <w:sz w:val="18"/>
-            <w:szCs w:val="18"/>
-            <w:bdr w:val="single" w:sz="4" w:space="1" w:color="auto" w:frame="1"/>
-            <w:lang w:eastAsia="it-IT"/>
-          </w:rPr>
-          <w:t>RestorePhones()</w:t>
-        </w:r>
-      </w:hyperlink>
-    </w:p>
-    <w:p>
-      <w:pPr>
-        <w:numPr>
-          <w:ilvl w:val="0"/>
-          <w:numId w:val="1"/>
-        </w:numPr>
-        <w:spacing w:after="0" w:line="240" w:lineRule="auto"/>
-        <w:rPr>
-          <w:rFonts w:ascii="Segoe UI" w:eastAsia="Times New Roman" w:hAnsi="Segoe UI" w:cs="Segoe UI"/>
-          <w:color w:val="000000" w:themeColor="text1"/>
-          <w:sz w:val="20"/>
-          <w:szCs w:val="20"/>
-          <w:lang w:eastAsia="it-IT"/>
-        </w:rPr>
-      </w:pPr>
-      <w:hyperlink r:id="rId9" w:history="1">
+        <w:proofErr w:type="gramEnd"/>
         <w:r>
           <w:rPr>
             <w:rFonts w:ascii="Segoe UI" w:eastAsia="Times New Roman" w:hAnsi="Segoe UI" w:cs="Segoe UI"/>
@@ -3705,7 +3924,306 @@
             <w:bdr w:val="single" w:sz="4" w:space="1" w:color="auto" w:frame="1"/>
             <w:lang w:eastAsia="it-IT"/>
           </w:rPr>
-          <w:t>loop()</w:t>
+          <w:t>)</w:t>
+        </w:r>
+      </w:hyperlink>
+    </w:p>
+    <w:p>
+      <w:pPr>
+        <w:numPr>
+          <w:ilvl w:val="1"/>
+          <w:numId w:val="1"/>
+        </w:numPr>
+        <w:spacing w:before="60" w:after="60" w:line="240" w:lineRule="auto"/>
+        <w:rPr>
+          <w:rFonts w:ascii="Segoe UI" w:eastAsia="Times New Roman" w:hAnsi="Segoe UI" w:cs="Segoe UI"/>
+          <w:color w:val="000000" w:themeColor="text1"/>
+          <w:sz w:val="20"/>
+          <w:szCs w:val="20"/>
+          <w:lang w:eastAsia="it-IT"/>
+        </w:rPr>
+      </w:pPr>
+      <w:r>
+        <w:rPr>
+          <w:rFonts w:ascii="Segoe UI" w:eastAsia="Times New Roman" w:hAnsi="Segoe UI" w:cs="Segoe UI"/>
+          <w:color w:val="000000" w:themeColor="text1"/>
+          <w:sz w:val="20"/>
+          <w:szCs w:val="20"/>
+          <w:lang w:eastAsia="it-IT"/>
+        </w:rPr>
+        <w:t>inizializza reset pin</w:t>
+      </w:r>
+    </w:p>
+    <w:p>
+      <w:pPr>
+        <w:numPr>
+          <w:ilvl w:val="1"/>
+          <w:numId w:val="1"/>
+        </w:numPr>
+        <w:spacing w:after="0" w:line="240" w:lineRule="auto"/>
+        <w:rPr>
+          <w:rFonts w:ascii="Segoe UI" w:eastAsia="Times New Roman" w:hAnsi="Segoe UI" w:cs="Segoe UI"/>
+          <w:color w:val="000000" w:themeColor="text1"/>
+          <w:sz w:val="20"/>
+          <w:szCs w:val="20"/>
+          <w:lang w:eastAsia="it-IT"/>
+        </w:rPr>
+      </w:pPr>
+      <w:r>
+        <w:rPr>
+          <w:rFonts w:ascii="Segoe UI" w:eastAsia="Times New Roman" w:hAnsi="Segoe UI" w:cs="Segoe UI"/>
+          <w:color w:val="000000" w:themeColor="text1"/>
+          <w:sz w:val="20"/>
+          <w:szCs w:val="20"/>
+          <w:lang w:eastAsia="it-IT"/>
+        </w:rPr>
+        <w:t>chiama </w:t>
+      </w:r>
+      <w:proofErr w:type="spellStart"/>
+      <w:r>
+        <w:fldChar w:fldCharType="begin"/>
+      </w:r>
+      <w:r>
+        <w:instrText xml:space="preserve"> HYPERLINK "vscode-file://vscode-app/c:/Users/Massimo/AppData/Local/Programs/Microsoft%20VS%20Code/f6cfa2ea24/resources/app/out/vs/code/electron-browser/workbench/workbench.html" </w:instrText>
+      </w:r>
+      <w:r>
+        <w:fldChar w:fldCharType="separate"/>
+      </w:r>
+      <w:proofErr w:type="gramStart"/>
+      <w:r>
+        <w:rPr>
+          <w:rFonts w:ascii="Segoe UI" w:eastAsia="Times New Roman" w:hAnsi="Segoe UI" w:cs="Segoe UI"/>
+          <w:color w:val="000000" w:themeColor="text1"/>
+          <w:sz w:val="18"/>
+          <w:szCs w:val="18"/>
+          <w:bdr w:val="single" w:sz="4" w:space="1" w:color="auto" w:frame="1"/>
+          <w:lang w:eastAsia="it-IT"/>
+        </w:rPr>
+        <w:t>initgsm</w:t>
+      </w:r>
+      <w:proofErr w:type="spellEnd"/>
+      <w:r>
+        <w:rPr>
+          <w:rFonts w:ascii="Segoe UI" w:eastAsia="Times New Roman" w:hAnsi="Segoe UI" w:cs="Segoe UI"/>
+          <w:color w:val="000000" w:themeColor="text1"/>
+          <w:sz w:val="18"/>
+          <w:szCs w:val="18"/>
+          <w:bdr w:val="single" w:sz="4" w:space="1" w:color="auto" w:frame="1"/>
+          <w:lang w:eastAsia="it-IT"/>
+        </w:rPr>
+        <w:t>(</w:t>
+      </w:r>
+      <w:proofErr w:type="gramEnd"/>
+      <w:r>
+        <w:rPr>
+          <w:rFonts w:ascii="Segoe UI" w:eastAsia="Times New Roman" w:hAnsi="Segoe UI" w:cs="Segoe UI"/>
+          <w:color w:val="000000" w:themeColor="text1"/>
+          <w:sz w:val="18"/>
+          <w:szCs w:val="18"/>
+          <w:bdr w:val="single" w:sz="4" w:space="1" w:color="auto" w:frame="1"/>
+          <w:lang w:eastAsia="it-IT"/>
+        </w:rPr>
+        <w:t>)</w:t>
+      </w:r>
+      <w:r>
+        <w:rPr>
+          <w:rFonts w:ascii="Segoe UI" w:eastAsia="Times New Roman" w:hAnsi="Segoe UI" w:cs="Segoe UI"/>
+          <w:color w:val="000000" w:themeColor="text1"/>
+          <w:sz w:val="18"/>
+          <w:szCs w:val="18"/>
+          <w:bdr w:val="single" w:sz="4" w:space="1" w:color="auto" w:frame="1"/>
+          <w:lang w:eastAsia="it-IT"/>
+        </w:rPr>
+        <w:fldChar w:fldCharType="end"/>
+      </w:r>
+    </w:p>
+    <w:p>
+      <w:pPr>
+        <w:numPr>
+          <w:ilvl w:val="1"/>
+          <w:numId w:val="1"/>
+        </w:numPr>
+        <w:spacing w:after="0" w:line="240" w:lineRule="auto"/>
+        <w:rPr>
+          <w:rFonts w:ascii="Segoe UI" w:eastAsia="Times New Roman" w:hAnsi="Segoe UI" w:cs="Segoe UI"/>
+          <w:color w:val="000000" w:themeColor="text1"/>
+          <w:sz w:val="20"/>
+          <w:szCs w:val="20"/>
+          <w:lang w:eastAsia="it-IT"/>
+        </w:rPr>
+      </w:pPr>
+      <w:r>
+        <w:rPr>
+          <w:rFonts w:ascii="Segoe UI" w:eastAsia="Times New Roman" w:hAnsi="Segoe UI" w:cs="Segoe UI"/>
+          <w:color w:val="000000" w:themeColor="text1"/>
+          <w:sz w:val="20"/>
+          <w:szCs w:val="20"/>
+          <w:lang w:eastAsia="it-IT"/>
+        </w:rPr>
+        <w:t>imposta </w:t>
+      </w:r>
+      <w:proofErr w:type="spellStart"/>
+      <w:r>
+        <w:fldChar w:fldCharType="begin"/>
+      </w:r>
+      <w:r>
+        <w:instrText xml:space="preserve"> HYPERLINK "vscode-file://vscode-app/c:/Users/Massimo/Ap</w:instrText>
+      </w:r>
+      <w:r>
+        <w:instrText xml:space="preserve">pData/Local/Programs/Microsoft%20VS%20Code/f6cfa2ea24/resources/app/out/vs/code/electron-browser/workbench/workbench.html" </w:instrText>
+      </w:r>
+      <w:r>
+        <w:fldChar w:fldCharType="separate"/>
+      </w:r>
+      <w:r>
+        <w:rPr>
+          <w:rFonts w:ascii="Segoe UI" w:eastAsia="Times New Roman" w:hAnsi="Segoe UI" w:cs="Segoe UI"/>
+          <w:color w:val="000000" w:themeColor="text1"/>
+          <w:sz w:val="18"/>
+          <w:szCs w:val="18"/>
+          <w:bdr w:val="single" w:sz="4" w:space="1" w:color="auto" w:frame="1"/>
+          <w:lang w:eastAsia="it-IT"/>
+        </w:rPr>
+        <w:t>EEPROM.update</w:t>
+      </w:r>
+      <w:proofErr w:type="spellEnd"/>
+      <w:r>
+        <w:rPr>
+          <w:rFonts w:ascii="Segoe UI" w:eastAsia="Times New Roman" w:hAnsi="Segoe UI" w:cs="Segoe UI"/>
+          <w:color w:val="000000" w:themeColor="text1"/>
+          <w:sz w:val="18"/>
+          <w:szCs w:val="18"/>
+          <w:bdr w:val="single" w:sz="4" w:space="1" w:color="auto" w:frame="1"/>
+          <w:lang w:eastAsia="it-IT"/>
+        </w:rPr>
+        <w:t>(5, 0)</w:t>
+      </w:r>
+      <w:r>
+        <w:rPr>
+          <w:rFonts w:ascii="Segoe UI" w:eastAsia="Times New Roman" w:hAnsi="Segoe UI" w:cs="Segoe UI"/>
+          <w:color w:val="000000" w:themeColor="text1"/>
+          <w:sz w:val="18"/>
+          <w:szCs w:val="18"/>
+          <w:bdr w:val="single" w:sz="4" w:space="1" w:color="auto" w:frame="1"/>
+          <w:lang w:eastAsia="it-IT"/>
+        </w:rPr>
+        <w:fldChar w:fldCharType="end"/>
+      </w:r>
+    </w:p>
+    <w:p>
+      <w:pPr>
+        <w:numPr>
+          <w:ilvl w:val="1"/>
+          <w:numId w:val="1"/>
+        </w:numPr>
+        <w:spacing w:after="0" w:line="240" w:lineRule="auto"/>
+        <w:rPr>
+          <w:rFonts w:ascii="Segoe UI" w:eastAsia="Times New Roman" w:hAnsi="Segoe UI" w:cs="Segoe UI"/>
+          <w:color w:val="000000" w:themeColor="text1"/>
+          <w:sz w:val="20"/>
+          <w:szCs w:val="20"/>
+          <w:lang w:eastAsia="it-IT"/>
+        </w:rPr>
+      </w:pPr>
+      <w:r>
+        <w:rPr>
+          <w:rFonts w:ascii="Segoe UI" w:eastAsia="Times New Roman" w:hAnsi="Segoe UI" w:cs="Segoe UI"/>
+          <w:color w:val="000000" w:themeColor="text1"/>
+          <w:sz w:val="20"/>
+          <w:szCs w:val="20"/>
+          <w:lang w:eastAsia="it-IT"/>
+        </w:rPr>
+        <w:t>carica numeri autorizzati con </w:t>
+      </w:r>
+      <w:proofErr w:type="spellStart"/>
+      <w:r>
+        <w:fldChar w:fldCharType="begin"/>
+      </w:r>
+      <w:r>
+        <w:instrText xml:space="preserve"> HYPERLINK "vscode-file://vscode-app/c:/Users/Massimo/AppData/Local/Programs/Mic</w:instrText>
+      </w:r>
+      <w:r>
+        <w:instrText xml:space="preserve">rosoft%20VS%20Code/f6cfa2ea24/resources/app/out/vs/code/electron-browser/workbench/workbench.html" </w:instrText>
+      </w:r>
+      <w:r>
+        <w:fldChar w:fldCharType="separate"/>
+      </w:r>
+      <w:r>
+        <w:rPr>
+          <w:rFonts w:ascii="Segoe UI" w:eastAsia="Times New Roman" w:hAnsi="Segoe UI" w:cs="Segoe UI"/>
+          <w:color w:val="000000" w:themeColor="text1"/>
+          <w:sz w:val="18"/>
+          <w:szCs w:val="18"/>
+          <w:bdr w:val="single" w:sz="4" w:space="1" w:color="auto" w:frame="1"/>
+          <w:lang w:eastAsia="it-IT"/>
+        </w:rPr>
+        <w:t>RestorePhones</w:t>
+      </w:r>
+      <w:proofErr w:type="spellEnd"/>
+      <w:r>
+        <w:rPr>
+          <w:rFonts w:ascii="Segoe UI" w:eastAsia="Times New Roman" w:hAnsi="Segoe UI" w:cs="Segoe UI"/>
+          <w:color w:val="000000" w:themeColor="text1"/>
+          <w:sz w:val="18"/>
+          <w:szCs w:val="18"/>
+          <w:bdr w:val="single" w:sz="4" w:space="1" w:color="auto" w:frame="1"/>
+          <w:lang w:eastAsia="it-IT"/>
+        </w:rPr>
+        <w:t>()</w:t>
+      </w:r>
+      <w:r>
+        <w:rPr>
+          <w:rFonts w:ascii="Segoe UI" w:eastAsia="Times New Roman" w:hAnsi="Segoe UI" w:cs="Segoe UI"/>
+          <w:color w:val="000000" w:themeColor="text1"/>
+          <w:sz w:val="18"/>
+          <w:szCs w:val="18"/>
+          <w:bdr w:val="single" w:sz="4" w:space="1" w:color="auto" w:frame="1"/>
+          <w:lang w:eastAsia="it-IT"/>
+        </w:rPr>
+        <w:fldChar w:fldCharType="end"/>
+      </w:r>
+    </w:p>
+    <w:p>
+      <w:pPr>
+        <w:numPr>
+          <w:ilvl w:val="0"/>
+          <w:numId w:val="1"/>
+        </w:numPr>
+        <w:spacing w:after="0" w:line="240" w:lineRule="auto"/>
+        <w:rPr>
+          <w:rFonts w:ascii="Segoe UI" w:eastAsia="Times New Roman" w:hAnsi="Segoe UI" w:cs="Segoe UI"/>
+          <w:color w:val="000000" w:themeColor="text1"/>
+          <w:sz w:val="20"/>
+          <w:szCs w:val="20"/>
+          <w:lang w:eastAsia="it-IT"/>
+        </w:rPr>
+      </w:pPr>
+      <w:hyperlink r:id="rId6" w:history="1">
+        <w:proofErr w:type="gramStart"/>
+        <w:r>
+          <w:rPr>
+            <w:rFonts w:ascii="Segoe UI" w:eastAsia="Times New Roman" w:hAnsi="Segoe UI" w:cs="Segoe UI"/>
+            <w:color w:val="000000" w:themeColor="text1"/>
+            <w:sz w:val="18"/>
+            <w:szCs w:val="18"/>
+            <w:u w:val="single"/>
+            <w:bdr w:val="single" w:sz="4" w:space="1" w:color="auto" w:frame="1"/>
+            <w:lang w:eastAsia="it-IT"/>
+          </w:rPr>
+          <w:t>loop(</w:t>
+        </w:r>
+        <w:proofErr w:type="gramEnd"/>
+        <w:r>
+          <w:rPr>
+            <w:rFonts w:ascii="Segoe UI" w:eastAsia="Times New Roman" w:hAnsi="Segoe UI" w:cs="Segoe UI"/>
+            <w:color w:val="000000" w:themeColor="text1"/>
+            <w:sz w:val="18"/>
+            <w:szCs w:val="18"/>
+            <w:u w:val="single"/>
+            <w:bdr w:val="single" w:sz="4" w:space="1" w:color="auto" w:frame="1"/>
+            <w:lang w:eastAsia="it-IT"/>
+          </w:rPr>
+          <w:t>)</w:t>
         </w:r>
       </w:hyperlink>
     </w:p>
@@ -4028,19 +4546,53 @@
         </w:rPr>
         <w:t>ogni 15 minuti verifica reset giornaliero e chiama </w:t>
       </w:r>
-      <w:hyperlink r:id="rId10" w:history="1">
-        <w:r>
-          <w:rPr>
-            <w:rFonts w:ascii="Segoe UI" w:eastAsia="Times New Roman" w:hAnsi="Segoe UI" w:cs="Segoe UI"/>
-            <w:color w:val="000000" w:themeColor="text1"/>
-            <w:sz w:val="18"/>
-            <w:szCs w:val="18"/>
-            <w:bdr w:val="single" w:sz="4" w:space="1" w:color="auto" w:frame="1"/>
-            <w:lang w:eastAsia="it-IT"/>
-          </w:rPr>
-          <w:t>initgsm()</w:t>
-        </w:r>
-      </w:hyperlink>
+      <w:proofErr w:type="spellStart"/>
+      <w:r>
+        <w:fldChar w:fldCharType="begin"/>
+      </w:r>
+      <w:r>
+        <w:instrText xml:space="preserve"> HYPERLINK "vscode-file://vscode-app/c:/Users/Massimo/AppData/Local/Programs/Microsoft%20VS%20Code/f6cfa2ea</w:instrText>
+      </w:r>
+      <w:r>
+        <w:instrText xml:space="preserve">24/resources/app/out/vs/code/electron-browser/workbench/workbench.html" </w:instrText>
+      </w:r>
+      <w:r>
+        <w:fldChar w:fldCharType="separate"/>
+      </w:r>
+      <w:r>
+        <w:rPr>
+          <w:rFonts w:ascii="Segoe UI" w:eastAsia="Times New Roman" w:hAnsi="Segoe UI" w:cs="Segoe UI"/>
+          <w:color w:val="000000" w:themeColor="text1"/>
+          <w:sz w:val="18"/>
+          <w:szCs w:val="18"/>
+          <w:bdr w:val="single" w:sz="4" w:space="1" w:color="auto" w:frame="1"/>
+          <w:lang w:eastAsia="it-IT"/>
+        </w:rPr>
+        <w:t>initgsm</w:t>
+      </w:r>
+      <w:proofErr w:type="spellEnd"/>
+      <w:r>
+        <w:rPr>
+          <w:rFonts w:ascii="Segoe UI" w:eastAsia="Times New Roman" w:hAnsi="Segoe UI" w:cs="Segoe UI"/>
+          <w:color w:val="000000" w:themeColor="text1"/>
+          <w:sz w:val="18"/>
+          <w:szCs w:val="18"/>
+          <w:bdr w:val="single" w:sz="4" w:space="1" w:color="auto" w:frame="1"/>
+          <w:lang w:eastAsia="it-IT"/>
+        </w:rPr>
+        <w:t>()</w:t>
+      </w:r>
+      <w:r>
+        <w:rPr>
+          <w:rFonts w:ascii="Segoe UI" w:eastAsia="Times New Roman" w:hAnsi="Segoe UI" w:cs="Segoe UI"/>
+          <w:color w:val="000000" w:themeColor="text1"/>
+          <w:sz w:val="18"/>
+          <w:szCs w:val="18"/>
+          <w:bdr w:val="single" w:sz="4" w:space="1" w:color="auto" w:frame="1"/>
+          <w:lang w:eastAsia="it-IT"/>
+        </w:rPr>
+        <w:fldChar w:fldCharType="end"/>
+      </w:r>
       <w:r>
         <w:rPr>
           <w:rFonts w:ascii="Segoe UI" w:eastAsia="Times New Roman" w:hAnsi="Segoe UI" w:cs="Segoe UI"/>
@@ -4054,21 +4606,75 @@
     </w:p>
     <w:p>
       <w:pPr>
-        <w:spacing w:after="0" w:line="330" w:lineRule="atLeast"/>
-        <w:rPr>
-          <w:rFonts w:ascii="Arial" w:eastAsia="Times New Roman" w:hAnsi="Arial" w:cs="Arial"/>
-          <w:color w:val="000000" w:themeColor="text1"/>
-          <w:sz w:val="24"/>
-          <w:szCs w:val="24"/>
-          <w:lang w:eastAsia="it-IT"/>
-        </w:rPr>
-      </w:pPr>
-      <w:r>
-        <w:rPr>
-          <w:rFonts w:ascii="Arial" w:eastAsia="Times New Roman" w:hAnsi="Arial" w:cs="Arial"/>
-          <w:color w:val="000000" w:themeColor="text1"/>
-          <w:sz w:val="24"/>
-          <w:szCs w:val="24"/>
+        <w:rPr>
+          <w:rFonts w:ascii="Segoe UI" w:eastAsia="Times New Roman" w:hAnsi="Segoe UI" w:cs="Segoe UI"/>
+          <w:color w:val="000000" w:themeColor="text1"/>
+          <w:sz w:val="20"/>
+          <w:szCs w:val="20"/>
+          <w:lang w:eastAsia="it-IT"/>
+        </w:rPr>
+      </w:pPr>
+      <w:r>
+        <w:rPr>
+          <w:rFonts w:ascii="Segoe UI" w:eastAsia="Times New Roman" w:hAnsi="Segoe UI" w:cs="Segoe UI"/>
+          <w:color w:val="000000" w:themeColor="text1"/>
+          <w:sz w:val="20"/>
+          <w:szCs w:val="20"/>
+          <w:lang w:eastAsia="it-IT"/>
+        </w:rPr>
+        <w:br w:type="page"/>
+      </w:r>
+    </w:p>
+    <w:p>
+      <w:pPr>
+        <w:spacing w:after="0" w:line="330" w:lineRule="atLeast"/>
+        <w:jc w:val="center"/>
+        <w:rPr>
+          <w:rFonts w:ascii="Arial" w:eastAsia="Times New Roman" w:hAnsi="Arial" w:cs="Arial"/>
+          <w:b/>
+          <w:bCs/>
+          <w:color w:val="000000" w:themeColor="text1"/>
+          <w:sz w:val="36"/>
+          <w:szCs w:val="36"/>
+          <w:lang w:eastAsia="it-IT"/>
+        </w:rPr>
+      </w:pPr>
+      <w:r>
+        <w:rPr>
+          <w:rFonts w:ascii="Arial" w:eastAsia="Times New Roman" w:hAnsi="Arial" w:cs="Arial"/>
+          <w:b/>
+          <w:bCs/>
+          <w:color w:val="000000" w:themeColor="text1"/>
+          <w:sz w:val="36"/>
+          <w:szCs w:val="36"/>
+          <w:lang w:eastAsia="it-IT"/>
+        </w:rPr>
+        <w:lastRenderedPageBreak/>
+        <w:t>Testing</w:t>
+      </w:r>
+    </w:p>
+    <w:p>
+      <w:pPr>
+        <w:spacing w:after="0" w:line="330" w:lineRule="atLeast"/>
+        <w:jc w:val="center"/>
+        <w:rPr>
+          <w:rFonts w:ascii="Arial" w:eastAsia="Times New Roman" w:hAnsi="Arial" w:cs="Arial"/>
+          <w:b/>
+          <w:bCs/>
+          <w:color w:val="000000" w:themeColor="text1"/>
+          <w:sz w:val="28"/>
+          <w:szCs w:val="28"/>
+          <w:lang w:eastAsia="it-IT"/>
+        </w:rPr>
+      </w:pPr>
+      <w:r>
+        <w:rPr>
+          <w:rFonts w:ascii="Arial" w:eastAsia="Times New Roman" w:hAnsi="Arial" w:cs="Arial"/>
+          <w:b/>
+          <w:bCs/>
+          <w:color w:val="000000" w:themeColor="text1"/>
+          <w:sz w:val="28"/>
+          <w:szCs w:val="28"/>
           <w:lang w:eastAsia="it-IT"/>
         </w:rPr>
         <w:t xml:space="preserve">    </w:t>
@@ -4079,7 +4685,1082 @@
         <w:spacing w:after="0" w:line="330" w:lineRule="atLeast"/>
         <w:rPr>
           <w:rFonts w:ascii="Arial" w:eastAsia="Times New Roman" w:hAnsi="Arial" w:cs="Arial"/>
-          <w:color w:val="BBBEBF"/>
+          <w:b/>
+          <w:bCs/>
+          <w:sz w:val="24"/>
+          <w:szCs w:val="24"/>
+          <w:lang w:eastAsia="it-IT"/>
+        </w:rPr>
+      </w:pPr>
+      <w:r>
+        <w:rPr>
+          <w:rFonts w:ascii="Arial" w:eastAsia="Times New Roman" w:hAnsi="Arial" w:cs="Arial"/>
+          <w:b/>
+          <w:bCs/>
+          <w:sz w:val="24"/>
+          <w:szCs w:val="24"/>
+          <w:lang w:eastAsia="it-IT"/>
+        </w:rPr>
+        <w:t>Comando M</w:t>
+      </w:r>
+      <w:r>
+        <w:rPr>
+          <w:rFonts w:ascii="Arial" w:eastAsia="Times New Roman" w:hAnsi="Arial" w:cs="Arial"/>
+          <w:b/>
+          <w:bCs/>
+          <w:sz w:val="24"/>
+          <w:szCs w:val="24"/>
+          <w:lang w:eastAsia="it-IT"/>
+        </w:rPr>
+        <w:t xml:space="preserve"> – Modifica numero Master</w:t>
+      </w:r>
+    </w:p>
+    <w:p>
+      <w:pPr>
+        <w:spacing w:after="0" w:line="330" w:lineRule="atLeast"/>
+        <w:rPr>
+          <w:rFonts w:ascii="Arial" w:eastAsia="Times New Roman" w:hAnsi="Arial" w:cs="Arial"/>
+          <w:color w:val="BFBFBF" w:themeColor="background1" w:themeShade="BF"/>
+          <w:sz w:val="24"/>
+          <w:szCs w:val="24"/>
+          <w:lang w:eastAsia="it-IT"/>
+        </w:rPr>
+      </w:pPr>
+      <w:r>
+        <w:rPr>
+          <w:rFonts w:ascii="Arial" w:eastAsia="Times New Roman" w:hAnsi="Arial" w:cs="Arial"/>
+          <w:color w:val="BFBFBF" w:themeColor="background1" w:themeShade="BF"/>
+          <w:sz w:val="24"/>
+          <w:szCs w:val="24"/>
+          <w:lang w:eastAsia="it-IT"/>
+        </w:rPr>
+        <w:t xml:space="preserve">Cancellare preventivamente tutti i numeri con </w:t>
+      </w:r>
+      <w:r>
+        <w:rPr>
+          <w:rFonts w:ascii="Arial" w:eastAsia="Times New Roman" w:hAnsi="Arial" w:cs="Arial"/>
+          <w:color w:val="BFBFBF" w:themeColor="background1" w:themeShade="BF"/>
+          <w:sz w:val="24"/>
+          <w:szCs w:val="24"/>
+          <w:lang w:eastAsia="it-IT"/>
+        </w:rPr>
+        <w:t xml:space="preserve">il comando </w:t>
+      </w:r>
+      <w:r>
+        <w:rPr>
+          <w:rFonts w:ascii="Arial" w:eastAsia="Times New Roman" w:hAnsi="Arial" w:cs="Arial"/>
+          <w:color w:val="BFBFBF" w:themeColor="background1" w:themeShade="BF"/>
+          <w:sz w:val="24"/>
+          <w:szCs w:val="24"/>
+          <w:lang w:eastAsia="it-IT"/>
+        </w:rPr>
+        <w:t>E per ottenere la pulizia della RAM e della EEPROM</w:t>
+      </w:r>
+      <w:r>
+        <w:rPr>
+          <w:rFonts w:ascii="Arial" w:eastAsia="Times New Roman" w:hAnsi="Arial" w:cs="Arial"/>
+          <w:color w:val="BFBFBF" w:themeColor="background1" w:themeShade="BF"/>
+          <w:sz w:val="24"/>
+          <w:szCs w:val="24"/>
+          <w:lang w:eastAsia="it-IT"/>
+        </w:rPr>
+        <w:t xml:space="preserve"> (vedi comando E)</w:t>
+      </w:r>
+    </w:p>
+    <w:p>
+      <w:pPr>
+        <w:spacing w:after="0" w:line="330" w:lineRule="atLeast"/>
+        <w:ind w:left="708"/>
+        <w:rPr>
+          <w:rFonts w:ascii="Arial" w:eastAsia="Times New Roman" w:hAnsi="Arial" w:cs="Arial"/>
+          <w:color w:val="000000" w:themeColor="text1"/>
+          <w:sz w:val="24"/>
+          <w:szCs w:val="24"/>
+          <w:lang w:eastAsia="it-IT"/>
+        </w:rPr>
+      </w:pPr>
+      <w:r>
+        <w:rPr>
+          <w:rFonts w:ascii="Arial" w:hAnsi="Arial" w:cs="Arial"/>
+        </w:rPr>
+        <w:t>Da qualsiasi numero (Master o non registrato), i</w:t>
+      </w:r>
+      <w:r>
+        <w:rPr>
+          <w:rFonts w:ascii="Arial" w:hAnsi="Arial" w:cs="Arial"/>
+        </w:rPr>
+        <w:t xml:space="preserve">nviare il Comando </w:t>
+      </w:r>
+      <w:r>
+        <w:rPr>
+          <w:rFonts w:ascii="Arial" w:eastAsia="Times New Roman" w:hAnsi="Arial" w:cs="Arial"/>
+          <w:color w:val="000000" w:themeColor="text1"/>
+          <w:sz w:val="24"/>
+          <w:szCs w:val="24"/>
+          <w:lang w:eastAsia="it-IT"/>
+        </w:rPr>
+        <w:t xml:space="preserve">- </w:t>
+      </w:r>
+      <w:r>
+        <w:rPr>
+          <w:rFonts w:ascii="Arial" w:eastAsia="Times New Roman" w:hAnsi="Arial" w:cs="Arial"/>
+          <w:b/>
+          <w:bCs/>
+          <w:i/>
+          <w:iCs/>
+          <w:color w:val="000000" w:themeColor="text1"/>
+          <w:sz w:val="24"/>
+          <w:szCs w:val="24"/>
+          <w:lang w:eastAsia="it-IT"/>
+        </w:rPr>
+        <w:t>M+</w:t>
+      </w:r>
+      <w:r>
+        <w:rPr>
+          <w:rFonts w:ascii="Arial" w:eastAsia="Times New Roman" w:hAnsi="Arial" w:cs="Arial"/>
+          <w:b/>
+          <w:bCs/>
+          <w:i/>
+          <w:iCs/>
+          <w:color w:val="000000" w:themeColor="text1"/>
+          <w:sz w:val="24"/>
+          <w:szCs w:val="24"/>
+          <w:lang w:eastAsia="it-IT"/>
+        </w:rPr>
+        <w:t>393334188263</w:t>
+      </w:r>
+      <w:r>
+        <w:rPr>
+          <w:rFonts w:ascii="Arial" w:eastAsia="Times New Roman" w:hAnsi="Arial" w:cs="Arial"/>
+          <w:color w:val="000000" w:themeColor="text1"/>
+          <w:sz w:val="24"/>
+          <w:szCs w:val="24"/>
+          <w:lang w:eastAsia="it-IT"/>
+        </w:rPr>
+        <w:t xml:space="preserve"> per m</w:t>
+      </w:r>
+      <w:r>
+        <w:rPr>
+          <w:rFonts w:ascii="Arial" w:eastAsia="Times New Roman" w:hAnsi="Arial" w:cs="Arial"/>
+          <w:color w:val="000000" w:themeColor="text1"/>
+          <w:sz w:val="24"/>
+          <w:szCs w:val="24"/>
+          <w:lang w:eastAsia="it-IT"/>
+        </w:rPr>
+        <w:t>odifica</w:t>
+      </w:r>
+      <w:r>
+        <w:rPr>
+          <w:rFonts w:ascii="Arial" w:eastAsia="Times New Roman" w:hAnsi="Arial" w:cs="Arial"/>
+          <w:color w:val="000000" w:themeColor="text1"/>
+          <w:sz w:val="24"/>
+          <w:szCs w:val="24"/>
+          <w:lang w:eastAsia="it-IT"/>
+        </w:rPr>
+        <w:t>re</w:t>
+      </w:r>
+      <w:r>
+        <w:rPr>
+          <w:rFonts w:ascii="Arial" w:eastAsia="Times New Roman" w:hAnsi="Arial" w:cs="Arial"/>
+          <w:color w:val="000000" w:themeColor="text1"/>
+          <w:sz w:val="24"/>
+          <w:szCs w:val="24"/>
+          <w:lang w:eastAsia="it-IT"/>
+        </w:rPr>
+        <w:t xml:space="preserve"> numero Master</w:t>
+      </w:r>
+    </w:p>
+    <w:p>
+      <w:pPr>
+        <w:spacing w:after="0" w:line="330" w:lineRule="atLeast"/>
+        <w:ind w:left="708"/>
+        <w:rPr>
+          <w:rFonts w:ascii="Arial" w:eastAsia="Times New Roman" w:hAnsi="Arial" w:cs="Arial"/>
+          <w:color w:val="000000" w:themeColor="text1"/>
+          <w:sz w:val="24"/>
+          <w:szCs w:val="24"/>
+          <w:lang w:eastAsia="it-IT"/>
+        </w:rPr>
+      </w:pPr>
+    </w:p>
+    <w:p>
+      <w:pPr>
+        <w:spacing w:after="0" w:line="330" w:lineRule="atLeast"/>
+        <w:rPr>
+          <w:rFonts w:ascii="Arial" w:eastAsia="Times New Roman" w:hAnsi="Arial" w:cs="Arial"/>
+          <w:b/>
+          <w:bCs/>
+          <w:sz w:val="24"/>
+          <w:szCs w:val="24"/>
+          <w:lang w:eastAsia="it-IT"/>
+        </w:rPr>
+      </w:pPr>
+      <w:r>
+        <w:rPr>
+          <w:rFonts w:ascii="Arial" w:eastAsia="Times New Roman" w:hAnsi="Arial" w:cs="Arial"/>
+          <w:b/>
+          <w:bCs/>
+          <w:sz w:val="24"/>
+          <w:szCs w:val="24"/>
+          <w:lang w:eastAsia="it-IT"/>
+        </w:rPr>
+        <w:t xml:space="preserve">Comando </w:t>
+      </w:r>
+      <w:r>
+        <w:rPr>
+          <w:rFonts w:ascii="Arial" w:eastAsia="Times New Roman" w:hAnsi="Arial" w:cs="Arial"/>
+          <w:b/>
+          <w:bCs/>
+          <w:sz w:val="24"/>
+          <w:szCs w:val="24"/>
+          <w:lang w:eastAsia="it-IT"/>
+        </w:rPr>
+        <w:t>D - Cancella Ausiliari</w:t>
+      </w:r>
+    </w:p>
+    <w:p>
+      <w:pPr>
+        <w:spacing w:after="0" w:line="330" w:lineRule="atLeast"/>
+        <w:ind w:left="708"/>
+        <w:rPr>
+          <w:rFonts w:ascii="Arial" w:eastAsia="Times New Roman" w:hAnsi="Arial" w:cs="Arial"/>
+          <w:color w:val="000000" w:themeColor="text1"/>
+          <w:sz w:val="24"/>
+          <w:szCs w:val="24"/>
+          <w:lang w:eastAsia="it-IT"/>
+        </w:rPr>
+      </w:pPr>
+      <w:r>
+        <w:rPr>
+          <w:rFonts w:ascii="Arial" w:hAnsi="Arial" w:cs="Arial"/>
+        </w:rPr>
+        <w:t>Da numero Master, i</w:t>
+      </w:r>
+      <w:r>
+        <w:rPr>
+          <w:rFonts w:ascii="Arial" w:hAnsi="Arial" w:cs="Arial"/>
+        </w:rPr>
+        <w:t xml:space="preserve">nviare il Comando </w:t>
+      </w:r>
+      <w:r>
+        <w:rPr>
+          <w:rFonts w:ascii="Arial" w:eastAsia="Times New Roman" w:hAnsi="Arial" w:cs="Arial"/>
+          <w:color w:val="000000" w:themeColor="text1"/>
+          <w:sz w:val="24"/>
+          <w:szCs w:val="24"/>
+          <w:lang w:eastAsia="it-IT"/>
+        </w:rPr>
+        <w:t xml:space="preserve">- </w:t>
+      </w:r>
+      <w:r>
+        <w:rPr>
+          <w:rFonts w:ascii="Arial" w:eastAsia="Times New Roman" w:hAnsi="Arial" w:cs="Arial"/>
+          <w:b/>
+          <w:bCs/>
+          <w:i/>
+          <w:iCs/>
+          <w:color w:val="000000" w:themeColor="text1"/>
+          <w:sz w:val="24"/>
+          <w:szCs w:val="24"/>
+          <w:lang w:eastAsia="it-IT"/>
+        </w:rPr>
+        <w:t>D</w:t>
+      </w:r>
+      <w:r>
+        <w:rPr>
+          <w:rFonts w:ascii="Arial" w:eastAsia="Times New Roman" w:hAnsi="Arial" w:cs="Arial"/>
+          <w:color w:val="000000" w:themeColor="text1"/>
+          <w:sz w:val="24"/>
+          <w:szCs w:val="24"/>
+          <w:lang w:eastAsia="it-IT"/>
+        </w:rPr>
+        <w:t xml:space="preserve"> per </w:t>
+      </w:r>
+      <w:r>
+        <w:rPr>
+          <w:rFonts w:ascii="Arial" w:eastAsia="Times New Roman" w:hAnsi="Arial" w:cs="Arial"/>
+          <w:color w:val="000000" w:themeColor="text1"/>
+          <w:sz w:val="24"/>
+          <w:szCs w:val="24"/>
+          <w:lang w:eastAsia="it-IT"/>
+        </w:rPr>
+        <w:t>cancellare tutti e 3 i numeri Ausiliari</w:t>
+      </w:r>
+    </w:p>
+    <w:p>
+      <w:pPr>
+        <w:spacing w:after="0" w:line="330" w:lineRule="atLeast"/>
+        <w:rPr>
+          <w:rFonts w:ascii="Arial" w:eastAsia="Times New Roman" w:hAnsi="Arial" w:cs="Arial"/>
+          <w:color w:val="000000" w:themeColor="text1"/>
+          <w:sz w:val="24"/>
+          <w:szCs w:val="24"/>
+          <w:lang w:eastAsia="it-IT"/>
+        </w:rPr>
+      </w:pPr>
+    </w:p>
+    <w:p>
+      <w:pPr>
+        <w:spacing w:after="0" w:line="330" w:lineRule="atLeast"/>
+        <w:rPr>
+          <w:rFonts w:ascii="Arial" w:eastAsia="Times New Roman" w:hAnsi="Arial" w:cs="Arial"/>
+          <w:b/>
+          <w:bCs/>
+          <w:sz w:val="24"/>
+          <w:szCs w:val="24"/>
+          <w:lang w:eastAsia="it-IT"/>
+        </w:rPr>
+      </w:pPr>
+      <w:r>
+        <w:rPr>
+          <w:rFonts w:ascii="Arial" w:eastAsia="Times New Roman" w:hAnsi="Arial" w:cs="Arial"/>
+          <w:b/>
+          <w:bCs/>
+          <w:sz w:val="24"/>
+          <w:szCs w:val="24"/>
+          <w:lang w:eastAsia="it-IT"/>
+        </w:rPr>
+        <w:t xml:space="preserve">Comando </w:t>
+      </w:r>
+      <w:r>
+        <w:rPr>
+          <w:rFonts w:ascii="Arial" w:eastAsia="Times New Roman" w:hAnsi="Arial" w:cs="Arial"/>
+          <w:b/>
+          <w:bCs/>
+          <w:sz w:val="24"/>
+          <w:szCs w:val="24"/>
+          <w:lang w:eastAsia="it-IT"/>
+        </w:rPr>
+        <w:t>A – Imposta Ausiliari (3)</w:t>
+      </w:r>
+    </w:p>
+    <w:p>
+      <w:pPr>
+        <w:spacing w:after="0" w:line="330" w:lineRule="atLeast"/>
+        <w:ind w:firstLine="708"/>
+        <w:rPr>
+          <w:rFonts w:ascii="Arial" w:eastAsia="Times New Roman" w:hAnsi="Arial" w:cs="Arial"/>
+          <w:b/>
+          <w:bCs/>
+          <w:i/>
+          <w:iCs/>
+          <w:color w:val="000000" w:themeColor="text1"/>
+          <w:sz w:val="24"/>
+          <w:szCs w:val="24"/>
+          <w:lang w:eastAsia="it-IT"/>
+        </w:rPr>
+      </w:pPr>
+      <w:r>
+        <w:rPr>
+          <w:rFonts w:ascii="Arial" w:hAnsi="Arial" w:cs="Arial"/>
+        </w:rPr>
+        <w:t>Da numero Master, i</w:t>
+      </w:r>
+      <w:r>
+        <w:rPr>
+          <w:rFonts w:ascii="Arial" w:hAnsi="Arial" w:cs="Arial"/>
+        </w:rPr>
+        <w:t>nvia</w:t>
+      </w:r>
+      <w:r>
+        <w:rPr>
+          <w:rFonts w:ascii="Arial" w:hAnsi="Arial" w:cs="Arial"/>
+        </w:rPr>
+        <w:t xml:space="preserve">re </w:t>
+      </w:r>
+      <w:r>
+        <w:rPr>
+          <w:rFonts w:ascii="Arial" w:hAnsi="Arial" w:cs="Arial"/>
+        </w:rPr>
+        <w:t xml:space="preserve">il Comando </w:t>
+      </w:r>
+      <w:r>
+        <w:rPr>
+          <w:rFonts w:ascii="Arial" w:eastAsia="Times New Roman" w:hAnsi="Arial" w:cs="Arial"/>
+          <w:color w:val="000000" w:themeColor="text1"/>
+          <w:sz w:val="24"/>
+          <w:szCs w:val="24"/>
+          <w:lang w:eastAsia="it-IT"/>
+        </w:rPr>
+        <w:t>–</w:t>
+      </w:r>
+      <w:r>
+        <w:rPr>
+          <w:rFonts w:ascii="Arial" w:eastAsia="Times New Roman" w:hAnsi="Arial" w:cs="Arial"/>
+          <w:color w:val="000000" w:themeColor="text1"/>
+          <w:sz w:val="24"/>
+          <w:szCs w:val="24"/>
+          <w:lang w:eastAsia="it-IT"/>
+        </w:rPr>
+        <w:t xml:space="preserve"> </w:t>
+      </w:r>
+      <w:r>
+        <w:rPr>
+          <w:rFonts w:ascii="Arial" w:eastAsia="Times New Roman" w:hAnsi="Arial" w:cs="Arial"/>
+          <w:b/>
+          <w:bCs/>
+          <w:i/>
+          <w:iCs/>
+          <w:color w:val="000000" w:themeColor="text1"/>
+          <w:sz w:val="24"/>
+          <w:szCs w:val="24"/>
+          <w:lang w:eastAsia="it-IT"/>
+        </w:rPr>
+        <w:t>A1</w:t>
+      </w:r>
+      <w:r>
+        <w:rPr>
+          <w:rFonts w:ascii="Arial" w:eastAsia="Times New Roman" w:hAnsi="Arial" w:cs="Arial"/>
+          <w:b/>
+          <w:bCs/>
+          <w:i/>
+          <w:iCs/>
+          <w:color w:val="000000" w:themeColor="text1"/>
+          <w:sz w:val="24"/>
+          <w:szCs w:val="24"/>
+          <w:lang w:eastAsia="it-IT"/>
+        </w:rPr>
+        <w:t>+393334188263</w:t>
+      </w:r>
+    </w:p>
+    <w:p>
+      <w:pPr>
+        <w:spacing w:after="0" w:line="330" w:lineRule="atLeast"/>
+        <w:ind w:left="4248"/>
+        <w:rPr>
+          <w:rFonts w:ascii="Arial" w:eastAsia="Times New Roman" w:hAnsi="Arial" w:cs="Arial"/>
+          <w:b/>
+          <w:bCs/>
+          <w:i/>
+          <w:iCs/>
+          <w:color w:val="000000" w:themeColor="text1"/>
+          <w:sz w:val="24"/>
+          <w:szCs w:val="24"/>
+          <w:lang w:eastAsia="it-IT"/>
+        </w:rPr>
+      </w:pPr>
+      <w:r>
+        <w:rPr>
+          <w:rFonts w:ascii="Arial" w:eastAsia="Times New Roman" w:hAnsi="Arial" w:cs="Arial"/>
+          <w:color w:val="000000" w:themeColor="text1"/>
+          <w:sz w:val="24"/>
+          <w:szCs w:val="24"/>
+          <w:lang w:eastAsia="it-IT"/>
+        </w:rPr>
+        <w:t xml:space="preserve">       </w:t>
+      </w:r>
+      <w:r>
+        <w:rPr>
+          <w:rFonts w:ascii="Arial" w:eastAsia="Times New Roman" w:hAnsi="Arial" w:cs="Arial"/>
+          <w:b/>
+          <w:bCs/>
+          <w:i/>
+          <w:iCs/>
+          <w:color w:val="000000" w:themeColor="text1"/>
+          <w:sz w:val="24"/>
+          <w:szCs w:val="24"/>
+          <w:lang w:eastAsia="it-IT"/>
+        </w:rPr>
+        <w:t>A</w:t>
+      </w:r>
+      <w:r>
+        <w:rPr>
+          <w:rFonts w:ascii="Arial" w:eastAsia="Times New Roman" w:hAnsi="Arial" w:cs="Arial"/>
+          <w:b/>
+          <w:bCs/>
+          <w:i/>
+          <w:iCs/>
+          <w:color w:val="000000" w:themeColor="text1"/>
+          <w:sz w:val="24"/>
+          <w:szCs w:val="24"/>
+          <w:lang w:eastAsia="it-IT"/>
+        </w:rPr>
+        <w:t>2</w:t>
+      </w:r>
+      <w:r>
+        <w:rPr>
+          <w:rFonts w:ascii="Arial" w:eastAsia="Times New Roman" w:hAnsi="Arial" w:cs="Arial"/>
+          <w:b/>
+          <w:bCs/>
+          <w:i/>
+          <w:iCs/>
+          <w:color w:val="000000" w:themeColor="text1"/>
+          <w:sz w:val="24"/>
+          <w:szCs w:val="24"/>
+          <w:lang w:eastAsia="it-IT"/>
+        </w:rPr>
+        <w:t>+393334188263</w:t>
+      </w:r>
+    </w:p>
+    <w:p>
+      <w:pPr>
+        <w:spacing w:after="0" w:line="330" w:lineRule="atLeast"/>
+        <w:ind w:left="4248"/>
+        <w:rPr>
+          <w:rFonts w:ascii="Arial" w:eastAsia="Times New Roman" w:hAnsi="Arial" w:cs="Arial"/>
+          <w:b/>
+          <w:bCs/>
+          <w:sz w:val="24"/>
+          <w:szCs w:val="24"/>
+          <w:lang w:eastAsia="it-IT"/>
+        </w:rPr>
+      </w:pPr>
+      <w:r>
+        <w:rPr>
+          <w:rFonts w:ascii="Arial" w:eastAsia="Times New Roman" w:hAnsi="Arial" w:cs="Arial"/>
+          <w:b/>
+          <w:bCs/>
+          <w:i/>
+          <w:iCs/>
+          <w:color w:val="000000" w:themeColor="text1"/>
+          <w:sz w:val="24"/>
+          <w:szCs w:val="24"/>
+          <w:lang w:eastAsia="it-IT"/>
+        </w:rPr>
+        <w:t xml:space="preserve">       </w:t>
+      </w:r>
+      <w:r>
+        <w:rPr>
+          <w:rFonts w:ascii="Arial" w:eastAsia="Times New Roman" w:hAnsi="Arial" w:cs="Arial"/>
+          <w:b/>
+          <w:bCs/>
+          <w:i/>
+          <w:iCs/>
+          <w:color w:val="000000" w:themeColor="text1"/>
+          <w:sz w:val="24"/>
+          <w:szCs w:val="24"/>
+          <w:lang w:eastAsia="it-IT"/>
+        </w:rPr>
+        <w:t>A</w:t>
+      </w:r>
+      <w:r>
+        <w:rPr>
+          <w:rFonts w:ascii="Arial" w:eastAsia="Times New Roman" w:hAnsi="Arial" w:cs="Arial"/>
+          <w:b/>
+          <w:bCs/>
+          <w:i/>
+          <w:iCs/>
+          <w:color w:val="000000" w:themeColor="text1"/>
+          <w:sz w:val="24"/>
+          <w:szCs w:val="24"/>
+          <w:lang w:eastAsia="it-IT"/>
+        </w:rPr>
+        <w:t>3</w:t>
+      </w:r>
+      <w:r>
+        <w:rPr>
+          <w:rFonts w:ascii="Arial" w:eastAsia="Times New Roman" w:hAnsi="Arial" w:cs="Arial"/>
+          <w:b/>
+          <w:bCs/>
+          <w:i/>
+          <w:iCs/>
+          <w:color w:val="000000" w:themeColor="text1"/>
+          <w:sz w:val="24"/>
+          <w:szCs w:val="24"/>
+          <w:lang w:eastAsia="it-IT"/>
+        </w:rPr>
+        <w:t>+393334188263</w:t>
+      </w:r>
+    </w:p>
+    <w:p>
+      <w:pPr>
+        <w:spacing w:after="0" w:line="330" w:lineRule="atLeast"/>
+        <w:rPr>
+          <w:rFonts w:ascii="Arial" w:eastAsia="Times New Roman" w:hAnsi="Arial" w:cs="Arial"/>
+          <w:b/>
+          <w:bCs/>
+          <w:sz w:val="24"/>
+          <w:szCs w:val="24"/>
+          <w:lang w:eastAsia="it-IT"/>
+        </w:rPr>
+      </w:pPr>
+    </w:p>
+    <w:p>
+      <w:pPr>
+        <w:spacing w:after="0" w:line="330" w:lineRule="atLeast"/>
+        <w:rPr>
+          <w:rFonts w:ascii="Arial" w:eastAsia="Times New Roman" w:hAnsi="Arial" w:cs="Arial"/>
+          <w:color w:val="000000" w:themeColor="text1"/>
+          <w:sz w:val="24"/>
+          <w:szCs w:val="24"/>
+          <w:lang w:eastAsia="it-IT"/>
+        </w:rPr>
+      </w:pPr>
+      <w:r>
+        <w:rPr>
+          <w:rFonts w:ascii="Arial" w:eastAsia="Times New Roman" w:hAnsi="Arial" w:cs="Arial"/>
+          <w:b/>
+          <w:bCs/>
+          <w:sz w:val="24"/>
+          <w:szCs w:val="24"/>
+          <w:lang w:eastAsia="it-IT"/>
+        </w:rPr>
+        <w:t xml:space="preserve">Comando </w:t>
+      </w:r>
+      <w:r>
+        <w:rPr>
+          <w:rFonts w:ascii="Arial" w:eastAsia="Times New Roman" w:hAnsi="Arial" w:cs="Arial"/>
+          <w:b/>
+          <w:bCs/>
+          <w:sz w:val="24"/>
+          <w:szCs w:val="24"/>
+          <w:lang w:eastAsia="it-IT"/>
+        </w:rPr>
+        <w:t>N</w:t>
+      </w:r>
+      <w:r>
+        <w:rPr>
+          <w:rFonts w:ascii="Arial" w:eastAsia="Times New Roman" w:hAnsi="Arial" w:cs="Arial"/>
+          <w:b/>
+          <w:bCs/>
+          <w:sz w:val="24"/>
+          <w:szCs w:val="24"/>
+          <w:lang w:eastAsia="it-IT"/>
+        </w:rPr>
+        <w:t xml:space="preserve"> - </w:t>
+      </w:r>
+      <w:r>
+        <w:rPr>
+          <w:rFonts w:ascii="Arial" w:eastAsia="Times New Roman" w:hAnsi="Arial" w:cs="Arial"/>
+          <w:b/>
+          <w:bCs/>
+          <w:sz w:val="24"/>
+          <w:szCs w:val="24"/>
+          <w:lang w:eastAsia="it-IT"/>
+        </w:rPr>
+        <w:t>Ritorna i numeri autorizzati</w:t>
+      </w:r>
+    </w:p>
+    <w:p>
+      <w:pPr>
+        <w:spacing w:after="0" w:line="330" w:lineRule="atLeast"/>
+        <w:rPr>
+          <w:rFonts w:ascii="Arial" w:eastAsia="Times New Roman" w:hAnsi="Arial" w:cs="Arial"/>
+          <w:b/>
+          <w:bCs/>
+          <w:sz w:val="24"/>
+          <w:szCs w:val="24"/>
+          <w:lang w:eastAsia="it-IT"/>
+        </w:rPr>
+      </w:pPr>
+      <w:r>
+        <w:rPr>
+          <w:rFonts w:ascii="Arial" w:hAnsi="Arial" w:cs="Arial"/>
+        </w:rPr>
+        <w:t>Da numero Master, i</w:t>
+      </w:r>
+      <w:r>
+        <w:rPr>
+          <w:rFonts w:ascii="Arial" w:hAnsi="Arial" w:cs="Arial"/>
+        </w:rPr>
+        <w:t>nvia</w:t>
+      </w:r>
+      <w:r>
+        <w:rPr>
+          <w:rFonts w:ascii="Arial" w:hAnsi="Arial" w:cs="Arial"/>
+        </w:rPr>
+        <w:t xml:space="preserve">re </w:t>
+      </w:r>
+      <w:r>
+        <w:rPr>
+          <w:rFonts w:ascii="Arial" w:hAnsi="Arial" w:cs="Arial"/>
+        </w:rPr>
+        <w:t xml:space="preserve">il Comando </w:t>
+      </w:r>
+      <w:r>
+        <w:rPr>
+          <w:rFonts w:ascii="Arial" w:eastAsia="Times New Roman" w:hAnsi="Arial" w:cs="Arial"/>
+          <w:color w:val="000000" w:themeColor="text1"/>
+          <w:sz w:val="24"/>
+          <w:szCs w:val="24"/>
+          <w:lang w:eastAsia="it-IT"/>
+        </w:rPr>
+        <w:t>–</w:t>
+      </w:r>
+      <w:r>
+        <w:rPr>
+          <w:rFonts w:ascii="Arial" w:eastAsia="Times New Roman" w:hAnsi="Arial" w:cs="Arial"/>
+          <w:color w:val="000000" w:themeColor="text1"/>
+          <w:sz w:val="24"/>
+          <w:szCs w:val="24"/>
+          <w:lang w:eastAsia="it-IT"/>
+        </w:rPr>
+        <w:t xml:space="preserve"> </w:t>
+      </w:r>
+      <w:r>
+        <w:rPr>
+          <w:rFonts w:ascii="Arial" w:eastAsia="Times New Roman" w:hAnsi="Arial" w:cs="Arial"/>
+          <w:b/>
+          <w:bCs/>
+          <w:color w:val="000000" w:themeColor="text1"/>
+          <w:sz w:val="24"/>
+          <w:szCs w:val="24"/>
+          <w:lang w:eastAsia="it-IT"/>
+        </w:rPr>
+        <w:t>N</w:t>
+      </w:r>
+    </w:p>
+    <w:p>
+      <w:pPr>
+        <w:spacing w:after="0" w:line="330" w:lineRule="atLeast"/>
+        <w:rPr>
+          <w:rFonts w:ascii="Arial" w:eastAsia="Times New Roman" w:hAnsi="Arial" w:cs="Arial"/>
+          <w:b/>
+          <w:bCs/>
+          <w:sz w:val="24"/>
+          <w:szCs w:val="24"/>
+          <w:lang w:eastAsia="it-IT"/>
+        </w:rPr>
+      </w:pPr>
+    </w:p>
+    <w:p>
+      <w:pPr>
+        <w:spacing w:after="0" w:line="330" w:lineRule="atLeast"/>
+        <w:rPr>
+          <w:rFonts w:ascii="Arial" w:eastAsia="Times New Roman" w:hAnsi="Arial" w:cs="Arial"/>
+          <w:b/>
+          <w:bCs/>
+          <w:color w:val="A6A6A6" w:themeColor="background1" w:themeShade="A6"/>
+          <w:sz w:val="24"/>
+          <w:szCs w:val="24"/>
+          <w:lang w:eastAsia="it-IT"/>
+        </w:rPr>
+      </w:pPr>
+      <w:r>
+        <w:rPr>
+          <w:rFonts w:ascii="Arial" w:eastAsia="Times New Roman" w:hAnsi="Arial" w:cs="Arial"/>
+          <w:b/>
+          <w:bCs/>
+          <w:color w:val="A6A6A6" w:themeColor="background1" w:themeShade="A6"/>
+          <w:sz w:val="24"/>
+          <w:szCs w:val="24"/>
+          <w:lang w:eastAsia="it-IT"/>
+        </w:rPr>
+        <w:t xml:space="preserve">Comando </w:t>
+      </w:r>
+      <w:r>
+        <w:rPr>
+          <w:rFonts w:ascii="Arial" w:eastAsia="Times New Roman" w:hAnsi="Arial" w:cs="Arial"/>
+          <w:b/>
+          <w:bCs/>
+          <w:color w:val="A6A6A6" w:themeColor="background1" w:themeShade="A6"/>
+          <w:sz w:val="24"/>
+          <w:szCs w:val="24"/>
+          <w:lang w:eastAsia="it-IT"/>
+        </w:rPr>
+        <w:t>E</w:t>
+      </w:r>
+      <w:r>
+        <w:rPr>
+          <w:rFonts w:ascii="Arial" w:eastAsia="Times New Roman" w:hAnsi="Arial" w:cs="Arial"/>
+          <w:b/>
+          <w:bCs/>
+          <w:color w:val="A6A6A6" w:themeColor="background1" w:themeShade="A6"/>
+          <w:sz w:val="24"/>
+          <w:szCs w:val="24"/>
+          <w:lang w:eastAsia="it-IT"/>
+        </w:rPr>
+        <w:t xml:space="preserve"> – Cancella tutti i numeri</w:t>
+      </w:r>
+    </w:p>
+    <w:p>
+      <w:pPr>
+        <w:spacing w:after="0" w:line="330" w:lineRule="atLeast"/>
+        <w:rPr>
+          <w:rFonts w:ascii="Arial" w:eastAsia="Times New Roman" w:hAnsi="Arial" w:cs="Arial"/>
+          <w:color w:val="A6A6A6" w:themeColor="background1" w:themeShade="A6"/>
+          <w:sz w:val="24"/>
+          <w:szCs w:val="24"/>
+          <w:u w:val="single"/>
+          <w:lang w:eastAsia="it-IT"/>
+        </w:rPr>
+      </w:pPr>
+      <w:r>
+        <w:rPr>
+          <w:rFonts w:ascii="Arial" w:hAnsi="Arial" w:cs="Arial"/>
+          <w:color w:val="A6A6A6" w:themeColor="background1" w:themeShade="A6"/>
+        </w:rPr>
+        <w:t xml:space="preserve">Da </w:t>
+      </w:r>
+      <w:r>
+        <w:rPr>
+          <w:rFonts w:ascii="Arial" w:hAnsi="Arial" w:cs="Arial"/>
+          <w:color w:val="A6A6A6" w:themeColor="background1" w:themeShade="A6"/>
+        </w:rPr>
+        <w:t xml:space="preserve">qualsiasi </w:t>
+      </w:r>
+      <w:r>
+        <w:rPr>
+          <w:rFonts w:ascii="Arial" w:hAnsi="Arial" w:cs="Arial"/>
+          <w:color w:val="A6A6A6" w:themeColor="background1" w:themeShade="A6"/>
+        </w:rPr>
+        <w:t xml:space="preserve">numero, inviare il Comando </w:t>
+      </w:r>
+      <w:r>
+        <w:rPr>
+          <w:rFonts w:ascii="Arial" w:eastAsia="Times New Roman" w:hAnsi="Arial" w:cs="Arial"/>
+          <w:color w:val="A6A6A6" w:themeColor="background1" w:themeShade="A6"/>
+          <w:sz w:val="24"/>
+          <w:szCs w:val="24"/>
+          <w:lang w:eastAsia="it-IT"/>
+        </w:rPr>
+        <w:t>–</w:t>
+      </w:r>
+      <w:r>
+        <w:rPr>
+          <w:rFonts w:ascii="Arial" w:eastAsia="Times New Roman" w:hAnsi="Arial" w:cs="Arial"/>
+          <w:color w:val="A6A6A6" w:themeColor="background1" w:themeShade="A6"/>
+          <w:sz w:val="24"/>
+          <w:szCs w:val="24"/>
+          <w:lang w:eastAsia="it-IT"/>
+        </w:rPr>
+        <w:t xml:space="preserve"> </w:t>
+      </w:r>
+      <w:r>
+        <w:rPr>
+          <w:rFonts w:ascii="Arial" w:eastAsia="Times New Roman" w:hAnsi="Arial" w:cs="Arial"/>
+          <w:b/>
+          <w:bCs/>
+          <w:color w:val="A6A6A6" w:themeColor="background1" w:themeShade="A6"/>
+          <w:sz w:val="24"/>
+          <w:szCs w:val="24"/>
+          <w:lang w:eastAsia="it-IT"/>
+        </w:rPr>
+        <w:t>E</w:t>
+      </w:r>
+    </w:p>
+    <w:p>
+      <w:pPr>
+        <w:spacing w:after="0" w:line="330" w:lineRule="atLeast"/>
+        <w:rPr>
+          <w:rFonts w:ascii="Arial" w:eastAsia="Times New Roman" w:hAnsi="Arial" w:cs="Arial"/>
+          <w:color w:val="A6A6A6" w:themeColor="background1" w:themeShade="A6"/>
+          <w:sz w:val="24"/>
+          <w:szCs w:val="24"/>
+          <w:lang w:eastAsia="it-IT"/>
+        </w:rPr>
+      </w:pPr>
+      <w:r>
+        <w:rPr>
+          <w:rFonts w:ascii="Arial" w:eastAsia="Times New Roman" w:hAnsi="Arial" w:cs="Arial"/>
+          <w:color w:val="A6A6A6" w:themeColor="background1" w:themeShade="A6"/>
+          <w:sz w:val="24"/>
+          <w:szCs w:val="24"/>
+          <w:lang w:eastAsia="it-IT"/>
+        </w:rPr>
+        <w:t>COMANDO NON DOCUMENTATO</w:t>
+      </w:r>
+    </w:p>
+    <w:p>
+      <w:pPr>
+        <w:spacing w:after="0" w:line="330" w:lineRule="atLeast"/>
+        <w:rPr>
+          <w:rFonts w:ascii="Arial" w:eastAsia="Times New Roman" w:hAnsi="Arial" w:cs="Arial"/>
+          <w:b/>
+          <w:bCs/>
+          <w:sz w:val="24"/>
+          <w:szCs w:val="24"/>
+          <w:lang w:eastAsia="it-IT"/>
+        </w:rPr>
+      </w:pPr>
+    </w:p>
+    <w:p>
+      <w:pPr>
+        <w:spacing w:after="0" w:line="330" w:lineRule="atLeast"/>
+        <w:rPr>
+          <w:rFonts w:ascii="Arial" w:eastAsia="Times New Roman" w:hAnsi="Arial" w:cs="Arial"/>
+          <w:b/>
+          <w:bCs/>
+          <w:sz w:val="24"/>
+          <w:szCs w:val="24"/>
+          <w:lang w:eastAsia="it-IT"/>
+        </w:rPr>
+      </w:pPr>
+      <w:r>
+        <w:rPr>
+          <w:rFonts w:ascii="Arial" w:eastAsia="Times New Roman" w:hAnsi="Arial" w:cs="Arial"/>
+          <w:b/>
+          <w:bCs/>
+          <w:sz w:val="24"/>
+          <w:szCs w:val="24"/>
+          <w:lang w:eastAsia="it-IT"/>
+        </w:rPr>
+        <w:t xml:space="preserve">Comando </w:t>
+      </w:r>
+      <w:r>
+        <w:rPr>
+          <w:rFonts w:ascii="Arial" w:eastAsia="Times New Roman" w:hAnsi="Arial" w:cs="Arial"/>
+          <w:b/>
+          <w:bCs/>
+          <w:sz w:val="24"/>
+          <w:szCs w:val="24"/>
+          <w:lang w:eastAsia="it-IT"/>
+        </w:rPr>
+        <w:t>S</w:t>
+      </w:r>
+      <w:r>
+        <w:rPr>
+          <w:rFonts w:ascii="Arial" w:eastAsia="Times New Roman" w:hAnsi="Arial" w:cs="Arial"/>
+          <w:b/>
+          <w:bCs/>
+          <w:sz w:val="24"/>
+          <w:szCs w:val="24"/>
+          <w:lang w:eastAsia="it-IT"/>
+        </w:rPr>
+        <w:t xml:space="preserve"> – Status, monitor Tensione</w:t>
+      </w:r>
+    </w:p>
+    <w:p>
+      <w:pPr>
+        <w:spacing w:after="0" w:line="330" w:lineRule="atLeast"/>
+        <w:ind w:left="708"/>
+        <w:rPr>
+          <w:rFonts w:ascii="Arial" w:eastAsia="Times New Roman" w:hAnsi="Arial" w:cs="Arial"/>
+          <w:color w:val="000000" w:themeColor="text1"/>
+          <w:sz w:val="24"/>
+          <w:szCs w:val="24"/>
+          <w:lang w:eastAsia="it-IT"/>
+        </w:rPr>
+      </w:pPr>
+      <w:r>
+        <w:rPr>
+          <w:rFonts w:ascii="Arial" w:hAnsi="Arial" w:cs="Arial"/>
+        </w:rPr>
+        <w:t>Da numero Master</w:t>
+      </w:r>
+      <w:r>
+        <w:rPr>
+          <w:rFonts w:ascii="Arial" w:hAnsi="Arial" w:cs="Arial"/>
+        </w:rPr>
+        <w:t xml:space="preserve"> o Aus</w:t>
+      </w:r>
+      <w:r>
+        <w:rPr>
+          <w:rFonts w:ascii="Arial" w:hAnsi="Arial" w:cs="Arial"/>
+        </w:rPr>
+        <w:t>i</w:t>
+      </w:r>
+      <w:r>
+        <w:rPr>
+          <w:rFonts w:ascii="Arial" w:hAnsi="Arial" w:cs="Arial"/>
+        </w:rPr>
+        <w:t>liario</w:t>
+      </w:r>
+      <w:r>
+        <w:rPr>
+          <w:rFonts w:ascii="Arial" w:hAnsi="Arial" w:cs="Arial"/>
+        </w:rPr>
+        <w:t>, i</w:t>
+      </w:r>
+      <w:r>
+        <w:rPr>
+          <w:rFonts w:ascii="Arial" w:hAnsi="Arial" w:cs="Arial"/>
+        </w:rPr>
+        <w:t xml:space="preserve">nviare il Comando </w:t>
+      </w:r>
+      <w:r>
+        <w:rPr>
+          <w:rFonts w:ascii="Arial" w:eastAsia="Times New Roman" w:hAnsi="Arial" w:cs="Arial"/>
+          <w:color w:val="000000" w:themeColor="text1"/>
+          <w:sz w:val="24"/>
+          <w:szCs w:val="24"/>
+          <w:lang w:eastAsia="it-IT"/>
+        </w:rPr>
+        <w:t xml:space="preserve">- </w:t>
+      </w:r>
+      <w:r>
+        <w:rPr>
+          <w:rFonts w:ascii="Arial" w:eastAsia="Times New Roman" w:hAnsi="Arial" w:cs="Arial"/>
+          <w:b/>
+          <w:bCs/>
+          <w:i/>
+          <w:iCs/>
+          <w:color w:val="000000" w:themeColor="text1"/>
+          <w:sz w:val="24"/>
+          <w:szCs w:val="24"/>
+          <w:lang w:eastAsia="it-IT"/>
+        </w:rPr>
+        <w:t>S</w:t>
+      </w:r>
+      <w:r>
+        <w:rPr>
+          <w:rFonts w:ascii="Arial" w:eastAsia="Times New Roman" w:hAnsi="Arial" w:cs="Arial"/>
+          <w:color w:val="000000" w:themeColor="text1"/>
+          <w:sz w:val="24"/>
+          <w:szCs w:val="24"/>
+          <w:lang w:eastAsia="it-IT"/>
+        </w:rPr>
+        <w:t xml:space="preserve"> per </w:t>
+      </w:r>
+      <w:r>
+        <w:rPr>
+          <w:rFonts w:ascii="Arial" w:eastAsia="Times New Roman" w:hAnsi="Arial" w:cs="Arial"/>
+          <w:color w:val="000000" w:themeColor="text1"/>
+          <w:sz w:val="24"/>
+          <w:szCs w:val="24"/>
+          <w:lang w:eastAsia="it-IT"/>
+        </w:rPr>
+        <w:t>ricevere via SMS lo stato della Tensione</w:t>
+      </w:r>
+    </w:p>
+    <w:p>
+      <w:pPr>
+        <w:spacing w:after="0" w:line="330" w:lineRule="atLeast"/>
+        <w:ind w:firstLine="708"/>
+        <w:rPr>
+          <w:rFonts w:ascii="Arial" w:eastAsia="Times New Roman" w:hAnsi="Arial" w:cs="Arial"/>
+          <w:b/>
+          <w:bCs/>
+          <w:sz w:val="24"/>
+          <w:szCs w:val="24"/>
+          <w:lang w:eastAsia="it-IT"/>
+        </w:rPr>
+      </w:pPr>
+    </w:p>
+    <w:p>
+      <w:pPr>
+        <w:spacing w:after="0" w:line="330" w:lineRule="atLeast"/>
+        <w:rPr>
+          <w:rFonts w:ascii="Arial" w:eastAsia="Times New Roman" w:hAnsi="Arial" w:cs="Arial"/>
+          <w:b/>
+          <w:bCs/>
+          <w:sz w:val="24"/>
+          <w:szCs w:val="24"/>
+          <w:lang w:eastAsia="it-IT"/>
+        </w:rPr>
+      </w:pPr>
+    </w:p>
+    <w:p>
+      <w:pPr>
+        <w:spacing w:after="0" w:line="330" w:lineRule="atLeast"/>
+        <w:rPr>
+          <w:rFonts w:ascii="Arial" w:eastAsia="Times New Roman" w:hAnsi="Arial" w:cs="Arial"/>
+          <w:b/>
+          <w:bCs/>
+          <w:sz w:val="24"/>
+          <w:szCs w:val="24"/>
+          <w:lang w:eastAsia="it-IT"/>
+        </w:rPr>
+      </w:pPr>
+    </w:p>
+    <w:p>
+      <w:pPr>
+        <w:spacing w:after="0" w:line="330" w:lineRule="atLeast"/>
+        <w:rPr>
+          <w:rFonts w:ascii="Arial" w:eastAsia="Times New Roman" w:hAnsi="Arial" w:cs="Arial"/>
+          <w:color w:val="000000" w:themeColor="text1"/>
+          <w:sz w:val="24"/>
+          <w:szCs w:val="24"/>
+          <w:lang w:eastAsia="it-IT"/>
+        </w:rPr>
+      </w:pPr>
+    </w:p>
+    <w:p>
+      <w:pPr>
+        <w:spacing w:after="0" w:line="330" w:lineRule="atLeast"/>
+        <w:rPr>
+          <w:rFonts w:ascii="Arial" w:eastAsia="Times New Roman" w:hAnsi="Arial" w:cs="Arial"/>
+          <w:color w:val="000000" w:themeColor="text1"/>
           <w:sz w:val="24"/>
           <w:szCs w:val="24"/>
           <w:lang w:eastAsia="it-IT"/>
@@ -4552,6 +6233,230 @@
       </w:rPr>
     </w:lvl>
   </w:abstractNum>
+  <w:abstractNum w:abstractNumId="3" w15:restartNumberingAfterBreak="0">
+    <w:nsid w:val="50BE3F4D"/>
+    <w:multiLevelType w:val="hybridMultilevel"/>
+    <w:tmpl w:val="01020D8A"/>
+    <w:lvl w:ilvl="0" w:tplc="71B48E0C">
+      <w:numFmt w:val="bullet"/>
+      <w:lvlText w:val="-"/>
+      <w:lvlJc w:val="left"/>
+      <w:pPr>
+        <w:ind w:left="720" w:hanging="360"/>
+      </w:pPr>
+      <w:rPr>
+        <w:rFonts w:ascii="Arial" w:eastAsia="Times New Roman" w:hAnsi="Arial" w:cs="Arial" w:hint="default"/>
+      </w:rPr>
+    </w:lvl>
+    <w:lvl w:ilvl="1" w:tplc="04100003" w:tentative="1">
+      <w:start w:val="1"/>
+      <w:numFmt w:val="bullet"/>
+      <w:lvlText w:val="o"/>
+      <w:lvlJc w:val="left"/>
+      <w:pPr>
+        <w:ind w:left="1440" w:hanging="360"/>
+      </w:pPr>
+      <w:rPr>
+        <w:rFonts w:ascii="Courier New" w:hAnsi="Courier New" w:cs="Courier New" w:hint="default"/>
+      </w:rPr>
+    </w:lvl>
+    <w:lvl w:ilvl="2" w:tplc="04100005" w:tentative="1">
+      <w:start w:val="1"/>
+      <w:numFmt w:val="bullet"/>
+      <w:lvlText w:val=""/>
+      <w:lvlJc w:val="left"/>
+      <w:pPr>
+        <w:ind w:left="2160" w:hanging="360"/>
+      </w:pPr>
+      <w:rPr>
+        <w:rFonts w:ascii="Wingdings" w:hAnsi="Wingdings" w:hint="default"/>
+      </w:rPr>
+    </w:lvl>
+    <w:lvl w:ilvl="3" w:tplc="04100001" w:tentative="1">
+      <w:start w:val="1"/>
+      <w:numFmt w:val="bullet"/>
+      <w:lvlText w:val=""/>
+      <w:lvlJc w:val="left"/>
+      <w:pPr>
+        <w:ind w:left="2880" w:hanging="360"/>
+      </w:pPr>
+      <w:rPr>
+        <w:rFonts w:ascii="Symbol" w:hAnsi="Symbol" w:hint="default"/>
+      </w:rPr>
+    </w:lvl>
+    <w:lvl w:ilvl="4" w:tplc="04100003" w:tentative="1">
+      <w:start w:val="1"/>
+      <w:numFmt w:val="bullet"/>
+      <w:lvlText w:val="o"/>
+      <w:lvlJc w:val="left"/>
+      <w:pPr>
+        <w:ind w:left="3600" w:hanging="360"/>
+      </w:pPr>
+      <w:rPr>
+        <w:rFonts w:ascii="Courier New" w:hAnsi="Courier New" w:cs="Courier New" w:hint="default"/>
+      </w:rPr>
+    </w:lvl>
+    <w:lvl w:ilvl="5" w:tplc="04100005" w:tentative="1">
+      <w:start w:val="1"/>
+      <w:numFmt w:val="bullet"/>
+      <w:lvlText w:val=""/>
+      <w:lvlJc w:val="left"/>
+      <w:pPr>
+        <w:ind w:left="4320" w:hanging="360"/>
+      </w:pPr>
+      <w:rPr>
+        <w:rFonts w:ascii="Wingdings" w:hAnsi="Wingdings" w:hint="default"/>
+      </w:rPr>
+    </w:lvl>
+    <w:lvl w:ilvl="6" w:tplc="04100001" w:tentative="1">
+      <w:start w:val="1"/>
+      <w:numFmt w:val="bullet"/>
+      <w:lvlText w:val=""/>
+      <w:lvlJc w:val="left"/>
+      <w:pPr>
+        <w:ind w:left="5040" w:hanging="360"/>
+      </w:pPr>
+      <w:rPr>
+        <w:rFonts w:ascii="Symbol" w:hAnsi="Symbol" w:hint="default"/>
+      </w:rPr>
+    </w:lvl>
+    <w:lvl w:ilvl="7" w:tplc="04100003" w:tentative="1">
+      <w:start w:val="1"/>
+      <w:numFmt w:val="bullet"/>
+      <w:lvlText w:val="o"/>
+      <w:lvlJc w:val="left"/>
+      <w:pPr>
+        <w:ind w:left="5760" w:hanging="360"/>
+      </w:pPr>
+      <w:rPr>
+        <w:rFonts w:ascii="Courier New" w:hAnsi="Courier New" w:cs="Courier New" w:hint="default"/>
+      </w:rPr>
+    </w:lvl>
+    <w:lvl w:ilvl="8" w:tplc="04100005" w:tentative="1">
+      <w:start w:val="1"/>
+      <w:numFmt w:val="bullet"/>
+      <w:lvlText w:val=""/>
+      <w:lvlJc w:val="left"/>
+      <w:pPr>
+        <w:ind w:left="6480" w:hanging="360"/>
+      </w:pPr>
+      <w:rPr>
+        <w:rFonts w:ascii="Wingdings" w:hAnsi="Wingdings" w:hint="default"/>
+      </w:rPr>
+    </w:lvl>
+  </w:abstractNum>
+  <w:abstractNum w:abstractNumId="4" w15:restartNumberingAfterBreak="0">
+    <w:nsid w:val="575237AF"/>
+    <w:multiLevelType w:val="hybridMultilevel"/>
+    <w:tmpl w:val="FFCE2A40"/>
+    <w:lvl w:ilvl="0" w:tplc="1310BE10">
+      <w:numFmt w:val="bullet"/>
+      <w:lvlText w:val="-"/>
+      <w:lvlJc w:val="left"/>
+      <w:pPr>
+        <w:ind w:left="720" w:hanging="360"/>
+      </w:pPr>
+      <w:rPr>
+        <w:rFonts w:ascii="Arial" w:eastAsia="Times New Roman" w:hAnsi="Arial" w:cs="Arial" w:hint="default"/>
+      </w:rPr>
+    </w:lvl>
+    <w:lvl w:ilvl="1" w:tplc="04100003" w:tentative="1">
+      <w:start w:val="1"/>
+      <w:numFmt w:val="bullet"/>
+      <w:lvlText w:val="o"/>
+      <w:lvlJc w:val="left"/>
+      <w:pPr>
+        <w:ind w:left="1440" w:hanging="360"/>
+      </w:pPr>
+      <w:rPr>
+        <w:rFonts w:ascii="Courier New" w:hAnsi="Courier New" w:cs="Courier New" w:hint="default"/>
+      </w:rPr>
+    </w:lvl>
+    <w:lvl w:ilvl="2" w:tplc="04100005" w:tentative="1">
+      <w:start w:val="1"/>
+      <w:numFmt w:val="bullet"/>
+      <w:lvlText w:val=""/>
+      <w:lvlJc w:val="left"/>
+      <w:pPr>
+        <w:ind w:left="2160" w:hanging="360"/>
+      </w:pPr>
+      <w:rPr>
+        <w:rFonts w:ascii="Wingdings" w:hAnsi="Wingdings" w:hint="default"/>
+      </w:rPr>
+    </w:lvl>
+    <w:lvl w:ilvl="3" w:tplc="04100001" w:tentative="1">
+      <w:start w:val="1"/>
+      <w:numFmt w:val="bullet"/>
+      <w:lvlText w:val=""/>
+      <w:lvlJc w:val="left"/>
+      <w:pPr>
+        <w:ind w:left="2880" w:hanging="360"/>
+      </w:pPr>
+      <w:rPr>
+        <w:rFonts w:ascii="Symbol" w:hAnsi="Symbol" w:hint="default"/>
+      </w:rPr>
+    </w:lvl>
+    <w:lvl w:ilvl="4" w:tplc="04100003" w:tentative="1">
+      <w:start w:val="1"/>
+      <w:numFmt w:val="bullet"/>
+      <w:lvlText w:val="o"/>
+      <w:lvlJc w:val="left"/>
+      <w:pPr>
+        <w:ind w:left="3600" w:hanging="360"/>
+      </w:pPr>
+      <w:rPr>
+        <w:rFonts w:ascii="Courier New" w:hAnsi="Courier New" w:cs="Courier New" w:hint="default"/>
+      </w:rPr>
+    </w:lvl>
+    <w:lvl w:ilvl="5" w:tplc="04100005" w:tentative="1">
+      <w:start w:val="1"/>
+      <w:numFmt w:val="bullet"/>
+      <w:lvlText w:val=""/>
+      <w:lvlJc w:val="left"/>
+      <w:pPr>
+        <w:ind w:left="4320" w:hanging="360"/>
+      </w:pPr>
+      <w:rPr>
+        <w:rFonts w:ascii="Wingdings" w:hAnsi="Wingdings" w:hint="default"/>
+      </w:rPr>
+    </w:lvl>
+    <w:lvl w:ilvl="6" w:tplc="04100001" w:tentative="1">
+      <w:start w:val="1"/>
+      <w:numFmt w:val="bullet"/>
+      <w:lvlText w:val=""/>
+      <w:lvlJc w:val="left"/>
+      <w:pPr>
+        <w:ind w:left="5040" w:hanging="360"/>
+      </w:pPr>
+      <w:rPr>
+        <w:rFonts w:ascii="Symbol" w:hAnsi="Symbol" w:hint="default"/>
+      </w:rPr>
+    </w:lvl>
+    <w:lvl w:ilvl="7" w:tplc="04100003" w:tentative="1">
+      <w:start w:val="1"/>
+      <w:numFmt w:val="bullet"/>
+      <w:lvlText w:val="o"/>
+      <w:lvlJc w:val="left"/>
+      <w:pPr>
+        <w:ind w:left="5760" w:hanging="360"/>
+      </w:pPr>
+      <w:rPr>
+        <w:rFonts w:ascii="Courier New" w:hAnsi="Courier New" w:cs="Courier New" w:hint="default"/>
+      </w:rPr>
+    </w:lvl>
+    <w:lvl w:ilvl="8" w:tplc="04100005" w:tentative="1">
+      <w:start w:val="1"/>
+      <w:numFmt w:val="bullet"/>
+      <w:lvlText w:val=""/>
+      <w:lvlJc w:val="left"/>
+      <w:pPr>
+        <w:ind w:left="6480" w:hanging="360"/>
+      </w:pPr>
+      <w:rPr>
+        <w:rFonts w:ascii="Wingdings" w:hAnsi="Wingdings" w:hint="default"/>
+      </w:rPr>
+    </w:lvl>
+  </w:abstractNum>
   <w:num w:numId="1">
     <w:abstractNumId w:val="2"/>
   </w:num>
@@ -4560,6 +6465,12 @@
   </w:num>
   <w:num w:numId="3">
     <w:abstractNumId w:val="1"/>
+  </w:num>
+  <w:num w:numId="4">
+    <w:abstractNumId w:val="4"/>
+  </w:num>
+  <w:num w:numId="5">
+    <w:abstractNumId w:val="3"/>
   </w:num>
 </w:numbering>
 </file>
@@ -4962,7 +6873,7 @@
   <w:style w:type="paragraph" w:default="1" w:styleId="Normale">
     <w:name w:val="Normal"/>
     <w:qFormat/>
-    <w:rsid w:val="0029255E"/>
+    <w:rsid w:val="00F1601E"/>
   </w:style>
   <w:style w:type="paragraph" w:styleId="Titolo3">
     <w:name w:val="heading 3"/>

</xml_diff>

<commit_message>
Commit Remoto di Docx
</commit_message>
<xml_diff>
--- a/SMS Manager for Power monitoring.docx
+++ b/SMS Manager for Power monitoring.docx
@@ -66,7 +66,6 @@
         </w:rPr>
         <w:t xml:space="preserve">  </w:t>
       </w:r>
-      <w:proofErr w:type="spellStart"/>
       <w:r>
         <w:rPr>
           <w:rFonts w:ascii="Arial" w:eastAsia="Times New Roman" w:hAnsi="Arial" w:cs="Arial"/>
@@ -77,41 +76,28 @@
           <w:szCs w:val="28"/>
           <w:lang w:val="en-US" w:eastAsia="it-IT"/>
         </w:rPr>
-        <w:t>Specifiche</w:t>
-      </w:r>
-      <w:proofErr w:type="spellEnd"/>
-      <w:r>
-        <w:rPr>
-          <w:rFonts w:ascii="Arial" w:eastAsia="Times New Roman" w:hAnsi="Arial" w:cs="Arial"/>
-          <w:b/>
-          <w:bCs/>
-          <w:color w:val="000000" w:themeColor="text1"/>
-          <w:sz w:val="28"/>
-          <w:szCs w:val="28"/>
+        <w:t>Specifiche:</w:t>
+      </w:r>
+    </w:p>
+    <w:p>
+      <w:pPr>
+        <w:spacing w:after="0" w:line="330" w:lineRule="atLeast"/>
+        <w:rPr>
+          <w:rFonts w:ascii="Arial" w:eastAsia="Times New Roman" w:hAnsi="Arial" w:cs="Arial"/>
+          <w:color w:val="000000" w:themeColor="text1"/>
+          <w:sz w:val="24"/>
+          <w:szCs w:val="24"/>
+          <w:lang w:eastAsia="it-IT"/>
+        </w:rPr>
+      </w:pPr>
+      <w:r>
+        <w:rPr>
+          <w:rFonts w:ascii="Arial" w:eastAsia="Times New Roman" w:hAnsi="Arial" w:cs="Arial"/>
+          <w:color w:val="000000" w:themeColor="text1"/>
+          <w:sz w:val="24"/>
+          <w:szCs w:val="24"/>
           <w:lang w:val="en-US" w:eastAsia="it-IT"/>
         </w:rPr>
-        <w:t>:</w:t>
-      </w:r>
-    </w:p>
-    <w:p>
-      <w:pPr>
-        <w:spacing w:after="0" w:line="330" w:lineRule="atLeast"/>
-        <w:rPr>
-          <w:rFonts w:ascii="Arial" w:eastAsia="Times New Roman" w:hAnsi="Arial" w:cs="Arial"/>
-          <w:color w:val="000000" w:themeColor="text1"/>
-          <w:sz w:val="24"/>
-          <w:szCs w:val="24"/>
-          <w:lang w:eastAsia="it-IT"/>
-        </w:rPr>
-      </w:pPr>
-      <w:r>
-        <w:rPr>
-          <w:rFonts w:ascii="Arial" w:eastAsia="Times New Roman" w:hAnsi="Arial" w:cs="Arial"/>
-          <w:color w:val="000000" w:themeColor="text1"/>
-          <w:sz w:val="24"/>
-          <w:szCs w:val="24"/>
-          <w:lang w:val="en-US" w:eastAsia="it-IT"/>
-        </w:rPr>
         <w:t xml:space="preserve">  </w:t>
       </w:r>
       <w:r>
@@ -144,29 +130,7 @@
           <w:szCs w:val="24"/>
           <w:lang w:eastAsia="it-IT"/>
         </w:rPr>
-        <w:t>  - OK    </w:t>
-      </w:r>
-      <w:proofErr w:type="spellStart"/>
-      <w:r>
-        <w:rPr>
-          <w:rFonts w:ascii="Arial" w:eastAsia="Times New Roman" w:hAnsi="Arial" w:cs="Arial"/>
-          <w:color w:val="000000" w:themeColor="text1"/>
-          <w:sz w:val="24"/>
-          <w:szCs w:val="24"/>
-          <w:lang w:eastAsia="it-IT"/>
-        </w:rPr>
-        <w:t>Reinizializzazione</w:t>
-      </w:r>
-      <w:proofErr w:type="spellEnd"/>
-      <w:r>
-        <w:rPr>
-          <w:rFonts w:ascii="Arial" w:eastAsia="Times New Roman" w:hAnsi="Arial" w:cs="Arial"/>
-          <w:color w:val="000000" w:themeColor="text1"/>
-          <w:sz w:val="24"/>
-          <w:szCs w:val="24"/>
-          <w:lang w:eastAsia="it-IT"/>
-        </w:rPr>
-        <w:t xml:space="preserve"> ogni 24 ore (ogni giorno) ad ora prestabilita</w:t>
+        <w:t>  - OK    Reinizializzazione ogni 24 ore (ogni giorno) ad ora prestabilita</w:t>
       </w:r>
     </w:p>
     <w:p>
@@ -686,10 +650,93 @@
           <w:u w:val="single"/>
           <w:lang w:eastAsia="it-IT"/>
         </w:rPr>
-        <w:t xml:space="preserve">Monitora la tensione di rete tramite un trasformatore e la libreria </w:t>
-      </w:r>
-      <w:proofErr w:type="spellStart"/>
-      <w:r>
+        <w:t>Monitora la tensione di rete tramite un trasformatore e la libreria EmonLib.</w:t>
+      </w:r>
+    </w:p>
+    <w:p>
+      <w:pPr>
+        <w:spacing w:after="0" w:line="330" w:lineRule="atLeast"/>
+        <w:ind w:left="708"/>
+        <w:rPr>
+          <w:rFonts w:ascii="Arial" w:eastAsia="Times New Roman" w:hAnsi="Arial" w:cs="Arial"/>
+          <w:color w:val="000000" w:themeColor="text1"/>
+          <w:sz w:val="24"/>
+          <w:szCs w:val="24"/>
+          <w:lang w:eastAsia="it-IT"/>
+        </w:rPr>
+      </w:pPr>
+      <w:r>
+        <w:rPr>
+          <w:rFonts w:ascii="Arial" w:eastAsia="Times New Roman" w:hAnsi="Arial" w:cs="Arial"/>
+          <w:color w:val="000000" w:themeColor="text1"/>
+          <w:sz w:val="24"/>
+          <w:szCs w:val="24"/>
+          <w:lang w:eastAsia="it-IT"/>
+        </w:rPr>
+        <w:t>- Notifica via SMS a numeri autorizzati (Master + fino a 3 ausiliari) i seguenti eventi:</w:t>
+      </w:r>
+    </w:p>
+    <w:p>
+      <w:pPr>
+        <w:spacing w:after="0" w:line="330" w:lineRule="atLeast"/>
+        <w:ind w:left="1416"/>
+        <w:rPr>
+          <w:rFonts w:ascii="Arial" w:eastAsia="Times New Roman" w:hAnsi="Arial" w:cs="Arial"/>
+          <w:color w:val="000000" w:themeColor="text1"/>
+          <w:sz w:val="24"/>
+          <w:szCs w:val="24"/>
+          <w:lang w:eastAsia="it-IT"/>
+        </w:rPr>
+      </w:pPr>
+      <w:r>
+        <w:rPr>
+          <w:rFonts w:ascii="Arial" w:eastAsia="Times New Roman" w:hAnsi="Arial" w:cs="Arial"/>
+          <w:color w:val="000000" w:themeColor="text1"/>
+          <w:sz w:val="24"/>
+          <w:szCs w:val="24"/>
+          <w:lang w:eastAsia="it-IT"/>
+        </w:rPr>
+        <w:t>- Mancanza di rete (tensione &lt; 180V)</w:t>
+      </w:r>
+    </w:p>
+    <w:p>
+      <w:pPr>
+        <w:spacing w:after="0" w:line="330" w:lineRule="atLeast"/>
+        <w:ind w:left="1416"/>
+        <w:rPr>
+          <w:rFonts w:ascii="Arial" w:eastAsia="Times New Roman" w:hAnsi="Arial" w:cs="Arial"/>
+          <w:color w:val="000000" w:themeColor="text1"/>
+          <w:sz w:val="24"/>
+          <w:szCs w:val="24"/>
+          <w:lang w:eastAsia="it-IT"/>
+        </w:rPr>
+      </w:pPr>
+      <w:r>
+        <w:rPr>
+          <w:rFonts w:ascii="Arial" w:eastAsia="Times New Roman" w:hAnsi="Arial" w:cs="Arial"/>
+          <w:color w:val="000000" w:themeColor="text1"/>
+          <w:sz w:val="24"/>
+          <w:szCs w:val="24"/>
+          <w:lang w:eastAsia="it-IT"/>
+        </w:rPr>
+        <w:t>- Ripresa rete (tensione &gt; 200V)</w:t>
+      </w:r>
+    </w:p>
+    <w:p>
+      <w:pPr>
+        <w:spacing w:after="0" w:line="330" w:lineRule="atLeast"/>
+        <w:rPr>
+          <w:rFonts w:ascii="Arial" w:eastAsia="Times New Roman" w:hAnsi="Arial" w:cs="Arial"/>
+          <w:color w:val="000000" w:themeColor="text1"/>
+          <w:sz w:val="24"/>
+          <w:szCs w:val="24"/>
+          <w:lang w:eastAsia="it-IT"/>
+        </w:rPr>
+      </w:pPr>
+    </w:p>
+    <w:p>
+      <w:pPr>
+        <w:spacing w:after="0" w:line="330" w:lineRule="atLeast"/>
         <w:rPr>
           <w:rFonts w:ascii="Arial" w:eastAsia="Times New Roman" w:hAnsi="Arial" w:cs="Arial"/>
           <w:color w:val="000000" w:themeColor="text1"/>
@@ -698,9 +745,7 @@
           <w:u w:val="single"/>
           <w:lang w:eastAsia="it-IT"/>
         </w:rPr>
-        <w:t>EmonLib</w:t>
-      </w:r>
-      <w:proofErr w:type="spellEnd"/>
+      </w:pPr>
       <w:r>
         <w:rPr>
           <w:rFonts w:ascii="Arial" w:eastAsia="Times New Roman" w:hAnsi="Arial" w:cs="Arial"/>
@@ -710,8 +755,20 @@
           <w:u w:val="single"/>
           <w:lang w:eastAsia="it-IT"/>
         </w:rPr>
-        <w:t>.</w:t>
-      </w:r>
+        <w:t>Gestisce comandi via SMS:</w:t>
+      </w:r>
+    </w:p>
+    <w:p>
+      <w:pPr>
+        <w:spacing w:after="0" w:line="330" w:lineRule="atLeast"/>
+        <w:rPr>
+          <w:rFonts w:ascii="Arial" w:eastAsia="Times New Roman" w:hAnsi="Arial" w:cs="Arial"/>
+          <w:color w:val="000000" w:themeColor="text1"/>
+          <w:sz w:val="24"/>
+          <w:szCs w:val="24"/>
+          <w:lang w:eastAsia="it-IT"/>
+        </w:rPr>
+      </w:pPr>
     </w:p>
     <w:p>
       <w:pPr>
@@ -733,126 +790,8 @@
           <w:szCs w:val="24"/>
           <w:lang w:eastAsia="it-IT"/>
         </w:rPr>
-        <w:t>- Notifica via SMS a numeri autorizzati (Master + fino a 3 ausiliari) i seguenti eventi:</w:t>
-      </w:r>
-    </w:p>
-    <w:p>
-      <w:pPr>
-        <w:spacing w:after="0" w:line="330" w:lineRule="atLeast"/>
-        <w:ind w:left="1416"/>
-        <w:rPr>
-          <w:rFonts w:ascii="Arial" w:eastAsia="Times New Roman" w:hAnsi="Arial" w:cs="Arial"/>
-          <w:color w:val="000000" w:themeColor="text1"/>
-          <w:sz w:val="24"/>
-          <w:szCs w:val="24"/>
-          <w:lang w:eastAsia="it-IT"/>
-        </w:rPr>
-      </w:pPr>
-      <w:r>
-        <w:rPr>
-          <w:rFonts w:ascii="Arial" w:eastAsia="Times New Roman" w:hAnsi="Arial" w:cs="Arial"/>
-          <w:color w:val="000000" w:themeColor="text1"/>
-          <w:sz w:val="24"/>
-          <w:szCs w:val="24"/>
-          <w:lang w:eastAsia="it-IT"/>
-        </w:rPr>
-        <w:t>- Mancanza di rete (tensione &lt; 180V)</w:t>
-      </w:r>
-    </w:p>
-    <w:p>
-      <w:pPr>
-        <w:spacing w:after="0" w:line="330" w:lineRule="atLeast"/>
-        <w:ind w:left="1416"/>
-        <w:rPr>
-          <w:rFonts w:ascii="Arial" w:eastAsia="Times New Roman" w:hAnsi="Arial" w:cs="Arial"/>
-          <w:color w:val="000000" w:themeColor="text1"/>
-          <w:sz w:val="24"/>
-          <w:szCs w:val="24"/>
-          <w:lang w:eastAsia="it-IT"/>
-        </w:rPr>
-      </w:pPr>
-      <w:r>
-        <w:rPr>
-          <w:rFonts w:ascii="Arial" w:eastAsia="Times New Roman" w:hAnsi="Arial" w:cs="Arial"/>
-          <w:color w:val="000000" w:themeColor="text1"/>
-          <w:sz w:val="24"/>
-          <w:szCs w:val="24"/>
-          <w:lang w:eastAsia="it-IT"/>
-        </w:rPr>
-        <w:t>- Ripresa rete (tensione &gt; 200V)</w:t>
-      </w:r>
-    </w:p>
-    <w:p>
-      <w:pPr>
-        <w:spacing w:after="0" w:line="330" w:lineRule="atLeast"/>
-        <w:rPr>
-          <w:rFonts w:ascii="Arial" w:eastAsia="Times New Roman" w:hAnsi="Arial" w:cs="Arial"/>
-          <w:color w:val="000000" w:themeColor="text1"/>
-          <w:sz w:val="24"/>
-          <w:szCs w:val="24"/>
-          <w:lang w:eastAsia="it-IT"/>
-        </w:rPr>
-      </w:pPr>
-    </w:p>
-    <w:p>
-      <w:pPr>
-        <w:spacing w:after="0" w:line="330" w:lineRule="atLeast"/>
-        <w:rPr>
-          <w:rFonts w:ascii="Arial" w:eastAsia="Times New Roman" w:hAnsi="Arial" w:cs="Arial"/>
-          <w:color w:val="000000" w:themeColor="text1"/>
-          <w:sz w:val="24"/>
-          <w:szCs w:val="24"/>
-          <w:u w:val="single"/>
-          <w:lang w:eastAsia="it-IT"/>
-        </w:rPr>
-      </w:pPr>
-      <w:r>
-        <w:rPr>
-          <w:rFonts w:ascii="Arial" w:eastAsia="Times New Roman" w:hAnsi="Arial" w:cs="Arial"/>
-          <w:color w:val="000000" w:themeColor="text1"/>
-          <w:sz w:val="24"/>
-          <w:szCs w:val="24"/>
-          <w:u w:val="single"/>
-          <w:lang w:eastAsia="it-IT"/>
-        </w:rPr>
-        <w:t>Gestisce comandi via SMS:</w:t>
-      </w:r>
-    </w:p>
-    <w:p>
-      <w:pPr>
-        <w:spacing w:after="0" w:line="330" w:lineRule="atLeast"/>
-        <w:rPr>
-          <w:rFonts w:ascii="Arial" w:eastAsia="Times New Roman" w:hAnsi="Arial" w:cs="Arial"/>
-          <w:color w:val="000000" w:themeColor="text1"/>
-          <w:sz w:val="24"/>
-          <w:szCs w:val="24"/>
-          <w:lang w:eastAsia="it-IT"/>
-        </w:rPr>
-      </w:pPr>
-    </w:p>
-    <w:p>
-      <w:pPr>
-        <w:spacing w:after="0" w:line="330" w:lineRule="atLeast"/>
-        <w:ind w:left="708"/>
-        <w:rPr>
-          <w:rFonts w:ascii="Arial" w:eastAsia="Times New Roman" w:hAnsi="Arial" w:cs="Arial"/>
-          <w:color w:val="000000" w:themeColor="text1"/>
-          <w:sz w:val="24"/>
-          <w:szCs w:val="24"/>
-          <w:lang w:eastAsia="it-IT"/>
-        </w:rPr>
-      </w:pPr>
-      <w:r>
-        <w:rPr>
-          <w:rFonts w:ascii="Arial" w:eastAsia="Times New Roman" w:hAnsi="Arial" w:cs="Arial"/>
-          <w:color w:val="000000" w:themeColor="text1"/>
-          <w:sz w:val="24"/>
-          <w:szCs w:val="24"/>
-          <w:lang w:eastAsia="it-IT"/>
-        </w:rPr>
         <w:t xml:space="preserve">- </w:t>
       </w:r>
-      <w:proofErr w:type="spellStart"/>
       <w:r>
         <w:rPr>
           <w:rFonts w:ascii="Arial" w:eastAsia="Times New Roman" w:hAnsi="Arial" w:cs="Arial"/>
@@ -865,7 +804,6 @@
         </w:rPr>
         <w:t>M+numero</w:t>
       </w:r>
-      <w:proofErr w:type="spellEnd"/>
       <w:r>
         <w:rPr>
           <w:rFonts w:ascii="Arial" w:eastAsia="Times New Roman" w:hAnsi="Arial" w:cs="Arial"/>
@@ -2122,7 +2060,6 @@
                 <w:lang w:eastAsia="it-IT"/>
               </w:rPr>
             </w:pPr>
-            <w:proofErr w:type="spellStart"/>
             <w:r>
               <w:rPr>
                 <w:rFonts w:ascii="Arial" w:eastAsia="Times New Roman" w:hAnsi="Arial" w:cs="Arial"/>
@@ -2133,7 +2070,6 @@
               </w:rPr>
               <w:t>Command</w:t>
             </w:r>
-            <w:proofErr w:type="spellEnd"/>
           </w:p>
         </w:tc>
         <w:tc>
@@ -2553,29 +2489,7 @@
                 <w:szCs w:val="24"/>
                 <w:lang w:val="en-US" w:eastAsia="it-IT"/>
               </w:rPr>
-              <w:t xml:space="preserve">Delete in EEPROM and </w:t>
-            </w:r>
-            <w:proofErr w:type="spellStart"/>
-            <w:r>
-              <w:rPr>
-                <w:rFonts w:ascii="Arial" w:eastAsia="Times New Roman" w:hAnsi="Arial" w:cs="Arial"/>
-                <w:color w:val="000000" w:themeColor="text1"/>
-                <w:sz w:val="24"/>
-                <w:szCs w:val="24"/>
-                <w:lang w:val="en-US" w:eastAsia="it-IT"/>
-              </w:rPr>
-              <w:t>phoneAut</w:t>
-            </w:r>
-            <w:proofErr w:type="spellEnd"/>
-            <w:r>
-              <w:rPr>
-                <w:rFonts w:ascii="Arial" w:eastAsia="Times New Roman" w:hAnsi="Arial" w:cs="Arial"/>
-                <w:color w:val="000000" w:themeColor="text1"/>
-                <w:sz w:val="24"/>
-                <w:szCs w:val="24"/>
-                <w:lang w:val="en-US" w:eastAsia="it-IT"/>
-              </w:rPr>
-              <w:t xml:space="preserve"> auxiliaries phone numbers except the Authorized </w:t>
+              <w:t xml:space="preserve">Delete in EEPROM and phoneAut auxiliaries phone numbers except the Authorized </w:t>
             </w:r>
             <w:proofErr w:type="gramStart"/>
             <w:r>
@@ -3377,27 +3291,15 @@
           <w:lang w:eastAsia="it-IT"/>
         </w:rPr>
       </w:pPr>
-      <w:proofErr w:type="spellStart"/>
-      <w:r>
-        <w:rPr>
-          <w:rFonts w:ascii="Arial" w:eastAsia="Times New Roman" w:hAnsi="Arial" w:cs="Arial"/>
-          <w:color w:val="000000" w:themeColor="text1"/>
-          <w:sz w:val="24"/>
-          <w:szCs w:val="24"/>
-          <w:lang w:eastAsia="it-IT"/>
-        </w:rPr>
-        <w:t>EEPROM.read</w:t>
-      </w:r>
-      <w:proofErr w:type="spellEnd"/>
-      <w:r>
-        <w:rPr>
-          <w:rFonts w:ascii="Arial" w:eastAsia="Times New Roman" w:hAnsi="Arial" w:cs="Arial"/>
-          <w:color w:val="000000" w:themeColor="text1"/>
-          <w:sz w:val="24"/>
-          <w:szCs w:val="24"/>
-          <w:lang w:eastAsia="it-IT"/>
-        </w:rPr>
-        <w:t>(5) Indicatore Rete presente (0) Rete assente (1)</w:t>
+      <w:r>
+        <w:rPr>
+          <w:rFonts w:ascii="Arial" w:eastAsia="Times New Roman" w:hAnsi="Arial" w:cs="Arial"/>
+          <w:color w:val="000000" w:themeColor="text1"/>
+          <w:sz w:val="24"/>
+          <w:szCs w:val="24"/>
+          <w:lang w:eastAsia="it-IT"/>
+        </w:rPr>
+        <w:t>EEPROM.read(5) Indicatore Rete presente (0) Rete assente (1)</w:t>
       </w:r>
     </w:p>
     <w:p>
@@ -3703,63 +3605,32 @@
         </w:rPr>
         <w:t>chiama </w:t>
       </w:r>
-      <w:proofErr w:type="spellStart"/>
-      <w:r>
-        <w:fldChar w:fldCharType="begin"/>
-      </w:r>
-      <w:r>
-        <w:instrText xml:space="preserve"> HYPERLINK "vscode-file://vscode-app/c:/Users/Massimo/AppData/Local/Programs/Microsoft%20VS%20Code/f6cfa2ea24/resources/app/out/vs/code/electron-browser/workbench/workbench.html" </w:instrText>
-      </w:r>
-      <w:r>
-        <w:fldChar w:fldCharType="separate"/>
-      </w:r>
-      <w:proofErr w:type="gramStart"/>
-      <w:r>
-        <w:rPr>
-          <w:rFonts w:ascii="Segoe UI" w:eastAsia="Times New Roman" w:hAnsi="Segoe UI" w:cs="Segoe UI"/>
-          <w:color w:val="000000" w:themeColor="text1"/>
-          <w:sz w:val="18"/>
-          <w:szCs w:val="18"/>
-          <w:bdr w:val="single" w:sz="4" w:space="1" w:color="auto" w:frame="1"/>
-          <w:lang w:eastAsia="it-IT"/>
-        </w:rPr>
-        <w:t>initgsm</w:t>
-      </w:r>
-      <w:proofErr w:type="spellEnd"/>
-      <w:r>
-        <w:rPr>
-          <w:rFonts w:ascii="Segoe UI" w:eastAsia="Times New Roman" w:hAnsi="Segoe UI" w:cs="Segoe UI"/>
-          <w:color w:val="000000" w:themeColor="text1"/>
-          <w:sz w:val="18"/>
-          <w:szCs w:val="18"/>
-          <w:bdr w:val="single" w:sz="4" w:space="1" w:color="auto" w:frame="1"/>
-          <w:lang w:eastAsia="it-IT"/>
-        </w:rPr>
-        <w:t>(</w:t>
-      </w:r>
-      <w:proofErr w:type="gramEnd"/>
-      <w:r>
-        <w:rPr>
-          <w:rFonts w:ascii="Segoe UI" w:eastAsia="Times New Roman" w:hAnsi="Segoe UI" w:cs="Segoe UI"/>
-          <w:color w:val="000000" w:themeColor="text1"/>
-          <w:sz w:val="18"/>
-          <w:szCs w:val="18"/>
-          <w:bdr w:val="single" w:sz="4" w:space="1" w:color="auto" w:frame="1"/>
-          <w:lang w:eastAsia="it-IT"/>
-        </w:rPr>
-        <w:t>)</w:t>
-      </w:r>
-      <w:r>
-        <w:rPr>
-          <w:rFonts w:ascii="Segoe UI" w:eastAsia="Times New Roman" w:hAnsi="Segoe UI" w:cs="Segoe UI"/>
-          <w:color w:val="000000" w:themeColor="text1"/>
-          <w:sz w:val="18"/>
-          <w:szCs w:val="18"/>
-          <w:bdr w:val="single" w:sz="4" w:space="1" w:color="auto" w:frame="1"/>
-          <w:lang w:eastAsia="it-IT"/>
-        </w:rPr>
-        <w:fldChar w:fldCharType="end"/>
-      </w:r>
+      <w:hyperlink r:id="rId7" w:history="1">
+        <w:proofErr w:type="gramStart"/>
+        <w:r>
+          <w:rPr>
+            <w:rFonts w:ascii="Segoe UI" w:eastAsia="Times New Roman" w:hAnsi="Segoe UI" w:cs="Segoe UI"/>
+            <w:color w:val="000000" w:themeColor="text1"/>
+            <w:sz w:val="18"/>
+            <w:szCs w:val="18"/>
+            <w:bdr w:val="single" w:sz="4" w:space="1" w:color="auto" w:frame="1"/>
+            <w:lang w:eastAsia="it-IT"/>
+          </w:rPr>
+          <w:t>initgsm(</w:t>
+        </w:r>
+        <w:proofErr w:type="gramEnd"/>
+        <w:r>
+          <w:rPr>
+            <w:rFonts w:ascii="Segoe UI" w:eastAsia="Times New Roman" w:hAnsi="Segoe UI" w:cs="Segoe UI"/>
+            <w:color w:val="000000" w:themeColor="text1"/>
+            <w:sz w:val="18"/>
+            <w:szCs w:val="18"/>
+            <w:bdr w:val="single" w:sz="4" w:space="1" w:color="auto" w:frame="1"/>
+            <w:lang w:eastAsia="it-IT"/>
+          </w:rPr>
+          <w:t>)</w:t>
+        </w:r>
+      </w:hyperlink>
     </w:p>
     <w:p>
       <w:pPr>
@@ -3786,50 +3657,19 @@
         </w:rPr>
         <w:t>imposta </w:t>
       </w:r>
-      <w:proofErr w:type="spellStart"/>
-      <w:r>
-        <w:fldChar w:fldCharType="begin"/>
-      </w:r>
-      <w:r>
-        <w:instrText xml:space="preserve"> HYPERLINK "vscode-file://vscode-app/c:/Users/Massimo/AppData/Local/Programs/Microsoft%20VS%20Code/f6cfa2ea24/resources/app/out/vs/code/electron-browser/workbench/workbench.html" </w:instrText>
-      </w:r>
-      <w:r>
-        <w:fldChar w:fldCharType="separate"/>
-      </w:r>
-      <w:r>
-        <w:rPr>
-          <w:rFonts w:ascii="Segoe UI" w:eastAsia="Times New Roman" w:hAnsi="Segoe UI" w:cs="Segoe UI"/>
-          <w:color w:val="000000" w:themeColor="text1"/>
-          <w:sz w:val="18"/>
-          <w:szCs w:val="18"/>
-          <w:bdr w:val="single" w:sz="4" w:space="1" w:color="auto" w:frame="1"/>
-          <w:lang w:eastAsia="it-IT"/>
-        </w:rPr>
-        <w:t>EEPROM.update</w:t>
-      </w:r>
-      <w:proofErr w:type="spellEnd"/>
-      <w:r>
-        <w:rPr>
-          <w:rFonts w:ascii="Segoe UI" w:eastAsia="Times New Roman" w:hAnsi="Segoe UI" w:cs="Segoe UI"/>
-          <w:color w:val="000000" w:themeColor="text1"/>
-          <w:sz w:val="18"/>
-          <w:szCs w:val="18"/>
-          <w:bdr w:val="single" w:sz="4" w:space="1" w:color="auto" w:frame="1"/>
-          <w:lang w:eastAsia="it-IT"/>
-        </w:rPr>
-        <w:t>(5, 0)</w:t>
-      </w:r>
-      <w:r>
-        <w:rPr>
-          <w:rFonts w:ascii="Segoe UI" w:eastAsia="Times New Roman" w:hAnsi="Segoe UI" w:cs="Segoe UI"/>
-          <w:color w:val="000000" w:themeColor="text1"/>
-          <w:sz w:val="18"/>
-          <w:szCs w:val="18"/>
-          <w:bdr w:val="single" w:sz="4" w:space="1" w:color="auto" w:frame="1"/>
-          <w:lang w:eastAsia="it-IT"/>
-        </w:rPr>
-        <w:fldChar w:fldCharType="end"/>
-      </w:r>
+      <w:hyperlink r:id="rId8" w:history="1">
+        <w:r>
+          <w:rPr>
+            <w:rFonts w:ascii="Segoe UI" w:eastAsia="Times New Roman" w:hAnsi="Segoe UI" w:cs="Segoe UI"/>
+            <w:color w:val="000000" w:themeColor="text1"/>
+            <w:sz w:val="18"/>
+            <w:szCs w:val="18"/>
+            <w:bdr w:val="single" w:sz="4" w:space="1" w:color="auto" w:frame="1"/>
+            <w:lang w:eastAsia="it-IT"/>
+          </w:rPr>
+          <w:t>EEPROM.update(5, 0)</w:t>
+        </w:r>
+      </w:hyperlink>
     </w:p>
     <w:p>
       <w:pPr>
@@ -3856,50 +3696,19 @@
         </w:rPr>
         <w:t>carica numeri autorizzati con </w:t>
       </w:r>
-      <w:proofErr w:type="spellStart"/>
-      <w:r>
-        <w:fldChar w:fldCharType="begin"/>
-      </w:r>
-      <w:r>
-        <w:instrText xml:space="preserve"> HYPERLINK "vscode-file://vscode-app/c:/Users/Massimo/AppData/Local/Programs/Microsoft%20VS%20Code/f6cfa2ea24/resources/app/out/vs/code/electron-browser/workbench/workbench.html" </w:instrText>
-      </w:r>
-      <w:r>
-        <w:fldChar w:fldCharType="separate"/>
-      </w:r>
-      <w:r>
-        <w:rPr>
-          <w:rFonts w:ascii="Segoe UI" w:eastAsia="Times New Roman" w:hAnsi="Segoe UI" w:cs="Segoe UI"/>
-          <w:color w:val="000000" w:themeColor="text1"/>
-          <w:sz w:val="18"/>
-          <w:szCs w:val="18"/>
-          <w:bdr w:val="single" w:sz="4" w:space="1" w:color="auto" w:frame="1"/>
-          <w:lang w:eastAsia="it-IT"/>
-        </w:rPr>
-        <w:t>RestorePhones</w:t>
-      </w:r>
-      <w:proofErr w:type="spellEnd"/>
-      <w:r>
-        <w:rPr>
-          <w:rFonts w:ascii="Segoe UI" w:eastAsia="Times New Roman" w:hAnsi="Segoe UI" w:cs="Segoe UI"/>
-          <w:color w:val="000000" w:themeColor="text1"/>
-          <w:sz w:val="18"/>
-          <w:szCs w:val="18"/>
-          <w:bdr w:val="single" w:sz="4" w:space="1" w:color="auto" w:frame="1"/>
-          <w:lang w:eastAsia="it-IT"/>
-        </w:rPr>
-        <w:t>()</w:t>
-      </w:r>
-      <w:r>
-        <w:rPr>
-          <w:rFonts w:ascii="Segoe UI" w:eastAsia="Times New Roman" w:hAnsi="Segoe UI" w:cs="Segoe UI"/>
-          <w:color w:val="000000" w:themeColor="text1"/>
-          <w:sz w:val="18"/>
-          <w:szCs w:val="18"/>
-          <w:bdr w:val="single" w:sz="4" w:space="1" w:color="auto" w:frame="1"/>
-          <w:lang w:eastAsia="it-IT"/>
-        </w:rPr>
-        <w:fldChar w:fldCharType="end"/>
-      </w:r>
+      <w:hyperlink r:id="rId9" w:history="1">
+        <w:r>
+          <w:rPr>
+            <w:rFonts w:ascii="Segoe UI" w:eastAsia="Times New Roman" w:hAnsi="Segoe UI" w:cs="Segoe UI"/>
+            <w:color w:val="000000" w:themeColor="text1"/>
+            <w:sz w:val="18"/>
+            <w:szCs w:val="18"/>
+            <w:bdr w:val="single" w:sz="4" w:space="1" w:color="auto" w:frame="1"/>
+            <w:lang w:eastAsia="it-IT"/>
+          </w:rPr>
+          <w:t>RestorePhones()</w:t>
+        </w:r>
+      </w:hyperlink>
     </w:p>
     <w:p>
       <w:pPr>
@@ -3916,7 +3725,7 @@
           <w:lang w:eastAsia="it-IT"/>
         </w:rPr>
       </w:pPr>
-      <w:hyperlink r:id="rId7" w:history="1">
+      <w:hyperlink r:id="rId10" w:history="1">
         <w:proofErr w:type="gramStart"/>
         <w:r>
           <w:rPr>
@@ -4264,50 +4073,19 @@
         </w:rPr>
         <w:t>ogni 15 minuti verifica reset giornaliero e chiama </w:t>
       </w:r>
-      <w:proofErr w:type="spellStart"/>
-      <w:r>
-        <w:fldChar w:fldCharType="begin"/>
-      </w:r>
-      <w:r>
-        <w:instrText xml:space="preserve"> HYPERLINK "vscode-file://vscode-app/c:/Users/Massimo/AppData/Local/Programs/Microsoft%20VS%20Code/f6cfa2ea24/resources/app/out/vs/code/electron-browser/workbench/workbench.html" </w:instrText>
-      </w:r>
-      <w:r>
-        <w:fldChar w:fldCharType="separate"/>
-      </w:r>
-      <w:r>
-        <w:rPr>
-          <w:rFonts w:ascii="Segoe UI" w:eastAsia="Times New Roman" w:hAnsi="Segoe UI" w:cs="Segoe UI"/>
-          <w:color w:val="000000" w:themeColor="text1"/>
-          <w:sz w:val="18"/>
-          <w:szCs w:val="18"/>
-          <w:bdr w:val="single" w:sz="4" w:space="1" w:color="auto" w:frame="1"/>
-          <w:lang w:eastAsia="it-IT"/>
-        </w:rPr>
-        <w:t>initgsm</w:t>
-      </w:r>
-      <w:proofErr w:type="spellEnd"/>
-      <w:r>
-        <w:rPr>
-          <w:rFonts w:ascii="Segoe UI" w:eastAsia="Times New Roman" w:hAnsi="Segoe UI" w:cs="Segoe UI"/>
-          <w:color w:val="000000" w:themeColor="text1"/>
-          <w:sz w:val="18"/>
-          <w:szCs w:val="18"/>
-          <w:bdr w:val="single" w:sz="4" w:space="1" w:color="auto" w:frame="1"/>
-          <w:lang w:eastAsia="it-IT"/>
-        </w:rPr>
-        <w:t>()</w:t>
-      </w:r>
-      <w:r>
-        <w:rPr>
-          <w:rFonts w:ascii="Segoe UI" w:eastAsia="Times New Roman" w:hAnsi="Segoe UI" w:cs="Segoe UI"/>
-          <w:color w:val="000000" w:themeColor="text1"/>
-          <w:sz w:val="18"/>
-          <w:szCs w:val="18"/>
-          <w:bdr w:val="single" w:sz="4" w:space="1" w:color="auto" w:frame="1"/>
-          <w:lang w:eastAsia="it-IT"/>
-        </w:rPr>
-        <w:fldChar w:fldCharType="end"/>
-      </w:r>
+      <w:hyperlink r:id="rId11" w:history="1">
+        <w:r>
+          <w:rPr>
+            <w:rFonts w:ascii="Segoe UI" w:eastAsia="Times New Roman" w:hAnsi="Segoe UI" w:cs="Segoe UI"/>
+            <w:color w:val="000000" w:themeColor="text1"/>
+            <w:sz w:val="18"/>
+            <w:szCs w:val="18"/>
+            <w:bdr w:val="single" w:sz="4" w:space="1" w:color="auto" w:frame="1"/>
+            <w:lang w:eastAsia="it-IT"/>
+          </w:rPr>
+          <w:t>initgsm()</w:t>
+        </w:r>
+      </w:hyperlink>
       <w:r>
         <w:rPr>
           <w:rFonts w:ascii="Segoe UI" w:eastAsia="Times New Roman" w:hAnsi="Segoe UI" w:cs="Segoe UI"/>
@@ -5368,7 +5146,7 @@
           <w:color w:val="000000" w:themeColor="text1"/>
           <w:sz w:val="28"/>
           <w:szCs w:val="28"/>
-          <w:lang w:eastAsia="it-IT"/>
+          <w:lang w:val="en-US" w:eastAsia="it-IT"/>
         </w:rPr>
       </w:pPr>
       <w:r>
@@ -5378,7 +5156,7 @@
           <w:bCs/>
           <w:sz w:val="28"/>
           <w:szCs w:val="28"/>
-          <w:lang w:eastAsia="it-IT"/>
+          <w:lang w:val="en-US" w:eastAsia="it-IT"/>
         </w:rPr>
         <w:t>Prim</w:t>
       </w:r>
@@ -5389,44 +5167,31 @@
           <w:bCs/>
           <w:sz w:val="28"/>
           <w:szCs w:val="28"/>
-          <w:lang w:eastAsia="it-IT"/>
-        </w:rPr>
-        <w:t xml:space="preserve">i LAB </w:t>
-      </w:r>
-      <w:proofErr w:type="spellStart"/>
-      <w:r>
-        <w:rPr>
-          <w:rFonts w:ascii="Arial" w:eastAsia="Times New Roman" w:hAnsi="Arial" w:cs="Arial"/>
-          <w:b/>
-          <w:bCs/>
-          <w:sz w:val="28"/>
-          <w:szCs w:val="28"/>
-          <w:lang w:eastAsia="it-IT"/>
-        </w:rPr>
-        <w:t>Tests</w:t>
-      </w:r>
-      <w:proofErr w:type="spellEnd"/>
-    </w:p>
-    <w:p>
-      <w:pPr>
-        <w:spacing w:after="0" w:line="330" w:lineRule="atLeast"/>
-        <w:rPr>
-          <w:rFonts w:ascii="Arial" w:eastAsia="Times New Roman" w:hAnsi="Arial" w:cs="Arial"/>
-          <w:b/>
-          <w:bCs/>
-          <w:sz w:val="24"/>
-          <w:szCs w:val="24"/>
-          <w:lang w:eastAsia="it-IT"/>
-        </w:rPr>
-      </w:pPr>
-      <w:r>
-        <w:rPr>
-          <w:rFonts w:ascii="Arial" w:eastAsia="Times New Roman" w:hAnsi="Arial" w:cs="Arial"/>
-          <w:b/>
-          <w:bCs/>
-          <w:sz w:val="24"/>
-          <w:szCs w:val="24"/>
-          <w:lang w:eastAsia="it-IT"/>
+          <w:lang w:val="en-US" w:eastAsia="it-IT"/>
+        </w:rPr>
+        <w:t>i LAB Tests</w:t>
+      </w:r>
+    </w:p>
+    <w:p>
+      <w:pPr>
+        <w:spacing w:after="0" w:line="330" w:lineRule="atLeast"/>
+        <w:rPr>
+          <w:rFonts w:ascii="Arial" w:eastAsia="Times New Roman" w:hAnsi="Arial" w:cs="Arial"/>
+          <w:b/>
+          <w:bCs/>
+          <w:sz w:val="24"/>
+          <w:szCs w:val="24"/>
+          <w:lang w:eastAsia="it-IT"/>
+        </w:rPr>
+      </w:pPr>
+      <w:r>
+        <w:rPr>
+          <w:rFonts w:ascii="Arial" w:eastAsia="Times New Roman" w:hAnsi="Arial" w:cs="Arial"/>
+          <w:b/>
+          <w:bCs/>
+          <w:sz w:val="24"/>
+          <w:szCs w:val="24"/>
+          <w:lang w:val="en-US" w:eastAsia="it-IT"/>
         </w:rPr>
         <w:t>1.0</w:t>
       </w:r>
@@ -5437,7 +5202,7 @@
           <w:bCs/>
           <w:sz w:val="24"/>
           <w:szCs w:val="24"/>
-          <w:lang w:eastAsia="it-IT"/>
+          <w:lang w:val="en-US" w:eastAsia="it-IT"/>
         </w:rPr>
         <w:tab/>
         <w:t>Prim</w:t>
@@ -5449,31 +5214,18 @@
           <w:bCs/>
           <w:sz w:val="24"/>
           <w:szCs w:val="24"/>
-          <w:lang w:eastAsia="it-IT"/>
-        </w:rPr>
-        <w:t xml:space="preserve">i LAB </w:t>
-      </w:r>
-      <w:proofErr w:type="spellStart"/>
-      <w:r>
-        <w:rPr>
-          <w:rFonts w:ascii="Arial" w:eastAsia="Times New Roman" w:hAnsi="Arial" w:cs="Arial"/>
-          <w:b/>
-          <w:bCs/>
-          <w:sz w:val="24"/>
-          <w:szCs w:val="24"/>
-          <w:lang w:eastAsia="it-IT"/>
-        </w:rPr>
-        <w:t>Tests</w:t>
-      </w:r>
-      <w:proofErr w:type="spellEnd"/>
-      <w:r>
-        <w:rPr>
-          <w:rFonts w:ascii="Arial" w:eastAsia="Times New Roman" w:hAnsi="Arial" w:cs="Arial"/>
-          <w:b/>
-          <w:bCs/>
-          <w:sz w:val="24"/>
-          <w:szCs w:val="24"/>
-          <w:lang w:eastAsia="it-IT"/>
+          <w:lang w:val="en-US" w:eastAsia="it-IT"/>
+        </w:rPr>
+        <w:t>i LAB Tests</w:t>
+      </w:r>
+      <w:r>
+        <w:rPr>
+          <w:rFonts w:ascii="Arial" w:eastAsia="Times New Roman" w:hAnsi="Arial" w:cs="Arial"/>
+          <w:b/>
+          <w:bCs/>
+          <w:sz w:val="24"/>
+          <w:szCs w:val="24"/>
+          <w:lang w:val="en-US" w:eastAsia="it-IT"/>
         </w:rPr>
         <w:t xml:space="preserve">. </w:t>
       </w:r>
@@ -5545,45 +5297,24 @@
         </w:rPr>
         <w:t xml:space="preserve">Attualmente il </w:t>
       </w:r>
-      <w:proofErr w:type="spellStart"/>
-      <w:r>
-        <w:rPr>
-          <w:rFonts w:ascii="Arial" w:eastAsia="Times New Roman" w:hAnsi="Arial" w:cs="Arial"/>
-          <w:color w:val="000000" w:themeColor="text1"/>
-          <w:sz w:val="24"/>
-          <w:szCs w:val="24"/>
-          <w:lang w:eastAsia="it-IT"/>
-        </w:rPr>
-        <w:t>Fw</w:t>
-      </w:r>
-      <w:proofErr w:type="spellEnd"/>
-      <w:r>
-        <w:rPr>
-          <w:rFonts w:ascii="Arial" w:eastAsia="Times New Roman" w:hAnsi="Arial" w:cs="Arial"/>
-          <w:color w:val="000000" w:themeColor="text1"/>
-          <w:sz w:val="24"/>
-          <w:szCs w:val="24"/>
-          <w:lang w:eastAsia="it-IT"/>
-        </w:rPr>
-        <w:t xml:space="preserve"> </w:t>
-      </w:r>
-      <w:r>
-        <w:rPr>
-          <w:rFonts w:ascii="Arial" w:eastAsia="Times New Roman" w:hAnsi="Arial" w:cs="Arial"/>
-          <w:sz w:val="24"/>
-          <w:szCs w:val="24"/>
-          <w:lang w:eastAsia="it-IT"/>
-        </w:rPr>
-        <w:t>p</w:t>
-      </w:r>
-      <w:r>
-        <w:rPr>
-          <w:rFonts w:ascii="Arial" w:eastAsia="Times New Roman" w:hAnsi="Arial" w:cs="Arial"/>
-          <w:sz w:val="24"/>
-          <w:szCs w:val="24"/>
-          <w:lang w:eastAsia="it-IT"/>
-        </w:rPr>
-        <w:t>revede</w:t>
+      <w:r>
+        <w:rPr>
+          <w:rFonts w:ascii="Arial" w:eastAsia="Times New Roman" w:hAnsi="Arial" w:cs="Arial"/>
+          <w:color w:val="000000" w:themeColor="text1"/>
+          <w:sz w:val="24"/>
+          <w:szCs w:val="24"/>
+          <w:lang w:eastAsia="it-IT"/>
+        </w:rPr>
+        <w:t xml:space="preserve">Fw </w:t>
+      </w:r>
+      <w:r>
+        <w:rPr>
+          <w:rFonts w:ascii="Arial" w:eastAsia="Times New Roman" w:hAnsi="Arial" w:cs="Arial"/>
+          <w:sz w:val="24"/>
+          <w:szCs w:val="24"/>
+          <w:lang w:eastAsia="it-IT"/>
+        </w:rPr>
+        <w:t>prevede</w:t>
       </w:r>
       <w:r>
         <w:rPr>
@@ -5680,18 +5411,7 @@
           <w:szCs w:val="24"/>
           <w:lang w:eastAsia="it-IT"/>
         </w:rPr>
-        <w:t>1</w:t>
-      </w:r>
-      <w:r>
-        <w:rPr>
-          <w:rFonts w:ascii="Arial" w:eastAsia="Times New Roman" w:hAnsi="Arial" w:cs="Arial"/>
-          <w:b/>
-          <w:bCs/>
-          <w:sz w:val="24"/>
-          <w:szCs w:val="24"/>
-          <w:lang w:eastAsia="it-IT"/>
-        </w:rPr>
-        <w:t>.</w:t>
+        <w:t>1.</w:t>
       </w:r>
       <w:r>
         <w:rPr>
@@ -5979,18 +5699,7 @@
           <w:szCs w:val="24"/>
           <w:lang w:eastAsia="it-IT"/>
         </w:rPr>
-        <w:t>2</w:t>
-      </w:r>
-      <w:r>
-        <w:rPr>
-          <w:rFonts w:ascii="Arial" w:eastAsia="Times New Roman" w:hAnsi="Arial" w:cs="Arial"/>
-          <w:b/>
-          <w:bCs/>
-          <w:sz w:val="24"/>
-          <w:szCs w:val="24"/>
-          <w:lang w:eastAsia="it-IT"/>
-        </w:rPr>
-        <w:t>.0</w:t>
+        <w:t>2.0</w:t>
       </w:r>
       <w:r>
         <w:rPr>
@@ -6161,29 +5870,7 @@
           <w:szCs w:val="24"/>
           <w:lang w:eastAsia="it-IT"/>
         </w:rPr>
-        <w:t>2</w:t>
-      </w:r>
-      <w:r>
-        <w:rPr>
-          <w:rFonts w:ascii="Arial" w:eastAsia="Times New Roman" w:hAnsi="Arial" w:cs="Arial"/>
-          <w:b/>
-          <w:bCs/>
-          <w:sz w:val="24"/>
-          <w:szCs w:val="24"/>
-          <w:lang w:eastAsia="it-IT"/>
-        </w:rPr>
-        <w:t>.</w:t>
-      </w:r>
-      <w:r>
-        <w:rPr>
-          <w:rFonts w:ascii="Arial" w:eastAsia="Times New Roman" w:hAnsi="Arial" w:cs="Arial"/>
-          <w:b/>
-          <w:bCs/>
-          <w:sz w:val="24"/>
-          <w:szCs w:val="24"/>
-          <w:lang w:eastAsia="it-IT"/>
-        </w:rPr>
-        <w:t>1</w:t>
+        <w:t>2.1</w:t>
       </w:r>
       <w:r>
         <w:rPr>
@@ -6282,18 +5969,7 @@
           <w:szCs w:val="24"/>
           <w:lang w:eastAsia="it-IT"/>
         </w:rPr>
-        <w:t>2.</w:t>
-      </w:r>
-      <w:r>
-        <w:rPr>
-          <w:rFonts w:ascii="Arial" w:eastAsia="Times New Roman" w:hAnsi="Arial" w:cs="Arial"/>
-          <w:b/>
-          <w:bCs/>
-          <w:sz w:val="24"/>
-          <w:szCs w:val="24"/>
-          <w:lang w:eastAsia="it-IT"/>
-        </w:rPr>
-        <w:t>2</w:t>
+        <w:t>2.2</w:t>
       </w:r>
       <w:r>
         <w:rPr>
@@ -6600,18 +6276,7 @@
           <w:szCs w:val="24"/>
           <w:lang w:eastAsia="it-IT"/>
         </w:rPr>
-        <w:t>2.</w:t>
-      </w:r>
-      <w:r>
-        <w:rPr>
-          <w:rFonts w:ascii="Arial" w:eastAsia="Times New Roman" w:hAnsi="Arial" w:cs="Arial"/>
-          <w:b/>
-          <w:bCs/>
-          <w:sz w:val="24"/>
-          <w:szCs w:val="24"/>
-          <w:lang w:eastAsia="it-IT"/>
-        </w:rPr>
-        <w:t>4</w:t>
+        <w:t>2.4</w:t>
       </w:r>
       <w:r>
         <w:rPr>
@@ -6647,7 +6312,7 @@
           <w:szCs w:val="24"/>
           <w:lang w:eastAsia="it-IT"/>
         </w:rPr>
-        <w:t>A</w:t>
+        <w:t>A2</w:t>
       </w:r>
       <w:r>
         <w:rPr>
@@ -6661,8 +6326,9 @@
           <w:szCs w:val="24"/>
           <w:lang w:eastAsia="it-IT"/>
         </w:rPr>
-        <w:t>2</w:t>
-      </w:r>
+        <w:t>+</w:t>
+      </w:r>
+      <w:proofErr w:type="gramStart"/>
       <w:r>
         <w:rPr>
           <w:rFonts w:ascii="Arial" w:eastAsia="Times New Roman" w:hAnsi="Arial" w:cs="Arial"/>
@@ -6675,9 +6341,310 @@
           <w:szCs w:val="24"/>
           <w:lang w:eastAsia="it-IT"/>
         </w:rPr>
-        <w:t>+</w:t>
-      </w:r>
-      <w:proofErr w:type="gramStart"/>
+        <w:t>393334188263</w:t>
+      </w:r>
+      <w:r>
+        <w:rPr>
+          <w:rFonts w:ascii="Arial" w:eastAsia="Times New Roman" w:hAnsi="Arial" w:cs="Arial"/>
+          <w:color w:val="000000" w:themeColor="text1"/>
+          <w:sz w:val="24"/>
+          <w:szCs w:val="24"/>
+          <w:lang w:eastAsia="it-IT"/>
+        </w:rPr>
+        <w:t xml:space="preserve"> </w:t>
+      </w:r>
+      <w:r>
+        <w:rPr>
+          <w:rFonts w:ascii="Arial" w:eastAsia="Times New Roman" w:hAnsi="Arial" w:cs="Arial"/>
+          <w:b/>
+          <w:bCs/>
+          <w:sz w:val="24"/>
+          <w:szCs w:val="24"/>
+          <w:lang w:eastAsia="it-IT"/>
+        </w:rPr>
+        <w:t xml:space="preserve"> -</w:t>
+      </w:r>
+      <w:proofErr w:type="gramEnd"/>
+      <w:r>
+        <w:rPr>
+          <w:rFonts w:ascii="Arial" w:eastAsia="Times New Roman" w:hAnsi="Arial" w:cs="Arial"/>
+          <w:b/>
+          <w:bCs/>
+          <w:sz w:val="24"/>
+          <w:szCs w:val="24"/>
+          <w:lang w:eastAsia="it-IT"/>
+        </w:rPr>
+        <w:t xml:space="preserve"> </w:t>
+      </w:r>
+      <w:r>
+        <w:rPr>
+          <w:rFonts w:ascii="Arial" w:eastAsia="Times New Roman" w:hAnsi="Arial" w:cs="Arial"/>
+          <w:b/>
+          <w:bCs/>
+          <w:sz w:val="24"/>
+          <w:szCs w:val="24"/>
+          <w:u w:val="single"/>
+          <w:lang w:eastAsia="it-IT"/>
+        </w:rPr>
+        <w:t xml:space="preserve">Imposta il </w:t>
+      </w:r>
+      <w:r>
+        <w:rPr>
+          <w:rFonts w:ascii="Arial" w:eastAsia="Times New Roman" w:hAnsi="Arial" w:cs="Arial"/>
+          <w:b/>
+          <w:bCs/>
+          <w:sz w:val="24"/>
+          <w:szCs w:val="24"/>
+          <w:u w:val="single"/>
+          <w:lang w:eastAsia="it-IT"/>
+        </w:rPr>
+        <w:t>secondo numero Ausiliario</w:t>
+      </w:r>
+      <w:r>
+        <w:rPr>
+          <w:rFonts w:ascii="Arial" w:eastAsia="Times New Roman" w:hAnsi="Arial" w:cs="Arial"/>
+          <w:b/>
+          <w:bCs/>
+          <w:sz w:val="24"/>
+          <w:szCs w:val="24"/>
+          <w:lang w:eastAsia="it-IT"/>
+        </w:rPr>
+        <w:t xml:space="preserve"> </w:t>
+      </w:r>
+    </w:p>
+    <w:p>
+      <w:pPr>
+        <w:spacing w:after="0" w:line="330" w:lineRule="atLeast"/>
+        <w:rPr>
+          <w:rFonts w:ascii="Arial" w:eastAsia="Times New Roman" w:hAnsi="Arial" w:cs="Arial"/>
+          <w:sz w:val="24"/>
+          <w:szCs w:val="24"/>
+          <w:lang w:eastAsia="it-IT"/>
+        </w:rPr>
+      </w:pPr>
+      <w:r>
+        <w:rPr>
+          <w:rFonts w:ascii="Arial" w:eastAsia="Times New Roman" w:hAnsi="Arial" w:cs="Arial"/>
+          <w:b/>
+          <w:bCs/>
+          <w:sz w:val="24"/>
+          <w:szCs w:val="24"/>
+          <w:lang w:eastAsia="it-IT"/>
+        </w:rPr>
+        <w:tab/>
+      </w:r>
+      <w:r>
+        <w:rPr>
+          <w:rFonts w:ascii="Arial" w:eastAsia="Times New Roman" w:hAnsi="Arial" w:cs="Arial"/>
+          <w:sz w:val="24"/>
+          <w:szCs w:val="24"/>
+          <w:lang w:eastAsia="it-IT"/>
+        </w:rPr>
+        <w:t xml:space="preserve">Inserisce l’Ausiliario </w:t>
+      </w:r>
+      <w:r>
+        <w:rPr>
+          <w:rFonts w:ascii="Arial" w:eastAsia="Times New Roman" w:hAnsi="Arial" w:cs="Arial"/>
+          <w:sz w:val="24"/>
+          <w:szCs w:val="24"/>
+          <w:lang w:eastAsia="it-IT"/>
+        </w:rPr>
+        <w:t>2</w:t>
+      </w:r>
+    </w:p>
+    <w:p>
+      <w:pPr>
+        <w:spacing w:after="0" w:line="330" w:lineRule="atLeast"/>
+        <w:rPr>
+          <w:rFonts w:ascii="Arial" w:eastAsia="Times New Roman" w:hAnsi="Arial" w:cs="Arial"/>
+          <w:b/>
+          <w:bCs/>
+          <w:sz w:val="24"/>
+          <w:szCs w:val="24"/>
+          <w:lang w:eastAsia="it-IT"/>
+        </w:rPr>
+      </w:pPr>
+      <w:r>
+        <w:rPr>
+          <w:rFonts w:ascii="Arial" w:eastAsia="Times New Roman" w:hAnsi="Arial" w:cs="Arial"/>
+          <w:b/>
+          <w:bCs/>
+          <w:sz w:val="24"/>
+          <w:szCs w:val="24"/>
+          <w:lang w:eastAsia="it-IT"/>
+        </w:rPr>
+        <w:t>2.</w:t>
+      </w:r>
+      <w:r>
+        <w:rPr>
+          <w:rFonts w:ascii="Arial" w:eastAsia="Times New Roman" w:hAnsi="Arial" w:cs="Arial"/>
+          <w:b/>
+          <w:bCs/>
+          <w:sz w:val="24"/>
+          <w:szCs w:val="24"/>
+          <w:lang w:eastAsia="it-IT"/>
+        </w:rPr>
+        <w:t>5</w:t>
+      </w:r>
+      <w:r>
+        <w:rPr>
+          <w:rFonts w:ascii="Arial" w:eastAsia="Times New Roman" w:hAnsi="Arial" w:cs="Arial"/>
+          <w:b/>
+          <w:bCs/>
+          <w:sz w:val="24"/>
+          <w:szCs w:val="24"/>
+          <w:lang w:eastAsia="it-IT"/>
+        </w:rPr>
+        <w:tab/>
+      </w:r>
+      <w:r>
+        <w:rPr>
+          <w:rFonts w:ascii="Arial" w:eastAsia="Times New Roman" w:hAnsi="Arial" w:cs="Arial"/>
+          <w:b/>
+          <w:bCs/>
+          <w:sz w:val="24"/>
+          <w:szCs w:val="24"/>
+          <w:lang w:eastAsia="it-IT"/>
+        </w:rPr>
+        <w:t xml:space="preserve">Comando </w:t>
+      </w:r>
+      <w:r>
+        <w:rPr>
+          <w:rFonts w:ascii="Arial" w:eastAsia="Times New Roman" w:hAnsi="Arial" w:cs="Arial"/>
+          <w:b/>
+          <w:bCs/>
+          <w:sz w:val="24"/>
+          <w:szCs w:val="24"/>
+          <w:lang w:eastAsia="it-IT"/>
+        </w:rPr>
+        <w:t xml:space="preserve">N - </w:t>
+      </w:r>
+      <w:r>
+        <w:rPr>
+          <w:rFonts w:ascii="Arial" w:eastAsia="Times New Roman" w:hAnsi="Arial" w:cs="Arial"/>
+          <w:b/>
+          <w:bCs/>
+          <w:sz w:val="24"/>
+          <w:szCs w:val="24"/>
+          <w:lang w:eastAsia="it-IT"/>
+        </w:rPr>
+        <w:t>Ritorna i numeri autorizzati</w:t>
+      </w:r>
+    </w:p>
+    <w:p>
+      <w:pPr>
+        <w:spacing w:after="0" w:line="330" w:lineRule="atLeast"/>
+        <w:rPr>
+          <w:rFonts w:ascii="Arial" w:eastAsia="Times New Roman" w:hAnsi="Arial" w:cs="Arial"/>
+          <w:sz w:val="24"/>
+          <w:szCs w:val="24"/>
+          <w:lang w:eastAsia="it-IT"/>
+        </w:rPr>
+      </w:pPr>
+      <w:r>
+        <w:rPr>
+          <w:rFonts w:ascii="Arial" w:eastAsia="Times New Roman" w:hAnsi="Arial" w:cs="Arial"/>
+          <w:b/>
+          <w:bCs/>
+          <w:sz w:val="24"/>
+          <w:szCs w:val="24"/>
+          <w:lang w:eastAsia="it-IT"/>
+        </w:rPr>
+        <w:tab/>
+      </w:r>
+      <w:r>
+        <w:rPr>
+          <w:rFonts w:ascii="Arial" w:eastAsia="Times New Roman" w:hAnsi="Arial" w:cs="Arial"/>
+          <w:sz w:val="24"/>
+          <w:szCs w:val="24"/>
+          <w:lang w:eastAsia="it-IT"/>
+        </w:rPr>
+        <w:t>Presente il MASTER</w:t>
+      </w:r>
+      <w:r>
+        <w:rPr>
+          <w:rFonts w:ascii="Arial" w:eastAsia="Times New Roman" w:hAnsi="Arial" w:cs="Arial"/>
+          <w:sz w:val="24"/>
+          <w:szCs w:val="24"/>
+          <w:lang w:eastAsia="it-IT"/>
+        </w:rPr>
+        <w:t xml:space="preserve"> e gl</w:t>
+      </w:r>
+      <w:r>
+        <w:rPr>
+          <w:rFonts w:ascii="Arial" w:eastAsia="Times New Roman" w:hAnsi="Arial" w:cs="Arial"/>
+          <w:sz w:val="24"/>
+          <w:szCs w:val="24"/>
+          <w:lang w:eastAsia="it-IT"/>
+        </w:rPr>
+        <w:t xml:space="preserve">i </w:t>
+      </w:r>
+      <w:r>
+        <w:rPr>
+          <w:rFonts w:ascii="Arial" w:eastAsia="Times New Roman" w:hAnsi="Arial" w:cs="Arial"/>
+          <w:sz w:val="24"/>
+          <w:szCs w:val="24"/>
+          <w:lang w:eastAsia="it-IT"/>
+        </w:rPr>
+        <w:t>Ausiliari 1 e 2</w:t>
+      </w:r>
+    </w:p>
+    <w:p>
+      <w:pPr>
+        <w:spacing w:after="0" w:line="330" w:lineRule="atLeast"/>
+        <w:rPr>
+          <w:rFonts w:ascii="Arial" w:eastAsia="Times New Roman" w:hAnsi="Arial" w:cs="Arial"/>
+          <w:b/>
+          <w:bCs/>
+          <w:sz w:val="24"/>
+          <w:szCs w:val="24"/>
+          <w:lang w:eastAsia="it-IT"/>
+        </w:rPr>
+      </w:pPr>
+      <w:r>
+        <w:rPr>
+          <w:rFonts w:ascii="Arial" w:eastAsia="Times New Roman" w:hAnsi="Arial" w:cs="Arial"/>
+          <w:b/>
+          <w:bCs/>
+          <w:sz w:val="24"/>
+          <w:szCs w:val="24"/>
+          <w:lang w:eastAsia="it-IT"/>
+        </w:rPr>
+        <w:t>2.</w:t>
+      </w:r>
+      <w:r>
+        <w:rPr>
+          <w:rFonts w:ascii="Arial" w:eastAsia="Times New Roman" w:hAnsi="Arial" w:cs="Arial"/>
+          <w:b/>
+          <w:bCs/>
+          <w:sz w:val="24"/>
+          <w:szCs w:val="24"/>
+          <w:lang w:eastAsia="it-IT"/>
+        </w:rPr>
+        <w:t>6</w:t>
+      </w:r>
+      <w:r>
+        <w:rPr>
+          <w:rFonts w:ascii="Arial" w:eastAsia="Times New Roman" w:hAnsi="Arial" w:cs="Arial"/>
+          <w:b/>
+          <w:bCs/>
+          <w:sz w:val="24"/>
+          <w:szCs w:val="24"/>
+          <w:lang w:eastAsia="it-IT"/>
+        </w:rPr>
+        <w:tab/>
+      </w:r>
+      <w:r>
+        <w:rPr>
+          <w:rFonts w:ascii="Arial" w:eastAsia="Times New Roman" w:hAnsi="Arial" w:cs="Arial"/>
+          <w:b/>
+          <w:bCs/>
+          <w:sz w:val="24"/>
+          <w:szCs w:val="24"/>
+          <w:lang w:eastAsia="it-IT"/>
+        </w:rPr>
+        <w:t xml:space="preserve">Comando </w:t>
+      </w:r>
       <w:r>
         <w:rPr>
           <w:rFonts w:ascii="Arial" w:eastAsia="Times New Roman" w:hAnsi="Arial" w:cs="Arial"/>
@@ -6690,348 +6657,7 @@
           <w:szCs w:val="24"/>
           <w:lang w:eastAsia="it-IT"/>
         </w:rPr>
-        <w:t>393334188263</w:t>
-      </w:r>
-      <w:r>
-        <w:rPr>
-          <w:rFonts w:ascii="Arial" w:eastAsia="Times New Roman" w:hAnsi="Arial" w:cs="Arial"/>
-          <w:color w:val="000000" w:themeColor="text1"/>
-          <w:sz w:val="24"/>
-          <w:szCs w:val="24"/>
-          <w:lang w:eastAsia="it-IT"/>
-        </w:rPr>
-        <w:t xml:space="preserve"> </w:t>
-      </w:r>
-      <w:r>
-        <w:rPr>
-          <w:rFonts w:ascii="Arial" w:eastAsia="Times New Roman" w:hAnsi="Arial" w:cs="Arial"/>
-          <w:b/>
-          <w:bCs/>
-          <w:sz w:val="24"/>
-          <w:szCs w:val="24"/>
-          <w:lang w:eastAsia="it-IT"/>
-        </w:rPr>
-        <w:t xml:space="preserve"> -</w:t>
-      </w:r>
-      <w:proofErr w:type="gramEnd"/>
-      <w:r>
-        <w:rPr>
-          <w:rFonts w:ascii="Arial" w:eastAsia="Times New Roman" w:hAnsi="Arial" w:cs="Arial"/>
-          <w:b/>
-          <w:bCs/>
-          <w:sz w:val="24"/>
-          <w:szCs w:val="24"/>
-          <w:lang w:eastAsia="it-IT"/>
-        </w:rPr>
-        <w:t xml:space="preserve"> </w:t>
-      </w:r>
-      <w:r>
-        <w:rPr>
-          <w:rFonts w:ascii="Arial" w:eastAsia="Times New Roman" w:hAnsi="Arial" w:cs="Arial"/>
-          <w:b/>
-          <w:bCs/>
-          <w:sz w:val="24"/>
-          <w:szCs w:val="24"/>
-          <w:u w:val="single"/>
-          <w:lang w:eastAsia="it-IT"/>
-        </w:rPr>
-        <w:t xml:space="preserve">Imposta il </w:t>
-      </w:r>
-      <w:r>
-        <w:rPr>
-          <w:rFonts w:ascii="Arial" w:eastAsia="Times New Roman" w:hAnsi="Arial" w:cs="Arial"/>
-          <w:b/>
-          <w:bCs/>
-          <w:sz w:val="24"/>
-          <w:szCs w:val="24"/>
-          <w:u w:val="single"/>
-          <w:lang w:eastAsia="it-IT"/>
-        </w:rPr>
-        <w:t>secondo</w:t>
-      </w:r>
-      <w:r>
-        <w:rPr>
-          <w:rFonts w:ascii="Arial" w:eastAsia="Times New Roman" w:hAnsi="Arial" w:cs="Arial"/>
-          <w:b/>
-          <w:bCs/>
-          <w:sz w:val="24"/>
-          <w:szCs w:val="24"/>
-          <w:u w:val="single"/>
-          <w:lang w:eastAsia="it-IT"/>
-        </w:rPr>
-        <w:t xml:space="preserve"> numero Ausiliario</w:t>
-      </w:r>
-      <w:r>
-        <w:rPr>
-          <w:rFonts w:ascii="Arial" w:eastAsia="Times New Roman" w:hAnsi="Arial" w:cs="Arial"/>
-          <w:b/>
-          <w:bCs/>
-          <w:sz w:val="24"/>
-          <w:szCs w:val="24"/>
-          <w:lang w:eastAsia="it-IT"/>
-        </w:rPr>
-        <w:t xml:space="preserve"> </w:t>
-      </w:r>
-    </w:p>
-    <w:p>
-      <w:pPr>
-        <w:spacing w:after="0" w:line="330" w:lineRule="atLeast"/>
-        <w:rPr>
-          <w:rFonts w:ascii="Arial" w:eastAsia="Times New Roman" w:hAnsi="Arial" w:cs="Arial"/>
-          <w:sz w:val="24"/>
-          <w:szCs w:val="24"/>
-          <w:lang w:eastAsia="it-IT"/>
-        </w:rPr>
-      </w:pPr>
-      <w:r>
-        <w:rPr>
-          <w:rFonts w:ascii="Arial" w:eastAsia="Times New Roman" w:hAnsi="Arial" w:cs="Arial"/>
-          <w:b/>
-          <w:bCs/>
-          <w:sz w:val="24"/>
-          <w:szCs w:val="24"/>
-          <w:lang w:eastAsia="it-IT"/>
-        </w:rPr>
-        <w:tab/>
-      </w:r>
-      <w:r>
-        <w:rPr>
-          <w:rFonts w:ascii="Arial" w:eastAsia="Times New Roman" w:hAnsi="Arial" w:cs="Arial"/>
-          <w:sz w:val="24"/>
-          <w:szCs w:val="24"/>
-          <w:lang w:eastAsia="it-IT"/>
-        </w:rPr>
-        <w:t xml:space="preserve">Inserisce l’Ausiliario </w:t>
-      </w:r>
-      <w:r>
-        <w:rPr>
-          <w:rFonts w:ascii="Arial" w:eastAsia="Times New Roman" w:hAnsi="Arial" w:cs="Arial"/>
-          <w:sz w:val="24"/>
-          <w:szCs w:val="24"/>
-          <w:lang w:eastAsia="it-IT"/>
-        </w:rPr>
-        <w:t>2</w:t>
-      </w:r>
-    </w:p>
-    <w:p>
-      <w:pPr>
-        <w:spacing w:after="0" w:line="330" w:lineRule="atLeast"/>
-        <w:rPr>
-          <w:rFonts w:ascii="Arial" w:eastAsia="Times New Roman" w:hAnsi="Arial" w:cs="Arial"/>
-          <w:b/>
-          <w:bCs/>
-          <w:sz w:val="24"/>
-          <w:szCs w:val="24"/>
-          <w:lang w:eastAsia="it-IT"/>
-        </w:rPr>
-      </w:pPr>
-      <w:r>
-        <w:rPr>
-          <w:rFonts w:ascii="Arial" w:eastAsia="Times New Roman" w:hAnsi="Arial" w:cs="Arial"/>
-          <w:b/>
-          <w:bCs/>
-          <w:sz w:val="24"/>
-          <w:szCs w:val="24"/>
-          <w:lang w:eastAsia="it-IT"/>
-        </w:rPr>
-        <w:t>2.</w:t>
-      </w:r>
-      <w:r>
-        <w:rPr>
-          <w:rFonts w:ascii="Arial" w:eastAsia="Times New Roman" w:hAnsi="Arial" w:cs="Arial"/>
-          <w:b/>
-          <w:bCs/>
-          <w:sz w:val="24"/>
-          <w:szCs w:val="24"/>
-          <w:lang w:eastAsia="it-IT"/>
-        </w:rPr>
-        <w:t>5</w:t>
-      </w:r>
-      <w:r>
-        <w:rPr>
-          <w:rFonts w:ascii="Arial" w:eastAsia="Times New Roman" w:hAnsi="Arial" w:cs="Arial"/>
-          <w:b/>
-          <w:bCs/>
-          <w:sz w:val="24"/>
-          <w:szCs w:val="24"/>
-          <w:lang w:eastAsia="it-IT"/>
-        </w:rPr>
-        <w:tab/>
-      </w:r>
-      <w:r>
-        <w:rPr>
-          <w:rFonts w:ascii="Arial" w:eastAsia="Times New Roman" w:hAnsi="Arial" w:cs="Arial"/>
-          <w:b/>
-          <w:bCs/>
-          <w:sz w:val="24"/>
-          <w:szCs w:val="24"/>
-          <w:lang w:eastAsia="it-IT"/>
-        </w:rPr>
-        <w:t xml:space="preserve">Comando </w:t>
-      </w:r>
-      <w:r>
-        <w:rPr>
-          <w:rFonts w:ascii="Arial" w:eastAsia="Times New Roman" w:hAnsi="Arial" w:cs="Arial"/>
-          <w:b/>
-          <w:bCs/>
-          <w:sz w:val="24"/>
-          <w:szCs w:val="24"/>
-          <w:lang w:eastAsia="it-IT"/>
-        </w:rPr>
-        <w:t xml:space="preserve">N - </w:t>
-      </w:r>
-      <w:r>
-        <w:rPr>
-          <w:rFonts w:ascii="Arial" w:eastAsia="Times New Roman" w:hAnsi="Arial" w:cs="Arial"/>
-          <w:b/>
-          <w:bCs/>
-          <w:sz w:val="24"/>
-          <w:szCs w:val="24"/>
-          <w:lang w:eastAsia="it-IT"/>
-        </w:rPr>
-        <w:t>Ritorna i numeri autorizzati</w:t>
-      </w:r>
-    </w:p>
-    <w:p>
-      <w:pPr>
-        <w:spacing w:after="0" w:line="330" w:lineRule="atLeast"/>
-        <w:rPr>
-          <w:rFonts w:ascii="Arial" w:eastAsia="Times New Roman" w:hAnsi="Arial" w:cs="Arial"/>
-          <w:sz w:val="24"/>
-          <w:szCs w:val="24"/>
-          <w:lang w:eastAsia="it-IT"/>
-        </w:rPr>
-      </w:pPr>
-      <w:r>
-        <w:rPr>
-          <w:rFonts w:ascii="Arial" w:eastAsia="Times New Roman" w:hAnsi="Arial" w:cs="Arial"/>
-          <w:b/>
-          <w:bCs/>
-          <w:sz w:val="24"/>
-          <w:szCs w:val="24"/>
-          <w:lang w:eastAsia="it-IT"/>
-        </w:rPr>
-        <w:tab/>
-      </w:r>
-      <w:r>
-        <w:rPr>
-          <w:rFonts w:ascii="Arial" w:eastAsia="Times New Roman" w:hAnsi="Arial" w:cs="Arial"/>
-          <w:sz w:val="24"/>
-          <w:szCs w:val="24"/>
-          <w:lang w:eastAsia="it-IT"/>
-        </w:rPr>
-        <w:t>Presente il MASTER</w:t>
-      </w:r>
-      <w:r>
-        <w:rPr>
-          <w:rFonts w:ascii="Arial" w:eastAsia="Times New Roman" w:hAnsi="Arial" w:cs="Arial"/>
-          <w:sz w:val="24"/>
-          <w:szCs w:val="24"/>
-          <w:lang w:eastAsia="it-IT"/>
-        </w:rPr>
-        <w:t xml:space="preserve"> e </w:t>
-      </w:r>
-      <w:r>
-        <w:rPr>
-          <w:rFonts w:ascii="Arial" w:eastAsia="Times New Roman" w:hAnsi="Arial" w:cs="Arial"/>
-          <w:sz w:val="24"/>
-          <w:szCs w:val="24"/>
-          <w:lang w:eastAsia="it-IT"/>
-        </w:rPr>
-        <w:t>g</w:t>
-      </w:r>
-      <w:r>
-        <w:rPr>
-          <w:rFonts w:ascii="Arial" w:eastAsia="Times New Roman" w:hAnsi="Arial" w:cs="Arial"/>
-          <w:sz w:val="24"/>
-          <w:szCs w:val="24"/>
-          <w:lang w:eastAsia="it-IT"/>
-        </w:rPr>
-        <w:t>l</w:t>
-      </w:r>
-      <w:r>
-        <w:rPr>
-          <w:rFonts w:ascii="Arial" w:eastAsia="Times New Roman" w:hAnsi="Arial" w:cs="Arial"/>
-          <w:sz w:val="24"/>
-          <w:szCs w:val="24"/>
-          <w:lang w:eastAsia="it-IT"/>
-        </w:rPr>
-        <w:t xml:space="preserve">i </w:t>
-      </w:r>
-      <w:r>
-        <w:rPr>
-          <w:rFonts w:ascii="Arial" w:eastAsia="Times New Roman" w:hAnsi="Arial" w:cs="Arial"/>
-          <w:sz w:val="24"/>
-          <w:szCs w:val="24"/>
-          <w:lang w:eastAsia="it-IT"/>
-        </w:rPr>
-        <w:t>Ausiliari 1</w:t>
-      </w:r>
-      <w:r>
-        <w:rPr>
-          <w:rFonts w:ascii="Arial" w:eastAsia="Times New Roman" w:hAnsi="Arial" w:cs="Arial"/>
-          <w:sz w:val="24"/>
-          <w:szCs w:val="24"/>
-          <w:lang w:eastAsia="it-IT"/>
-        </w:rPr>
-        <w:t xml:space="preserve"> e 2</w:t>
-      </w:r>
-    </w:p>
-    <w:p>
-      <w:pPr>
-        <w:spacing w:after="0" w:line="330" w:lineRule="atLeast"/>
-        <w:rPr>
-          <w:rFonts w:ascii="Arial" w:eastAsia="Times New Roman" w:hAnsi="Arial" w:cs="Arial"/>
-          <w:b/>
-          <w:bCs/>
-          <w:sz w:val="24"/>
-          <w:szCs w:val="24"/>
-          <w:lang w:eastAsia="it-IT"/>
-        </w:rPr>
-      </w:pPr>
-      <w:r>
-        <w:rPr>
-          <w:rFonts w:ascii="Arial" w:eastAsia="Times New Roman" w:hAnsi="Arial" w:cs="Arial"/>
-          <w:b/>
-          <w:bCs/>
-          <w:sz w:val="24"/>
-          <w:szCs w:val="24"/>
-          <w:lang w:eastAsia="it-IT"/>
-        </w:rPr>
-        <w:t>2.</w:t>
-      </w:r>
-      <w:r>
-        <w:rPr>
-          <w:rFonts w:ascii="Arial" w:eastAsia="Times New Roman" w:hAnsi="Arial" w:cs="Arial"/>
-          <w:b/>
-          <w:bCs/>
-          <w:sz w:val="24"/>
-          <w:szCs w:val="24"/>
-          <w:lang w:eastAsia="it-IT"/>
-        </w:rPr>
-        <w:t>6</w:t>
-      </w:r>
-      <w:r>
-        <w:rPr>
-          <w:rFonts w:ascii="Arial" w:eastAsia="Times New Roman" w:hAnsi="Arial" w:cs="Arial"/>
-          <w:b/>
-          <w:bCs/>
-          <w:sz w:val="24"/>
-          <w:szCs w:val="24"/>
-          <w:lang w:eastAsia="it-IT"/>
-        </w:rPr>
-        <w:tab/>
-      </w:r>
-      <w:r>
-        <w:rPr>
-          <w:rFonts w:ascii="Arial" w:eastAsia="Times New Roman" w:hAnsi="Arial" w:cs="Arial"/>
-          <w:b/>
-          <w:bCs/>
-          <w:sz w:val="24"/>
-          <w:szCs w:val="24"/>
-          <w:lang w:eastAsia="it-IT"/>
-        </w:rPr>
-        <w:t xml:space="preserve">Comando </w:t>
+        <w:t>A3</w:t>
       </w:r>
       <w:r>
         <w:rPr>
@@ -7045,8 +6671,9 @@
           <w:szCs w:val="24"/>
           <w:lang w:eastAsia="it-IT"/>
         </w:rPr>
-        <w:t>A</w:t>
-      </w:r>
+        <w:t>+</w:t>
+      </w:r>
+      <w:proofErr w:type="gramStart"/>
       <w:r>
         <w:rPr>
           <w:rFonts w:ascii="Arial" w:eastAsia="Times New Roman" w:hAnsi="Arial" w:cs="Arial"/>
@@ -7059,35 +6686,6 @@
           <w:szCs w:val="24"/>
           <w:lang w:eastAsia="it-IT"/>
         </w:rPr>
-        <w:t>3</w:t>
-      </w:r>
-      <w:r>
-        <w:rPr>
-          <w:rFonts w:ascii="Arial" w:eastAsia="Times New Roman" w:hAnsi="Arial" w:cs="Arial"/>
-          <w:b/>
-          <w:bCs/>
-          <w:i/>
-          <w:iCs/>
-          <w:color w:val="000000" w:themeColor="text1"/>
-          <w:sz w:val="24"/>
-          <w:szCs w:val="24"/>
-          <w:lang w:eastAsia="it-IT"/>
-        </w:rPr>
-        <w:t>+</w:t>
-      </w:r>
-      <w:proofErr w:type="gramStart"/>
-      <w:r>
-        <w:rPr>
-          <w:rFonts w:ascii="Arial" w:eastAsia="Times New Roman" w:hAnsi="Arial" w:cs="Arial"/>
-          <w:b/>
-          <w:bCs/>
-          <w:i/>
-          <w:iCs/>
-          <w:color w:val="000000" w:themeColor="text1"/>
-          <w:sz w:val="24"/>
-          <w:szCs w:val="24"/>
-          <w:lang w:eastAsia="it-IT"/>
-        </w:rPr>
         <w:t>393334188263</w:t>
       </w:r>
       <w:r>
@@ -7145,19 +6743,7 @@
           <w:u w:val="single"/>
           <w:lang w:eastAsia="it-IT"/>
         </w:rPr>
-        <w:t>terzo</w:t>
-      </w:r>
-      <w:r>
-        <w:rPr>
-          <w:rFonts w:ascii="Arial" w:eastAsia="Times New Roman" w:hAnsi="Arial" w:cs="Arial"/>
-          <w:b/>
-          <w:bCs/>
-          <w:sz w:val="24"/>
-          <w:szCs w:val="24"/>
-          <w:u w:val="single"/>
-          <w:lang w:eastAsia="it-IT"/>
-        </w:rPr>
-        <w:t xml:space="preserve"> numero Ausiliario</w:t>
+        <w:t>terzo numero Ausiliario</w:t>
       </w:r>
       <w:r>
         <w:rPr>
@@ -7498,18 +7084,7 @@
           <w:szCs w:val="24"/>
           <w:lang w:eastAsia="it-IT"/>
         </w:rPr>
-        <w:t>S</w:t>
-      </w:r>
-      <w:r>
-        <w:rPr>
-          <w:rFonts w:ascii="Arial" w:eastAsia="Times New Roman" w:hAnsi="Arial" w:cs="Arial"/>
-          <w:b/>
-          <w:bCs/>
-          <w:sz w:val="24"/>
-          <w:szCs w:val="24"/>
-          <w:lang w:eastAsia="it-IT"/>
-        </w:rPr>
-        <w:t xml:space="preserve"> - </w:t>
+        <w:t xml:space="preserve">S - </w:t>
       </w:r>
       <w:r>
         <w:rPr>
@@ -7531,202 +7106,8 @@
           <w:szCs w:val="24"/>
           <w:lang w:eastAsia="it-IT"/>
         </w:rPr>
-        <w:t xml:space="preserve">l valore di Tensione + </w:t>
-      </w:r>
-      <w:proofErr w:type="spellStart"/>
-      <w:r>
-        <w:rPr>
-          <w:rFonts w:ascii="Arial" w:eastAsia="Times New Roman" w:hAnsi="Arial" w:cs="Arial"/>
-          <w:b/>
-          <w:bCs/>
-          <w:sz w:val="24"/>
-          <w:szCs w:val="24"/>
-          <w:lang w:eastAsia="it-IT"/>
-        </w:rPr>
-        <w:t>Timestamp</w:t>
-      </w:r>
-      <w:proofErr w:type="spellEnd"/>
-    </w:p>
-    <w:p>
-      <w:pPr>
-        <w:spacing w:after="0" w:line="330" w:lineRule="atLeast"/>
-        <w:rPr>
-          <w:rFonts w:ascii="Arial" w:eastAsia="Times New Roman" w:hAnsi="Arial" w:cs="Arial"/>
-          <w:sz w:val="24"/>
-          <w:szCs w:val="24"/>
-          <w:lang w:eastAsia="it-IT"/>
-        </w:rPr>
-      </w:pPr>
-      <w:r>
-        <w:rPr>
-          <w:rFonts w:ascii="Arial" w:eastAsia="Times New Roman" w:hAnsi="Arial" w:cs="Arial"/>
-          <w:sz w:val="24"/>
-          <w:szCs w:val="24"/>
-          <w:lang w:eastAsia="it-IT"/>
-        </w:rPr>
-        <w:tab/>
-      </w:r>
-      <w:r>
-        <w:rPr>
-          <w:rFonts w:ascii="Arial" w:eastAsia="Times New Roman" w:hAnsi="Arial" w:cs="Arial"/>
-          <w:sz w:val="24"/>
-          <w:szCs w:val="24"/>
-          <w:lang w:eastAsia="it-IT"/>
-        </w:rPr>
-        <w:t xml:space="preserve">Ritorna al richiedente </w:t>
-      </w:r>
-      <w:r>
-        <w:rPr>
-          <w:rFonts w:ascii="Arial" w:eastAsia="Times New Roman" w:hAnsi="Arial" w:cs="Arial"/>
-          <w:sz w:val="24"/>
-          <w:szCs w:val="24"/>
-          <w:lang w:eastAsia="it-IT"/>
-        </w:rPr>
-        <w:t xml:space="preserve">(Master) </w:t>
-      </w:r>
-      <w:r>
-        <w:rPr>
-          <w:rFonts w:ascii="Arial" w:eastAsia="Times New Roman" w:hAnsi="Arial" w:cs="Arial"/>
-          <w:sz w:val="24"/>
-          <w:szCs w:val="24"/>
-          <w:lang w:eastAsia="it-IT"/>
-        </w:rPr>
-        <w:t xml:space="preserve">il </w:t>
-      </w:r>
-      <w:proofErr w:type="spellStart"/>
-      <w:r>
-        <w:rPr>
-          <w:rFonts w:ascii="Arial" w:eastAsia="Times New Roman" w:hAnsi="Arial" w:cs="Arial"/>
-          <w:sz w:val="24"/>
-          <w:szCs w:val="24"/>
-          <w:lang w:eastAsia="it-IT"/>
-        </w:rPr>
-        <w:t>Timestamp</w:t>
-      </w:r>
-      <w:proofErr w:type="spellEnd"/>
-      <w:r>
-        <w:rPr>
-          <w:rFonts w:ascii="Arial" w:eastAsia="Times New Roman" w:hAnsi="Arial" w:cs="Arial"/>
-          <w:sz w:val="24"/>
-          <w:szCs w:val="24"/>
-          <w:lang w:eastAsia="it-IT"/>
-        </w:rPr>
-        <w:t xml:space="preserve"> + Valore Tensione</w:t>
-      </w:r>
-    </w:p>
-    <w:p>
-      <w:pPr>
-        <w:spacing w:after="0" w:line="330" w:lineRule="atLeast"/>
-        <w:rPr>
-          <w:rFonts w:ascii="Arial" w:eastAsia="Times New Roman" w:hAnsi="Arial" w:cs="Arial"/>
-          <w:b/>
-          <w:bCs/>
-          <w:sz w:val="24"/>
-          <w:szCs w:val="24"/>
-          <w:lang w:eastAsia="it-IT"/>
-        </w:rPr>
-      </w:pPr>
-      <w:r>
-        <w:rPr>
-          <w:rFonts w:ascii="Arial" w:eastAsia="Times New Roman" w:hAnsi="Arial" w:cs="Arial"/>
-          <w:b/>
-          <w:bCs/>
-          <w:sz w:val="24"/>
-          <w:szCs w:val="24"/>
-          <w:lang w:eastAsia="it-IT"/>
-        </w:rPr>
-        <w:t>3</w:t>
-      </w:r>
-      <w:r>
-        <w:rPr>
-          <w:rFonts w:ascii="Arial" w:eastAsia="Times New Roman" w:hAnsi="Arial" w:cs="Arial"/>
-          <w:b/>
-          <w:bCs/>
-          <w:sz w:val="24"/>
-          <w:szCs w:val="24"/>
-          <w:lang w:eastAsia="it-IT"/>
-        </w:rPr>
-        <w:t>.</w:t>
-      </w:r>
-      <w:r>
-        <w:rPr>
-          <w:rFonts w:ascii="Arial" w:eastAsia="Times New Roman" w:hAnsi="Arial" w:cs="Arial"/>
-          <w:b/>
-          <w:bCs/>
-          <w:sz w:val="24"/>
-          <w:szCs w:val="24"/>
-          <w:lang w:eastAsia="it-IT"/>
-        </w:rPr>
-        <w:t>1</w:t>
-      </w:r>
-      <w:r>
-        <w:rPr>
-          <w:rFonts w:ascii="Arial" w:eastAsia="Times New Roman" w:hAnsi="Arial" w:cs="Arial"/>
-          <w:b/>
-          <w:bCs/>
-          <w:sz w:val="24"/>
-          <w:szCs w:val="24"/>
-          <w:lang w:eastAsia="it-IT"/>
-        </w:rPr>
-        <w:tab/>
-      </w:r>
-      <w:r>
-        <w:rPr>
-          <w:rFonts w:ascii="Arial" w:eastAsia="Times New Roman" w:hAnsi="Arial" w:cs="Arial"/>
-          <w:b/>
-          <w:bCs/>
-          <w:sz w:val="24"/>
-          <w:szCs w:val="24"/>
-          <w:lang w:eastAsia="it-IT"/>
-        </w:rPr>
-        <w:t xml:space="preserve">Comando </w:t>
-      </w:r>
-      <w:r>
-        <w:rPr>
-          <w:rFonts w:ascii="Arial" w:eastAsia="Times New Roman" w:hAnsi="Arial" w:cs="Arial"/>
-          <w:b/>
-          <w:bCs/>
-          <w:sz w:val="24"/>
-          <w:szCs w:val="24"/>
-          <w:lang w:eastAsia="it-IT"/>
-        </w:rPr>
-        <w:t xml:space="preserve">S - </w:t>
-      </w:r>
-      <w:r>
-        <w:rPr>
-          <w:rFonts w:ascii="Arial" w:eastAsia="Times New Roman" w:hAnsi="Arial" w:cs="Arial"/>
-          <w:b/>
-          <w:bCs/>
-          <w:sz w:val="24"/>
-          <w:szCs w:val="24"/>
-          <w:lang w:eastAsia="it-IT"/>
-        </w:rPr>
-        <w:t>Ritorna i</w:t>
-      </w:r>
-      <w:r>
-        <w:rPr>
-          <w:rFonts w:ascii="Arial" w:eastAsia="Times New Roman" w:hAnsi="Arial" w:cs="Arial"/>
-          <w:b/>
-          <w:bCs/>
-          <w:sz w:val="24"/>
-          <w:szCs w:val="24"/>
-          <w:lang w:eastAsia="it-IT"/>
-        </w:rPr>
-        <w:t xml:space="preserve">l valore di Tensione + </w:t>
-      </w:r>
-      <w:proofErr w:type="spellStart"/>
-      <w:r>
-        <w:rPr>
-          <w:rFonts w:ascii="Arial" w:eastAsia="Times New Roman" w:hAnsi="Arial" w:cs="Arial"/>
-          <w:b/>
-          <w:bCs/>
-          <w:sz w:val="24"/>
-          <w:szCs w:val="24"/>
-          <w:lang w:eastAsia="it-IT"/>
-        </w:rPr>
-        <w:t>Timestamp</w:t>
-      </w:r>
-      <w:proofErr w:type="spellEnd"/>
+        <w:t>l valore di Tensione + Timestamp</w:t>
+      </w:r>
     </w:p>
     <w:p>
       <w:pPr>
@@ -7755,6 +7136,146 @@
           <w:szCs w:val="24"/>
           <w:lang w:eastAsia="it-IT"/>
         </w:rPr>
+        <w:t xml:space="preserve">(Master) </w:t>
+      </w:r>
+      <w:r>
+        <w:rPr>
+          <w:rFonts w:ascii="Arial" w:eastAsia="Times New Roman" w:hAnsi="Arial" w:cs="Arial"/>
+          <w:sz w:val="24"/>
+          <w:szCs w:val="24"/>
+          <w:lang w:eastAsia="it-IT"/>
+        </w:rPr>
+        <w:t>il Timestamp + Valore Tensione</w:t>
+      </w:r>
+    </w:p>
+    <w:p>
+      <w:pPr>
+        <w:spacing w:after="0" w:line="330" w:lineRule="atLeast"/>
+        <w:rPr>
+          <w:rFonts w:ascii="Arial" w:eastAsia="Times New Roman" w:hAnsi="Arial" w:cs="Arial"/>
+          <w:b/>
+          <w:bCs/>
+          <w:sz w:val="24"/>
+          <w:szCs w:val="24"/>
+          <w:lang w:eastAsia="it-IT"/>
+        </w:rPr>
+      </w:pPr>
+      <w:r>
+        <w:rPr>
+          <w:rFonts w:ascii="Arial" w:eastAsia="Times New Roman" w:hAnsi="Arial" w:cs="Arial"/>
+          <w:b/>
+          <w:bCs/>
+          <w:sz w:val="24"/>
+          <w:szCs w:val="24"/>
+          <w:lang w:eastAsia="it-IT"/>
+        </w:rPr>
+        <w:t>3</w:t>
+      </w:r>
+      <w:r>
+        <w:rPr>
+          <w:rFonts w:ascii="Arial" w:eastAsia="Times New Roman" w:hAnsi="Arial" w:cs="Arial"/>
+          <w:b/>
+          <w:bCs/>
+          <w:sz w:val="24"/>
+          <w:szCs w:val="24"/>
+          <w:lang w:eastAsia="it-IT"/>
+        </w:rPr>
+        <w:t>.</w:t>
+      </w:r>
+      <w:r>
+        <w:rPr>
+          <w:rFonts w:ascii="Arial" w:eastAsia="Times New Roman" w:hAnsi="Arial" w:cs="Arial"/>
+          <w:b/>
+          <w:bCs/>
+          <w:sz w:val="24"/>
+          <w:szCs w:val="24"/>
+          <w:lang w:eastAsia="it-IT"/>
+        </w:rPr>
+        <w:t>1</w:t>
+      </w:r>
+      <w:r>
+        <w:rPr>
+          <w:rFonts w:ascii="Arial" w:eastAsia="Times New Roman" w:hAnsi="Arial" w:cs="Arial"/>
+          <w:b/>
+          <w:bCs/>
+          <w:sz w:val="24"/>
+          <w:szCs w:val="24"/>
+          <w:lang w:eastAsia="it-IT"/>
+        </w:rPr>
+        <w:tab/>
+      </w:r>
+      <w:r>
+        <w:rPr>
+          <w:rFonts w:ascii="Arial" w:eastAsia="Times New Roman" w:hAnsi="Arial" w:cs="Arial"/>
+          <w:b/>
+          <w:bCs/>
+          <w:sz w:val="24"/>
+          <w:szCs w:val="24"/>
+          <w:lang w:eastAsia="it-IT"/>
+        </w:rPr>
+        <w:t xml:space="preserve">Comando </w:t>
+      </w:r>
+      <w:r>
+        <w:rPr>
+          <w:rFonts w:ascii="Arial" w:eastAsia="Times New Roman" w:hAnsi="Arial" w:cs="Arial"/>
+          <w:b/>
+          <w:bCs/>
+          <w:sz w:val="24"/>
+          <w:szCs w:val="24"/>
+          <w:lang w:eastAsia="it-IT"/>
+        </w:rPr>
+        <w:t xml:space="preserve">S - </w:t>
+      </w:r>
+      <w:r>
+        <w:rPr>
+          <w:rFonts w:ascii="Arial" w:eastAsia="Times New Roman" w:hAnsi="Arial" w:cs="Arial"/>
+          <w:b/>
+          <w:bCs/>
+          <w:sz w:val="24"/>
+          <w:szCs w:val="24"/>
+          <w:lang w:eastAsia="it-IT"/>
+        </w:rPr>
+        <w:t>Ritorna i</w:t>
+      </w:r>
+      <w:r>
+        <w:rPr>
+          <w:rFonts w:ascii="Arial" w:eastAsia="Times New Roman" w:hAnsi="Arial" w:cs="Arial"/>
+          <w:b/>
+          <w:bCs/>
+          <w:sz w:val="24"/>
+          <w:szCs w:val="24"/>
+          <w:lang w:eastAsia="it-IT"/>
+        </w:rPr>
+        <w:t>l valore di Tensione + Timestamp</w:t>
+      </w:r>
+    </w:p>
+    <w:p>
+      <w:pPr>
+        <w:spacing w:after="0" w:line="330" w:lineRule="atLeast"/>
+        <w:rPr>
+          <w:rFonts w:ascii="Arial" w:eastAsia="Times New Roman" w:hAnsi="Arial" w:cs="Arial"/>
+          <w:sz w:val="24"/>
+          <w:szCs w:val="24"/>
+          <w:lang w:eastAsia="it-IT"/>
+        </w:rPr>
+      </w:pPr>
+      <w:r>
+        <w:rPr>
+          <w:rFonts w:ascii="Arial" w:eastAsia="Times New Roman" w:hAnsi="Arial" w:cs="Arial"/>
+          <w:sz w:val="24"/>
+          <w:szCs w:val="24"/>
+          <w:lang w:eastAsia="it-IT"/>
+        </w:rPr>
+        <w:tab/>
+        <w:t xml:space="preserve">Ritorna al richiedente </w:t>
+      </w:r>
+      <w:r>
+        <w:rPr>
+          <w:rFonts w:ascii="Arial" w:eastAsia="Times New Roman" w:hAnsi="Arial" w:cs="Arial"/>
+          <w:sz w:val="24"/>
+          <w:szCs w:val="24"/>
+          <w:lang w:eastAsia="it-IT"/>
+        </w:rPr>
         <w:t xml:space="preserve">(Ausiliario) </w:t>
       </w:r>
       <w:r>
@@ -7764,27 +7285,7 @@
           <w:szCs w:val="24"/>
           <w:lang w:eastAsia="it-IT"/>
         </w:rPr>
-        <w:t xml:space="preserve">il </w:t>
-      </w:r>
-      <w:proofErr w:type="spellStart"/>
-      <w:r>
-        <w:rPr>
-          <w:rFonts w:ascii="Arial" w:eastAsia="Times New Roman" w:hAnsi="Arial" w:cs="Arial"/>
-          <w:sz w:val="24"/>
-          <w:szCs w:val="24"/>
-          <w:lang w:eastAsia="it-IT"/>
-        </w:rPr>
-        <w:t>Timestamp</w:t>
-      </w:r>
-      <w:proofErr w:type="spellEnd"/>
-      <w:r>
-        <w:rPr>
-          <w:rFonts w:ascii="Arial" w:eastAsia="Times New Roman" w:hAnsi="Arial" w:cs="Arial"/>
-          <w:sz w:val="24"/>
-          <w:szCs w:val="24"/>
-          <w:lang w:eastAsia="it-IT"/>
-        </w:rPr>
-        <w:t xml:space="preserve"> + Valore Tensione</w:t>
+        <w:t>il Timestamp + Valore Tensione</w:t>
       </w:r>
     </w:p>
     <w:p>
@@ -7885,21 +7386,8 @@
           <w:szCs w:val="24"/>
           <w:lang w:eastAsia="it-IT"/>
         </w:rPr>
-        <w:t xml:space="preserve">l valore di Tensione + </w:t>
-      </w:r>
-      <w:proofErr w:type="spellStart"/>
-      <w:r>
-        <w:rPr>
-          <w:rFonts w:ascii="Arial" w:eastAsia="Times New Roman" w:hAnsi="Arial" w:cs="Arial"/>
-          <w:b/>
-          <w:bCs/>
-          <w:sz w:val="24"/>
-          <w:szCs w:val="24"/>
-          <w:lang w:eastAsia="it-IT"/>
-        </w:rPr>
-        <w:t>Timestamp</w:t>
-      </w:r>
-      <w:proofErr w:type="spellEnd"/>
+        <w:t>l valore di Tensione + Timestamp</w:t>
+      </w:r>
     </w:p>
     <w:p>
       <w:pPr>
@@ -7929,47 +7417,7 @@
           <w:szCs w:val="24"/>
           <w:lang w:val="en-US" w:eastAsia="it-IT"/>
         </w:rPr>
-        <w:t xml:space="preserve">Da </w:t>
-      </w:r>
-      <w:proofErr w:type="spellStart"/>
-      <w:r>
-        <w:rPr>
-          <w:rFonts w:ascii="Arial" w:eastAsia="Times New Roman" w:hAnsi="Arial" w:cs="Arial"/>
-          <w:sz w:val="24"/>
-          <w:szCs w:val="24"/>
-          <w:lang w:val="en-US" w:eastAsia="it-IT"/>
-        </w:rPr>
-        <w:t>numero</w:t>
-      </w:r>
-      <w:proofErr w:type="spellEnd"/>
-      <w:r>
-        <w:rPr>
-          <w:rFonts w:ascii="Arial" w:eastAsia="Times New Roman" w:hAnsi="Arial" w:cs="Arial"/>
-          <w:sz w:val="24"/>
-          <w:szCs w:val="24"/>
-          <w:lang w:val="en-US" w:eastAsia="it-IT"/>
-        </w:rPr>
-        <w:t xml:space="preserve"> </w:t>
-      </w:r>
-      <w:proofErr w:type="spellStart"/>
-      <w:r>
-        <w:rPr>
-          <w:rFonts w:ascii="Arial" w:eastAsia="Times New Roman" w:hAnsi="Arial" w:cs="Arial"/>
-          <w:sz w:val="24"/>
-          <w:szCs w:val="24"/>
-          <w:lang w:val="en-US" w:eastAsia="it-IT"/>
-        </w:rPr>
-        <w:t>sconosciuto</w:t>
-      </w:r>
-      <w:proofErr w:type="spellEnd"/>
-      <w:r>
-        <w:rPr>
-          <w:rFonts w:ascii="Arial" w:eastAsia="Times New Roman" w:hAnsi="Arial" w:cs="Arial"/>
-          <w:sz w:val="24"/>
-          <w:szCs w:val="24"/>
-          <w:lang w:val="en-US" w:eastAsia="it-IT"/>
-        </w:rPr>
-        <w:t xml:space="preserve"> – SMS:</w:t>
+        <w:t>Da numero sconosciuto – SMS:</w:t>
       </w:r>
       <w:r>
         <w:rPr>
@@ -8419,16 +7867,7 @@
                 <w:szCs w:val="16"/>
                 <w:lang w:eastAsia="it-IT"/>
               </w:rPr>
-              <w:t>Prim</w:t>
-            </w:r>
-            <w:r>
-              <w:rPr>
-                <w:rFonts w:ascii="Arial" w:eastAsia="Times New Roman" w:hAnsi="Arial" w:cs="Arial"/>
-                <w:sz w:val="16"/>
-                <w:szCs w:val="16"/>
-                <w:lang w:eastAsia="it-IT"/>
-              </w:rPr>
-              <w:t>i LAB TESTS</w:t>
+              <w:t>Primi LAB TESTS</w:t>
             </w:r>
           </w:p>
         </w:tc>
@@ -8456,25 +7895,7 @@
                 <w:szCs w:val="16"/>
                 <w:lang w:eastAsia="it-IT"/>
               </w:rPr>
-              <w:t>Ritorna i numeri</w:t>
-            </w:r>
-            <w:r>
-              <w:rPr>
-                <w:rFonts w:ascii="Arial" w:eastAsia="Times New Roman" w:hAnsi="Arial" w:cs="Arial"/>
-                <w:sz w:val="16"/>
-                <w:szCs w:val="16"/>
-                <w:lang w:eastAsia="it-IT"/>
-              </w:rPr>
-              <w:t xml:space="preserve"> </w:t>
-            </w:r>
-            <w:r>
-              <w:rPr>
-                <w:rFonts w:ascii="Arial" w:eastAsia="Times New Roman" w:hAnsi="Arial" w:cs="Arial"/>
-                <w:sz w:val="16"/>
-                <w:szCs w:val="16"/>
-                <w:lang w:eastAsia="it-IT"/>
-              </w:rPr>
-              <w:t>autorizzati</w:t>
+              <w:t>Ritorna i numeri autorizzati</w:t>
             </w:r>
           </w:p>
           <w:p>
@@ -8496,67 +7917,16 @@
                 <w:szCs w:val="16"/>
                 <w:lang w:eastAsia="it-IT"/>
               </w:rPr>
-              <w:t xml:space="preserve">Attualmente il </w:t>
-            </w:r>
-            <w:proofErr w:type="spellStart"/>
-            <w:r>
-              <w:rPr>
-                <w:rFonts w:ascii="Arial" w:eastAsia="Times New Roman" w:hAnsi="Arial" w:cs="Arial"/>
-                <w:color w:val="000000" w:themeColor="text1"/>
-                <w:sz w:val="16"/>
-                <w:szCs w:val="16"/>
-                <w:lang w:eastAsia="it-IT"/>
-              </w:rPr>
-              <w:t>Fw</w:t>
-            </w:r>
-            <w:proofErr w:type="spellEnd"/>
-            <w:r>
-              <w:rPr>
-                <w:rFonts w:ascii="Arial" w:eastAsia="Times New Roman" w:hAnsi="Arial" w:cs="Arial"/>
-                <w:color w:val="000000" w:themeColor="text1"/>
-                <w:sz w:val="16"/>
-                <w:szCs w:val="16"/>
-                <w:lang w:eastAsia="it-IT"/>
-              </w:rPr>
-              <w:t xml:space="preserve"> </w:t>
-            </w:r>
-            <w:r>
-              <w:rPr>
-                <w:rFonts w:ascii="Arial" w:eastAsia="Times New Roman" w:hAnsi="Arial" w:cs="Arial"/>
-                <w:sz w:val="16"/>
-                <w:szCs w:val="16"/>
-                <w:lang w:eastAsia="it-IT"/>
-              </w:rPr>
-              <w:t>prevede il Master già inserito nel codice</w:t>
-            </w:r>
-            <w:r>
-              <w:rPr>
-                <w:rFonts w:ascii="Arial" w:eastAsia="Times New Roman" w:hAnsi="Arial" w:cs="Arial"/>
-                <w:sz w:val="16"/>
-                <w:szCs w:val="16"/>
-                <w:lang w:eastAsia="it-IT"/>
-              </w:rPr>
-              <w:t xml:space="preserve"> (usare n. fittizio per poi cambiarlo </w:t>
-            </w:r>
-            <w:proofErr w:type="spellStart"/>
-            <w:r>
-              <w:rPr>
-                <w:rFonts w:ascii="Arial" w:eastAsia="Times New Roman" w:hAnsi="Arial" w:cs="Arial"/>
-                <w:sz w:val="16"/>
-                <w:szCs w:val="16"/>
-                <w:lang w:eastAsia="it-IT"/>
-              </w:rPr>
-              <w:t>cn</w:t>
-            </w:r>
-            <w:proofErr w:type="spellEnd"/>
-            <w:r>
-              <w:rPr>
-                <w:rFonts w:ascii="Arial" w:eastAsia="Times New Roman" w:hAnsi="Arial" w:cs="Arial"/>
-                <w:sz w:val="16"/>
-                <w:szCs w:val="16"/>
-                <w:lang w:eastAsia="it-IT"/>
-              </w:rPr>
-              <w:t xml:space="preserve"> i comandi)</w:t>
+              <w:t xml:space="preserve">Attualmente il Fw </w:t>
+            </w:r>
+            <w:r>
+              <w:rPr>
+                <w:rFonts w:ascii="Arial" w:eastAsia="Times New Roman" w:hAnsi="Arial" w:cs="Arial"/>
+                <w:sz w:val="16"/>
+                <w:szCs w:val="16"/>
+                <w:lang w:eastAsia="it-IT"/>
+              </w:rPr>
+              <w:t>prevede il Master già inserito nel codice (usare n. fittizio per poi cambiarlo cn i comandi)</w:t>
             </w:r>
           </w:p>
         </w:tc>
@@ -8619,15 +7989,15 @@
                 <w:rFonts w:ascii="Arial" w:eastAsia="Times New Roman" w:hAnsi="Arial" w:cs="Arial"/>
                 <w:sz w:val="16"/>
                 <w:szCs w:val="16"/>
-                <w:lang w:val="en-US" w:eastAsia="it-IT"/>
-              </w:rPr>
-            </w:pPr>
-            <w:r>
-              <w:rPr>
-                <w:rFonts w:ascii="Arial" w:eastAsia="Times New Roman" w:hAnsi="Arial" w:cs="Arial"/>
-                <w:sz w:val="16"/>
-                <w:szCs w:val="16"/>
-                <w:lang w:val="en-US" w:eastAsia="it-IT"/>
+                <w:lang w:eastAsia="it-IT"/>
+              </w:rPr>
+            </w:pPr>
+            <w:r>
+              <w:rPr>
+                <w:rFonts w:ascii="Arial" w:eastAsia="Times New Roman" w:hAnsi="Arial" w:cs="Arial"/>
+                <w:sz w:val="16"/>
+                <w:szCs w:val="16"/>
+                <w:lang w:eastAsia="it-IT"/>
               </w:rPr>
               <w:t xml:space="preserve">SMS: </w:t>
             </w:r>
@@ -8639,46 +8009,17 @@
                 <w:rFonts w:ascii="Arial" w:eastAsia="Times New Roman" w:hAnsi="Arial" w:cs="Arial"/>
                 <w:sz w:val="16"/>
                 <w:szCs w:val="16"/>
-                <w:lang w:val="en-US" w:eastAsia="it-IT"/>
-              </w:rPr>
-            </w:pPr>
-            <w:proofErr w:type="gramStart"/>
-            <w:r>
-              <w:rPr>
-                <w:rFonts w:ascii="Arial" w:eastAsia="Times New Roman" w:hAnsi="Arial" w:cs="Arial"/>
-                <w:sz w:val="16"/>
-                <w:szCs w:val="16"/>
-                <w:lang w:val="en-US" w:eastAsia="it-IT"/>
-              </w:rPr>
-              <w:t>”A</w:t>
-            </w:r>
-            <w:r>
-              <w:rPr>
-                <w:rFonts w:ascii="Arial" w:eastAsia="Times New Roman" w:hAnsi="Arial" w:cs="Arial"/>
-                <w:sz w:val="16"/>
-                <w:szCs w:val="16"/>
-                <w:lang w:val="en-US" w:eastAsia="it-IT"/>
-              </w:rPr>
-              <w:t>uthorized</w:t>
-            </w:r>
-            <w:proofErr w:type="gramEnd"/>
-            <w:r>
-              <w:rPr>
-                <w:rFonts w:ascii="Arial" w:eastAsia="Times New Roman" w:hAnsi="Arial" w:cs="Arial"/>
-                <w:sz w:val="16"/>
-                <w:szCs w:val="16"/>
-                <w:lang w:val="en-US" w:eastAsia="it-IT"/>
-              </w:rPr>
-              <w:t xml:space="preserve"> phone n."</w:t>
-            </w:r>
-            <w:r>
-              <w:rPr>
-                <w:rFonts w:ascii="Arial" w:eastAsia="Times New Roman" w:hAnsi="Arial" w:cs="Arial"/>
-                <w:sz w:val="16"/>
-                <w:szCs w:val="16"/>
-                <w:lang w:val="en-US" w:eastAsia="it-IT"/>
-              </w:rPr>
-              <w:t xml:space="preserve"> con:</w:t>
+                <w:lang w:eastAsia="it-IT"/>
+              </w:rPr>
+            </w:pPr>
+            <w:r>
+              <w:rPr>
+                <w:rFonts w:ascii="Arial" w:eastAsia="Times New Roman" w:hAnsi="Arial" w:cs="Arial"/>
+                <w:sz w:val="16"/>
+                <w:szCs w:val="16"/>
+                <w:lang w:eastAsia="it-IT"/>
+              </w:rPr>
+              <w:t>”Authorized phone n." con:</w:t>
             </w:r>
           </w:p>
           <w:p>
@@ -8903,16 +8244,7 @@
                 <w:szCs w:val="16"/>
                 <w:lang w:eastAsia="it-IT"/>
               </w:rPr>
-              <w:t xml:space="preserve">SMS: </w:t>
-            </w:r>
-            <w:r>
-              <w:rPr>
-                <w:rFonts w:ascii="Arial" w:eastAsia="Times New Roman" w:hAnsi="Arial" w:cs="Arial"/>
-                <w:sz w:val="16"/>
-                <w:szCs w:val="16"/>
-                <w:lang w:eastAsia="it-IT"/>
-              </w:rPr>
-              <w:t>ALL NUMBERS DELETED</w:t>
+              <w:t>SMS: ALL NUMBERS DELETED</w:t>
             </w:r>
           </w:p>
         </w:tc>
@@ -9136,34 +8468,7 @@
                 <w:szCs w:val="16"/>
                 <w:lang w:val="en-US" w:eastAsia="it-IT"/>
               </w:rPr>
-              <w:t>”</w:t>
-            </w:r>
-            <w:r>
-              <w:rPr>
-                <w:rFonts w:ascii="Arial" w:eastAsia="Times New Roman" w:hAnsi="Arial" w:cs="Arial"/>
-                <w:sz w:val="16"/>
-                <w:szCs w:val="16"/>
-                <w:lang w:val="en-US" w:eastAsia="it-IT"/>
-              </w:rPr>
-              <w:t xml:space="preserve"> </w:t>
-            </w:r>
-            <w:r>
-              <w:rPr>
-                <w:rFonts w:ascii="Arial" w:eastAsia="Times New Roman" w:hAnsi="Arial" w:cs="Arial"/>
-                <w:sz w:val="16"/>
-                <w:szCs w:val="16"/>
-                <w:lang w:val="en-US" w:eastAsia="it-IT"/>
-              </w:rPr>
-              <w:t>M TELEPHONE NUMBER SAVED</w:t>
-            </w:r>
-            <w:r>
-              <w:rPr>
-                <w:rFonts w:ascii="Arial" w:eastAsia="Times New Roman" w:hAnsi="Arial" w:cs="Arial"/>
-                <w:sz w:val="16"/>
-                <w:szCs w:val="16"/>
-                <w:lang w:val="en-US" w:eastAsia="it-IT"/>
-              </w:rPr>
-              <w:t>”</w:t>
+              <w:t>” M TELEPHONE NUMBER SAVED”</w:t>
             </w:r>
           </w:p>
         </w:tc>
@@ -9332,15 +8637,15 @@
                 <w:rFonts w:ascii="Arial" w:eastAsia="Times New Roman" w:hAnsi="Arial" w:cs="Arial"/>
                 <w:sz w:val="16"/>
                 <w:szCs w:val="16"/>
-                <w:lang w:val="en-US" w:eastAsia="it-IT"/>
-              </w:rPr>
-            </w:pPr>
-            <w:r>
-              <w:rPr>
-                <w:rFonts w:ascii="Arial" w:eastAsia="Times New Roman" w:hAnsi="Arial" w:cs="Arial"/>
-                <w:sz w:val="16"/>
-                <w:szCs w:val="16"/>
-                <w:lang w:val="en-US" w:eastAsia="it-IT"/>
+                <w:lang w:eastAsia="it-IT"/>
+              </w:rPr>
+            </w:pPr>
+            <w:r>
+              <w:rPr>
+                <w:rFonts w:ascii="Arial" w:eastAsia="Times New Roman" w:hAnsi="Arial" w:cs="Arial"/>
+                <w:sz w:val="16"/>
+                <w:szCs w:val="16"/>
+                <w:lang w:eastAsia="it-IT"/>
               </w:rPr>
               <w:t>SMS:</w:t>
             </w:r>
@@ -9353,55 +8658,17 @@
                 <w:rFonts w:ascii="Arial" w:eastAsia="Times New Roman" w:hAnsi="Arial" w:cs="Arial"/>
                 <w:sz w:val="16"/>
                 <w:szCs w:val="16"/>
-                <w:lang w:val="en-US" w:eastAsia="it-IT"/>
-              </w:rPr>
-            </w:pPr>
-            <w:proofErr w:type="gramStart"/>
-            <w:r>
-              <w:rPr>
-                <w:rFonts w:ascii="Arial" w:eastAsia="Times New Roman" w:hAnsi="Arial" w:cs="Arial"/>
-                <w:sz w:val="16"/>
-                <w:szCs w:val="16"/>
-                <w:lang w:val="en-US" w:eastAsia="it-IT"/>
-              </w:rPr>
-              <w:t>”A</w:t>
-            </w:r>
-            <w:r>
-              <w:rPr>
-                <w:rFonts w:ascii="Arial" w:eastAsia="Times New Roman" w:hAnsi="Arial" w:cs="Arial"/>
-                <w:sz w:val="16"/>
-                <w:szCs w:val="16"/>
-                <w:lang w:val="en-US" w:eastAsia="it-IT"/>
-              </w:rPr>
-              <w:t>uthorized</w:t>
-            </w:r>
-            <w:proofErr w:type="gramEnd"/>
-            <w:r>
-              <w:rPr>
-                <w:rFonts w:ascii="Arial" w:eastAsia="Times New Roman" w:hAnsi="Arial" w:cs="Arial"/>
-                <w:sz w:val="16"/>
-                <w:szCs w:val="16"/>
-                <w:lang w:val="en-US" w:eastAsia="it-IT"/>
-              </w:rPr>
-              <w:t xml:space="preserve"> phone n."</w:t>
-            </w:r>
-            <w:r>
-              <w:rPr>
-                <w:rFonts w:ascii="Arial" w:eastAsia="Times New Roman" w:hAnsi="Arial" w:cs="Arial"/>
-                <w:sz w:val="16"/>
-                <w:szCs w:val="16"/>
-                <w:lang w:val="en-US" w:eastAsia="it-IT"/>
-              </w:rPr>
-              <w:t xml:space="preserve"> </w:t>
-            </w:r>
-            <w:r>
-              <w:rPr>
-                <w:rFonts w:ascii="Arial" w:eastAsia="Times New Roman" w:hAnsi="Arial" w:cs="Arial"/>
-                <w:sz w:val="16"/>
-                <w:szCs w:val="16"/>
-                <w:lang w:val="en-US" w:eastAsia="it-IT"/>
-              </w:rPr>
-              <w:t>con:</w:t>
+                <w:lang w:eastAsia="it-IT"/>
+              </w:rPr>
+            </w:pPr>
+            <w:r>
+              <w:rPr>
+                <w:rFonts w:ascii="Arial" w:eastAsia="Times New Roman" w:hAnsi="Arial" w:cs="Arial"/>
+                <w:sz w:val="16"/>
+                <w:szCs w:val="16"/>
+                <w:lang w:eastAsia="it-IT"/>
+              </w:rPr>
+              <w:t>”Authorized phone n." con:</w:t>
             </w:r>
           </w:p>
           <w:p>
@@ -9524,16 +8791,7 @@
                 <w:szCs w:val="16"/>
                 <w:lang w:eastAsia="it-IT"/>
               </w:rPr>
-              <w:t>Da condizione di fabbrica</w:t>
-            </w:r>
-            <w:r>
-              <w:rPr>
-                <w:rFonts w:ascii="Arial" w:eastAsia="Times New Roman" w:hAnsi="Arial" w:cs="Arial"/>
-                <w:sz w:val="16"/>
-                <w:szCs w:val="16"/>
-                <w:lang w:eastAsia="it-IT"/>
-              </w:rPr>
-              <w:t xml:space="preserve"> (Telefono Master non definito)</w:t>
+              <w:t>Da condizione di fabbrica (Telefono Master non definito)</w:t>
             </w:r>
           </w:p>
         </w:tc>
@@ -9838,15 +9096,15 @@
                 <w:rFonts w:ascii="Arial" w:eastAsia="Times New Roman" w:hAnsi="Arial" w:cs="Arial"/>
                 <w:sz w:val="16"/>
                 <w:szCs w:val="16"/>
-                <w:lang w:val="en-US" w:eastAsia="it-IT"/>
-              </w:rPr>
-            </w:pPr>
-            <w:r>
-              <w:rPr>
-                <w:rFonts w:ascii="Arial" w:eastAsia="Times New Roman" w:hAnsi="Arial" w:cs="Arial"/>
-                <w:sz w:val="16"/>
-                <w:szCs w:val="16"/>
-                <w:lang w:val="en-US" w:eastAsia="it-IT"/>
+                <w:lang w:eastAsia="it-IT"/>
+              </w:rPr>
+            </w:pPr>
+            <w:r>
+              <w:rPr>
+                <w:rFonts w:ascii="Arial" w:eastAsia="Times New Roman" w:hAnsi="Arial" w:cs="Arial"/>
+                <w:sz w:val="16"/>
+                <w:szCs w:val="16"/>
+                <w:lang w:eastAsia="it-IT"/>
               </w:rPr>
               <w:t>SMS:</w:t>
             </w:r>
@@ -9859,46 +9117,17 @@
                 <w:rFonts w:ascii="Arial" w:eastAsia="Times New Roman" w:hAnsi="Arial" w:cs="Arial"/>
                 <w:sz w:val="16"/>
                 <w:szCs w:val="16"/>
-                <w:lang w:val="en-US" w:eastAsia="it-IT"/>
-              </w:rPr>
-            </w:pPr>
-            <w:proofErr w:type="gramStart"/>
-            <w:r>
-              <w:rPr>
-                <w:rFonts w:ascii="Arial" w:eastAsia="Times New Roman" w:hAnsi="Arial" w:cs="Arial"/>
-                <w:sz w:val="16"/>
-                <w:szCs w:val="16"/>
-                <w:lang w:val="en-US" w:eastAsia="it-IT"/>
-              </w:rPr>
-              <w:t>”A</w:t>
-            </w:r>
-            <w:r>
-              <w:rPr>
-                <w:rFonts w:ascii="Arial" w:eastAsia="Times New Roman" w:hAnsi="Arial" w:cs="Arial"/>
-                <w:sz w:val="16"/>
-                <w:szCs w:val="16"/>
-                <w:lang w:val="en-US" w:eastAsia="it-IT"/>
-              </w:rPr>
-              <w:t>uthorized</w:t>
-            </w:r>
-            <w:proofErr w:type="gramEnd"/>
-            <w:r>
-              <w:rPr>
-                <w:rFonts w:ascii="Arial" w:eastAsia="Times New Roman" w:hAnsi="Arial" w:cs="Arial"/>
-                <w:sz w:val="16"/>
-                <w:szCs w:val="16"/>
-                <w:lang w:val="en-US" w:eastAsia="it-IT"/>
-              </w:rPr>
-              <w:t xml:space="preserve"> phone n."</w:t>
-            </w:r>
-            <w:r>
-              <w:rPr>
-                <w:rFonts w:ascii="Arial" w:eastAsia="Times New Roman" w:hAnsi="Arial" w:cs="Arial"/>
-                <w:sz w:val="16"/>
-                <w:szCs w:val="16"/>
-                <w:lang w:val="en-US" w:eastAsia="it-IT"/>
-              </w:rPr>
-              <w:t xml:space="preserve"> con:</w:t>
+                <w:lang w:eastAsia="it-IT"/>
+              </w:rPr>
+            </w:pPr>
+            <w:r>
+              <w:rPr>
+                <w:rFonts w:ascii="Arial" w:eastAsia="Times New Roman" w:hAnsi="Arial" w:cs="Arial"/>
+                <w:sz w:val="16"/>
+                <w:szCs w:val="16"/>
+                <w:lang w:eastAsia="it-IT"/>
+              </w:rPr>
+              <w:t>”Authorized phone n." con:</w:t>
             </w:r>
           </w:p>
           <w:p>
@@ -10127,16 +9356,7 @@
                 <w:szCs w:val="16"/>
                 <w:lang w:eastAsia="it-IT"/>
               </w:rPr>
-              <w:t xml:space="preserve">SMS: </w:t>
-            </w:r>
-            <w:r>
-              <w:rPr>
-                <w:rFonts w:ascii="Arial" w:eastAsia="Times New Roman" w:hAnsi="Arial" w:cs="Arial"/>
-                <w:sz w:val="16"/>
-                <w:szCs w:val="16"/>
-                <w:lang w:eastAsia="it-IT"/>
-              </w:rPr>
-              <w:t>"TELEPHONE NUMBER SAVED "</w:t>
+              <w:t>SMS: "TELEPHONE NUMBER SAVED "</w:t>
             </w:r>
           </w:p>
           <w:p>
@@ -10321,15 +9541,15 @@
                 <w:rFonts w:ascii="Arial" w:eastAsia="Times New Roman" w:hAnsi="Arial" w:cs="Arial"/>
                 <w:sz w:val="16"/>
                 <w:szCs w:val="16"/>
-                <w:lang w:val="en-US" w:eastAsia="it-IT"/>
-              </w:rPr>
-            </w:pPr>
-            <w:r>
-              <w:rPr>
-                <w:rFonts w:ascii="Arial" w:eastAsia="Times New Roman" w:hAnsi="Arial" w:cs="Arial"/>
-                <w:sz w:val="16"/>
-                <w:szCs w:val="16"/>
-                <w:lang w:val="en-US" w:eastAsia="it-IT"/>
+                <w:lang w:eastAsia="it-IT"/>
+              </w:rPr>
+            </w:pPr>
+            <w:r>
+              <w:rPr>
+                <w:rFonts w:ascii="Arial" w:eastAsia="Times New Roman" w:hAnsi="Arial" w:cs="Arial"/>
+                <w:sz w:val="16"/>
+                <w:szCs w:val="16"/>
+                <w:lang w:eastAsia="it-IT"/>
               </w:rPr>
               <w:t>SMS:</w:t>
             </w:r>
@@ -10342,46 +9562,17 @@
                 <w:rFonts w:ascii="Arial" w:eastAsia="Times New Roman" w:hAnsi="Arial" w:cs="Arial"/>
                 <w:sz w:val="16"/>
                 <w:szCs w:val="16"/>
-                <w:lang w:val="en-US" w:eastAsia="it-IT"/>
-              </w:rPr>
-            </w:pPr>
-            <w:proofErr w:type="gramStart"/>
-            <w:r>
-              <w:rPr>
-                <w:rFonts w:ascii="Arial" w:eastAsia="Times New Roman" w:hAnsi="Arial" w:cs="Arial"/>
-                <w:sz w:val="16"/>
-                <w:szCs w:val="16"/>
-                <w:lang w:val="en-US" w:eastAsia="it-IT"/>
-              </w:rPr>
-              <w:t>”A</w:t>
-            </w:r>
-            <w:r>
-              <w:rPr>
-                <w:rFonts w:ascii="Arial" w:eastAsia="Times New Roman" w:hAnsi="Arial" w:cs="Arial"/>
-                <w:sz w:val="16"/>
-                <w:szCs w:val="16"/>
-                <w:lang w:val="en-US" w:eastAsia="it-IT"/>
-              </w:rPr>
-              <w:t>uthorized</w:t>
-            </w:r>
-            <w:proofErr w:type="gramEnd"/>
-            <w:r>
-              <w:rPr>
-                <w:rFonts w:ascii="Arial" w:eastAsia="Times New Roman" w:hAnsi="Arial" w:cs="Arial"/>
-                <w:sz w:val="16"/>
-                <w:szCs w:val="16"/>
-                <w:lang w:val="en-US" w:eastAsia="it-IT"/>
-              </w:rPr>
-              <w:t xml:space="preserve"> phone n."</w:t>
-            </w:r>
-            <w:r>
-              <w:rPr>
-                <w:rFonts w:ascii="Arial" w:eastAsia="Times New Roman" w:hAnsi="Arial" w:cs="Arial"/>
-                <w:sz w:val="16"/>
-                <w:szCs w:val="16"/>
-                <w:lang w:val="en-US" w:eastAsia="it-IT"/>
-              </w:rPr>
-              <w:t xml:space="preserve"> con:</w:t>
+                <w:lang w:eastAsia="it-IT"/>
+              </w:rPr>
+            </w:pPr>
+            <w:r>
+              <w:rPr>
+                <w:rFonts w:ascii="Arial" w:eastAsia="Times New Roman" w:hAnsi="Arial" w:cs="Arial"/>
+                <w:sz w:val="16"/>
+                <w:szCs w:val="16"/>
+                <w:lang w:eastAsia="it-IT"/>
+              </w:rPr>
+              <w:t>”Authorized phone n." con:</w:t>
             </w:r>
           </w:p>
           <w:p>
@@ -10812,7 +10003,7 @@
                 <w:rFonts w:ascii="Arial" w:eastAsia="Times New Roman" w:hAnsi="Arial" w:cs="Arial"/>
                 <w:sz w:val="16"/>
                 <w:szCs w:val="16"/>
-                <w:lang w:val="en-US" w:eastAsia="it-IT"/>
+                <w:lang w:eastAsia="it-IT"/>
               </w:rPr>
             </w:pPr>
             <w:proofErr w:type="gramStart"/>
@@ -10821,18 +10012,9 @@
                 <w:rFonts w:ascii="Arial" w:eastAsia="Times New Roman" w:hAnsi="Arial" w:cs="Arial"/>
                 <w:sz w:val="16"/>
                 <w:szCs w:val="16"/>
-                <w:lang w:val="en-US" w:eastAsia="it-IT"/>
-              </w:rPr>
-              <w:t>”A</w:t>
-            </w:r>
-            <w:r>
-              <w:rPr>
-                <w:rFonts w:ascii="Arial" w:eastAsia="Times New Roman" w:hAnsi="Arial" w:cs="Arial"/>
-                <w:sz w:val="16"/>
-                <w:szCs w:val="16"/>
-                <w:lang w:val="en-US" w:eastAsia="it-IT"/>
-              </w:rPr>
-              <w:t>uthorized</w:t>
+                <w:lang w:eastAsia="it-IT"/>
+              </w:rPr>
+              <w:t>”Authorized</w:t>
             </w:r>
             <w:proofErr w:type="gramEnd"/>
             <w:r>
@@ -10840,18 +10022,9 @@
                 <w:rFonts w:ascii="Arial" w:eastAsia="Times New Roman" w:hAnsi="Arial" w:cs="Arial"/>
                 <w:sz w:val="16"/>
                 <w:szCs w:val="16"/>
-                <w:lang w:val="en-US" w:eastAsia="it-IT"/>
-              </w:rPr>
-              <w:t xml:space="preserve"> phone n."</w:t>
-            </w:r>
-            <w:r>
-              <w:rPr>
-                <w:rFonts w:ascii="Arial" w:eastAsia="Times New Roman" w:hAnsi="Arial" w:cs="Arial"/>
-                <w:sz w:val="16"/>
-                <w:szCs w:val="16"/>
-                <w:lang w:val="en-US" w:eastAsia="it-IT"/>
-              </w:rPr>
-              <w:t xml:space="preserve"> con:</w:t>
+                <w:lang w:eastAsia="it-IT"/>
+              </w:rPr>
+              <w:t xml:space="preserve"> phone n." con:</w:t>
             </w:r>
           </w:p>
           <w:p>
@@ -10908,25 +10081,7 @@
                 <w:szCs w:val="16"/>
                 <w:lang w:eastAsia="it-IT"/>
               </w:rPr>
-              <w:t>,</w:t>
-            </w:r>
-            <w:r>
-              <w:rPr>
-                <w:rFonts w:ascii="Arial" w:eastAsia="Times New Roman" w:hAnsi="Arial" w:cs="Arial"/>
-                <w:sz w:val="16"/>
-                <w:szCs w:val="16"/>
-                <w:lang w:eastAsia="it-IT"/>
-              </w:rPr>
-              <w:t xml:space="preserve"> Aux1</w:t>
-            </w:r>
-            <w:r>
-              <w:rPr>
-                <w:rFonts w:ascii="Arial" w:eastAsia="Times New Roman" w:hAnsi="Arial" w:cs="Arial"/>
-                <w:sz w:val="16"/>
-                <w:szCs w:val="16"/>
-                <w:lang w:eastAsia="it-IT"/>
-              </w:rPr>
-              <w:t>e Aux2</w:t>
+              <w:t>, Aux1e Aux2</w:t>
             </w:r>
           </w:p>
         </w:tc>
@@ -11027,25 +10182,7 @@
                 <w:szCs w:val="16"/>
                 <w:lang w:eastAsia="it-IT"/>
               </w:rPr>
-              <w:t xml:space="preserve">Imposta il </w:t>
-            </w:r>
-            <w:r>
-              <w:rPr>
-                <w:rFonts w:ascii="Arial" w:eastAsia="Times New Roman" w:hAnsi="Arial" w:cs="Arial"/>
-                <w:sz w:val="16"/>
-                <w:szCs w:val="16"/>
-                <w:lang w:eastAsia="it-IT"/>
-              </w:rPr>
-              <w:t xml:space="preserve">terzo </w:t>
-            </w:r>
-            <w:r>
-              <w:rPr>
-                <w:rFonts w:ascii="Arial" w:eastAsia="Times New Roman" w:hAnsi="Arial" w:cs="Arial"/>
-                <w:sz w:val="16"/>
-                <w:szCs w:val="16"/>
-                <w:lang w:eastAsia="it-IT"/>
-              </w:rPr>
-              <w:t>numero Ausiliario</w:t>
+              <w:t>Imposta il terzo numero Ausiliario</w:t>
             </w:r>
           </w:p>
         </w:tc>
@@ -11095,31 +10232,7 @@
                 <w:szCs w:val="16"/>
                 <w:lang w:eastAsia="it-IT"/>
               </w:rPr>
-              <w:t>A</w:t>
-            </w:r>
-            <w:r>
-              <w:rPr>
-                <w:rFonts w:ascii="Arial" w:eastAsia="Times New Roman" w:hAnsi="Arial" w:cs="Arial"/>
-                <w:i/>
-                <w:iCs/>
-                <w:color w:val="000000" w:themeColor="text1"/>
-                <w:sz w:val="16"/>
-                <w:szCs w:val="16"/>
-                <w:lang w:eastAsia="it-IT"/>
-              </w:rPr>
-              <w:t>3</w:t>
-            </w:r>
-            <w:r>
-              <w:rPr>
-                <w:rFonts w:ascii="Arial" w:eastAsia="Times New Roman" w:hAnsi="Arial" w:cs="Arial"/>
-                <w:i/>
-                <w:iCs/>
-                <w:color w:val="000000" w:themeColor="text1"/>
-                <w:sz w:val="16"/>
-                <w:szCs w:val="16"/>
-                <w:lang w:eastAsia="it-IT"/>
-              </w:rPr>
-              <w:t xml:space="preserve">+393334188263  </w:t>
+              <w:t xml:space="preserve">A3+393334188263  </w:t>
             </w:r>
           </w:p>
         </w:tc>
@@ -11341,7 +10454,7 @@
                 <w:rFonts w:ascii="Arial" w:eastAsia="Times New Roman" w:hAnsi="Arial" w:cs="Arial"/>
                 <w:sz w:val="16"/>
                 <w:szCs w:val="16"/>
-                <w:lang w:val="en-US" w:eastAsia="it-IT"/>
+                <w:lang w:eastAsia="it-IT"/>
               </w:rPr>
             </w:pPr>
             <w:proofErr w:type="gramStart"/>
@@ -11350,18 +10463,9 @@
                 <w:rFonts w:ascii="Arial" w:eastAsia="Times New Roman" w:hAnsi="Arial" w:cs="Arial"/>
                 <w:sz w:val="16"/>
                 <w:szCs w:val="16"/>
-                <w:lang w:val="en-US" w:eastAsia="it-IT"/>
-              </w:rPr>
-              <w:t>”A</w:t>
-            </w:r>
-            <w:r>
-              <w:rPr>
-                <w:rFonts w:ascii="Arial" w:eastAsia="Times New Roman" w:hAnsi="Arial" w:cs="Arial"/>
-                <w:sz w:val="16"/>
-                <w:szCs w:val="16"/>
-                <w:lang w:val="en-US" w:eastAsia="it-IT"/>
-              </w:rPr>
-              <w:t>uthorized</w:t>
+                <w:lang w:eastAsia="it-IT"/>
+              </w:rPr>
+              <w:t>”Authorized</w:t>
             </w:r>
             <w:proofErr w:type="gramEnd"/>
             <w:r>
@@ -11369,18 +10473,9 @@
                 <w:rFonts w:ascii="Arial" w:eastAsia="Times New Roman" w:hAnsi="Arial" w:cs="Arial"/>
                 <w:sz w:val="16"/>
                 <w:szCs w:val="16"/>
-                <w:lang w:val="en-US" w:eastAsia="it-IT"/>
-              </w:rPr>
-              <w:t xml:space="preserve"> phone n."</w:t>
-            </w:r>
-            <w:r>
-              <w:rPr>
-                <w:rFonts w:ascii="Arial" w:eastAsia="Times New Roman" w:hAnsi="Arial" w:cs="Arial"/>
-                <w:sz w:val="16"/>
-                <w:szCs w:val="16"/>
-                <w:lang w:val="en-US" w:eastAsia="it-IT"/>
-              </w:rPr>
-              <w:t xml:space="preserve"> con:</w:t>
+                <w:lang w:eastAsia="it-IT"/>
+              </w:rPr>
+              <w:t xml:space="preserve"> phone n." con:</w:t>
             </w:r>
           </w:p>
           <w:p>
@@ -11437,34 +10532,7 @@
                 <w:szCs w:val="16"/>
                 <w:lang w:eastAsia="it-IT"/>
               </w:rPr>
-              <w:t>, Aux1</w:t>
-            </w:r>
-            <w:r>
-              <w:rPr>
-                <w:rFonts w:ascii="Arial" w:eastAsia="Times New Roman" w:hAnsi="Arial" w:cs="Arial"/>
-                <w:sz w:val="16"/>
-                <w:szCs w:val="16"/>
-                <w:lang w:eastAsia="it-IT"/>
-              </w:rPr>
-              <w:t>,</w:t>
-            </w:r>
-            <w:r>
-              <w:rPr>
-                <w:rFonts w:ascii="Arial" w:eastAsia="Times New Roman" w:hAnsi="Arial" w:cs="Arial"/>
-                <w:sz w:val="16"/>
-                <w:szCs w:val="16"/>
-                <w:lang w:eastAsia="it-IT"/>
-              </w:rPr>
-              <w:t xml:space="preserve"> Aux2</w:t>
-            </w:r>
-            <w:r>
-              <w:rPr>
-                <w:rFonts w:ascii="Arial" w:eastAsia="Times New Roman" w:hAnsi="Arial" w:cs="Arial"/>
-                <w:sz w:val="16"/>
-                <w:szCs w:val="16"/>
-                <w:lang w:eastAsia="it-IT"/>
-              </w:rPr>
-              <w:t xml:space="preserve"> e Aux3</w:t>
+              <w:t>, Aux1, Aux2 e Aux3</w:t>
             </w:r>
           </w:p>
         </w:tc>
@@ -11531,7 +10599,6 @@
                 <w:lang w:eastAsia="it-IT"/>
               </w:rPr>
             </w:pPr>
-            <w:proofErr w:type="spellStart"/>
             <w:r>
               <w:rPr>
                 <w:rFonts w:ascii="Arial" w:eastAsia="Times New Roman" w:hAnsi="Arial" w:cs="Arial"/>
@@ -11541,7 +10608,6 @@
               </w:rPr>
               <w:t>Operation</w:t>
             </w:r>
-            <w:proofErr w:type="spellEnd"/>
           </w:p>
         </w:tc>
         <w:tc>
@@ -11567,19 +10633,8 @@
                 <w:szCs w:val="16"/>
                 <w:lang w:eastAsia="it-IT"/>
               </w:rPr>
-              <w:t xml:space="preserve">Ritorna il valore di Tensione + </w:t>
-            </w:r>
-            <w:proofErr w:type="spellStart"/>
-            <w:r>
-              <w:rPr>
-                <w:rFonts w:ascii="Arial" w:eastAsia="Times New Roman" w:hAnsi="Arial" w:cs="Arial"/>
-                <w:sz w:val="16"/>
-                <w:szCs w:val="16"/>
-                <w:lang w:eastAsia="it-IT"/>
-              </w:rPr>
-              <w:t>Timestamp</w:t>
-            </w:r>
-            <w:proofErr w:type="spellEnd"/>
+              <w:t>Ritorna il valore di Tensione + Timestamp</w:t>
+            </w:r>
           </w:p>
         </w:tc>
         <w:tc>
@@ -11725,7 +10780,6 @@
                 <w:lang w:eastAsia="it-IT"/>
               </w:rPr>
             </w:pPr>
-            <w:proofErr w:type="spellStart"/>
             <w:r>
               <w:rPr>
                 <w:rFonts w:ascii="Arial" w:eastAsia="Times New Roman" w:hAnsi="Arial" w:cs="Arial"/>
@@ -11735,7 +10789,6 @@
               </w:rPr>
               <w:t>Operation</w:t>
             </w:r>
-            <w:proofErr w:type="spellEnd"/>
           </w:p>
         </w:tc>
         <w:tc>
@@ -11761,19 +10814,8 @@
                 <w:szCs w:val="16"/>
                 <w:lang w:eastAsia="it-IT"/>
               </w:rPr>
-              <w:t xml:space="preserve">Ritorna il valore di Tensione + </w:t>
-            </w:r>
-            <w:proofErr w:type="spellStart"/>
-            <w:r>
-              <w:rPr>
-                <w:rFonts w:ascii="Arial" w:eastAsia="Times New Roman" w:hAnsi="Arial" w:cs="Arial"/>
-                <w:sz w:val="16"/>
-                <w:szCs w:val="16"/>
-                <w:lang w:eastAsia="it-IT"/>
-              </w:rPr>
-              <w:t>Timestamp</w:t>
-            </w:r>
-            <w:proofErr w:type="spellEnd"/>
+              <w:t>Ritorna il valore di Tensione + Timestamp</w:t>
+            </w:r>
           </w:p>
         </w:tc>
         <w:tc>
@@ -11910,7 +10952,6 @@
                 <w:lang w:eastAsia="it-IT"/>
               </w:rPr>
             </w:pPr>
-            <w:proofErr w:type="spellStart"/>
             <w:r>
               <w:rPr>
                 <w:rFonts w:ascii="Arial" w:eastAsia="Times New Roman" w:hAnsi="Arial" w:cs="Arial"/>
@@ -11920,7 +10961,6 @@
               </w:rPr>
               <w:t>Operation</w:t>
             </w:r>
-            <w:proofErr w:type="spellEnd"/>
           </w:p>
         </w:tc>
         <w:tc>
@@ -11946,19 +10986,8 @@
                 <w:szCs w:val="16"/>
                 <w:lang w:eastAsia="it-IT"/>
               </w:rPr>
-              <w:t xml:space="preserve">Ritorna il valore di Tensione + </w:t>
-            </w:r>
-            <w:proofErr w:type="spellStart"/>
-            <w:r>
-              <w:rPr>
-                <w:rFonts w:ascii="Arial" w:eastAsia="Times New Roman" w:hAnsi="Arial" w:cs="Arial"/>
-                <w:sz w:val="16"/>
-                <w:szCs w:val="16"/>
-                <w:lang w:eastAsia="it-IT"/>
-              </w:rPr>
-              <w:t>Timestamp</w:t>
-            </w:r>
-            <w:proofErr w:type="spellEnd"/>
+              <w:t>Ritorna il valore di Tensione + Timestamp</w:t>
+            </w:r>
           </w:p>
         </w:tc>
         <w:tc>
@@ -11983,19 +11012,8 @@
                 <w:szCs w:val="16"/>
                 <w:lang w:eastAsia="it-IT"/>
               </w:rPr>
-              <w:t xml:space="preserve">Da telefono </w:t>
-            </w:r>
-            <w:proofErr w:type="spellStart"/>
-            <w:r>
-              <w:rPr>
-                <w:rFonts w:ascii="Arial" w:eastAsia="Times New Roman" w:hAnsi="Arial" w:cs="Arial"/>
-                <w:sz w:val="16"/>
-                <w:szCs w:val="16"/>
-                <w:lang w:eastAsia="it-IT"/>
-              </w:rPr>
-              <w:t>scooisciuto</w:t>
-            </w:r>
-            <w:proofErr w:type="spellEnd"/>
+              <w:t>Da telefono scooisciuto</w:t>
+            </w:r>
           </w:p>
         </w:tc>
         <w:tc>
@@ -12038,15 +11056,15 @@
                 <w:rFonts w:ascii="Arial" w:eastAsia="Times New Roman" w:hAnsi="Arial" w:cs="Arial"/>
                 <w:sz w:val="16"/>
                 <w:szCs w:val="16"/>
-                <w:lang w:eastAsia="it-IT"/>
-              </w:rPr>
-            </w:pPr>
-            <w:r>
-              <w:rPr>
-                <w:rFonts w:ascii="Arial" w:eastAsia="Times New Roman" w:hAnsi="Arial" w:cs="Arial"/>
-                <w:sz w:val="16"/>
-                <w:szCs w:val="16"/>
-                <w:lang w:eastAsia="it-IT"/>
+                <w:lang w:val="en-US" w:eastAsia="it-IT"/>
+              </w:rPr>
+            </w:pPr>
+            <w:r>
+              <w:rPr>
+                <w:rFonts w:ascii="Arial" w:eastAsia="Times New Roman" w:hAnsi="Arial" w:cs="Arial"/>
+                <w:sz w:val="16"/>
+                <w:szCs w:val="16"/>
+                <w:lang w:val="en-US" w:eastAsia="it-IT"/>
               </w:rPr>
               <w:t>"Request from NOT AUTHORIZED number"</w:t>
             </w:r>
@@ -12059,7 +11077,7 @@
                 <w:rFonts w:ascii="Arial" w:eastAsia="Times New Roman" w:hAnsi="Arial" w:cs="Arial"/>
                 <w:sz w:val="16"/>
                 <w:szCs w:val="16"/>
-                <w:lang w:eastAsia="it-IT"/>
+                <w:lang w:val="en-US" w:eastAsia="it-IT"/>
               </w:rPr>
             </w:pPr>
           </w:p>
@@ -12100,6 +11118,15 @@
                 <w:lang w:val="en-US" w:eastAsia="it-IT"/>
               </w:rPr>
             </w:pPr>
+            <w:r>
+              <w:rPr>
+                <w:rFonts w:ascii="Arial" w:eastAsia="Times New Roman" w:hAnsi="Arial" w:cs="Arial"/>
+                <w:sz w:val="16"/>
+                <w:szCs w:val="16"/>
+                <w:lang w:val="en-US" w:eastAsia="it-IT"/>
+              </w:rPr>
+              <w:t>3.3</w:t>
+            </w:r>
           </w:p>
         </w:tc>
         <w:tc>

</xml_diff>

<commit_message>
Aggiornamento 2 doc TestPlan
</commit_message>
<xml_diff>
--- a/SMS Manager for Power monitoring.docx
+++ b/SMS Manager for Power monitoring.docx
@@ -66,6 +66,7 @@
         </w:rPr>
         <w:t xml:space="preserve">  </w:t>
       </w:r>
+      <w:proofErr w:type="spellStart"/>
       <w:r>
         <w:rPr>
           <w:rFonts w:ascii="Arial" w:eastAsia="Times New Roman" w:hAnsi="Arial" w:cs="Arial"/>
@@ -76,7 +77,20 @@
           <w:szCs w:val="28"/>
           <w:lang w:val="en-US" w:eastAsia="it-IT"/>
         </w:rPr>
-        <w:t>Specifiche:</w:t>
+        <w:t>Specifiche</w:t>
+      </w:r>
+      <w:proofErr w:type="spellEnd"/>
+      <w:r>
+        <w:rPr>
+          <w:rFonts w:ascii="Arial" w:eastAsia="Times New Roman" w:hAnsi="Arial" w:cs="Arial"/>
+          <w:b/>
+          <w:bCs/>
+          <w:color w:val="000000" w:themeColor="text1"/>
+          <w:sz w:val="28"/>
+          <w:szCs w:val="28"/>
+          <w:lang w:val="en-US" w:eastAsia="it-IT"/>
+        </w:rPr>
+        <w:t>:</w:t>
       </w:r>
     </w:p>
     <w:p>
@@ -130,7 +144,29 @@
           <w:szCs w:val="24"/>
           <w:lang w:eastAsia="it-IT"/>
         </w:rPr>
-        <w:t>  - OK    Reinizializzazione ogni 24 ore (ogni giorno) ad ora prestabilita</w:t>
+        <w:t>  - OK    </w:t>
+      </w:r>
+      <w:proofErr w:type="spellStart"/>
+      <w:r>
+        <w:rPr>
+          <w:rFonts w:ascii="Arial" w:eastAsia="Times New Roman" w:hAnsi="Arial" w:cs="Arial"/>
+          <w:color w:val="000000" w:themeColor="text1"/>
+          <w:sz w:val="24"/>
+          <w:szCs w:val="24"/>
+          <w:lang w:eastAsia="it-IT"/>
+        </w:rPr>
+        <w:t>Reinizializzazione</w:t>
+      </w:r>
+      <w:proofErr w:type="spellEnd"/>
+      <w:r>
+        <w:rPr>
+          <w:rFonts w:ascii="Arial" w:eastAsia="Times New Roman" w:hAnsi="Arial" w:cs="Arial"/>
+          <w:color w:val="000000" w:themeColor="text1"/>
+          <w:sz w:val="24"/>
+          <w:szCs w:val="24"/>
+          <w:lang w:eastAsia="it-IT"/>
+        </w:rPr>
+        <w:t xml:space="preserve"> ogni 24 ore (ogni giorno) ad ora prestabilita</w:t>
       </w:r>
     </w:p>
     <w:p>
@@ -265,6 +301,7 @@
         </w:rPr>
         <w:t xml:space="preserve">- OK </w:t>
       </w:r>
+      <w:proofErr w:type="gramStart"/>
       <w:r>
         <w:rPr>
           <w:rFonts w:ascii="Arial" w:eastAsia="Times New Roman" w:hAnsi="Arial" w:cs="Arial"/>
@@ -284,7 +321,18 @@
           <w:szCs w:val="24"/>
           <w:lang w:eastAsia="it-IT"/>
         </w:rPr>
-        <w:t>da Master</w:t>
+        <w:t>da</w:t>
+      </w:r>
+      <w:proofErr w:type="gramEnd"/>
+      <w:r>
+        <w:rPr>
+          <w:rFonts w:ascii="Arial" w:eastAsia="Times New Roman" w:hAnsi="Arial" w:cs="Arial"/>
+          <w:color w:val="000000" w:themeColor="text1"/>
+          <w:sz w:val="24"/>
+          <w:szCs w:val="24"/>
+          <w:lang w:eastAsia="it-IT"/>
+        </w:rPr>
+        <w:t xml:space="preserve"> Master</w:t>
       </w:r>
       <w:r>
         <w:rPr>
@@ -306,6 +354,7 @@
         </w:rPr>
         <w:t xml:space="preserve">Prevedere la richiesta SMS (CMD N) per vedere quanti e quali numeri </w:t>
       </w:r>
+      <w:proofErr w:type="gramStart"/>
       <w:r>
         <w:rPr>
           <w:rFonts w:ascii="Arial" w:eastAsia="Times New Roman" w:hAnsi="Arial" w:cs="Arial"/>
@@ -325,7 +374,18 @@
           <w:szCs w:val="24"/>
           <w:lang w:eastAsia="it-IT"/>
         </w:rPr>
-        <w:t xml:space="preserve">sono impostati + Messaggio SMS per richiedente non autorizzato </w:t>
+        <w:t>sono</w:t>
+      </w:r>
+      <w:proofErr w:type="gramEnd"/>
+      <w:r>
+        <w:rPr>
+          <w:rFonts w:ascii="Arial" w:eastAsia="Times New Roman" w:hAnsi="Arial" w:cs="Arial"/>
+          <w:color w:val="000000" w:themeColor="text1"/>
+          <w:sz w:val="24"/>
+          <w:szCs w:val="24"/>
+          <w:lang w:eastAsia="it-IT"/>
+        </w:rPr>
+        <w:t xml:space="preserve"> impostati + Messaggio SMS per richiedente non autorizzato </w:t>
       </w:r>
     </w:p>
     <w:p>
@@ -626,7 +686,31 @@
           <w:u w:val="single"/>
           <w:lang w:eastAsia="it-IT"/>
         </w:rPr>
-        <w:t>Monitora la tensione di rete tramite un trasformatore e la libreria EmonLib.</w:t>
+        <w:t xml:space="preserve">Monitora la tensione di rete tramite un trasformatore e la libreria </w:t>
+      </w:r>
+      <w:proofErr w:type="spellStart"/>
+      <w:r>
+        <w:rPr>
+          <w:rFonts w:ascii="Arial" w:eastAsia="Times New Roman" w:hAnsi="Arial" w:cs="Arial"/>
+          <w:color w:val="000000" w:themeColor="text1"/>
+          <w:sz w:val="24"/>
+          <w:szCs w:val="24"/>
+          <w:u w:val="single"/>
+          <w:lang w:eastAsia="it-IT"/>
+        </w:rPr>
+        <w:t>EmonLib</w:t>
+      </w:r>
+      <w:proofErr w:type="spellEnd"/>
+      <w:r>
+        <w:rPr>
+          <w:rFonts w:ascii="Arial" w:eastAsia="Times New Roman" w:hAnsi="Arial" w:cs="Arial"/>
+          <w:color w:val="000000" w:themeColor="text1"/>
+          <w:sz w:val="24"/>
+          <w:szCs w:val="24"/>
+          <w:u w:val="single"/>
+          <w:lang w:eastAsia="it-IT"/>
+        </w:rPr>
+        <w:t>.</w:t>
       </w:r>
     </w:p>
     <w:p>
@@ -768,6 +852,7 @@
         </w:rPr>
         <w:t xml:space="preserve">- </w:t>
       </w:r>
+      <w:proofErr w:type="spellStart"/>
       <w:r>
         <w:rPr>
           <w:rFonts w:ascii="Arial" w:eastAsia="Times New Roman" w:hAnsi="Arial" w:cs="Arial"/>
@@ -780,6 +865,7 @@
         </w:rPr>
         <w:t>M+numero</w:t>
       </w:r>
+      <w:proofErr w:type="spellEnd"/>
       <w:r>
         <w:rPr>
           <w:rFonts w:ascii="Arial" w:eastAsia="Times New Roman" w:hAnsi="Arial" w:cs="Arial"/>
@@ -1854,7 +1940,29 @@
           <w:szCs w:val="24"/>
           <w:lang w:eastAsia="it-IT"/>
         </w:rPr>
-        <w:t>  Germania  totale cifre 13 senza +</w:t>
+        <w:t xml:space="preserve">  </w:t>
+      </w:r>
+      <w:proofErr w:type="gramStart"/>
+      <w:r>
+        <w:rPr>
+          <w:rFonts w:ascii="Arial" w:eastAsia="Times New Roman" w:hAnsi="Arial" w:cs="Arial"/>
+          <w:color w:val="000000" w:themeColor="text1"/>
+          <w:sz w:val="24"/>
+          <w:szCs w:val="24"/>
+          <w:lang w:eastAsia="it-IT"/>
+        </w:rPr>
+        <w:t>Germania  totale</w:t>
+      </w:r>
+      <w:proofErr w:type="gramEnd"/>
+      <w:r>
+        <w:rPr>
+          <w:rFonts w:ascii="Arial" w:eastAsia="Times New Roman" w:hAnsi="Arial" w:cs="Arial"/>
+          <w:color w:val="000000" w:themeColor="text1"/>
+          <w:sz w:val="24"/>
+          <w:szCs w:val="24"/>
+          <w:lang w:eastAsia="it-IT"/>
+        </w:rPr>
+        <w:t xml:space="preserve"> cifre 13 senza +</w:t>
       </w:r>
     </w:p>
     <w:p>
@@ -2014,6 +2122,7 @@
                 <w:lang w:eastAsia="it-IT"/>
               </w:rPr>
             </w:pPr>
+            <w:proofErr w:type="spellStart"/>
             <w:r>
               <w:rPr>
                 <w:rFonts w:ascii="Arial" w:eastAsia="Times New Roman" w:hAnsi="Arial" w:cs="Arial"/>
@@ -2024,6 +2133,7 @@
               </w:rPr>
               <w:t>Command</w:t>
             </w:r>
+            <w:proofErr w:type="spellEnd"/>
           </w:p>
         </w:tc>
         <w:tc>
@@ -2467,7 +2577,51 @@
                 <w:szCs w:val="24"/>
                 <w:lang w:val="en-US" w:eastAsia="it-IT"/>
               </w:rPr>
-              <w:t>Delete in EEPROM and phoneAut auxiliaries phone numbers except the Authorized MASTER[0]</w:t>
+              <w:t xml:space="preserve">Delete in EEPROM and </w:t>
+            </w:r>
+            <w:proofErr w:type="spellStart"/>
+            <w:r>
+              <w:rPr>
+                <w:rFonts w:ascii="Arial" w:eastAsia="Times New Roman" w:hAnsi="Arial" w:cs="Arial"/>
+                <w:color w:val="000000" w:themeColor="text1"/>
+                <w:sz w:val="24"/>
+                <w:szCs w:val="24"/>
+                <w:lang w:val="en-US" w:eastAsia="it-IT"/>
+              </w:rPr>
+              <w:t>phoneAut</w:t>
+            </w:r>
+            <w:proofErr w:type="spellEnd"/>
+            <w:r>
+              <w:rPr>
+                <w:rFonts w:ascii="Arial" w:eastAsia="Times New Roman" w:hAnsi="Arial" w:cs="Arial"/>
+                <w:color w:val="000000" w:themeColor="text1"/>
+                <w:sz w:val="24"/>
+                <w:szCs w:val="24"/>
+                <w:lang w:val="en-US" w:eastAsia="it-IT"/>
+              </w:rPr>
+              <w:t xml:space="preserve"> auxiliaries phone numbers except the Authorized </w:t>
+            </w:r>
+            <w:proofErr w:type="gramStart"/>
+            <w:r>
+              <w:rPr>
+                <w:rFonts w:ascii="Arial" w:eastAsia="Times New Roman" w:hAnsi="Arial" w:cs="Arial"/>
+                <w:color w:val="000000" w:themeColor="text1"/>
+                <w:sz w:val="24"/>
+                <w:szCs w:val="24"/>
+                <w:lang w:val="en-US" w:eastAsia="it-IT"/>
+              </w:rPr>
+              <w:t>MASTER[</w:t>
+            </w:r>
+            <w:proofErr w:type="gramEnd"/>
+            <w:r>
+              <w:rPr>
+                <w:rFonts w:ascii="Arial" w:eastAsia="Times New Roman" w:hAnsi="Arial" w:cs="Arial"/>
+                <w:color w:val="000000" w:themeColor="text1"/>
+                <w:sz w:val="24"/>
+                <w:szCs w:val="24"/>
+                <w:lang w:val="en-US" w:eastAsia="it-IT"/>
+              </w:rPr>
+              <w:t>0]</w:t>
             </w:r>
           </w:p>
           <w:p>
@@ -2620,8 +2774,20 @@
                 <w:szCs w:val="24"/>
                 <w:lang w:eastAsia="it-IT"/>
               </w:rPr>
-              <w:t>AGGIUNGI/SOSTITUISCI cellulare AUSILIARIO in posizione....</w:t>
-            </w:r>
+              <w:t xml:space="preserve">AGGIUNGI/SOSTITUISCI cellulare AUSILIARIO in </w:t>
+            </w:r>
+            <w:proofErr w:type="gramStart"/>
+            <w:r>
+              <w:rPr>
+                <w:rFonts w:ascii="Arial" w:eastAsia="Times New Roman" w:hAnsi="Arial" w:cs="Arial"/>
+                <w:color w:val="000000" w:themeColor="text1"/>
+                <w:sz w:val="24"/>
+                <w:szCs w:val="24"/>
+                <w:lang w:eastAsia="it-IT"/>
+              </w:rPr>
+              <w:t>posizione....</w:t>
+            </w:r>
+            <w:proofErr w:type="gramEnd"/>
           </w:p>
         </w:tc>
       </w:tr>
@@ -3235,15 +3401,27 @@
           <w:lang w:eastAsia="it-IT"/>
         </w:rPr>
       </w:pPr>
-      <w:r>
-        <w:rPr>
-          <w:rFonts w:ascii="Arial" w:eastAsia="Times New Roman" w:hAnsi="Arial" w:cs="Arial"/>
-          <w:color w:val="000000" w:themeColor="text1"/>
-          <w:sz w:val="24"/>
-          <w:szCs w:val="24"/>
-          <w:lang w:eastAsia="it-IT"/>
-        </w:rPr>
-        <w:t>EEPROM.read(5) Indicatore Rete presente (0) Rete assente (1)</w:t>
+      <w:proofErr w:type="spellStart"/>
+      <w:r>
+        <w:rPr>
+          <w:rFonts w:ascii="Arial" w:eastAsia="Times New Roman" w:hAnsi="Arial" w:cs="Arial"/>
+          <w:color w:val="000000" w:themeColor="text1"/>
+          <w:sz w:val="24"/>
+          <w:szCs w:val="24"/>
+          <w:lang w:eastAsia="it-IT"/>
+        </w:rPr>
+        <w:t>EEPROM.read</w:t>
+      </w:r>
+      <w:proofErr w:type="spellEnd"/>
+      <w:r>
+        <w:rPr>
+          <w:rFonts w:ascii="Arial" w:eastAsia="Times New Roman" w:hAnsi="Arial" w:cs="Arial"/>
+          <w:color w:val="000000" w:themeColor="text1"/>
+          <w:sz w:val="24"/>
+          <w:szCs w:val="24"/>
+          <w:lang w:eastAsia="it-IT"/>
+        </w:rPr>
+        <w:t>(5) Indicatore Rete presente (0) Rete assente (1)</w:t>
       </w:r>
     </w:p>
     <w:p>
@@ -3470,6 +3648,7 @@
         </w:rPr>
       </w:pPr>
       <w:hyperlink r:id="rId6" w:history="1">
+        <w:proofErr w:type="gramStart"/>
         <w:r>
           <w:rPr>
             <w:rFonts w:ascii="Segoe UI" w:eastAsia="Times New Roman" w:hAnsi="Segoe UI" w:cs="Segoe UI"/>
@@ -3480,169 +3659,9 @@
             <w:bdr w:val="single" w:sz="4" w:space="1" w:color="auto" w:frame="1"/>
             <w:lang w:eastAsia="it-IT"/>
           </w:rPr>
-          <w:t>setup()</w:t>
+          <w:t>setup(</w:t>
         </w:r>
-      </w:hyperlink>
-    </w:p>
-    <w:p>
-      <w:pPr>
-        <w:numPr>
-          <w:ilvl w:val="1"/>
-          <w:numId w:val="1"/>
-        </w:numPr>
-        <w:spacing w:before="60" w:after="60" w:line="240" w:lineRule="auto"/>
-        <w:rPr>
-          <w:rFonts w:ascii="Segoe UI" w:eastAsia="Times New Roman" w:hAnsi="Segoe UI" w:cs="Segoe UI"/>
-          <w:color w:val="000000" w:themeColor="text1"/>
-          <w:sz w:val="20"/>
-          <w:szCs w:val="20"/>
-          <w:lang w:eastAsia="it-IT"/>
-        </w:rPr>
-      </w:pPr>
-      <w:r>
-        <w:rPr>
-          <w:rFonts w:ascii="Segoe UI" w:eastAsia="Times New Roman" w:hAnsi="Segoe UI" w:cs="Segoe UI"/>
-          <w:color w:val="000000" w:themeColor="text1"/>
-          <w:sz w:val="20"/>
-          <w:szCs w:val="20"/>
-          <w:lang w:eastAsia="it-IT"/>
-        </w:rPr>
-        <w:t>inizializza reset pin</w:t>
-      </w:r>
-    </w:p>
-    <w:p>
-      <w:pPr>
-        <w:numPr>
-          <w:ilvl w:val="1"/>
-          <w:numId w:val="1"/>
-        </w:numPr>
-        <w:spacing w:after="0" w:line="240" w:lineRule="auto"/>
-        <w:rPr>
-          <w:rFonts w:ascii="Segoe UI" w:eastAsia="Times New Roman" w:hAnsi="Segoe UI" w:cs="Segoe UI"/>
-          <w:color w:val="000000" w:themeColor="text1"/>
-          <w:sz w:val="20"/>
-          <w:szCs w:val="20"/>
-          <w:lang w:eastAsia="it-IT"/>
-        </w:rPr>
-      </w:pPr>
-      <w:r>
-        <w:rPr>
-          <w:rFonts w:ascii="Segoe UI" w:eastAsia="Times New Roman" w:hAnsi="Segoe UI" w:cs="Segoe UI"/>
-          <w:color w:val="000000" w:themeColor="text1"/>
-          <w:sz w:val="20"/>
-          <w:szCs w:val="20"/>
-          <w:lang w:eastAsia="it-IT"/>
-        </w:rPr>
-        <w:t>chiama </w:t>
-      </w:r>
-      <w:hyperlink r:id="rId7" w:history="1">
-        <w:r>
-          <w:rPr>
-            <w:rFonts w:ascii="Segoe UI" w:eastAsia="Times New Roman" w:hAnsi="Segoe UI" w:cs="Segoe UI"/>
-            <w:color w:val="000000" w:themeColor="text1"/>
-            <w:sz w:val="18"/>
-            <w:szCs w:val="18"/>
-            <w:bdr w:val="single" w:sz="4" w:space="1" w:color="auto" w:frame="1"/>
-            <w:lang w:eastAsia="it-IT"/>
-          </w:rPr>
-          <w:t>initgsm()</w:t>
-        </w:r>
-      </w:hyperlink>
-    </w:p>
-    <w:p>
-      <w:pPr>
-        <w:numPr>
-          <w:ilvl w:val="1"/>
-          <w:numId w:val="1"/>
-        </w:numPr>
-        <w:spacing w:after="0" w:line="240" w:lineRule="auto"/>
-        <w:rPr>
-          <w:rFonts w:ascii="Segoe UI" w:eastAsia="Times New Roman" w:hAnsi="Segoe UI" w:cs="Segoe UI"/>
-          <w:color w:val="000000" w:themeColor="text1"/>
-          <w:sz w:val="20"/>
-          <w:szCs w:val="20"/>
-          <w:lang w:eastAsia="it-IT"/>
-        </w:rPr>
-      </w:pPr>
-      <w:r>
-        <w:rPr>
-          <w:rFonts w:ascii="Segoe UI" w:eastAsia="Times New Roman" w:hAnsi="Segoe UI" w:cs="Segoe UI"/>
-          <w:color w:val="000000" w:themeColor="text1"/>
-          <w:sz w:val="20"/>
-          <w:szCs w:val="20"/>
-          <w:lang w:eastAsia="it-IT"/>
-        </w:rPr>
-        <w:t>imposta </w:t>
-      </w:r>
-      <w:hyperlink r:id="rId8" w:history="1">
-        <w:r>
-          <w:rPr>
-            <w:rFonts w:ascii="Segoe UI" w:eastAsia="Times New Roman" w:hAnsi="Segoe UI" w:cs="Segoe UI"/>
-            <w:color w:val="000000" w:themeColor="text1"/>
-            <w:sz w:val="18"/>
-            <w:szCs w:val="18"/>
-            <w:bdr w:val="single" w:sz="4" w:space="1" w:color="auto" w:frame="1"/>
-            <w:lang w:eastAsia="it-IT"/>
-          </w:rPr>
-          <w:t>EEPROM.update(5, 0)</w:t>
-        </w:r>
-      </w:hyperlink>
-    </w:p>
-    <w:p>
-      <w:pPr>
-        <w:numPr>
-          <w:ilvl w:val="1"/>
-          <w:numId w:val="1"/>
-        </w:numPr>
-        <w:spacing w:after="0" w:line="240" w:lineRule="auto"/>
-        <w:rPr>
-          <w:rFonts w:ascii="Segoe UI" w:eastAsia="Times New Roman" w:hAnsi="Segoe UI" w:cs="Segoe UI"/>
-          <w:color w:val="000000" w:themeColor="text1"/>
-          <w:sz w:val="20"/>
-          <w:szCs w:val="20"/>
-          <w:lang w:eastAsia="it-IT"/>
-        </w:rPr>
-      </w:pPr>
-      <w:r>
-        <w:rPr>
-          <w:rFonts w:ascii="Segoe UI" w:eastAsia="Times New Roman" w:hAnsi="Segoe UI" w:cs="Segoe UI"/>
-          <w:color w:val="000000" w:themeColor="text1"/>
-          <w:sz w:val="20"/>
-          <w:szCs w:val="20"/>
-          <w:lang w:eastAsia="it-IT"/>
-        </w:rPr>
-        <w:t>carica numeri autorizzati con </w:t>
-      </w:r>
-      <w:hyperlink r:id="rId9" w:history="1">
-        <w:r>
-          <w:rPr>
-            <w:rFonts w:ascii="Segoe UI" w:eastAsia="Times New Roman" w:hAnsi="Segoe UI" w:cs="Segoe UI"/>
-            <w:color w:val="000000" w:themeColor="text1"/>
-            <w:sz w:val="18"/>
-            <w:szCs w:val="18"/>
-            <w:bdr w:val="single" w:sz="4" w:space="1" w:color="auto" w:frame="1"/>
-            <w:lang w:eastAsia="it-IT"/>
-          </w:rPr>
-          <w:t>RestorePhones()</w:t>
-        </w:r>
-      </w:hyperlink>
-    </w:p>
-    <w:p>
-      <w:pPr>
-        <w:numPr>
-          <w:ilvl w:val="0"/>
-          <w:numId w:val="1"/>
-        </w:numPr>
-        <w:spacing w:after="0" w:line="240" w:lineRule="auto"/>
-        <w:rPr>
-          <w:rFonts w:ascii="Segoe UI" w:eastAsia="Times New Roman" w:hAnsi="Segoe UI" w:cs="Segoe UI"/>
-          <w:color w:val="000000" w:themeColor="text1"/>
-          <w:sz w:val="20"/>
-          <w:szCs w:val="20"/>
-          <w:lang w:eastAsia="it-IT"/>
-        </w:rPr>
-      </w:pPr>
-      <w:hyperlink r:id="rId10" w:history="1">
+        <w:proofErr w:type="gramEnd"/>
         <w:r>
           <w:rPr>
             <w:rFonts w:ascii="Segoe UI" w:eastAsia="Times New Roman" w:hAnsi="Segoe UI" w:cs="Segoe UI"/>
@@ -3653,7 +3672,309 @@
             <w:bdr w:val="single" w:sz="4" w:space="1" w:color="auto" w:frame="1"/>
             <w:lang w:eastAsia="it-IT"/>
           </w:rPr>
-          <w:t>loop()</w:t>
+          <w:t>)</w:t>
+        </w:r>
+      </w:hyperlink>
+    </w:p>
+    <w:p>
+      <w:pPr>
+        <w:numPr>
+          <w:ilvl w:val="1"/>
+          <w:numId w:val="1"/>
+        </w:numPr>
+        <w:spacing w:before="60" w:after="60" w:line="240" w:lineRule="auto"/>
+        <w:rPr>
+          <w:rFonts w:ascii="Segoe UI" w:eastAsia="Times New Roman" w:hAnsi="Segoe UI" w:cs="Segoe UI"/>
+          <w:color w:val="000000" w:themeColor="text1"/>
+          <w:sz w:val="20"/>
+          <w:szCs w:val="20"/>
+          <w:lang w:eastAsia="it-IT"/>
+        </w:rPr>
+      </w:pPr>
+      <w:r>
+        <w:rPr>
+          <w:rFonts w:ascii="Segoe UI" w:eastAsia="Times New Roman" w:hAnsi="Segoe UI" w:cs="Segoe UI"/>
+          <w:color w:val="000000" w:themeColor="text1"/>
+          <w:sz w:val="20"/>
+          <w:szCs w:val="20"/>
+          <w:lang w:eastAsia="it-IT"/>
+        </w:rPr>
+        <w:t>inizializza reset pin</w:t>
+      </w:r>
+    </w:p>
+    <w:p>
+      <w:pPr>
+        <w:numPr>
+          <w:ilvl w:val="1"/>
+          <w:numId w:val="1"/>
+        </w:numPr>
+        <w:spacing w:after="0" w:line="240" w:lineRule="auto"/>
+        <w:rPr>
+          <w:rFonts w:ascii="Segoe UI" w:eastAsia="Times New Roman" w:hAnsi="Segoe UI" w:cs="Segoe UI"/>
+          <w:color w:val="000000" w:themeColor="text1"/>
+          <w:sz w:val="20"/>
+          <w:szCs w:val="20"/>
+          <w:lang w:eastAsia="it-IT"/>
+        </w:rPr>
+      </w:pPr>
+      <w:r>
+        <w:rPr>
+          <w:rFonts w:ascii="Segoe UI" w:eastAsia="Times New Roman" w:hAnsi="Segoe UI" w:cs="Segoe UI"/>
+          <w:color w:val="000000" w:themeColor="text1"/>
+          <w:sz w:val="20"/>
+          <w:szCs w:val="20"/>
+          <w:lang w:eastAsia="it-IT"/>
+        </w:rPr>
+        <w:t>chiama </w:t>
+      </w:r>
+      <w:proofErr w:type="spellStart"/>
+      <w:r>
+        <w:fldChar w:fldCharType="begin"/>
+      </w:r>
+      <w:r>
+        <w:instrText xml:space="preserve"> HYPERLINK "vscode-file://vscode-app/</w:instrText>
+      </w:r>
+      <w:r>
+        <w:instrText xml:space="preserve">c:/Users/Massimo/AppData/Local/Programs/Microsoft%20VS%20Code/f6cfa2ea24/resources/app/out/vs/code/electron-browser/workbench/workbench.html" </w:instrText>
+      </w:r>
+      <w:r>
+        <w:fldChar w:fldCharType="separate"/>
+      </w:r>
+      <w:proofErr w:type="gramStart"/>
+      <w:r>
+        <w:rPr>
+          <w:rFonts w:ascii="Segoe UI" w:eastAsia="Times New Roman" w:hAnsi="Segoe UI" w:cs="Segoe UI"/>
+          <w:color w:val="000000" w:themeColor="text1"/>
+          <w:sz w:val="18"/>
+          <w:szCs w:val="18"/>
+          <w:bdr w:val="single" w:sz="4" w:space="1" w:color="auto" w:frame="1"/>
+          <w:lang w:eastAsia="it-IT"/>
+        </w:rPr>
+        <w:t>initgsm</w:t>
+      </w:r>
+      <w:proofErr w:type="spellEnd"/>
+      <w:r>
+        <w:rPr>
+          <w:rFonts w:ascii="Segoe UI" w:eastAsia="Times New Roman" w:hAnsi="Segoe UI" w:cs="Segoe UI"/>
+          <w:color w:val="000000" w:themeColor="text1"/>
+          <w:sz w:val="18"/>
+          <w:szCs w:val="18"/>
+          <w:bdr w:val="single" w:sz="4" w:space="1" w:color="auto" w:frame="1"/>
+          <w:lang w:eastAsia="it-IT"/>
+        </w:rPr>
+        <w:t>(</w:t>
+      </w:r>
+      <w:proofErr w:type="gramEnd"/>
+      <w:r>
+        <w:rPr>
+          <w:rFonts w:ascii="Segoe UI" w:eastAsia="Times New Roman" w:hAnsi="Segoe UI" w:cs="Segoe UI"/>
+          <w:color w:val="000000" w:themeColor="text1"/>
+          <w:sz w:val="18"/>
+          <w:szCs w:val="18"/>
+          <w:bdr w:val="single" w:sz="4" w:space="1" w:color="auto" w:frame="1"/>
+          <w:lang w:eastAsia="it-IT"/>
+        </w:rPr>
+        <w:t>)</w:t>
+      </w:r>
+      <w:r>
+        <w:rPr>
+          <w:rFonts w:ascii="Segoe UI" w:eastAsia="Times New Roman" w:hAnsi="Segoe UI" w:cs="Segoe UI"/>
+          <w:color w:val="000000" w:themeColor="text1"/>
+          <w:sz w:val="18"/>
+          <w:szCs w:val="18"/>
+          <w:bdr w:val="single" w:sz="4" w:space="1" w:color="auto" w:frame="1"/>
+          <w:lang w:eastAsia="it-IT"/>
+        </w:rPr>
+        <w:fldChar w:fldCharType="end"/>
+      </w:r>
+    </w:p>
+    <w:p>
+      <w:pPr>
+        <w:numPr>
+          <w:ilvl w:val="1"/>
+          <w:numId w:val="1"/>
+        </w:numPr>
+        <w:spacing w:after="0" w:line="240" w:lineRule="auto"/>
+        <w:rPr>
+          <w:rFonts w:ascii="Segoe UI" w:eastAsia="Times New Roman" w:hAnsi="Segoe UI" w:cs="Segoe UI"/>
+          <w:color w:val="000000" w:themeColor="text1"/>
+          <w:sz w:val="20"/>
+          <w:szCs w:val="20"/>
+          <w:lang w:eastAsia="it-IT"/>
+        </w:rPr>
+      </w:pPr>
+      <w:r>
+        <w:rPr>
+          <w:rFonts w:ascii="Segoe UI" w:eastAsia="Times New Roman" w:hAnsi="Segoe UI" w:cs="Segoe UI"/>
+          <w:color w:val="000000" w:themeColor="text1"/>
+          <w:sz w:val="20"/>
+          <w:szCs w:val="20"/>
+          <w:lang w:eastAsia="it-IT"/>
+        </w:rPr>
+        <w:t>imposta </w:t>
+      </w:r>
+      <w:proofErr w:type="spellStart"/>
+      <w:r>
+        <w:fldChar w:fldCharType="begin"/>
+      </w:r>
+      <w:r>
+        <w:instrText xml:space="preserve"> HYPERLINK "vscode-file://vscode-app/c:/Users/Massimo/AppData/Local/Programs/Microsoft%20VS%2</w:instrText>
+      </w:r>
+      <w:r>
+        <w:instrText xml:space="preserve">0Code/f6cfa2ea24/resources/app/out/vs/code/electron-browser/workbench/workbench.html" </w:instrText>
+      </w:r>
+      <w:r>
+        <w:fldChar w:fldCharType="separate"/>
+      </w:r>
+      <w:r>
+        <w:rPr>
+          <w:rFonts w:ascii="Segoe UI" w:eastAsia="Times New Roman" w:hAnsi="Segoe UI" w:cs="Segoe UI"/>
+          <w:color w:val="000000" w:themeColor="text1"/>
+          <w:sz w:val="18"/>
+          <w:szCs w:val="18"/>
+          <w:bdr w:val="single" w:sz="4" w:space="1" w:color="auto" w:frame="1"/>
+          <w:lang w:eastAsia="it-IT"/>
+        </w:rPr>
+        <w:t>EEPROM.update</w:t>
+      </w:r>
+      <w:proofErr w:type="spellEnd"/>
+      <w:r>
+        <w:rPr>
+          <w:rFonts w:ascii="Segoe UI" w:eastAsia="Times New Roman" w:hAnsi="Segoe UI" w:cs="Segoe UI"/>
+          <w:color w:val="000000" w:themeColor="text1"/>
+          <w:sz w:val="18"/>
+          <w:szCs w:val="18"/>
+          <w:bdr w:val="single" w:sz="4" w:space="1" w:color="auto" w:frame="1"/>
+          <w:lang w:eastAsia="it-IT"/>
+        </w:rPr>
+        <w:t>(5, 0)</w:t>
+      </w:r>
+      <w:r>
+        <w:rPr>
+          <w:rFonts w:ascii="Segoe UI" w:eastAsia="Times New Roman" w:hAnsi="Segoe UI" w:cs="Segoe UI"/>
+          <w:color w:val="000000" w:themeColor="text1"/>
+          <w:sz w:val="18"/>
+          <w:szCs w:val="18"/>
+          <w:bdr w:val="single" w:sz="4" w:space="1" w:color="auto" w:frame="1"/>
+          <w:lang w:eastAsia="it-IT"/>
+        </w:rPr>
+        <w:fldChar w:fldCharType="end"/>
+      </w:r>
+    </w:p>
+    <w:p>
+      <w:pPr>
+        <w:numPr>
+          <w:ilvl w:val="1"/>
+          <w:numId w:val="1"/>
+        </w:numPr>
+        <w:spacing w:after="0" w:line="240" w:lineRule="auto"/>
+        <w:rPr>
+          <w:rFonts w:ascii="Segoe UI" w:eastAsia="Times New Roman" w:hAnsi="Segoe UI" w:cs="Segoe UI"/>
+          <w:color w:val="000000" w:themeColor="text1"/>
+          <w:sz w:val="20"/>
+          <w:szCs w:val="20"/>
+          <w:lang w:eastAsia="it-IT"/>
+        </w:rPr>
+      </w:pPr>
+      <w:r>
+        <w:rPr>
+          <w:rFonts w:ascii="Segoe UI" w:eastAsia="Times New Roman" w:hAnsi="Segoe UI" w:cs="Segoe UI"/>
+          <w:color w:val="000000" w:themeColor="text1"/>
+          <w:sz w:val="20"/>
+          <w:szCs w:val="20"/>
+          <w:lang w:eastAsia="it-IT"/>
+        </w:rPr>
+        <w:t>carica numeri autorizzati con </w:t>
+      </w:r>
+      <w:proofErr w:type="spellStart"/>
+      <w:r>
+        <w:fldChar w:fldCharType="begin"/>
+      </w:r>
+      <w:r>
+        <w:instrText xml:space="preserve"> HYPERLINK "vscode-file://vscode-app/c:/Users/Massimo/AppData/Local/Programs/Microsoft%20VS%20Code/f6cfa2ea24/resourc</w:instrText>
+      </w:r>
+      <w:r>
+        <w:instrText xml:space="preserve">es/app/out/vs/code/electron-browser/workbench/workbench.html" </w:instrText>
+      </w:r>
+      <w:r>
+        <w:fldChar w:fldCharType="separate"/>
+      </w:r>
+      <w:r>
+        <w:rPr>
+          <w:rFonts w:ascii="Segoe UI" w:eastAsia="Times New Roman" w:hAnsi="Segoe UI" w:cs="Segoe UI"/>
+          <w:color w:val="000000" w:themeColor="text1"/>
+          <w:sz w:val="18"/>
+          <w:szCs w:val="18"/>
+          <w:bdr w:val="single" w:sz="4" w:space="1" w:color="auto" w:frame="1"/>
+          <w:lang w:eastAsia="it-IT"/>
+        </w:rPr>
+        <w:t>RestorePhones</w:t>
+      </w:r>
+      <w:proofErr w:type="spellEnd"/>
+      <w:r>
+        <w:rPr>
+          <w:rFonts w:ascii="Segoe UI" w:eastAsia="Times New Roman" w:hAnsi="Segoe UI" w:cs="Segoe UI"/>
+          <w:color w:val="000000" w:themeColor="text1"/>
+          <w:sz w:val="18"/>
+          <w:szCs w:val="18"/>
+          <w:bdr w:val="single" w:sz="4" w:space="1" w:color="auto" w:frame="1"/>
+          <w:lang w:eastAsia="it-IT"/>
+        </w:rPr>
+        <w:t>()</w:t>
+      </w:r>
+      <w:r>
+        <w:rPr>
+          <w:rFonts w:ascii="Segoe UI" w:eastAsia="Times New Roman" w:hAnsi="Segoe UI" w:cs="Segoe UI"/>
+          <w:color w:val="000000" w:themeColor="text1"/>
+          <w:sz w:val="18"/>
+          <w:szCs w:val="18"/>
+          <w:bdr w:val="single" w:sz="4" w:space="1" w:color="auto" w:frame="1"/>
+          <w:lang w:eastAsia="it-IT"/>
+        </w:rPr>
+        <w:fldChar w:fldCharType="end"/>
+      </w:r>
+    </w:p>
+    <w:p>
+      <w:pPr>
+        <w:numPr>
+          <w:ilvl w:val="0"/>
+          <w:numId w:val="1"/>
+        </w:numPr>
+        <w:spacing w:after="0" w:line="240" w:lineRule="auto"/>
+        <w:rPr>
+          <w:rFonts w:ascii="Segoe UI" w:eastAsia="Times New Roman" w:hAnsi="Segoe UI" w:cs="Segoe UI"/>
+          <w:color w:val="000000" w:themeColor="text1"/>
+          <w:sz w:val="20"/>
+          <w:szCs w:val="20"/>
+          <w:lang w:eastAsia="it-IT"/>
+        </w:rPr>
+      </w:pPr>
+      <w:hyperlink r:id="rId7" w:history="1">
+        <w:proofErr w:type="gramStart"/>
+        <w:r>
+          <w:rPr>
+            <w:rFonts w:ascii="Segoe UI" w:eastAsia="Times New Roman" w:hAnsi="Segoe UI" w:cs="Segoe UI"/>
+            <w:color w:val="000000" w:themeColor="text1"/>
+            <w:sz w:val="18"/>
+            <w:szCs w:val="18"/>
+            <w:u w:val="single"/>
+            <w:bdr w:val="single" w:sz="4" w:space="1" w:color="auto" w:frame="1"/>
+            <w:lang w:eastAsia="it-IT"/>
+          </w:rPr>
+          <w:t>loop(</w:t>
+        </w:r>
+        <w:proofErr w:type="gramEnd"/>
+        <w:r>
+          <w:rPr>
+            <w:rFonts w:ascii="Segoe UI" w:eastAsia="Times New Roman" w:hAnsi="Segoe UI" w:cs="Segoe UI"/>
+            <w:color w:val="000000" w:themeColor="text1"/>
+            <w:sz w:val="18"/>
+            <w:szCs w:val="18"/>
+            <w:u w:val="single"/>
+            <w:bdr w:val="single" w:sz="4" w:space="1" w:color="auto" w:frame="1"/>
+            <w:lang w:eastAsia="it-IT"/>
+          </w:rPr>
+          <w:t>)</w:t>
         </w:r>
       </w:hyperlink>
     </w:p>
@@ -3976,19 +4297,50 @@
         </w:rPr>
         <w:t>ogni 15 minuti verifica reset giornaliero e chiama </w:t>
       </w:r>
-      <w:hyperlink r:id="rId11" w:history="1">
-        <w:r>
-          <w:rPr>
-            <w:rFonts w:ascii="Segoe UI" w:eastAsia="Times New Roman" w:hAnsi="Segoe UI" w:cs="Segoe UI"/>
-            <w:color w:val="000000" w:themeColor="text1"/>
-            <w:sz w:val="18"/>
-            <w:szCs w:val="18"/>
-            <w:bdr w:val="single" w:sz="4" w:space="1" w:color="auto" w:frame="1"/>
-            <w:lang w:eastAsia="it-IT"/>
-          </w:rPr>
-          <w:t>initgsm()</w:t>
-        </w:r>
-      </w:hyperlink>
+      <w:proofErr w:type="spellStart"/>
+      <w:r>
+        <w:fldChar w:fldCharType="begin"/>
+      </w:r>
+      <w:r>
+        <w:instrText xml:space="preserve"> HYPERLINK "vscode-file://vscode-app/c:/Users/Massimo/AppData/Local/Programs/Microsoft%20VS%20Code/f6cfa2ea24/resources/app/out/vs/code/electron-browser/workbench/workbench.html" </w:instrText>
+      </w:r>
+      <w:r>
+        <w:fldChar w:fldCharType="separate"/>
+      </w:r>
+      <w:r>
+        <w:rPr>
+          <w:rFonts w:ascii="Segoe UI" w:eastAsia="Times New Roman" w:hAnsi="Segoe UI" w:cs="Segoe UI"/>
+          <w:color w:val="000000" w:themeColor="text1"/>
+          <w:sz w:val="18"/>
+          <w:szCs w:val="18"/>
+          <w:bdr w:val="single" w:sz="4" w:space="1" w:color="auto" w:frame="1"/>
+          <w:lang w:eastAsia="it-IT"/>
+        </w:rPr>
+        <w:t>initgsm</w:t>
+      </w:r>
+      <w:proofErr w:type="spellEnd"/>
+      <w:r>
+        <w:rPr>
+          <w:rFonts w:ascii="Segoe UI" w:eastAsia="Times New Roman" w:hAnsi="Segoe UI" w:cs="Segoe UI"/>
+          <w:color w:val="000000" w:themeColor="text1"/>
+          <w:sz w:val="18"/>
+          <w:szCs w:val="18"/>
+          <w:bdr w:val="single" w:sz="4" w:space="1" w:color="auto" w:frame="1"/>
+          <w:lang w:eastAsia="it-IT"/>
+        </w:rPr>
+        <w:t>()</w:t>
+      </w:r>
+      <w:r>
+        <w:rPr>
+          <w:rFonts w:ascii="Segoe UI" w:eastAsia="Times New Roman" w:hAnsi="Segoe UI" w:cs="Segoe UI"/>
+          <w:color w:val="000000" w:themeColor="text1"/>
+          <w:sz w:val="18"/>
+          <w:szCs w:val="18"/>
+          <w:bdr w:val="single" w:sz="4" w:space="1" w:color="auto" w:frame="1"/>
+          <w:lang w:eastAsia="it-IT"/>
+        </w:rPr>
+        <w:fldChar w:fldCharType="end"/>
+      </w:r>
       <w:r>
         <w:rPr>
           <w:rFonts w:ascii="Segoe UI" w:eastAsia="Times New Roman" w:hAnsi="Segoe UI" w:cs="Segoe UI"/>
@@ -5052,6 +5404,7 @@
           <w:lang w:val="en-US" w:eastAsia="it-IT"/>
         </w:rPr>
       </w:pPr>
+      <w:proofErr w:type="spellStart"/>
       <w:r>
         <w:rPr>
           <w:rFonts w:ascii="Arial" w:eastAsia="Times New Roman" w:hAnsi="Arial" w:cs="Arial"/>
@@ -5072,7 +5425,19 @@
           <w:szCs w:val="28"/>
           <w:lang w:val="en-US" w:eastAsia="it-IT"/>
         </w:rPr>
-        <w:t>i LAB Tests</w:t>
+        <w:t>i</w:t>
+      </w:r>
+      <w:proofErr w:type="spellEnd"/>
+      <w:r>
+        <w:rPr>
+          <w:rFonts w:ascii="Arial" w:eastAsia="Times New Roman" w:hAnsi="Arial" w:cs="Arial"/>
+          <w:b/>
+          <w:bCs/>
+          <w:sz w:val="28"/>
+          <w:szCs w:val="28"/>
+          <w:lang w:val="en-US" w:eastAsia="it-IT"/>
+        </w:rPr>
+        <w:t xml:space="preserve"> LAB Tests</w:t>
       </w:r>
     </w:p>
     <w:p>
@@ -5108,6 +5473,17 @@
           <w:lang w:val="en-US" w:eastAsia="it-IT"/>
         </w:rPr>
         <w:tab/>
+      </w:r>
+      <w:proofErr w:type="spellStart"/>
+      <w:r>
+        <w:rPr>
+          <w:rFonts w:ascii="Arial" w:eastAsia="Times New Roman" w:hAnsi="Arial" w:cs="Arial"/>
+          <w:b/>
+          <w:bCs/>
+          <w:sz w:val="24"/>
+          <w:szCs w:val="24"/>
+          <w:lang w:val="en-US" w:eastAsia="it-IT"/>
+        </w:rPr>
         <w:t>Prim</w:t>
       </w:r>
       <w:r>
@@ -5119,7 +5495,19 @@
           <w:szCs w:val="24"/>
           <w:lang w:val="en-US" w:eastAsia="it-IT"/>
         </w:rPr>
-        <w:t>i LAB Tests</w:t>
+        <w:t>i</w:t>
+      </w:r>
+      <w:proofErr w:type="spellEnd"/>
+      <w:r>
+        <w:rPr>
+          <w:rFonts w:ascii="Arial" w:eastAsia="Times New Roman" w:hAnsi="Arial" w:cs="Arial"/>
+          <w:b/>
+          <w:bCs/>
+          <w:sz w:val="24"/>
+          <w:szCs w:val="24"/>
+          <w:lang w:val="en-US" w:eastAsia="it-IT"/>
+        </w:rPr>
+        <w:t xml:space="preserve"> LAB Tests</w:t>
       </w:r>
       <w:r>
         <w:rPr>
@@ -5200,15 +5588,27 @@
         </w:rPr>
         <w:t xml:space="preserve">Attualmente il </w:t>
       </w:r>
-      <w:r>
-        <w:rPr>
-          <w:rFonts w:ascii="Arial" w:eastAsia="Times New Roman" w:hAnsi="Arial" w:cs="Arial"/>
-          <w:color w:val="000000" w:themeColor="text1"/>
-          <w:sz w:val="24"/>
-          <w:szCs w:val="24"/>
-          <w:lang w:eastAsia="it-IT"/>
-        </w:rPr>
-        <w:t xml:space="preserve">Fw </w:t>
+      <w:proofErr w:type="spellStart"/>
+      <w:r>
+        <w:rPr>
+          <w:rFonts w:ascii="Arial" w:eastAsia="Times New Roman" w:hAnsi="Arial" w:cs="Arial"/>
+          <w:color w:val="000000" w:themeColor="text1"/>
+          <w:sz w:val="24"/>
+          <w:szCs w:val="24"/>
+          <w:lang w:eastAsia="it-IT"/>
+        </w:rPr>
+        <w:t>Fw</w:t>
+      </w:r>
+      <w:proofErr w:type="spellEnd"/>
+      <w:r>
+        <w:rPr>
+          <w:rFonts w:ascii="Arial" w:eastAsia="Times New Roman" w:hAnsi="Arial" w:cs="Arial"/>
+          <w:color w:val="000000" w:themeColor="text1"/>
+          <w:sz w:val="24"/>
+          <w:szCs w:val="24"/>
+          <w:lang w:eastAsia="it-IT"/>
+        </w:rPr>
+        <w:t xml:space="preserve"> </w:t>
       </w:r>
       <w:r>
         <w:rPr>
@@ -5361,7 +5761,22 @@
           <w:szCs w:val="24"/>
           <w:lang w:eastAsia="it-IT"/>
         </w:rPr>
-        <w:t>M+393334188263</w:t>
+        <w:t>M+</w:t>
+      </w:r>
+      <w:proofErr w:type="gramStart"/>
+      <w:r>
+        <w:rPr>
+          <w:rFonts w:ascii="Arial" w:eastAsia="Times New Roman" w:hAnsi="Arial" w:cs="Arial"/>
+          <w:b/>
+          <w:bCs/>
+          <w:i/>
+          <w:iCs/>
+          <w:color w:val="000000" w:themeColor="text1"/>
+          <w:sz w:val="24"/>
+          <w:szCs w:val="24"/>
+          <w:lang w:eastAsia="it-IT"/>
+        </w:rPr>
+        <w:t>393334188263</w:t>
       </w:r>
       <w:r>
         <w:rPr>
@@ -5382,7 +5797,19 @@
           <w:szCs w:val="24"/>
           <w:lang w:eastAsia="it-IT"/>
         </w:rPr>
-        <w:t xml:space="preserve"> - </w:t>
+        <w:t xml:space="preserve"> -</w:t>
+      </w:r>
+      <w:proofErr w:type="gramEnd"/>
+      <w:r>
+        <w:rPr>
+          <w:rFonts w:ascii="Arial" w:eastAsia="Times New Roman" w:hAnsi="Arial" w:cs="Arial"/>
+          <w:b/>
+          <w:bCs/>
+          <w:sz w:val="24"/>
+          <w:szCs w:val="24"/>
+          <w:lang w:eastAsia="it-IT"/>
+        </w:rPr>
+        <w:t xml:space="preserve"> </w:t>
       </w:r>
       <w:r>
         <w:rPr>
@@ -5611,237 +6038,9 @@
           <w:szCs w:val="24"/>
           <w:lang w:eastAsia="it-IT"/>
         </w:rPr>
-        <w:t>M+393334188263</w:t>
-      </w:r>
-      <w:r>
-        <w:rPr>
-          <w:rFonts w:ascii="Arial" w:eastAsia="Times New Roman" w:hAnsi="Arial" w:cs="Arial"/>
-          <w:color w:val="000000" w:themeColor="text1"/>
-          <w:sz w:val="24"/>
-          <w:szCs w:val="24"/>
-          <w:lang w:eastAsia="it-IT"/>
-        </w:rPr>
-        <w:t xml:space="preserve"> </w:t>
-      </w:r>
-      <w:r>
-        <w:rPr>
-          <w:rFonts w:ascii="Arial" w:eastAsia="Times New Roman" w:hAnsi="Arial" w:cs="Arial"/>
-          <w:b/>
-          <w:bCs/>
-          <w:sz w:val="24"/>
-          <w:szCs w:val="24"/>
-          <w:lang w:eastAsia="it-IT"/>
-        </w:rPr>
-        <w:t xml:space="preserve"> - </w:t>
-      </w:r>
-      <w:r>
-        <w:rPr>
-          <w:rFonts w:ascii="Arial" w:eastAsia="Times New Roman" w:hAnsi="Arial" w:cs="Arial"/>
-          <w:b/>
-          <w:bCs/>
-          <w:sz w:val="24"/>
-          <w:szCs w:val="24"/>
-          <w:u w:val="single"/>
-          <w:lang w:eastAsia="it-IT"/>
-        </w:rPr>
-        <w:t>Imposta il numero Master</w:t>
-      </w:r>
-      <w:r>
-        <w:rPr>
-          <w:rFonts w:ascii="Arial" w:eastAsia="Times New Roman" w:hAnsi="Arial" w:cs="Arial"/>
-          <w:b/>
-          <w:bCs/>
-          <w:sz w:val="24"/>
-          <w:szCs w:val="24"/>
-          <w:lang w:eastAsia="it-IT"/>
-        </w:rPr>
-        <w:t xml:space="preserve"> </w:t>
-      </w:r>
-    </w:p>
-    <w:p>
-      <w:pPr>
-        <w:spacing w:after="0" w:line="330" w:lineRule="atLeast"/>
-        <w:rPr>
-          <w:rFonts w:ascii="Arial" w:eastAsia="Times New Roman" w:hAnsi="Arial" w:cs="Arial"/>
-          <w:sz w:val="24"/>
-          <w:szCs w:val="24"/>
-          <w:lang w:eastAsia="it-IT"/>
-        </w:rPr>
-      </w:pPr>
-      <w:r>
-        <w:rPr>
-          <w:rFonts w:ascii="Arial" w:eastAsia="Times New Roman" w:hAnsi="Arial" w:cs="Arial"/>
-          <w:b/>
-          <w:bCs/>
-          <w:sz w:val="24"/>
-          <w:szCs w:val="24"/>
-          <w:lang w:eastAsia="it-IT"/>
-        </w:rPr>
-        <w:tab/>
-      </w:r>
-      <w:r>
-        <w:rPr>
-          <w:rFonts w:ascii="Arial" w:eastAsia="Times New Roman" w:hAnsi="Arial" w:cs="Arial"/>
-          <w:sz w:val="24"/>
-          <w:szCs w:val="24"/>
-          <w:lang w:eastAsia="it-IT"/>
-        </w:rPr>
-        <w:t>Inserisce</w:t>
-      </w:r>
-      <w:r>
-        <w:rPr>
-          <w:rFonts w:ascii="Arial" w:eastAsia="Times New Roman" w:hAnsi="Arial" w:cs="Arial"/>
-          <w:sz w:val="24"/>
-          <w:szCs w:val="24"/>
-          <w:lang w:eastAsia="it-IT"/>
-        </w:rPr>
-        <w:t xml:space="preserve"> solo il MASTER</w:t>
-      </w:r>
-    </w:p>
-    <w:p>
-      <w:pPr>
-        <w:spacing w:after="0" w:line="330" w:lineRule="atLeast"/>
-        <w:rPr>
-          <w:rFonts w:ascii="Arial" w:eastAsia="Times New Roman" w:hAnsi="Arial" w:cs="Arial"/>
-          <w:b/>
-          <w:bCs/>
-          <w:sz w:val="24"/>
-          <w:szCs w:val="24"/>
-          <w:lang w:eastAsia="it-IT"/>
-        </w:rPr>
-      </w:pPr>
-      <w:r>
-        <w:rPr>
-          <w:rFonts w:ascii="Arial" w:eastAsia="Times New Roman" w:hAnsi="Arial" w:cs="Arial"/>
-          <w:b/>
-          <w:bCs/>
-          <w:sz w:val="24"/>
-          <w:szCs w:val="24"/>
-          <w:lang w:eastAsia="it-IT"/>
-        </w:rPr>
-        <w:t>2.1</w:t>
-      </w:r>
-      <w:r>
-        <w:rPr>
-          <w:rFonts w:ascii="Arial" w:eastAsia="Times New Roman" w:hAnsi="Arial" w:cs="Arial"/>
-          <w:b/>
-          <w:bCs/>
-          <w:sz w:val="24"/>
-          <w:szCs w:val="24"/>
-          <w:lang w:eastAsia="it-IT"/>
-        </w:rPr>
-        <w:tab/>
-      </w:r>
-      <w:r>
-        <w:rPr>
-          <w:rFonts w:ascii="Arial" w:eastAsia="Times New Roman" w:hAnsi="Arial" w:cs="Arial"/>
-          <w:b/>
-          <w:bCs/>
-          <w:sz w:val="24"/>
-          <w:szCs w:val="24"/>
-          <w:lang w:eastAsia="it-IT"/>
-        </w:rPr>
-        <w:t xml:space="preserve">Comando </w:t>
-      </w:r>
-      <w:r>
-        <w:rPr>
-          <w:rFonts w:ascii="Arial" w:eastAsia="Times New Roman" w:hAnsi="Arial" w:cs="Arial"/>
-          <w:b/>
-          <w:bCs/>
-          <w:sz w:val="24"/>
-          <w:szCs w:val="24"/>
-          <w:lang w:eastAsia="it-IT"/>
-        </w:rPr>
-        <w:t xml:space="preserve">N - </w:t>
-      </w:r>
-      <w:r>
-        <w:rPr>
-          <w:rFonts w:ascii="Arial" w:eastAsia="Times New Roman" w:hAnsi="Arial" w:cs="Arial"/>
-          <w:b/>
-          <w:bCs/>
-          <w:sz w:val="24"/>
-          <w:szCs w:val="24"/>
-          <w:lang w:eastAsia="it-IT"/>
-        </w:rPr>
-        <w:t>Ritorna i numeri autorizzati</w:t>
-      </w:r>
-    </w:p>
-    <w:p>
-      <w:pPr>
-        <w:spacing w:after="0" w:line="330" w:lineRule="atLeast"/>
-        <w:rPr>
-          <w:rFonts w:ascii="Arial" w:eastAsia="Times New Roman" w:hAnsi="Arial" w:cs="Arial"/>
-          <w:sz w:val="24"/>
-          <w:szCs w:val="24"/>
-          <w:lang w:eastAsia="it-IT"/>
-        </w:rPr>
-      </w:pPr>
-      <w:r>
-        <w:rPr>
-          <w:rFonts w:ascii="Arial" w:eastAsia="Times New Roman" w:hAnsi="Arial" w:cs="Arial"/>
-          <w:b/>
-          <w:bCs/>
-          <w:sz w:val="24"/>
-          <w:szCs w:val="24"/>
-          <w:lang w:eastAsia="it-IT"/>
-        </w:rPr>
-        <w:tab/>
-      </w:r>
-      <w:r>
-        <w:rPr>
-          <w:rFonts w:ascii="Arial" w:eastAsia="Times New Roman" w:hAnsi="Arial" w:cs="Arial"/>
-          <w:sz w:val="24"/>
-          <w:szCs w:val="24"/>
-          <w:lang w:eastAsia="it-IT"/>
-        </w:rPr>
-        <w:t>Presente solo il MASTER</w:t>
-      </w:r>
-    </w:p>
-    <w:p>
-      <w:pPr>
-        <w:spacing w:after="0" w:line="330" w:lineRule="atLeast"/>
-        <w:rPr>
-          <w:rFonts w:ascii="Arial" w:eastAsia="Times New Roman" w:hAnsi="Arial" w:cs="Arial"/>
-          <w:b/>
-          <w:bCs/>
-          <w:sz w:val="24"/>
-          <w:szCs w:val="24"/>
-          <w:lang w:eastAsia="it-IT"/>
-        </w:rPr>
-      </w:pPr>
-      <w:r>
-        <w:rPr>
-          <w:rFonts w:ascii="Arial" w:eastAsia="Times New Roman" w:hAnsi="Arial" w:cs="Arial"/>
-          <w:b/>
-          <w:bCs/>
-          <w:sz w:val="24"/>
-          <w:szCs w:val="24"/>
-          <w:lang w:eastAsia="it-IT"/>
-        </w:rPr>
-        <w:t>2.2</w:t>
-      </w:r>
-      <w:r>
-        <w:rPr>
-          <w:rFonts w:ascii="Arial" w:eastAsia="Times New Roman" w:hAnsi="Arial" w:cs="Arial"/>
-          <w:b/>
-          <w:bCs/>
-          <w:sz w:val="24"/>
-          <w:szCs w:val="24"/>
-          <w:lang w:eastAsia="it-IT"/>
-        </w:rPr>
-        <w:tab/>
-      </w:r>
-      <w:r>
-        <w:rPr>
-          <w:rFonts w:ascii="Arial" w:eastAsia="Times New Roman" w:hAnsi="Arial" w:cs="Arial"/>
-          <w:b/>
-          <w:bCs/>
-          <w:sz w:val="24"/>
-          <w:szCs w:val="24"/>
-          <w:lang w:eastAsia="it-IT"/>
-        </w:rPr>
-        <w:t xml:space="preserve">Comando </w:t>
-      </w:r>
+        <w:t>M+</w:t>
+      </w:r>
+      <w:proofErr w:type="gramStart"/>
       <w:r>
         <w:rPr>
           <w:rFonts w:ascii="Arial" w:eastAsia="Times New Roman" w:hAnsi="Arial" w:cs="Arial"/>
@@ -5854,7 +6053,248 @@
           <w:szCs w:val="24"/>
           <w:lang w:eastAsia="it-IT"/>
         </w:rPr>
-        <w:t>A1</w:t>
+        <w:t>393334188263</w:t>
+      </w:r>
+      <w:r>
+        <w:rPr>
+          <w:rFonts w:ascii="Arial" w:eastAsia="Times New Roman" w:hAnsi="Arial" w:cs="Arial"/>
+          <w:color w:val="000000" w:themeColor="text1"/>
+          <w:sz w:val="24"/>
+          <w:szCs w:val="24"/>
+          <w:lang w:eastAsia="it-IT"/>
+        </w:rPr>
+        <w:t xml:space="preserve"> </w:t>
+      </w:r>
+      <w:r>
+        <w:rPr>
+          <w:rFonts w:ascii="Arial" w:eastAsia="Times New Roman" w:hAnsi="Arial" w:cs="Arial"/>
+          <w:b/>
+          <w:bCs/>
+          <w:sz w:val="24"/>
+          <w:szCs w:val="24"/>
+          <w:lang w:eastAsia="it-IT"/>
+        </w:rPr>
+        <w:t xml:space="preserve"> -</w:t>
+      </w:r>
+      <w:proofErr w:type="gramEnd"/>
+      <w:r>
+        <w:rPr>
+          <w:rFonts w:ascii="Arial" w:eastAsia="Times New Roman" w:hAnsi="Arial" w:cs="Arial"/>
+          <w:b/>
+          <w:bCs/>
+          <w:sz w:val="24"/>
+          <w:szCs w:val="24"/>
+          <w:lang w:eastAsia="it-IT"/>
+        </w:rPr>
+        <w:t xml:space="preserve"> </w:t>
+      </w:r>
+      <w:r>
+        <w:rPr>
+          <w:rFonts w:ascii="Arial" w:eastAsia="Times New Roman" w:hAnsi="Arial" w:cs="Arial"/>
+          <w:b/>
+          <w:bCs/>
+          <w:sz w:val="24"/>
+          <w:szCs w:val="24"/>
+          <w:u w:val="single"/>
+          <w:lang w:eastAsia="it-IT"/>
+        </w:rPr>
+        <w:t>Imposta il numero Master</w:t>
+      </w:r>
+      <w:r>
+        <w:rPr>
+          <w:rFonts w:ascii="Arial" w:eastAsia="Times New Roman" w:hAnsi="Arial" w:cs="Arial"/>
+          <w:b/>
+          <w:bCs/>
+          <w:sz w:val="24"/>
+          <w:szCs w:val="24"/>
+          <w:lang w:eastAsia="it-IT"/>
+        </w:rPr>
+        <w:t xml:space="preserve"> </w:t>
+      </w:r>
+    </w:p>
+    <w:p>
+      <w:pPr>
+        <w:spacing w:after="0" w:line="330" w:lineRule="atLeast"/>
+        <w:rPr>
+          <w:rFonts w:ascii="Arial" w:eastAsia="Times New Roman" w:hAnsi="Arial" w:cs="Arial"/>
+          <w:sz w:val="24"/>
+          <w:szCs w:val="24"/>
+          <w:lang w:eastAsia="it-IT"/>
+        </w:rPr>
+      </w:pPr>
+      <w:r>
+        <w:rPr>
+          <w:rFonts w:ascii="Arial" w:eastAsia="Times New Roman" w:hAnsi="Arial" w:cs="Arial"/>
+          <w:b/>
+          <w:bCs/>
+          <w:sz w:val="24"/>
+          <w:szCs w:val="24"/>
+          <w:lang w:eastAsia="it-IT"/>
+        </w:rPr>
+        <w:tab/>
+      </w:r>
+      <w:r>
+        <w:rPr>
+          <w:rFonts w:ascii="Arial" w:eastAsia="Times New Roman" w:hAnsi="Arial" w:cs="Arial"/>
+          <w:sz w:val="24"/>
+          <w:szCs w:val="24"/>
+          <w:lang w:eastAsia="it-IT"/>
+        </w:rPr>
+        <w:t>Inserisce</w:t>
+      </w:r>
+      <w:r>
+        <w:rPr>
+          <w:rFonts w:ascii="Arial" w:eastAsia="Times New Roman" w:hAnsi="Arial" w:cs="Arial"/>
+          <w:sz w:val="24"/>
+          <w:szCs w:val="24"/>
+          <w:lang w:eastAsia="it-IT"/>
+        </w:rPr>
+        <w:t xml:space="preserve"> solo il MASTER</w:t>
+      </w:r>
+    </w:p>
+    <w:p>
+      <w:pPr>
+        <w:spacing w:after="0" w:line="330" w:lineRule="atLeast"/>
+        <w:rPr>
+          <w:rFonts w:ascii="Arial" w:eastAsia="Times New Roman" w:hAnsi="Arial" w:cs="Arial"/>
+          <w:b/>
+          <w:bCs/>
+          <w:sz w:val="24"/>
+          <w:szCs w:val="24"/>
+          <w:lang w:eastAsia="it-IT"/>
+        </w:rPr>
+      </w:pPr>
+      <w:r>
+        <w:rPr>
+          <w:rFonts w:ascii="Arial" w:eastAsia="Times New Roman" w:hAnsi="Arial" w:cs="Arial"/>
+          <w:b/>
+          <w:bCs/>
+          <w:sz w:val="24"/>
+          <w:szCs w:val="24"/>
+          <w:lang w:eastAsia="it-IT"/>
+        </w:rPr>
+        <w:t>2.1</w:t>
+      </w:r>
+      <w:r>
+        <w:rPr>
+          <w:rFonts w:ascii="Arial" w:eastAsia="Times New Roman" w:hAnsi="Arial" w:cs="Arial"/>
+          <w:b/>
+          <w:bCs/>
+          <w:sz w:val="24"/>
+          <w:szCs w:val="24"/>
+          <w:lang w:eastAsia="it-IT"/>
+        </w:rPr>
+        <w:tab/>
+      </w:r>
+      <w:r>
+        <w:rPr>
+          <w:rFonts w:ascii="Arial" w:eastAsia="Times New Roman" w:hAnsi="Arial" w:cs="Arial"/>
+          <w:b/>
+          <w:bCs/>
+          <w:sz w:val="24"/>
+          <w:szCs w:val="24"/>
+          <w:lang w:eastAsia="it-IT"/>
+        </w:rPr>
+        <w:t xml:space="preserve">Comando </w:t>
+      </w:r>
+      <w:r>
+        <w:rPr>
+          <w:rFonts w:ascii="Arial" w:eastAsia="Times New Roman" w:hAnsi="Arial" w:cs="Arial"/>
+          <w:b/>
+          <w:bCs/>
+          <w:sz w:val="24"/>
+          <w:szCs w:val="24"/>
+          <w:lang w:eastAsia="it-IT"/>
+        </w:rPr>
+        <w:t xml:space="preserve">N - </w:t>
+      </w:r>
+      <w:r>
+        <w:rPr>
+          <w:rFonts w:ascii="Arial" w:eastAsia="Times New Roman" w:hAnsi="Arial" w:cs="Arial"/>
+          <w:b/>
+          <w:bCs/>
+          <w:sz w:val="24"/>
+          <w:szCs w:val="24"/>
+          <w:lang w:eastAsia="it-IT"/>
+        </w:rPr>
+        <w:t>Ritorna i numeri autorizzati</w:t>
+      </w:r>
+    </w:p>
+    <w:p>
+      <w:pPr>
+        <w:spacing w:after="0" w:line="330" w:lineRule="atLeast"/>
+        <w:rPr>
+          <w:rFonts w:ascii="Arial" w:eastAsia="Times New Roman" w:hAnsi="Arial" w:cs="Arial"/>
+          <w:sz w:val="24"/>
+          <w:szCs w:val="24"/>
+          <w:lang w:eastAsia="it-IT"/>
+        </w:rPr>
+      </w:pPr>
+      <w:r>
+        <w:rPr>
+          <w:rFonts w:ascii="Arial" w:eastAsia="Times New Roman" w:hAnsi="Arial" w:cs="Arial"/>
+          <w:b/>
+          <w:bCs/>
+          <w:sz w:val="24"/>
+          <w:szCs w:val="24"/>
+          <w:lang w:eastAsia="it-IT"/>
+        </w:rPr>
+        <w:tab/>
+      </w:r>
+      <w:r>
+        <w:rPr>
+          <w:rFonts w:ascii="Arial" w:eastAsia="Times New Roman" w:hAnsi="Arial" w:cs="Arial"/>
+          <w:sz w:val="24"/>
+          <w:szCs w:val="24"/>
+          <w:lang w:eastAsia="it-IT"/>
+        </w:rPr>
+        <w:t>Presente solo il MASTER</w:t>
+      </w:r>
+    </w:p>
+    <w:p>
+      <w:pPr>
+        <w:spacing w:after="0" w:line="330" w:lineRule="atLeast"/>
+        <w:rPr>
+          <w:rFonts w:ascii="Arial" w:eastAsia="Times New Roman" w:hAnsi="Arial" w:cs="Arial"/>
+          <w:b/>
+          <w:bCs/>
+          <w:sz w:val="24"/>
+          <w:szCs w:val="24"/>
+          <w:lang w:eastAsia="it-IT"/>
+        </w:rPr>
+      </w:pPr>
+      <w:r>
+        <w:rPr>
+          <w:rFonts w:ascii="Arial" w:eastAsia="Times New Roman" w:hAnsi="Arial" w:cs="Arial"/>
+          <w:b/>
+          <w:bCs/>
+          <w:sz w:val="24"/>
+          <w:szCs w:val="24"/>
+          <w:lang w:eastAsia="it-IT"/>
+        </w:rPr>
+        <w:t>2.2</w:t>
+      </w:r>
+      <w:r>
+        <w:rPr>
+          <w:rFonts w:ascii="Arial" w:eastAsia="Times New Roman" w:hAnsi="Arial" w:cs="Arial"/>
+          <w:b/>
+          <w:bCs/>
+          <w:sz w:val="24"/>
+          <w:szCs w:val="24"/>
+          <w:lang w:eastAsia="it-IT"/>
+        </w:rPr>
+        <w:tab/>
+      </w:r>
+      <w:r>
+        <w:rPr>
+          <w:rFonts w:ascii="Arial" w:eastAsia="Times New Roman" w:hAnsi="Arial" w:cs="Arial"/>
+          <w:b/>
+          <w:bCs/>
+          <w:sz w:val="24"/>
+          <w:szCs w:val="24"/>
+          <w:lang w:eastAsia="it-IT"/>
+        </w:rPr>
+        <w:t xml:space="preserve">Comando </w:t>
       </w:r>
       <w:r>
         <w:rPr>
@@ -5868,259 +6308,7 @@
           <w:szCs w:val="24"/>
           <w:lang w:eastAsia="it-IT"/>
         </w:rPr>
-        <w:t>+393334188263</w:t>
-      </w:r>
-      <w:r>
-        <w:rPr>
-          <w:rFonts w:ascii="Arial" w:eastAsia="Times New Roman" w:hAnsi="Arial" w:cs="Arial"/>
-          <w:color w:val="000000" w:themeColor="text1"/>
-          <w:sz w:val="24"/>
-          <w:szCs w:val="24"/>
-          <w:lang w:eastAsia="it-IT"/>
-        </w:rPr>
-        <w:t xml:space="preserve"> </w:t>
-      </w:r>
-      <w:r>
-        <w:rPr>
-          <w:rFonts w:ascii="Arial" w:eastAsia="Times New Roman" w:hAnsi="Arial" w:cs="Arial"/>
-          <w:b/>
-          <w:bCs/>
-          <w:sz w:val="24"/>
-          <w:szCs w:val="24"/>
-          <w:lang w:eastAsia="it-IT"/>
-        </w:rPr>
-        <w:t xml:space="preserve"> - </w:t>
-      </w:r>
-      <w:r>
-        <w:rPr>
-          <w:rFonts w:ascii="Arial" w:eastAsia="Times New Roman" w:hAnsi="Arial" w:cs="Arial"/>
-          <w:b/>
-          <w:bCs/>
-          <w:sz w:val="24"/>
-          <w:szCs w:val="24"/>
-          <w:u w:val="single"/>
-          <w:lang w:eastAsia="it-IT"/>
-        </w:rPr>
-        <w:t xml:space="preserve">Imposta il </w:t>
-      </w:r>
-      <w:r>
-        <w:rPr>
-          <w:rFonts w:ascii="Arial" w:eastAsia="Times New Roman" w:hAnsi="Arial" w:cs="Arial"/>
-          <w:b/>
-          <w:bCs/>
-          <w:sz w:val="24"/>
-          <w:szCs w:val="24"/>
-          <w:u w:val="single"/>
-          <w:lang w:eastAsia="it-IT"/>
-        </w:rPr>
-        <w:t>primo numero Ausiliario</w:t>
-      </w:r>
-      <w:r>
-        <w:rPr>
-          <w:rFonts w:ascii="Arial" w:eastAsia="Times New Roman" w:hAnsi="Arial" w:cs="Arial"/>
-          <w:b/>
-          <w:bCs/>
-          <w:sz w:val="24"/>
-          <w:szCs w:val="24"/>
-          <w:lang w:eastAsia="it-IT"/>
-        </w:rPr>
-        <w:t xml:space="preserve"> </w:t>
-      </w:r>
-    </w:p>
-    <w:p>
-      <w:pPr>
-        <w:spacing w:after="0" w:line="330" w:lineRule="atLeast"/>
-        <w:rPr>
-          <w:rFonts w:ascii="Arial" w:eastAsia="Times New Roman" w:hAnsi="Arial" w:cs="Arial"/>
-          <w:sz w:val="24"/>
-          <w:szCs w:val="24"/>
-          <w:lang w:eastAsia="it-IT"/>
-        </w:rPr>
-      </w:pPr>
-      <w:r>
-        <w:rPr>
-          <w:rFonts w:ascii="Arial" w:eastAsia="Times New Roman" w:hAnsi="Arial" w:cs="Arial"/>
-          <w:b/>
-          <w:bCs/>
-          <w:sz w:val="24"/>
-          <w:szCs w:val="24"/>
-          <w:lang w:eastAsia="it-IT"/>
-        </w:rPr>
-        <w:tab/>
-      </w:r>
-      <w:r>
-        <w:rPr>
-          <w:rFonts w:ascii="Arial" w:eastAsia="Times New Roman" w:hAnsi="Arial" w:cs="Arial"/>
-          <w:sz w:val="24"/>
-          <w:szCs w:val="24"/>
-          <w:lang w:eastAsia="it-IT"/>
-        </w:rPr>
-        <w:t>Inserisce l’Ausiliario 1</w:t>
-      </w:r>
-    </w:p>
-    <w:p>
-      <w:pPr>
-        <w:spacing w:after="0" w:line="330" w:lineRule="atLeast"/>
-        <w:rPr>
-          <w:rFonts w:ascii="Arial" w:eastAsia="Times New Roman" w:hAnsi="Arial" w:cs="Arial"/>
-          <w:b/>
-          <w:bCs/>
-          <w:sz w:val="24"/>
-          <w:szCs w:val="24"/>
-          <w:lang w:eastAsia="it-IT"/>
-        </w:rPr>
-      </w:pPr>
-      <w:r>
-        <w:rPr>
-          <w:rFonts w:ascii="Arial" w:eastAsia="Times New Roman" w:hAnsi="Arial" w:cs="Arial"/>
-          <w:b/>
-          <w:bCs/>
-          <w:sz w:val="24"/>
-          <w:szCs w:val="24"/>
-          <w:lang w:eastAsia="it-IT"/>
-        </w:rPr>
-        <w:t>2.</w:t>
-      </w:r>
-      <w:r>
-        <w:rPr>
-          <w:rFonts w:ascii="Arial" w:eastAsia="Times New Roman" w:hAnsi="Arial" w:cs="Arial"/>
-          <w:b/>
-          <w:bCs/>
-          <w:sz w:val="24"/>
-          <w:szCs w:val="24"/>
-          <w:lang w:eastAsia="it-IT"/>
-        </w:rPr>
-        <w:t>3</w:t>
-      </w:r>
-      <w:r>
-        <w:rPr>
-          <w:rFonts w:ascii="Arial" w:eastAsia="Times New Roman" w:hAnsi="Arial" w:cs="Arial"/>
-          <w:b/>
-          <w:bCs/>
-          <w:sz w:val="24"/>
-          <w:szCs w:val="24"/>
-          <w:lang w:eastAsia="it-IT"/>
-        </w:rPr>
-        <w:tab/>
-      </w:r>
-      <w:r>
-        <w:rPr>
-          <w:rFonts w:ascii="Arial" w:eastAsia="Times New Roman" w:hAnsi="Arial" w:cs="Arial"/>
-          <w:b/>
-          <w:bCs/>
-          <w:sz w:val="24"/>
-          <w:szCs w:val="24"/>
-          <w:lang w:eastAsia="it-IT"/>
-        </w:rPr>
-        <w:t xml:space="preserve">Comando </w:t>
-      </w:r>
-      <w:r>
-        <w:rPr>
-          <w:rFonts w:ascii="Arial" w:eastAsia="Times New Roman" w:hAnsi="Arial" w:cs="Arial"/>
-          <w:b/>
-          <w:bCs/>
-          <w:sz w:val="24"/>
-          <w:szCs w:val="24"/>
-          <w:lang w:eastAsia="it-IT"/>
-        </w:rPr>
-        <w:t xml:space="preserve">N - </w:t>
-      </w:r>
-      <w:r>
-        <w:rPr>
-          <w:rFonts w:ascii="Arial" w:eastAsia="Times New Roman" w:hAnsi="Arial" w:cs="Arial"/>
-          <w:b/>
-          <w:bCs/>
-          <w:sz w:val="24"/>
-          <w:szCs w:val="24"/>
-          <w:lang w:eastAsia="it-IT"/>
-        </w:rPr>
-        <w:t>Ritorna i numeri autorizzati</w:t>
-      </w:r>
-    </w:p>
-    <w:p>
-      <w:pPr>
-        <w:spacing w:after="0" w:line="330" w:lineRule="atLeast"/>
-        <w:rPr>
-          <w:rFonts w:ascii="Arial" w:eastAsia="Times New Roman" w:hAnsi="Arial" w:cs="Arial"/>
-          <w:sz w:val="24"/>
-          <w:szCs w:val="24"/>
-          <w:lang w:eastAsia="it-IT"/>
-        </w:rPr>
-      </w:pPr>
-      <w:r>
-        <w:rPr>
-          <w:rFonts w:ascii="Arial" w:eastAsia="Times New Roman" w:hAnsi="Arial" w:cs="Arial"/>
-          <w:b/>
-          <w:bCs/>
-          <w:sz w:val="24"/>
-          <w:szCs w:val="24"/>
-          <w:lang w:eastAsia="it-IT"/>
-        </w:rPr>
-        <w:tab/>
-      </w:r>
-      <w:r>
-        <w:rPr>
-          <w:rFonts w:ascii="Arial" w:eastAsia="Times New Roman" w:hAnsi="Arial" w:cs="Arial"/>
-          <w:sz w:val="24"/>
-          <w:szCs w:val="24"/>
-          <w:lang w:eastAsia="it-IT"/>
-        </w:rPr>
-        <w:t>Presente il MASTER</w:t>
-      </w:r>
-      <w:r>
-        <w:rPr>
-          <w:rFonts w:ascii="Arial" w:eastAsia="Times New Roman" w:hAnsi="Arial" w:cs="Arial"/>
-          <w:sz w:val="24"/>
-          <w:szCs w:val="24"/>
-          <w:lang w:eastAsia="it-IT"/>
-        </w:rPr>
-        <w:t xml:space="preserve"> e l’Ausiliario 1</w:t>
-      </w:r>
-    </w:p>
-    <w:p>
-      <w:pPr>
-        <w:spacing w:after="0" w:line="330" w:lineRule="atLeast"/>
-        <w:rPr>
-          <w:rFonts w:ascii="Arial" w:eastAsia="Times New Roman" w:hAnsi="Arial" w:cs="Arial"/>
-          <w:b/>
-          <w:bCs/>
-          <w:sz w:val="24"/>
-          <w:szCs w:val="24"/>
-          <w:lang w:eastAsia="it-IT"/>
-        </w:rPr>
-      </w:pPr>
-      <w:r>
-        <w:rPr>
-          <w:rFonts w:ascii="Arial" w:eastAsia="Times New Roman" w:hAnsi="Arial" w:cs="Arial"/>
-          <w:b/>
-          <w:bCs/>
-          <w:sz w:val="24"/>
-          <w:szCs w:val="24"/>
-          <w:lang w:eastAsia="it-IT"/>
-        </w:rPr>
-        <w:t>2.4</w:t>
-      </w:r>
-      <w:r>
-        <w:rPr>
-          <w:rFonts w:ascii="Arial" w:eastAsia="Times New Roman" w:hAnsi="Arial" w:cs="Arial"/>
-          <w:b/>
-          <w:bCs/>
-          <w:sz w:val="24"/>
-          <w:szCs w:val="24"/>
-          <w:lang w:eastAsia="it-IT"/>
-        </w:rPr>
-        <w:tab/>
-      </w:r>
-      <w:r>
-        <w:rPr>
-          <w:rFonts w:ascii="Arial" w:eastAsia="Times New Roman" w:hAnsi="Arial" w:cs="Arial"/>
-          <w:b/>
-          <w:bCs/>
-          <w:sz w:val="24"/>
-          <w:szCs w:val="24"/>
-          <w:lang w:eastAsia="it-IT"/>
-        </w:rPr>
-        <w:t xml:space="preserve">Comando </w:t>
+        <w:t>A1</w:t>
       </w:r>
       <w:r>
         <w:rPr>
@@ -6134,8 +6322,9 @@
           <w:szCs w:val="24"/>
           <w:lang w:eastAsia="it-IT"/>
         </w:rPr>
-        <w:t>A2</w:t>
-      </w:r>
+        <w:t>+</w:t>
+      </w:r>
+      <w:proofErr w:type="gramStart"/>
       <w:r>
         <w:rPr>
           <w:rFonts w:ascii="Arial" w:eastAsia="Times New Roman" w:hAnsi="Arial" w:cs="Arial"/>
@@ -6148,7 +6337,7 @@
           <w:szCs w:val="24"/>
           <w:lang w:eastAsia="it-IT"/>
         </w:rPr>
-        <w:t>+393334188263</w:t>
+        <w:t>393334188263</w:t>
       </w:r>
       <w:r>
         <w:rPr>
@@ -6169,7 +6358,19 @@
           <w:szCs w:val="24"/>
           <w:lang w:eastAsia="it-IT"/>
         </w:rPr>
-        <w:t xml:space="preserve"> - </w:t>
+        <w:t xml:space="preserve"> -</w:t>
+      </w:r>
+      <w:proofErr w:type="gramEnd"/>
+      <w:r>
+        <w:rPr>
+          <w:rFonts w:ascii="Arial" w:eastAsia="Times New Roman" w:hAnsi="Arial" w:cs="Arial"/>
+          <w:b/>
+          <w:bCs/>
+          <w:sz w:val="24"/>
+          <w:szCs w:val="24"/>
+          <w:lang w:eastAsia="it-IT"/>
+        </w:rPr>
+        <w:t xml:space="preserve"> </w:t>
       </w:r>
       <w:r>
         <w:rPr>
@@ -6193,7 +6394,7 @@
           <w:u w:val="single"/>
           <w:lang w:eastAsia="it-IT"/>
         </w:rPr>
-        <w:t>secondo numero Ausiliario</w:t>
+        <w:t>primo numero Ausiliario</w:t>
       </w:r>
       <w:r>
         <w:rPr>
@@ -6235,16 +6436,7 @@
           <w:szCs w:val="24"/>
           <w:lang w:eastAsia="it-IT"/>
         </w:rPr>
-        <w:t xml:space="preserve">Inserisce l’Ausiliario </w:t>
-      </w:r>
-      <w:r>
-        <w:rPr>
-          <w:rFonts w:ascii="Arial" w:eastAsia="Times New Roman" w:hAnsi="Arial" w:cs="Arial"/>
-          <w:sz w:val="24"/>
-          <w:szCs w:val="24"/>
-          <w:lang w:eastAsia="it-IT"/>
-        </w:rPr>
-        <w:t>2</w:t>
+        <w:t>Inserisce l’Ausiliario 1</w:t>
       </w:r>
     </w:p>
     <w:p>
@@ -6279,7 +6471,7 @@
           <w:szCs w:val="24"/>
           <w:lang w:eastAsia="it-IT"/>
         </w:rPr>
-        <w:t>5</w:t>
+        <w:t>3</w:t>
       </w:r>
       <w:r>
         <w:rPr>
@@ -6363,25 +6555,7 @@
           <w:szCs w:val="24"/>
           <w:lang w:eastAsia="it-IT"/>
         </w:rPr>
-        <w:t xml:space="preserve"> e gl</w:t>
-      </w:r>
-      <w:r>
-        <w:rPr>
-          <w:rFonts w:ascii="Arial" w:eastAsia="Times New Roman" w:hAnsi="Arial" w:cs="Arial"/>
-          <w:sz w:val="24"/>
-          <w:szCs w:val="24"/>
-          <w:lang w:eastAsia="it-IT"/>
-        </w:rPr>
-        <w:t xml:space="preserve">i </w:t>
-      </w:r>
-      <w:r>
-        <w:rPr>
-          <w:rFonts w:ascii="Arial" w:eastAsia="Times New Roman" w:hAnsi="Arial" w:cs="Arial"/>
-          <w:sz w:val="24"/>
-          <w:szCs w:val="24"/>
-          <w:lang w:eastAsia="it-IT"/>
-        </w:rPr>
-        <w:t>Ausiliari 1 e 2</w:t>
+        <w:t xml:space="preserve"> e l’Ausiliario 1</w:t>
       </w:r>
     </w:p>
     <w:p>
@@ -6405,18 +6579,7 @@
           <w:szCs w:val="24"/>
           <w:lang w:eastAsia="it-IT"/>
         </w:rPr>
-        <w:t>2.</w:t>
-      </w:r>
-      <w:r>
-        <w:rPr>
-          <w:rFonts w:ascii="Arial" w:eastAsia="Times New Roman" w:hAnsi="Arial" w:cs="Arial"/>
-          <w:b/>
-          <w:bCs/>
-          <w:sz w:val="24"/>
-          <w:szCs w:val="24"/>
-          <w:lang w:eastAsia="it-IT"/>
-        </w:rPr>
-        <w:t>6</w:t>
+        <w:t>2.4</w:t>
       </w:r>
       <w:r>
         <w:rPr>
@@ -6452,7 +6615,7 @@
           <w:szCs w:val="24"/>
           <w:lang w:eastAsia="it-IT"/>
         </w:rPr>
-        <w:t>A3</w:t>
+        <w:t>A2</w:t>
       </w:r>
       <w:r>
         <w:rPr>
@@ -6466,7 +6629,22 @@
           <w:szCs w:val="24"/>
           <w:lang w:eastAsia="it-IT"/>
         </w:rPr>
-        <w:t>+393334188263</w:t>
+        <w:t>+</w:t>
+      </w:r>
+      <w:proofErr w:type="gramStart"/>
+      <w:r>
+        <w:rPr>
+          <w:rFonts w:ascii="Arial" w:eastAsia="Times New Roman" w:hAnsi="Arial" w:cs="Arial"/>
+          <w:b/>
+          <w:bCs/>
+          <w:i/>
+          <w:iCs/>
+          <w:color w:val="000000" w:themeColor="text1"/>
+          <w:sz w:val="24"/>
+          <w:szCs w:val="24"/>
+          <w:lang w:eastAsia="it-IT"/>
+        </w:rPr>
+        <w:t>393334188263</w:t>
       </w:r>
       <w:r>
         <w:rPr>
@@ -6487,7 +6665,364 @@
           <w:szCs w:val="24"/>
           <w:lang w:eastAsia="it-IT"/>
         </w:rPr>
-        <w:t xml:space="preserve"> - </w:t>
+        <w:t xml:space="preserve"> -</w:t>
+      </w:r>
+      <w:proofErr w:type="gramEnd"/>
+      <w:r>
+        <w:rPr>
+          <w:rFonts w:ascii="Arial" w:eastAsia="Times New Roman" w:hAnsi="Arial" w:cs="Arial"/>
+          <w:b/>
+          <w:bCs/>
+          <w:sz w:val="24"/>
+          <w:szCs w:val="24"/>
+          <w:lang w:eastAsia="it-IT"/>
+        </w:rPr>
+        <w:t xml:space="preserve"> </w:t>
+      </w:r>
+      <w:r>
+        <w:rPr>
+          <w:rFonts w:ascii="Arial" w:eastAsia="Times New Roman" w:hAnsi="Arial" w:cs="Arial"/>
+          <w:b/>
+          <w:bCs/>
+          <w:sz w:val="24"/>
+          <w:szCs w:val="24"/>
+          <w:u w:val="single"/>
+          <w:lang w:eastAsia="it-IT"/>
+        </w:rPr>
+        <w:t xml:space="preserve">Imposta il </w:t>
+      </w:r>
+      <w:r>
+        <w:rPr>
+          <w:rFonts w:ascii="Arial" w:eastAsia="Times New Roman" w:hAnsi="Arial" w:cs="Arial"/>
+          <w:b/>
+          <w:bCs/>
+          <w:sz w:val="24"/>
+          <w:szCs w:val="24"/>
+          <w:u w:val="single"/>
+          <w:lang w:eastAsia="it-IT"/>
+        </w:rPr>
+        <w:t>secondo numero Ausiliario</w:t>
+      </w:r>
+      <w:r>
+        <w:rPr>
+          <w:rFonts w:ascii="Arial" w:eastAsia="Times New Roman" w:hAnsi="Arial" w:cs="Arial"/>
+          <w:b/>
+          <w:bCs/>
+          <w:sz w:val="24"/>
+          <w:szCs w:val="24"/>
+          <w:lang w:eastAsia="it-IT"/>
+        </w:rPr>
+        <w:t xml:space="preserve"> </w:t>
+      </w:r>
+    </w:p>
+    <w:p>
+      <w:pPr>
+        <w:spacing w:after="0" w:line="330" w:lineRule="atLeast"/>
+        <w:rPr>
+          <w:rFonts w:ascii="Arial" w:eastAsia="Times New Roman" w:hAnsi="Arial" w:cs="Arial"/>
+          <w:sz w:val="24"/>
+          <w:szCs w:val="24"/>
+          <w:lang w:eastAsia="it-IT"/>
+        </w:rPr>
+      </w:pPr>
+      <w:r>
+        <w:rPr>
+          <w:rFonts w:ascii="Arial" w:eastAsia="Times New Roman" w:hAnsi="Arial" w:cs="Arial"/>
+          <w:b/>
+          <w:bCs/>
+          <w:sz w:val="24"/>
+          <w:szCs w:val="24"/>
+          <w:lang w:eastAsia="it-IT"/>
+        </w:rPr>
+        <w:tab/>
+      </w:r>
+      <w:r>
+        <w:rPr>
+          <w:rFonts w:ascii="Arial" w:eastAsia="Times New Roman" w:hAnsi="Arial" w:cs="Arial"/>
+          <w:sz w:val="24"/>
+          <w:szCs w:val="24"/>
+          <w:lang w:eastAsia="it-IT"/>
+        </w:rPr>
+        <w:t xml:space="preserve">Inserisce l’Ausiliario </w:t>
+      </w:r>
+      <w:r>
+        <w:rPr>
+          <w:rFonts w:ascii="Arial" w:eastAsia="Times New Roman" w:hAnsi="Arial" w:cs="Arial"/>
+          <w:sz w:val="24"/>
+          <w:szCs w:val="24"/>
+          <w:lang w:eastAsia="it-IT"/>
+        </w:rPr>
+        <w:t>2</w:t>
+      </w:r>
+    </w:p>
+    <w:p>
+      <w:pPr>
+        <w:spacing w:after="0" w:line="330" w:lineRule="atLeast"/>
+        <w:rPr>
+          <w:rFonts w:ascii="Arial" w:eastAsia="Times New Roman" w:hAnsi="Arial" w:cs="Arial"/>
+          <w:b/>
+          <w:bCs/>
+          <w:sz w:val="24"/>
+          <w:szCs w:val="24"/>
+          <w:lang w:eastAsia="it-IT"/>
+        </w:rPr>
+      </w:pPr>
+      <w:r>
+        <w:rPr>
+          <w:rFonts w:ascii="Arial" w:eastAsia="Times New Roman" w:hAnsi="Arial" w:cs="Arial"/>
+          <w:b/>
+          <w:bCs/>
+          <w:sz w:val="24"/>
+          <w:szCs w:val="24"/>
+          <w:lang w:eastAsia="it-IT"/>
+        </w:rPr>
+        <w:t>2.</w:t>
+      </w:r>
+      <w:r>
+        <w:rPr>
+          <w:rFonts w:ascii="Arial" w:eastAsia="Times New Roman" w:hAnsi="Arial" w:cs="Arial"/>
+          <w:b/>
+          <w:bCs/>
+          <w:sz w:val="24"/>
+          <w:szCs w:val="24"/>
+          <w:lang w:eastAsia="it-IT"/>
+        </w:rPr>
+        <w:t>5</w:t>
+      </w:r>
+      <w:r>
+        <w:rPr>
+          <w:rFonts w:ascii="Arial" w:eastAsia="Times New Roman" w:hAnsi="Arial" w:cs="Arial"/>
+          <w:b/>
+          <w:bCs/>
+          <w:sz w:val="24"/>
+          <w:szCs w:val="24"/>
+          <w:lang w:eastAsia="it-IT"/>
+        </w:rPr>
+        <w:tab/>
+      </w:r>
+      <w:r>
+        <w:rPr>
+          <w:rFonts w:ascii="Arial" w:eastAsia="Times New Roman" w:hAnsi="Arial" w:cs="Arial"/>
+          <w:b/>
+          <w:bCs/>
+          <w:sz w:val="24"/>
+          <w:szCs w:val="24"/>
+          <w:lang w:eastAsia="it-IT"/>
+        </w:rPr>
+        <w:t xml:space="preserve">Comando </w:t>
+      </w:r>
+      <w:r>
+        <w:rPr>
+          <w:rFonts w:ascii="Arial" w:eastAsia="Times New Roman" w:hAnsi="Arial" w:cs="Arial"/>
+          <w:b/>
+          <w:bCs/>
+          <w:sz w:val="24"/>
+          <w:szCs w:val="24"/>
+          <w:lang w:eastAsia="it-IT"/>
+        </w:rPr>
+        <w:t xml:space="preserve">N - </w:t>
+      </w:r>
+      <w:r>
+        <w:rPr>
+          <w:rFonts w:ascii="Arial" w:eastAsia="Times New Roman" w:hAnsi="Arial" w:cs="Arial"/>
+          <w:b/>
+          <w:bCs/>
+          <w:sz w:val="24"/>
+          <w:szCs w:val="24"/>
+          <w:lang w:eastAsia="it-IT"/>
+        </w:rPr>
+        <w:t>Ritorna i numeri autorizzati</w:t>
+      </w:r>
+    </w:p>
+    <w:p>
+      <w:pPr>
+        <w:spacing w:after="0" w:line="330" w:lineRule="atLeast"/>
+        <w:rPr>
+          <w:rFonts w:ascii="Arial" w:eastAsia="Times New Roman" w:hAnsi="Arial" w:cs="Arial"/>
+          <w:sz w:val="24"/>
+          <w:szCs w:val="24"/>
+          <w:lang w:eastAsia="it-IT"/>
+        </w:rPr>
+      </w:pPr>
+      <w:r>
+        <w:rPr>
+          <w:rFonts w:ascii="Arial" w:eastAsia="Times New Roman" w:hAnsi="Arial" w:cs="Arial"/>
+          <w:b/>
+          <w:bCs/>
+          <w:sz w:val="24"/>
+          <w:szCs w:val="24"/>
+          <w:lang w:eastAsia="it-IT"/>
+        </w:rPr>
+        <w:tab/>
+      </w:r>
+      <w:r>
+        <w:rPr>
+          <w:rFonts w:ascii="Arial" w:eastAsia="Times New Roman" w:hAnsi="Arial" w:cs="Arial"/>
+          <w:sz w:val="24"/>
+          <w:szCs w:val="24"/>
+          <w:lang w:eastAsia="it-IT"/>
+        </w:rPr>
+        <w:t>Presente il MASTER</w:t>
+      </w:r>
+      <w:r>
+        <w:rPr>
+          <w:rFonts w:ascii="Arial" w:eastAsia="Times New Roman" w:hAnsi="Arial" w:cs="Arial"/>
+          <w:sz w:val="24"/>
+          <w:szCs w:val="24"/>
+          <w:lang w:eastAsia="it-IT"/>
+        </w:rPr>
+        <w:t xml:space="preserve"> e gl</w:t>
+      </w:r>
+      <w:r>
+        <w:rPr>
+          <w:rFonts w:ascii="Arial" w:eastAsia="Times New Roman" w:hAnsi="Arial" w:cs="Arial"/>
+          <w:sz w:val="24"/>
+          <w:szCs w:val="24"/>
+          <w:lang w:eastAsia="it-IT"/>
+        </w:rPr>
+        <w:t xml:space="preserve">i </w:t>
+      </w:r>
+      <w:r>
+        <w:rPr>
+          <w:rFonts w:ascii="Arial" w:eastAsia="Times New Roman" w:hAnsi="Arial" w:cs="Arial"/>
+          <w:sz w:val="24"/>
+          <w:szCs w:val="24"/>
+          <w:lang w:eastAsia="it-IT"/>
+        </w:rPr>
+        <w:t>Ausiliari 1 e 2</w:t>
+      </w:r>
+    </w:p>
+    <w:p>
+      <w:pPr>
+        <w:spacing w:after="0" w:line="330" w:lineRule="atLeast"/>
+        <w:rPr>
+          <w:rFonts w:ascii="Arial" w:eastAsia="Times New Roman" w:hAnsi="Arial" w:cs="Arial"/>
+          <w:b/>
+          <w:bCs/>
+          <w:sz w:val="24"/>
+          <w:szCs w:val="24"/>
+          <w:lang w:eastAsia="it-IT"/>
+        </w:rPr>
+      </w:pPr>
+      <w:r>
+        <w:rPr>
+          <w:rFonts w:ascii="Arial" w:eastAsia="Times New Roman" w:hAnsi="Arial" w:cs="Arial"/>
+          <w:b/>
+          <w:bCs/>
+          <w:sz w:val="24"/>
+          <w:szCs w:val="24"/>
+          <w:lang w:eastAsia="it-IT"/>
+        </w:rPr>
+        <w:t>2.</w:t>
+      </w:r>
+      <w:r>
+        <w:rPr>
+          <w:rFonts w:ascii="Arial" w:eastAsia="Times New Roman" w:hAnsi="Arial" w:cs="Arial"/>
+          <w:b/>
+          <w:bCs/>
+          <w:sz w:val="24"/>
+          <w:szCs w:val="24"/>
+          <w:lang w:eastAsia="it-IT"/>
+        </w:rPr>
+        <w:t>6</w:t>
+      </w:r>
+      <w:r>
+        <w:rPr>
+          <w:rFonts w:ascii="Arial" w:eastAsia="Times New Roman" w:hAnsi="Arial" w:cs="Arial"/>
+          <w:b/>
+          <w:bCs/>
+          <w:sz w:val="24"/>
+          <w:szCs w:val="24"/>
+          <w:lang w:eastAsia="it-IT"/>
+        </w:rPr>
+        <w:tab/>
+      </w:r>
+      <w:r>
+        <w:rPr>
+          <w:rFonts w:ascii="Arial" w:eastAsia="Times New Roman" w:hAnsi="Arial" w:cs="Arial"/>
+          <w:b/>
+          <w:bCs/>
+          <w:sz w:val="24"/>
+          <w:szCs w:val="24"/>
+          <w:lang w:eastAsia="it-IT"/>
+        </w:rPr>
+        <w:t xml:space="preserve">Comando </w:t>
+      </w:r>
+      <w:r>
+        <w:rPr>
+          <w:rFonts w:ascii="Arial" w:eastAsia="Times New Roman" w:hAnsi="Arial" w:cs="Arial"/>
+          <w:b/>
+          <w:bCs/>
+          <w:i/>
+          <w:iCs/>
+          <w:color w:val="000000" w:themeColor="text1"/>
+          <w:sz w:val="24"/>
+          <w:szCs w:val="24"/>
+          <w:lang w:eastAsia="it-IT"/>
+        </w:rPr>
+        <w:t>A3</w:t>
+      </w:r>
+      <w:r>
+        <w:rPr>
+          <w:rFonts w:ascii="Arial" w:eastAsia="Times New Roman" w:hAnsi="Arial" w:cs="Arial"/>
+          <w:b/>
+          <w:bCs/>
+          <w:i/>
+          <w:iCs/>
+          <w:color w:val="000000" w:themeColor="text1"/>
+          <w:sz w:val="24"/>
+          <w:szCs w:val="24"/>
+          <w:lang w:eastAsia="it-IT"/>
+        </w:rPr>
+        <w:t>+</w:t>
+      </w:r>
+      <w:proofErr w:type="gramStart"/>
+      <w:r>
+        <w:rPr>
+          <w:rFonts w:ascii="Arial" w:eastAsia="Times New Roman" w:hAnsi="Arial" w:cs="Arial"/>
+          <w:b/>
+          <w:bCs/>
+          <w:i/>
+          <w:iCs/>
+          <w:color w:val="000000" w:themeColor="text1"/>
+          <w:sz w:val="24"/>
+          <w:szCs w:val="24"/>
+          <w:lang w:eastAsia="it-IT"/>
+        </w:rPr>
+        <w:t>393334188263</w:t>
+      </w:r>
+      <w:r>
+        <w:rPr>
+          <w:rFonts w:ascii="Arial" w:eastAsia="Times New Roman" w:hAnsi="Arial" w:cs="Arial"/>
+          <w:color w:val="000000" w:themeColor="text1"/>
+          <w:sz w:val="24"/>
+          <w:szCs w:val="24"/>
+          <w:lang w:eastAsia="it-IT"/>
+        </w:rPr>
+        <w:t xml:space="preserve"> </w:t>
+      </w:r>
+      <w:r>
+        <w:rPr>
+          <w:rFonts w:ascii="Arial" w:eastAsia="Times New Roman" w:hAnsi="Arial" w:cs="Arial"/>
+          <w:b/>
+          <w:bCs/>
+          <w:sz w:val="24"/>
+          <w:szCs w:val="24"/>
+          <w:lang w:eastAsia="it-IT"/>
+        </w:rPr>
+        <w:t xml:space="preserve"> -</w:t>
+      </w:r>
+      <w:proofErr w:type="gramEnd"/>
+      <w:r>
+        <w:rPr>
+          <w:rFonts w:ascii="Arial" w:eastAsia="Times New Roman" w:hAnsi="Arial" w:cs="Arial"/>
+          <w:b/>
+          <w:bCs/>
+          <w:sz w:val="24"/>
+          <w:szCs w:val="24"/>
+          <w:lang w:eastAsia="it-IT"/>
+        </w:rPr>
+        <w:t xml:space="preserve"> </w:t>
       </w:r>
       <w:r>
         <w:rPr>
@@ -6874,8 +7409,21 @@
           <w:szCs w:val="24"/>
           <w:lang w:eastAsia="it-IT"/>
         </w:rPr>
-        <w:t>l valore di Tensione + Timestamp</w:t>
-      </w:r>
+        <w:t xml:space="preserve">l valore di Tensione + </w:t>
+      </w:r>
+      <w:proofErr w:type="spellStart"/>
+      <w:r>
+        <w:rPr>
+          <w:rFonts w:ascii="Arial" w:eastAsia="Times New Roman" w:hAnsi="Arial" w:cs="Arial"/>
+          <w:b/>
+          <w:bCs/>
+          <w:sz w:val="24"/>
+          <w:szCs w:val="24"/>
+          <w:lang w:eastAsia="it-IT"/>
+        </w:rPr>
+        <w:t>Timestamp</w:t>
+      </w:r>
+      <w:proofErr w:type="spellEnd"/>
     </w:p>
     <w:p>
       <w:pPr>
@@ -6913,7 +7461,27 @@
           <w:szCs w:val="24"/>
           <w:lang w:eastAsia="it-IT"/>
         </w:rPr>
-        <w:t>il Timestamp + Valore Tensione</w:t>
+        <w:t xml:space="preserve">il </w:t>
+      </w:r>
+      <w:proofErr w:type="spellStart"/>
+      <w:r>
+        <w:rPr>
+          <w:rFonts w:ascii="Arial" w:eastAsia="Times New Roman" w:hAnsi="Arial" w:cs="Arial"/>
+          <w:sz w:val="24"/>
+          <w:szCs w:val="24"/>
+          <w:lang w:eastAsia="it-IT"/>
+        </w:rPr>
+        <w:t>Timestamp</w:t>
+      </w:r>
+      <w:proofErr w:type="spellEnd"/>
+      <w:r>
+        <w:rPr>
+          <w:rFonts w:ascii="Arial" w:eastAsia="Times New Roman" w:hAnsi="Arial" w:cs="Arial"/>
+          <w:sz w:val="24"/>
+          <w:szCs w:val="24"/>
+          <w:lang w:eastAsia="it-IT"/>
+        </w:rPr>
+        <w:t xml:space="preserve"> + Valore Tensione</w:t>
       </w:r>
     </w:p>
     <w:p>
@@ -7014,8 +7582,21 @@
           <w:szCs w:val="24"/>
           <w:lang w:eastAsia="it-IT"/>
         </w:rPr>
-        <w:t>l valore di Tensione + Timestamp</w:t>
-      </w:r>
+        <w:t xml:space="preserve">l valore di Tensione + </w:t>
+      </w:r>
+      <w:proofErr w:type="spellStart"/>
+      <w:r>
+        <w:rPr>
+          <w:rFonts w:ascii="Arial" w:eastAsia="Times New Roman" w:hAnsi="Arial" w:cs="Arial"/>
+          <w:b/>
+          <w:bCs/>
+          <w:sz w:val="24"/>
+          <w:szCs w:val="24"/>
+          <w:lang w:eastAsia="it-IT"/>
+        </w:rPr>
+        <w:t>Timestamp</w:t>
+      </w:r>
+      <w:proofErr w:type="spellEnd"/>
     </w:p>
     <w:p>
       <w:pPr>
@@ -7053,7 +7634,27 @@
           <w:szCs w:val="24"/>
           <w:lang w:eastAsia="it-IT"/>
         </w:rPr>
-        <w:t>il Timestamp + Valore Tensione</w:t>
+        <w:t xml:space="preserve">il </w:t>
+      </w:r>
+      <w:proofErr w:type="spellStart"/>
+      <w:r>
+        <w:rPr>
+          <w:rFonts w:ascii="Arial" w:eastAsia="Times New Roman" w:hAnsi="Arial" w:cs="Arial"/>
+          <w:sz w:val="24"/>
+          <w:szCs w:val="24"/>
+          <w:lang w:eastAsia="it-IT"/>
+        </w:rPr>
+        <w:t>Timestamp</w:t>
+      </w:r>
+      <w:proofErr w:type="spellEnd"/>
+      <w:r>
+        <w:rPr>
+          <w:rFonts w:ascii="Arial" w:eastAsia="Times New Roman" w:hAnsi="Arial" w:cs="Arial"/>
+          <w:sz w:val="24"/>
+          <w:szCs w:val="24"/>
+          <w:lang w:eastAsia="it-IT"/>
+        </w:rPr>
+        <w:t xml:space="preserve"> + Valore Tensione</w:t>
       </w:r>
     </w:p>
     <w:p>
@@ -7154,8 +7755,21 @@
           <w:szCs w:val="24"/>
           <w:lang w:eastAsia="it-IT"/>
         </w:rPr>
-        <w:t>l valore di Tensione + Timestamp</w:t>
-      </w:r>
+        <w:t xml:space="preserve">l valore di Tensione + </w:t>
+      </w:r>
+      <w:proofErr w:type="spellStart"/>
+      <w:r>
+        <w:rPr>
+          <w:rFonts w:ascii="Arial" w:eastAsia="Times New Roman" w:hAnsi="Arial" w:cs="Arial"/>
+          <w:b/>
+          <w:bCs/>
+          <w:sz w:val="24"/>
+          <w:szCs w:val="24"/>
+          <w:lang w:eastAsia="it-IT"/>
+        </w:rPr>
+        <w:t>Timestamp</w:t>
+      </w:r>
+      <w:proofErr w:type="spellEnd"/>
     </w:p>
     <w:p>
       <w:pPr>
@@ -7185,7 +7799,47 @@
           <w:szCs w:val="24"/>
           <w:lang w:val="en-US" w:eastAsia="it-IT"/>
         </w:rPr>
-        <w:t>Da numero sconosciuto – SMS:</w:t>
+        <w:t xml:space="preserve">Da </w:t>
+      </w:r>
+      <w:proofErr w:type="spellStart"/>
+      <w:r>
+        <w:rPr>
+          <w:rFonts w:ascii="Arial" w:eastAsia="Times New Roman" w:hAnsi="Arial" w:cs="Arial"/>
+          <w:sz w:val="24"/>
+          <w:szCs w:val="24"/>
+          <w:lang w:val="en-US" w:eastAsia="it-IT"/>
+        </w:rPr>
+        <w:t>numero</w:t>
+      </w:r>
+      <w:proofErr w:type="spellEnd"/>
+      <w:r>
+        <w:rPr>
+          <w:rFonts w:ascii="Arial" w:eastAsia="Times New Roman" w:hAnsi="Arial" w:cs="Arial"/>
+          <w:sz w:val="24"/>
+          <w:szCs w:val="24"/>
+          <w:lang w:val="en-US" w:eastAsia="it-IT"/>
+        </w:rPr>
+        <w:t xml:space="preserve"> </w:t>
+      </w:r>
+      <w:proofErr w:type="spellStart"/>
+      <w:r>
+        <w:rPr>
+          <w:rFonts w:ascii="Arial" w:eastAsia="Times New Roman" w:hAnsi="Arial" w:cs="Arial"/>
+          <w:sz w:val="24"/>
+          <w:szCs w:val="24"/>
+          <w:lang w:val="en-US" w:eastAsia="it-IT"/>
+        </w:rPr>
+        <w:t>sconosciuto</w:t>
+      </w:r>
+      <w:proofErr w:type="spellEnd"/>
+      <w:r>
+        <w:rPr>
+          <w:rFonts w:ascii="Arial" w:eastAsia="Times New Roman" w:hAnsi="Arial" w:cs="Arial"/>
+          <w:sz w:val="24"/>
+          <w:szCs w:val="24"/>
+          <w:lang w:val="en-US" w:eastAsia="it-IT"/>
+        </w:rPr>
+        <w:t xml:space="preserve"> – SMS:</w:t>
       </w:r>
       <w:r>
         <w:rPr>
@@ -7326,6 +7980,7 @@
                 <w:lang w:val="en-US" w:eastAsia="it-IT"/>
               </w:rPr>
             </w:pPr>
+            <w:proofErr w:type="gramStart"/>
             <w:r>
               <w:rPr>
                 <w:rFonts w:ascii="Arial" w:eastAsia="Times New Roman" w:hAnsi="Arial" w:cs="Arial"/>
@@ -7338,6 +7993,7 @@
               </w:rPr>
               <w:t>Test  #</w:t>
             </w:r>
+            <w:proofErr w:type="gramEnd"/>
           </w:p>
         </w:tc>
         <w:tc>
@@ -7690,16 +8346,58 @@
                 <w:szCs w:val="16"/>
                 <w:lang w:eastAsia="it-IT"/>
               </w:rPr>
-              <w:t xml:space="preserve">Attualmente il Fw </w:t>
-            </w:r>
-            <w:r>
-              <w:rPr>
-                <w:rFonts w:ascii="Arial" w:eastAsia="Times New Roman" w:hAnsi="Arial" w:cs="Arial"/>
-                <w:sz w:val="16"/>
-                <w:szCs w:val="16"/>
-                <w:lang w:eastAsia="it-IT"/>
-              </w:rPr>
-              <w:t>prevede il Master già inserito nel codice (usare n. fittizio per poi cambiarlo cn i comandi)</w:t>
+              <w:t xml:space="preserve">Attualmente il </w:t>
+            </w:r>
+            <w:proofErr w:type="spellStart"/>
+            <w:r>
+              <w:rPr>
+                <w:rFonts w:ascii="Arial" w:eastAsia="Times New Roman" w:hAnsi="Arial" w:cs="Arial"/>
+                <w:color w:val="000000" w:themeColor="text1"/>
+                <w:sz w:val="16"/>
+                <w:szCs w:val="16"/>
+                <w:lang w:eastAsia="it-IT"/>
+              </w:rPr>
+              <w:t>Fw</w:t>
+            </w:r>
+            <w:proofErr w:type="spellEnd"/>
+            <w:r>
+              <w:rPr>
+                <w:rFonts w:ascii="Arial" w:eastAsia="Times New Roman" w:hAnsi="Arial" w:cs="Arial"/>
+                <w:color w:val="000000" w:themeColor="text1"/>
+                <w:sz w:val="16"/>
+                <w:szCs w:val="16"/>
+                <w:lang w:eastAsia="it-IT"/>
+              </w:rPr>
+              <w:t xml:space="preserve"> </w:t>
+            </w:r>
+            <w:r>
+              <w:rPr>
+                <w:rFonts w:ascii="Arial" w:eastAsia="Times New Roman" w:hAnsi="Arial" w:cs="Arial"/>
+                <w:sz w:val="16"/>
+                <w:szCs w:val="16"/>
+                <w:lang w:eastAsia="it-IT"/>
+              </w:rPr>
+              <w:t xml:space="preserve">prevede il Master già inserito nel codice (usare n. fittizio per poi cambiarlo </w:t>
+            </w:r>
+            <w:proofErr w:type="spellStart"/>
+            <w:r>
+              <w:rPr>
+                <w:rFonts w:ascii="Arial" w:eastAsia="Times New Roman" w:hAnsi="Arial" w:cs="Arial"/>
+                <w:sz w:val="16"/>
+                <w:szCs w:val="16"/>
+                <w:lang w:eastAsia="it-IT"/>
+              </w:rPr>
+              <w:t>cn</w:t>
+            </w:r>
+            <w:proofErr w:type="spellEnd"/>
+            <w:r>
+              <w:rPr>
+                <w:rFonts w:ascii="Arial" w:eastAsia="Times New Roman" w:hAnsi="Arial" w:cs="Arial"/>
+                <w:sz w:val="16"/>
+                <w:szCs w:val="16"/>
+                <w:lang w:eastAsia="it-IT"/>
+              </w:rPr>
+              <w:t xml:space="preserve"> i comandi)</w:t>
             </w:r>
           </w:p>
         </w:tc>
@@ -7795,6 +8493,7 @@
                 <w:lang w:val="en-US" w:eastAsia="it-IT"/>
               </w:rPr>
             </w:pPr>
+            <w:proofErr w:type="gramStart"/>
             <w:r>
               <w:rPr>
                 <w:rFonts w:ascii="Arial" w:eastAsia="Times New Roman" w:hAnsi="Arial" w:cs="Arial"/>
@@ -7802,7 +8501,17 @@
                 <w:szCs w:val="16"/>
                 <w:lang w:val="en-US" w:eastAsia="it-IT"/>
               </w:rPr>
-              <w:t>”Authorized phone n." con:</w:t>
+              <w:t>”Authorized</w:t>
+            </w:r>
+            <w:proofErr w:type="gramEnd"/>
+            <w:r>
+              <w:rPr>
+                <w:rFonts w:ascii="Arial" w:eastAsia="Times New Roman" w:hAnsi="Arial" w:cs="Arial"/>
+                <w:sz w:val="16"/>
+                <w:szCs w:val="16"/>
+                <w:lang w:val="en-US" w:eastAsia="it-IT"/>
+              </w:rPr>
+              <w:t xml:space="preserve"> phone n." con:</w:t>
             </w:r>
           </w:p>
           <w:p>
@@ -7984,7 +8693,27 @@
                 <w:szCs w:val="16"/>
                 <w:lang w:eastAsia="it-IT"/>
               </w:rPr>
-              <w:t>Da qualsiasi numero  – Comando non documentato</w:t>
+              <w:t xml:space="preserve">Da qualsiasi </w:t>
+            </w:r>
+            <w:proofErr w:type="gramStart"/>
+            <w:r>
+              <w:rPr>
+                <w:rFonts w:ascii="Arial" w:eastAsia="Times New Roman" w:hAnsi="Arial" w:cs="Arial"/>
+                <w:sz w:val="16"/>
+                <w:szCs w:val="16"/>
+                <w:lang w:eastAsia="it-IT"/>
+              </w:rPr>
+              <w:t>numero  –</w:t>
+            </w:r>
+            <w:proofErr w:type="gramEnd"/>
+            <w:r>
+              <w:rPr>
+                <w:rFonts w:ascii="Arial" w:eastAsia="Times New Roman" w:hAnsi="Arial" w:cs="Arial"/>
+                <w:sz w:val="16"/>
+                <w:szCs w:val="16"/>
+                <w:lang w:eastAsia="it-IT"/>
+              </w:rPr>
+              <w:t xml:space="preserve"> Comando non documentato</w:t>
             </w:r>
           </w:p>
         </w:tc>
@@ -8500,6 +9229,7 @@
                 <w:lang w:val="en-US" w:eastAsia="it-IT"/>
               </w:rPr>
             </w:pPr>
+            <w:proofErr w:type="gramStart"/>
             <w:r>
               <w:rPr>
                 <w:rFonts w:ascii="Arial" w:eastAsia="Times New Roman" w:hAnsi="Arial" w:cs="Arial"/>
@@ -8507,7 +9237,17 @@
                 <w:szCs w:val="16"/>
                 <w:lang w:val="en-US" w:eastAsia="it-IT"/>
               </w:rPr>
-              <w:t>”Authorized phone n." con:</w:t>
+              <w:t>”Authorized</w:t>
+            </w:r>
+            <w:proofErr w:type="gramEnd"/>
+            <w:r>
+              <w:rPr>
+                <w:rFonts w:ascii="Arial" w:eastAsia="Times New Roman" w:hAnsi="Arial" w:cs="Arial"/>
+                <w:sz w:val="16"/>
+                <w:szCs w:val="16"/>
+                <w:lang w:val="en-US" w:eastAsia="it-IT"/>
+              </w:rPr>
+              <w:t xml:space="preserve"> phone n." con:</w:t>
             </w:r>
           </w:p>
           <w:p>
@@ -8985,6 +9725,7 @@
                 <w:lang w:val="en-US" w:eastAsia="it-IT"/>
               </w:rPr>
             </w:pPr>
+            <w:proofErr w:type="gramStart"/>
             <w:r>
               <w:rPr>
                 <w:rFonts w:ascii="Arial" w:eastAsia="Times New Roman" w:hAnsi="Arial" w:cs="Arial"/>
@@ -8992,7 +9733,17 @@
                 <w:szCs w:val="16"/>
                 <w:lang w:val="en-US" w:eastAsia="it-IT"/>
               </w:rPr>
-              <w:t>”Authorized phone n." con:</w:t>
+              <w:t>”Authorized</w:t>
+            </w:r>
+            <w:proofErr w:type="gramEnd"/>
+            <w:r>
+              <w:rPr>
+                <w:rFonts w:ascii="Arial" w:eastAsia="Times New Roman" w:hAnsi="Arial" w:cs="Arial"/>
+                <w:sz w:val="16"/>
+                <w:szCs w:val="16"/>
+                <w:lang w:val="en-US" w:eastAsia="it-IT"/>
+              </w:rPr>
+              <w:t xml:space="preserve"> phone n." con:</w:t>
             </w:r>
           </w:p>
           <w:p>
@@ -9446,6 +10197,7 @@
                 <w:lang w:val="en-US" w:eastAsia="it-IT"/>
               </w:rPr>
             </w:pPr>
+            <w:proofErr w:type="gramStart"/>
             <w:r>
               <w:rPr>
                 <w:rFonts w:ascii="Arial" w:eastAsia="Times New Roman" w:hAnsi="Arial" w:cs="Arial"/>
@@ -9453,7 +10205,17 @@
                 <w:szCs w:val="16"/>
                 <w:lang w:val="en-US" w:eastAsia="it-IT"/>
               </w:rPr>
-              <w:t>”Authorized phone n." con:</w:t>
+              <w:t>”Authorized</w:t>
+            </w:r>
+            <w:proofErr w:type="gramEnd"/>
+            <w:r>
+              <w:rPr>
+                <w:rFonts w:ascii="Arial" w:eastAsia="Times New Roman" w:hAnsi="Arial" w:cs="Arial"/>
+                <w:sz w:val="16"/>
+                <w:szCs w:val="16"/>
+                <w:lang w:val="en-US" w:eastAsia="it-IT"/>
+              </w:rPr>
+              <w:t xml:space="preserve"> phone n." con:</w:t>
             </w:r>
           </w:p>
           <w:p>
@@ -9888,15 +10650,15 @@
                 <w:rFonts w:ascii="Arial" w:eastAsia="Times New Roman" w:hAnsi="Arial" w:cs="Arial"/>
                 <w:sz w:val="16"/>
                 <w:szCs w:val="16"/>
-                <w:lang w:eastAsia="it-IT"/>
-              </w:rPr>
-            </w:pPr>
-            <w:r>
-              <w:rPr>
-                <w:rFonts w:ascii="Arial" w:eastAsia="Times New Roman" w:hAnsi="Arial" w:cs="Arial"/>
-                <w:sz w:val="16"/>
-                <w:szCs w:val="16"/>
-                <w:lang w:eastAsia="it-IT"/>
+                <w:lang w:val="en-US" w:eastAsia="it-IT"/>
+              </w:rPr>
+            </w:pPr>
+            <w:r>
+              <w:rPr>
+                <w:rFonts w:ascii="Arial" w:eastAsia="Times New Roman" w:hAnsi="Arial" w:cs="Arial"/>
+                <w:sz w:val="16"/>
+                <w:szCs w:val="16"/>
+                <w:lang w:val="en-US" w:eastAsia="it-IT"/>
               </w:rPr>
               <w:t>SMS:</w:t>
             </w:r>
@@ -9909,17 +10671,28 @@
                 <w:rFonts w:ascii="Arial" w:eastAsia="Times New Roman" w:hAnsi="Arial" w:cs="Arial"/>
                 <w:sz w:val="16"/>
                 <w:szCs w:val="16"/>
-                <w:lang w:eastAsia="it-IT"/>
-              </w:rPr>
-            </w:pPr>
-            <w:r>
-              <w:rPr>
-                <w:rFonts w:ascii="Arial" w:eastAsia="Times New Roman" w:hAnsi="Arial" w:cs="Arial"/>
-                <w:sz w:val="16"/>
-                <w:szCs w:val="16"/>
-                <w:lang w:eastAsia="it-IT"/>
-              </w:rPr>
-              <w:t>”Authorized phone n." con:</w:t>
+                <w:lang w:val="en-US" w:eastAsia="it-IT"/>
+              </w:rPr>
+            </w:pPr>
+            <w:proofErr w:type="gramStart"/>
+            <w:r>
+              <w:rPr>
+                <w:rFonts w:ascii="Arial" w:eastAsia="Times New Roman" w:hAnsi="Arial" w:cs="Arial"/>
+                <w:sz w:val="16"/>
+                <w:szCs w:val="16"/>
+                <w:lang w:val="en-US" w:eastAsia="it-IT"/>
+              </w:rPr>
+              <w:t>”Authorized</w:t>
+            </w:r>
+            <w:proofErr w:type="gramEnd"/>
+            <w:r>
+              <w:rPr>
+                <w:rFonts w:ascii="Arial" w:eastAsia="Times New Roman" w:hAnsi="Arial" w:cs="Arial"/>
+                <w:sz w:val="16"/>
+                <w:szCs w:val="16"/>
+                <w:lang w:val="en-US" w:eastAsia="it-IT"/>
+              </w:rPr>
+              <w:t xml:space="preserve"> phone n." con:</w:t>
             </w:r>
           </w:p>
           <w:p>
@@ -10249,6 +11022,7 @@
                 <w:lang w:eastAsia="it-IT"/>
               </w:rPr>
             </w:pPr>
+            <w:proofErr w:type="spellStart"/>
             <w:r>
               <w:rPr>
                 <w:rFonts w:ascii="Arial" w:eastAsia="Times New Roman" w:hAnsi="Arial" w:cs="Arial"/>
@@ -10258,6 +11032,7 @@
               </w:rPr>
               <w:t>Operation</w:t>
             </w:r>
+            <w:proofErr w:type="spellEnd"/>
           </w:p>
         </w:tc>
         <w:tc>
@@ -10354,15 +11129,15 @@
                 <w:rFonts w:ascii="Arial" w:eastAsia="Times New Roman" w:hAnsi="Arial" w:cs="Arial"/>
                 <w:sz w:val="16"/>
                 <w:szCs w:val="16"/>
-                <w:lang w:eastAsia="it-IT"/>
-              </w:rPr>
-            </w:pPr>
-            <w:r>
-              <w:rPr>
-                <w:rFonts w:ascii="Arial" w:eastAsia="Times New Roman" w:hAnsi="Arial" w:cs="Arial"/>
-                <w:sz w:val="16"/>
-                <w:szCs w:val="16"/>
-                <w:lang w:eastAsia="it-IT"/>
+                <w:lang w:val="en-US" w:eastAsia="it-IT"/>
+              </w:rPr>
+            </w:pPr>
+            <w:r>
+              <w:rPr>
+                <w:rFonts w:ascii="Arial" w:eastAsia="Times New Roman" w:hAnsi="Arial" w:cs="Arial"/>
+                <w:sz w:val="16"/>
+                <w:szCs w:val="16"/>
+                <w:lang w:val="en-US" w:eastAsia="it-IT"/>
               </w:rPr>
               <w:t>SMS:</w:t>
             </w:r>
@@ -10375,17 +11150,28 @@
                 <w:rFonts w:ascii="Arial" w:eastAsia="Times New Roman" w:hAnsi="Arial" w:cs="Arial"/>
                 <w:sz w:val="16"/>
                 <w:szCs w:val="16"/>
-                <w:lang w:eastAsia="it-IT"/>
-              </w:rPr>
-            </w:pPr>
-            <w:r>
-              <w:rPr>
-                <w:rFonts w:ascii="Arial" w:eastAsia="Times New Roman" w:hAnsi="Arial" w:cs="Arial"/>
-                <w:sz w:val="16"/>
-                <w:szCs w:val="16"/>
-                <w:lang w:eastAsia="it-IT"/>
-              </w:rPr>
-              <w:t>”Authorized phone n." con:</w:t>
+                <w:lang w:val="en-US" w:eastAsia="it-IT"/>
+              </w:rPr>
+            </w:pPr>
+            <w:proofErr w:type="gramStart"/>
+            <w:r>
+              <w:rPr>
+                <w:rFonts w:ascii="Arial" w:eastAsia="Times New Roman" w:hAnsi="Arial" w:cs="Arial"/>
+                <w:sz w:val="16"/>
+                <w:szCs w:val="16"/>
+                <w:lang w:val="en-US" w:eastAsia="it-IT"/>
+              </w:rPr>
+              <w:t>”Authorized</w:t>
+            </w:r>
+            <w:proofErr w:type="gramEnd"/>
+            <w:r>
+              <w:rPr>
+                <w:rFonts w:ascii="Arial" w:eastAsia="Times New Roman" w:hAnsi="Arial" w:cs="Arial"/>
+                <w:sz w:val="16"/>
+                <w:szCs w:val="16"/>
+                <w:lang w:val="en-US" w:eastAsia="it-IT"/>
+              </w:rPr>
+              <w:t xml:space="preserve"> phone n." con:</w:t>
             </w:r>
           </w:p>
           <w:p>
@@ -10512,6 +11298,7 @@
                 <w:lang w:eastAsia="it-IT"/>
               </w:rPr>
             </w:pPr>
+            <w:proofErr w:type="spellStart"/>
             <w:r>
               <w:rPr>
                 <w:rFonts w:ascii="Arial" w:eastAsia="Times New Roman" w:hAnsi="Arial" w:cs="Arial"/>
@@ -10521,6 +11308,7 @@
               </w:rPr>
               <w:t>Operation</w:t>
             </w:r>
+            <w:proofErr w:type="spellEnd"/>
           </w:p>
         </w:tc>
         <w:tc>
@@ -10573,16 +11361,7 @@
                 <w:szCs w:val="16"/>
                 <w:lang w:eastAsia="it-IT"/>
               </w:rPr>
-              <w:t>Da telefono sconosciuto</w:t>
-            </w:r>
-            <w:r>
-              <w:rPr>
-                <w:rFonts w:ascii="Arial" w:eastAsia="Times New Roman" w:hAnsi="Arial" w:cs="Arial"/>
-                <w:sz w:val="16"/>
-                <w:szCs w:val="16"/>
-                <w:lang w:eastAsia="it-IT"/>
-              </w:rPr>
-              <w:t xml:space="preserve"> o AUX</w:t>
+              <w:t>Da telefono sconosciuto o AUX</w:t>
             </w:r>
           </w:p>
         </w:tc>
@@ -10626,19 +11405,68 @@
                 <w:rFonts w:ascii="Arial" w:eastAsia="Times New Roman" w:hAnsi="Arial" w:cs="Arial"/>
                 <w:sz w:val="16"/>
                 <w:szCs w:val="16"/>
-                <w:lang w:eastAsia="it-IT"/>
-              </w:rPr>
-            </w:pPr>
-            <w:r>
-              <w:rPr>
-                <w:rFonts w:ascii="Arial" w:eastAsia="Times New Roman" w:hAnsi="Arial" w:cs="Arial"/>
-                <w:color w:val="FF0000"/>
-                <w:sz w:val="16"/>
-                <w:szCs w:val="16"/>
-                <w:lang w:eastAsia="it-IT"/>
-              </w:rPr>
-              <w:t>MANCA caso con comando N da numero non autorizzato</w:t>
-            </w:r>
+                <w:lang w:val="en-US" w:eastAsia="it-IT"/>
+              </w:rPr>
+            </w:pPr>
+            <w:r>
+              <w:rPr>
+                <w:rFonts w:ascii="Arial" w:eastAsia="Times New Roman" w:hAnsi="Arial" w:cs="Arial"/>
+                <w:sz w:val="16"/>
+                <w:szCs w:val="16"/>
+                <w:lang w:val="en-US" w:eastAsia="it-IT"/>
+              </w:rPr>
+              <w:t>SMS</w:t>
+            </w:r>
+            <w:r>
+              <w:rPr>
+                <w:rFonts w:ascii="Arial" w:eastAsia="Times New Roman" w:hAnsi="Arial" w:cs="Arial"/>
+                <w:sz w:val="16"/>
+                <w:szCs w:val="16"/>
+                <w:lang w:val="en-US" w:eastAsia="it-IT"/>
+              </w:rPr>
+              <w:t xml:space="preserve"> a </w:t>
+            </w:r>
+            <w:proofErr w:type="spellStart"/>
+            <w:r>
+              <w:rPr>
+                <w:rFonts w:ascii="Arial" w:eastAsia="Times New Roman" w:hAnsi="Arial" w:cs="Arial"/>
+                <w:sz w:val="16"/>
+                <w:szCs w:val="16"/>
+                <w:lang w:val="en-US" w:eastAsia="it-IT"/>
+              </w:rPr>
+              <w:t>Richiedente</w:t>
+            </w:r>
+            <w:proofErr w:type="spellEnd"/>
+            <w:r>
+              <w:rPr>
+                <w:rFonts w:ascii="Arial" w:eastAsia="Times New Roman" w:hAnsi="Arial" w:cs="Arial"/>
+                <w:sz w:val="16"/>
+                <w:szCs w:val="16"/>
+                <w:lang w:val="en-US" w:eastAsia="it-IT"/>
+              </w:rPr>
+              <w:t xml:space="preserve">; </w:t>
+            </w:r>
+            <w:r>
+              <w:rPr>
+                <w:rFonts w:ascii="Arial" w:eastAsia="Times New Roman" w:hAnsi="Arial" w:cs="Arial"/>
+                <w:sz w:val="16"/>
+                <w:szCs w:val="16"/>
+                <w:lang w:val="en-US" w:eastAsia="it-IT"/>
+              </w:rPr>
+              <w:t>"Request from NOT AUTHORIZED number"</w:t>
+            </w:r>
+          </w:p>
+          <w:p>
+            <w:pPr>
+              <w:spacing w:line="330" w:lineRule="atLeast"/>
+              <w:jc w:val="center"/>
+              <w:rPr>
+                <w:rFonts w:ascii="Arial" w:eastAsia="Times New Roman" w:hAnsi="Arial" w:cs="Arial"/>
+                <w:sz w:val="16"/>
+                <w:szCs w:val="16"/>
+                <w:lang w:val="en-US" w:eastAsia="it-IT"/>
+              </w:rPr>
+            </w:pPr>
           </w:p>
         </w:tc>
         <w:tc>
@@ -10654,7 +11482,7 @@
                 <w:rFonts w:ascii="Arial" w:eastAsia="Times New Roman" w:hAnsi="Arial" w:cs="Arial"/>
                 <w:sz w:val="16"/>
                 <w:szCs w:val="16"/>
-                <w:lang w:eastAsia="it-IT"/>
+                <w:lang w:val="en-US" w:eastAsia="it-IT"/>
               </w:rPr>
             </w:pPr>
           </w:p>
@@ -10707,6 +11535,7 @@
                 <w:lang w:eastAsia="it-IT"/>
               </w:rPr>
             </w:pPr>
+            <w:proofErr w:type="spellStart"/>
             <w:r>
               <w:rPr>
                 <w:rFonts w:ascii="Arial" w:eastAsia="Times New Roman" w:hAnsi="Arial" w:cs="Arial"/>
@@ -10716,6 +11545,7 @@
               </w:rPr>
               <w:t>Operation</w:t>
             </w:r>
+            <w:proofErr w:type="spellEnd"/>
           </w:p>
         </w:tc>
         <w:tc>
@@ -10741,8 +11571,19 @@
                 <w:szCs w:val="16"/>
                 <w:lang w:eastAsia="it-IT"/>
               </w:rPr>
-              <w:t>Ritorna il valore di Tensione + Timestamp</w:t>
-            </w:r>
+              <w:t xml:space="preserve">Ritorna il valore di Tensione + </w:t>
+            </w:r>
+            <w:proofErr w:type="spellStart"/>
+            <w:r>
+              <w:rPr>
+                <w:rFonts w:ascii="Arial" w:eastAsia="Times New Roman" w:hAnsi="Arial" w:cs="Arial"/>
+                <w:sz w:val="16"/>
+                <w:szCs w:val="16"/>
+                <w:lang w:eastAsia="it-IT"/>
+              </w:rPr>
+              <w:t>Timestamp</w:t>
+            </w:r>
+            <w:proofErr w:type="spellEnd"/>
           </w:p>
         </w:tc>
         <w:tc>
@@ -10832,9 +11673,10 @@
                 <w:rFonts w:ascii="Arial" w:eastAsia="Times New Roman" w:hAnsi="Arial" w:cs="Arial"/>
                 <w:sz w:val="16"/>
                 <w:szCs w:val="16"/>
-                <w:lang w:val="en-US" w:eastAsia="it-IT"/>
-              </w:rPr>
-            </w:pPr>
+                <w:lang w:eastAsia="it-IT"/>
+              </w:rPr>
+            </w:pPr>
+            <w:proofErr w:type="spellStart"/>
             <w:r>
               <w:rPr>
                 <w:rFonts w:ascii="Arial" w:eastAsia="Times New Roman" w:hAnsi="Arial" w:cs="Arial"/>
@@ -10842,46 +11684,41 @@
                 <w:iCs/>
                 <w:sz w:val="16"/>
                 <w:szCs w:val="16"/>
-                <w:lang w:val="en-US" w:eastAsia="it-IT"/>
+                <w:lang w:eastAsia="it-IT"/>
               </w:rPr>
               <w:t>timestamp</w:t>
             </w:r>
-            <w:r>
-              <w:rPr>
-                <w:rFonts w:ascii="Arial" w:eastAsia="Times New Roman" w:hAnsi="Arial" w:cs="Arial"/>
-                <w:sz w:val="16"/>
-                <w:szCs w:val="16"/>
-                <w:lang w:val="en-US" w:eastAsia="it-IT"/>
-              </w:rPr>
-              <w:t xml:space="preserve"> </w:t>
-            </w:r>
-            <w:r>
-              <w:rPr>
-                <w:rFonts w:ascii="Arial" w:eastAsia="Times New Roman" w:hAnsi="Arial" w:cs="Arial"/>
-                <w:sz w:val="16"/>
-                <w:szCs w:val="16"/>
-                <w:lang w:val="en-US" w:eastAsia="it-IT"/>
-              </w:rPr>
-              <w:t>“</w:t>
-            </w:r>
-            <w:r>
-              <w:rPr>
-                <w:rFonts w:ascii="Arial" w:eastAsia="Times New Roman" w:hAnsi="Arial" w:cs="Arial"/>
-                <w:sz w:val="16"/>
-                <w:szCs w:val="16"/>
-                <w:lang w:val="en-US" w:eastAsia="it-IT"/>
-              </w:rPr>
-              <w:t xml:space="preserve">Current Voltage: </w:t>
-            </w:r>
-            <w:r>
-              <w:rPr>
-                <w:rFonts w:ascii="Arial" w:eastAsia="Times New Roman" w:hAnsi="Arial" w:cs="Arial"/>
-                <w:sz w:val="16"/>
-                <w:szCs w:val="16"/>
-                <w:lang w:val="en-US" w:eastAsia="it-IT"/>
-              </w:rPr>
-              <w:t>“</w:t>
-            </w:r>
+            <w:proofErr w:type="spellEnd"/>
+            <w:r>
+              <w:rPr>
+                <w:rFonts w:ascii="Arial" w:eastAsia="Times New Roman" w:hAnsi="Arial" w:cs="Arial"/>
+                <w:sz w:val="16"/>
+                <w:szCs w:val="16"/>
+                <w:lang w:eastAsia="it-IT"/>
+              </w:rPr>
+              <w:t xml:space="preserve"> “</w:t>
+            </w:r>
+            <w:proofErr w:type="spellStart"/>
+            <w:r>
+              <w:rPr>
+                <w:rFonts w:ascii="Arial" w:eastAsia="Times New Roman" w:hAnsi="Arial" w:cs="Arial"/>
+                <w:sz w:val="16"/>
+                <w:szCs w:val="16"/>
+                <w:lang w:eastAsia="it-IT"/>
+              </w:rPr>
+              <w:t>Current</w:t>
+            </w:r>
+            <w:proofErr w:type="spellEnd"/>
+            <w:r>
+              <w:rPr>
+                <w:rFonts w:ascii="Arial" w:eastAsia="Times New Roman" w:hAnsi="Arial" w:cs="Arial"/>
+                <w:sz w:val="16"/>
+                <w:szCs w:val="16"/>
+                <w:lang w:eastAsia="it-IT"/>
+              </w:rPr>
+              <w:t xml:space="preserve"> Voltage: “</w:t>
+            </w:r>
+            <w:proofErr w:type="spellStart"/>
             <w:r>
               <w:rPr>
                 <w:rFonts w:ascii="Arial" w:eastAsia="Times New Roman" w:hAnsi="Arial" w:cs="Arial"/>
@@ -10889,36 +11726,39 @@
                 <w:iCs/>
                 <w:sz w:val="16"/>
                 <w:szCs w:val="16"/>
-                <w:lang w:val="en-US" w:eastAsia="it-IT"/>
+                <w:lang w:eastAsia="it-IT"/>
               </w:rPr>
               <w:t>voltage</w:t>
             </w:r>
-            <w:r>
-              <w:rPr>
-                <w:rFonts w:ascii="Arial" w:eastAsia="Times New Roman" w:hAnsi="Arial" w:cs="Arial"/>
-                <w:sz w:val="16"/>
-                <w:szCs w:val="16"/>
-                <w:lang w:val="en-US" w:eastAsia="it-IT"/>
-              </w:rPr>
-              <w:t xml:space="preserve"> </w:t>
-            </w:r>
-            <w:r>
-              <w:rPr>
-                <w:rFonts w:ascii="Arial" w:eastAsia="Times New Roman" w:hAnsi="Arial" w:cs="Arial"/>
-                <w:sz w:val="16"/>
-                <w:szCs w:val="16"/>
-                <w:lang w:val="en-US" w:eastAsia="it-IT"/>
-              </w:rPr>
-              <w:t>“</w:t>
-            </w:r>
-            <w:r>
-              <w:rPr>
-                <w:rFonts w:ascii="Arial" w:eastAsia="Times New Roman" w:hAnsi="Arial" w:cs="Arial"/>
-                <w:sz w:val="16"/>
-                <w:szCs w:val="16"/>
-                <w:lang w:val="en-US" w:eastAsia="it-IT"/>
-              </w:rPr>
-              <w:t>Vac"</w:t>
+            <w:proofErr w:type="spellEnd"/>
+            <w:r>
+              <w:rPr>
+                <w:rFonts w:ascii="Arial" w:eastAsia="Times New Roman" w:hAnsi="Arial" w:cs="Arial"/>
+                <w:sz w:val="16"/>
+                <w:szCs w:val="16"/>
+                <w:lang w:eastAsia="it-IT"/>
+              </w:rPr>
+              <w:t xml:space="preserve"> “</w:t>
+            </w:r>
+            <w:proofErr w:type="spellStart"/>
+            <w:r>
+              <w:rPr>
+                <w:rFonts w:ascii="Arial" w:eastAsia="Times New Roman" w:hAnsi="Arial" w:cs="Arial"/>
+                <w:sz w:val="16"/>
+                <w:szCs w:val="16"/>
+                <w:lang w:eastAsia="it-IT"/>
+              </w:rPr>
+              <w:t>Vac</w:t>
+            </w:r>
+            <w:proofErr w:type="spellEnd"/>
+            <w:r>
+              <w:rPr>
+                <w:rFonts w:ascii="Arial" w:eastAsia="Times New Roman" w:hAnsi="Arial" w:cs="Arial"/>
+                <w:sz w:val="16"/>
+                <w:szCs w:val="16"/>
+                <w:lang w:eastAsia="it-IT"/>
+              </w:rPr>
+              <w:t>"</w:t>
             </w:r>
           </w:p>
         </w:tc>
@@ -10935,7 +11775,7 @@
                 <w:rFonts w:ascii="Arial" w:eastAsia="Times New Roman" w:hAnsi="Arial" w:cs="Arial"/>
                 <w:sz w:val="16"/>
                 <w:szCs w:val="16"/>
-                <w:lang w:val="en-US" w:eastAsia="it-IT"/>
+                <w:lang w:eastAsia="it-IT"/>
               </w:rPr>
             </w:pPr>
           </w:p>
@@ -10988,6 +11828,7 @@
                 <w:lang w:eastAsia="it-IT"/>
               </w:rPr>
             </w:pPr>
+            <w:proofErr w:type="spellStart"/>
             <w:r>
               <w:rPr>
                 <w:rFonts w:ascii="Arial" w:eastAsia="Times New Roman" w:hAnsi="Arial" w:cs="Arial"/>
@@ -10997,6 +11838,7 @@
               </w:rPr>
               <w:t>Operation</w:t>
             </w:r>
+            <w:proofErr w:type="spellEnd"/>
           </w:p>
         </w:tc>
         <w:tc>
@@ -11022,8 +11864,19 @@
                 <w:szCs w:val="16"/>
                 <w:lang w:eastAsia="it-IT"/>
               </w:rPr>
-              <w:t>Ritorna il valore di Tensione + Timestamp</w:t>
-            </w:r>
+              <w:t xml:space="preserve">Ritorna il valore di Tensione + </w:t>
+            </w:r>
+            <w:proofErr w:type="spellStart"/>
+            <w:r>
+              <w:rPr>
+                <w:rFonts w:ascii="Arial" w:eastAsia="Times New Roman" w:hAnsi="Arial" w:cs="Arial"/>
+                <w:sz w:val="16"/>
+                <w:szCs w:val="16"/>
+                <w:lang w:eastAsia="it-IT"/>
+              </w:rPr>
+              <w:t>Timestamp</w:t>
+            </w:r>
+            <w:proofErr w:type="spellEnd"/>
           </w:p>
         </w:tc>
         <w:tc>
@@ -11116,6 +11969,7 @@
                 <w:lang w:eastAsia="it-IT"/>
               </w:rPr>
             </w:pPr>
+            <w:proofErr w:type="spellStart"/>
             <w:r>
               <w:rPr>
                 <w:rFonts w:ascii="Arial" w:eastAsia="Times New Roman" w:hAnsi="Arial" w:cs="Arial"/>
@@ -11127,15 +11981,37 @@
               </w:rPr>
               <w:t>timestamp</w:t>
             </w:r>
-            <w:r>
-              <w:rPr>
-                <w:rFonts w:ascii="Arial" w:eastAsia="Times New Roman" w:hAnsi="Arial" w:cs="Arial"/>
-                <w:sz w:val="16"/>
-                <w:szCs w:val="16"/>
-                <w:lang w:eastAsia="it-IT"/>
-              </w:rPr>
-              <w:t xml:space="preserve"> “Current Voltage: “</w:t>
-            </w:r>
+            <w:proofErr w:type="spellEnd"/>
+            <w:r>
+              <w:rPr>
+                <w:rFonts w:ascii="Arial" w:eastAsia="Times New Roman" w:hAnsi="Arial" w:cs="Arial"/>
+                <w:sz w:val="16"/>
+                <w:szCs w:val="16"/>
+                <w:lang w:eastAsia="it-IT"/>
+              </w:rPr>
+              <w:t xml:space="preserve"> “</w:t>
+            </w:r>
+            <w:proofErr w:type="spellStart"/>
+            <w:r>
+              <w:rPr>
+                <w:rFonts w:ascii="Arial" w:eastAsia="Times New Roman" w:hAnsi="Arial" w:cs="Arial"/>
+                <w:sz w:val="16"/>
+                <w:szCs w:val="16"/>
+                <w:lang w:eastAsia="it-IT"/>
+              </w:rPr>
+              <w:t>Current</w:t>
+            </w:r>
+            <w:proofErr w:type="spellEnd"/>
+            <w:r>
+              <w:rPr>
+                <w:rFonts w:ascii="Arial" w:eastAsia="Times New Roman" w:hAnsi="Arial" w:cs="Arial"/>
+                <w:sz w:val="16"/>
+                <w:szCs w:val="16"/>
+                <w:lang w:eastAsia="it-IT"/>
+              </w:rPr>
+              <w:t xml:space="preserve"> Voltage: “</w:t>
+            </w:r>
+            <w:proofErr w:type="spellStart"/>
             <w:r>
               <w:rPr>
                 <w:rFonts w:ascii="Arial" w:eastAsia="Times New Roman" w:hAnsi="Arial" w:cs="Arial"/>
@@ -11147,14 +12023,35 @@
               </w:rPr>
               <w:t>voltage</w:t>
             </w:r>
-            <w:r>
-              <w:rPr>
-                <w:rFonts w:ascii="Arial" w:eastAsia="Times New Roman" w:hAnsi="Arial" w:cs="Arial"/>
-                <w:sz w:val="16"/>
-                <w:szCs w:val="16"/>
-                <w:lang w:eastAsia="it-IT"/>
-              </w:rPr>
-              <w:t xml:space="preserve"> “Vac"</w:t>
+            <w:proofErr w:type="spellEnd"/>
+            <w:r>
+              <w:rPr>
+                <w:rFonts w:ascii="Arial" w:eastAsia="Times New Roman" w:hAnsi="Arial" w:cs="Arial"/>
+                <w:sz w:val="16"/>
+                <w:szCs w:val="16"/>
+                <w:lang w:eastAsia="it-IT"/>
+              </w:rPr>
+              <w:t xml:space="preserve"> “</w:t>
+            </w:r>
+            <w:proofErr w:type="spellStart"/>
+            <w:r>
+              <w:rPr>
+                <w:rFonts w:ascii="Arial" w:eastAsia="Times New Roman" w:hAnsi="Arial" w:cs="Arial"/>
+                <w:sz w:val="16"/>
+                <w:szCs w:val="16"/>
+                <w:lang w:eastAsia="it-IT"/>
+              </w:rPr>
+              <w:t>Vac</w:t>
+            </w:r>
+            <w:proofErr w:type="spellEnd"/>
+            <w:r>
+              <w:rPr>
+                <w:rFonts w:ascii="Arial" w:eastAsia="Times New Roman" w:hAnsi="Arial" w:cs="Arial"/>
+                <w:sz w:val="16"/>
+                <w:szCs w:val="16"/>
+                <w:lang w:eastAsia="it-IT"/>
+              </w:rPr>
+              <w:t>"</w:t>
             </w:r>
           </w:p>
         </w:tc>
@@ -11224,6 +12121,7 @@
                 <w:lang w:eastAsia="it-IT"/>
               </w:rPr>
             </w:pPr>
+            <w:proofErr w:type="spellStart"/>
             <w:r>
               <w:rPr>
                 <w:rFonts w:ascii="Arial" w:eastAsia="Times New Roman" w:hAnsi="Arial" w:cs="Arial"/>
@@ -11233,6 +12131,7 @@
               </w:rPr>
               <w:t>Operation</w:t>
             </w:r>
+            <w:proofErr w:type="spellEnd"/>
           </w:p>
         </w:tc>
         <w:tc>
@@ -11258,8 +12157,19 @@
                 <w:szCs w:val="16"/>
                 <w:lang w:eastAsia="it-IT"/>
               </w:rPr>
-              <w:t>Ritorna il valore di Tensione + Timestamp</w:t>
-            </w:r>
+              <w:t xml:space="preserve">Ritorna il valore di Tensione + </w:t>
+            </w:r>
+            <w:proofErr w:type="spellStart"/>
+            <w:r>
+              <w:rPr>
+                <w:rFonts w:ascii="Arial" w:eastAsia="Times New Roman" w:hAnsi="Arial" w:cs="Arial"/>
+                <w:sz w:val="16"/>
+                <w:szCs w:val="16"/>
+                <w:lang w:eastAsia="it-IT"/>
+              </w:rPr>
+              <w:t>Timestamp</w:t>
+            </w:r>
+            <w:proofErr w:type="spellEnd"/>
           </w:p>
         </w:tc>
         <w:tc>
@@ -11285,7 +12195,7 @@
                 <w:szCs w:val="16"/>
                 <w:lang w:eastAsia="it-IT"/>
               </w:rPr>
-              <w:t>Da telefono sconosciuto</w:t>
+              <w:t>Da Tel. Sconosciuto (non MASTER)</w:t>
             </w:r>
           </w:p>
         </w:tc>
@@ -11443,6 +12353,7 @@
                 <w:lang w:val="en-US" w:eastAsia="it-IT"/>
               </w:rPr>
             </w:pPr>
+            <w:proofErr w:type="spellStart"/>
             <w:r>
               <w:rPr>
                 <w:rFonts w:ascii="Arial" w:eastAsia="Times New Roman" w:hAnsi="Arial" w:cs="Arial"/>
@@ -11452,6 +12363,7 @@
               </w:rPr>
               <w:t>Operation</w:t>
             </w:r>
+            <w:proofErr w:type="spellEnd"/>
           </w:p>
         </w:tc>
         <w:tc>
@@ -11628,13 +12540,274 @@
                 <w:lang w:val="en-US" w:eastAsia="it-IT"/>
               </w:rPr>
             </w:pPr>
-            <w:r>
+          </w:p>
+        </w:tc>
+        <w:tc>
+          <w:tcPr>
+            <w:tcW w:w="1559" w:type="dxa"/>
+            <w:vAlign w:val="center"/>
+          </w:tcPr>
+          <w:p>
+            <w:pPr>
+              <w:spacing w:line="330" w:lineRule="atLeast"/>
+              <w:jc w:val="center"/>
+              <w:rPr>
+                <w:rFonts w:ascii="Arial" w:eastAsia="Times New Roman" w:hAnsi="Arial" w:cs="Arial"/>
+                <w:sz w:val="16"/>
+                <w:szCs w:val="16"/>
+                <w:lang w:eastAsia="it-IT"/>
+              </w:rPr>
+            </w:pPr>
+            <w:proofErr w:type="spellStart"/>
+            <w:r>
+              <w:rPr>
+                <w:rFonts w:ascii="Arial" w:eastAsia="Times New Roman" w:hAnsi="Arial" w:cs="Arial"/>
+                <w:sz w:val="16"/>
+                <w:szCs w:val="16"/>
+                <w:lang w:eastAsia="it-IT"/>
+              </w:rPr>
+              <w:t>Operation</w:t>
+            </w:r>
+            <w:proofErr w:type="spellEnd"/>
+          </w:p>
+        </w:tc>
+        <w:tc>
+          <w:tcPr>
+            <w:tcW w:w="3828" w:type="dxa"/>
+            <w:vAlign w:val="center"/>
+          </w:tcPr>
+          <w:p>
+            <w:pPr>
+              <w:spacing w:line="330" w:lineRule="atLeast"/>
+              <w:jc w:val="center"/>
+              <w:rPr>
+                <w:rFonts w:ascii="Arial" w:eastAsia="Times New Roman" w:hAnsi="Arial" w:cs="Arial"/>
+                <w:sz w:val="16"/>
+                <w:szCs w:val="16"/>
+                <w:lang w:eastAsia="it-IT"/>
+              </w:rPr>
+            </w:pPr>
+            <w:r>
+              <w:rPr>
+                <w:rFonts w:ascii="Arial" w:eastAsia="Times New Roman" w:hAnsi="Arial" w:cs="Arial"/>
+                <w:sz w:val="16"/>
+                <w:szCs w:val="16"/>
+                <w:lang w:eastAsia="it-IT"/>
+              </w:rPr>
+              <w:t xml:space="preserve">Cancella tutti i numeri </w:t>
+            </w:r>
+            <w:r>
+              <w:rPr>
+                <w:rFonts w:ascii="Arial" w:eastAsia="Times New Roman" w:hAnsi="Arial" w:cs="Arial"/>
+                <w:sz w:val="16"/>
+                <w:szCs w:val="16"/>
+                <w:lang w:eastAsia="it-IT"/>
+              </w:rPr>
+              <w:t xml:space="preserve">ESCLUSO </w:t>
+            </w:r>
+            <w:r>
+              <w:rPr>
+                <w:rFonts w:ascii="Arial" w:eastAsia="Times New Roman" w:hAnsi="Arial" w:cs="Arial"/>
+                <w:sz w:val="16"/>
+                <w:szCs w:val="16"/>
+                <w:lang w:eastAsia="it-IT"/>
+              </w:rPr>
+              <w:t>il MASTER</w:t>
+            </w:r>
+          </w:p>
+        </w:tc>
+        <w:tc>
+          <w:tcPr>
+            <w:tcW w:w="2409" w:type="dxa"/>
+            <w:vAlign w:val="center"/>
+          </w:tcPr>
+          <w:p>
+            <w:pPr>
+              <w:spacing w:line="330" w:lineRule="atLeast"/>
+              <w:jc w:val="center"/>
+              <w:rPr>
+                <w:rFonts w:ascii="Arial" w:eastAsia="Times New Roman" w:hAnsi="Arial" w:cs="Arial"/>
+                <w:sz w:val="16"/>
+                <w:szCs w:val="16"/>
+                <w:lang w:eastAsia="it-IT"/>
+              </w:rPr>
+            </w:pPr>
+            <w:r>
+              <w:rPr>
+                <w:rFonts w:ascii="Arial" w:eastAsia="Times New Roman" w:hAnsi="Arial" w:cs="Arial"/>
+                <w:sz w:val="16"/>
+                <w:szCs w:val="16"/>
+                <w:lang w:eastAsia="it-IT"/>
+              </w:rPr>
+              <w:t>D</w:t>
+            </w:r>
+            <w:r>
+              <w:rPr>
+                <w:rFonts w:ascii="Arial" w:eastAsia="Times New Roman" w:hAnsi="Arial" w:cs="Arial"/>
+                <w:sz w:val="16"/>
+                <w:szCs w:val="16"/>
+                <w:lang w:eastAsia="it-IT"/>
+              </w:rPr>
+              <w:t xml:space="preserve">a Tel. </w:t>
+            </w:r>
+            <w:r>
+              <w:rPr>
+                <w:rFonts w:ascii="Arial" w:eastAsia="Times New Roman" w:hAnsi="Arial" w:cs="Arial"/>
+                <w:sz w:val="16"/>
+                <w:szCs w:val="16"/>
+                <w:lang w:eastAsia="it-IT"/>
+              </w:rPr>
+              <w:t xml:space="preserve">Sconosciuto (non </w:t>
+            </w:r>
+            <w:r>
+              <w:rPr>
+                <w:rFonts w:ascii="Arial" w:eastAsia="Times New Roman" w:hAnsi="Arial" w:cs="Arial"/>
+                <w:sz w:val="16"/>
+                <w:szCs w:val="16"/>
+                <w:lang w:eastAsia="it-IT"/>
+              </w:rPr>
+              <w:t>MASTER</w:t>
+            </w:r>
+            <w:r>
+              <w:rPr>
+                <w:rFonts w:ascii="Arial" w:eastAsia="Times New Roman" w:hAnsi="Arial" w:cs="Arial"/>
+                <w:sz w:val="16"/>
+                <w:szCs w:val="16"/>
+                <w:lang w:eastAsia="it-IT"/>
+              </w:rPr>
+              <w:t>)</w:t>
+            </w:r>
+          </w:p>
+        </w:tc>
+        <w:tc>
+          <w:tcPr>
+            <w:tcW w:w="1701" w:type="dxa"/>
+            <w:vAlign w:val="center"/>
+          </w:tcPr>
+          <w:p>
+            <w:pPr>
+              <w:spacing w:line="330" w:lineRule="atLeast"/>
+              <w:jc w:val="center"/>
               <w:rPr>
                 <w:rFonts w:ascii="Arial" w:eastAsia="Times New Roman" w:hAnsi="Arial" w:cs="Arial"/>
                 <w:sz w:val="16"/>
                 <w:szCs w:val="16"/>
                 <w:lang w:val="en-US" w:eastAsia="it-IT"/>
               </w:rPr>
+            </w:pPr>
+            <w:r>
+              <w:rPr>
+                <w:rFonts w:ascii="Arial" w:eastAsia="Times New Roman" w:hAnsi="Arial" w:cs="Arial"/>
+                <w:sz w:val="16"/>
+                <w:szCs w:val="16"/>
+                <w:lang w:val="en-US" w:eastAsia="it-IT"/>
+              </w:rPr>
+              <w:t>D</w:t>
+            </w:r>
+          </w:p>
+        </w:tc>
+        <w:tc>
+          <w:tcPr>
+            <w:tcW w:w="3828" w:type="dxa"/>
+            <w:vAlign w:val="center"/>
+          </w:tcPr>
+          <w:p>
+            <w:pPr>
+              <w:spacing w:line="330" w:lineRule="atLeast"/>
+              <w:jc w:val="center"/>
+              <w:rPr>
+                <w:rFonts w:ascii="Arial" w:eastAsia="Times New Roman" w:hAnsi="Arial" w:cs="Arial"/>
+                <w:sz w:val="16"/>
+                <w:szCs w:val="16"/>
+                <w:lang w:val="en-US" w:eastAsia="it-IT"/>
+              </w:rPr>
+            </w:pPr>
+            <w:r>
+              <w:rPr>
+                <w:rFonts w:ascii="Arial" w:eastAsia="Times New Roman" w:hAnsi="Arial" w:cs="Arial"/>
+                <w:sz w:val="16"/>
+                <w:szCs w:val="16"/>
+                <w:lang w:val="en-US" w:eastAsia="it-IT"/>
+              </w:rPr>
+              <w:t xml:space="preserve">SMS a </w:t>
+            </w:r>
+            <w:proofErr w:type="spellStart"/>
+            <w:r>
+              <w:rPr>
+                <w:rFonts w:ascii="Arial" w:eastAsia="Times New Roman" w:hAnsi="Arial" w:cs="Arial"/>
+                <w:sz w:val="16"/>
+                <w:szCs w:val="16"/>
+                <w:lang w:val="en-US" w:eastAsia="it-IT"/>
+              </w:rPr>
+              <w:t>Richiedente</w:t>
+            </w:r>
+            <w:proofErr w:type="spellEnd"/>
+            <w:r>
+              <w:rPr>
+                <w:rFonts w:ascii="Arial" w:eastAsia="Times New Roman" w:hAnsi="Arial" w:cs="Arial"/>
+                <w:sz w:val="16"/>
+                <w:szCs w:val="16"/>
+                <w:lang w:val="en-US" w:eastAsia="it-IT"/>
+              </w:rPr>
+              <w:t xml:space="preserve">; </w:t>
+            </w:r>
+            <w:r>
+              <w:rPr>
+                <w:rFonts w:ascii="Arial" w:eastAsia="Times New Roman" w:hAnsi="Arial" w:cs="Arial"/>
+                <w:sz w:val="16"/>
+                <w:szCs w:val="16"/>
+                <w:lang w:val="en-US" w:eastAsia="it-IT"/>
+              </w:rPr>
+              <w:t>"Request from NOT AUTHORIZED number"</w:t>
+            </w:r>
+          </w:p>
+        </w:tc>
+        <w:tc>
+          <w:tcPr>
+            <w:tcW w:w="992" w:type="dxa"/>
+            <w:vAlign w:val="center"/>
+          </w:tcPr>
+          <w:p>
+            <w:pPr>
+              <w:spacing w:line="330" w:lineRule="atLeast"/>
+              <w:jc w:val="center"/>
+              <w:rPr>
+                <w:rFonts w:ascii="Arial" w:eastAsia="Times New Roman" w:hAnsi="Arial" w:cs="Arial"/>
+                <w:sz w:val="16"/>
+                <w:szCs w:val="16"/>
+                <w:lang w:val="en-US" w:eastAsia="it-IT"/>
+              </w:rPr>
+            </w:pPr>
+          </w:p>
+        </w:tc>
+      </w:tr>
+      <w:tr>
+        <w:trPr>
+          <w:jc w:val="center"/>
+        </w:trPr>
+        <w:tc>
+          <w:tcPr>
+            <w:tcW w:w="704" w:type="dxa"/>
+            <w:vAlign w:val="center"/>
+          </w:tcPr>
+          <w:p>
+            <w:pPr>
+              <w:spacing w:line="330" w:lineRule="atLeast"/>
+              <w:jc w:val="center"/>
+              <w:rPr>
+                <w:rFonts w:ascii="Arial" w:eastAsia="Times New Roman" w:hAnsi="Arial" w:cs="Arial"/>
+                <w:sz w:val="16"/>
+                <w:szCs w:val="16"/>
+                <w:lang w:val="en-US" w:eastAsia="it-IT"/>
+              </w:rPr>
+            </w:pPr>
+            <w:r>
+              <w:rPr>
+                <w:rFonts w:ascii="Arial" w:eastAsia="Times New Roman" w:hAnsi="Arial" w:cs="Arial"/>
+                <w:sz w:val="16"/>
+                <w:szCs w:val="16"/>
+                <w:lang w:val="en-US" w:eastAsia="it-IT"/>
+              </w:rPr>
               <w:t>3.5</w:t>
             </w:r>
           </w:p>
@@ -11655,6 +12828,7 @@
                 <w:lang w:val="en-US" w:eastAsia="it-IT"/>
               </w:rPr>
             </w:pPr>
+            <w:proofErr w:type="spellStart"/>
             <w:r>
               <w:rPr>
                 <w:rFonts w:ascii="Arial" w:eastAsia="Times New Roman" w:hAnsi="Arial" w:cs="Arial"/>
@@ -11664,6 +12838,7 @@
               </w:rPr>
               <w:t>Operation</w:t>
             </w:r>
+            <w:proofErr w:type="spellEnd"/>
           </w:p>
         </w:tc>
         <w:tc>
@@ -11784,6 +12959,7 @@
                 <w:lang w:val="en-US" w:eastAsia="it-IT"/>
               </w:rPr>
             </w:pPr>
+            <w:proofErr w:type="gramStart"/>
             <w:r>
               <w:rPr>
                 <w:rFonts w:ascii="Arial" w:eastAsia="Times New Roman" w:hAnsi="Arial" w:cs="Arial"/>
@@ -11791,7 +12967,17 @@
                 <w:szCs w:val="16"/>
                 <w:lang w:val="en-US" w:eastAsia="it-IT"/>
               </w:rPr>
-              <w:t>”Authorized phone n." con:</w:t>
+              <w:t>”Authorized</w:t>
+            </w:r>
+            <w:proofErr w:type="gramEnd"/>
+            <w:r>
+              <w:rPr>
+                <w:rFonts w:ascii="Arial" w:eastAsia="Times New Roman" w:hAnsi="Arial" w:cs="Arial"/>
+                <w:sz w:val="16"/>
+                <w:szCs w:val="16"/>
+                <w:lang w:val="en-US" w:eastAsia="it-IT"/>
+              </w:rPr>
+              <w:t xml:space="preserve"> phone n." con:</w:t>
             </w:r>
           </w:p>
           <w:p>
@@ -11879,60 +13065,146 @@
           <w:rFonts w:ascii="Arial" w:eastAsia="Times New Roman" w:hAnsi="Arial" w:cs="Arial"/>
           <w:sz w:val="24"/>
           <w:szCs w:val="24"/>
+          <w:lang w:eastAsia="it-IT"/>
+        </w:rPr>
+      </w:pPr>
+    </w:p>
+    <w:p>
+      <w:pPr>
+        <w:spacing w:after="0" w:line="330" w:lineRule="atLeast"/>
+        <w:rPr>
+          <w:rFonts w:ascii="Arial" w:eastAsia="Times New Roman" w:hAnsi="Arial" w:cs="Arial"/>
+          <w:b/>
+          <w:bCs/>
+          <w:sz w:val="24"/>
+          <w:szCs w:val="24"/>
+          <w:lang w:eastAsia="it-IT"/>
+        </w:rPr>
+      </w:pPr>
+      <w:r>
+        <w:rPr>
+          <w:rFonts w:ascii="Arial" w:eastAsia="Times New Roman" w:hAnsi="Arial" w:cs="Arial"/>
+          <w:sz w:val="24"/>
+          <w:szCs w:val="24"/>
+          <w:lang w:eastAsia="it-IT"/>
+        </w:rPr>
+        <w:t xml:space="preserve">Controllare </w:t>
+      </w:r>
+      <w:proofErr w:type="spellStart"/>
+      <w:r>
+        <w:rPr>
+          <w:rFonts w:ascii="Arial" w:eastAsia="Times New Roman" w:hAnsi="Arial" w:cs="Arial"/>
+          <w:sz w:val="24"/>
+          <w:szCs w:val="24"/>
+          <w:lang w:eastAsia="it-IT"/>
+        </w:rPr>
+        <w:t>phoneAut</w:t>
+      </w:r>
+      <w:proofErr w:type="spellEnd"/>
+      <w:r>
+        <w:rPr>
+          <w:rFonts w:ascii="Arial" w:eastAsia="Times New Roman" w:hAnsi="Arial" w:cs="Arial"/>
+          <w:sz w:val="24"/>
+          <w:szCs w:val="24"/>
+          <w:lang w:eastAsia="it-IT"/>
+        </w:rPr>
+        <w:t>:</w:t>
+      </w:r>
+    </w:p>
+    <w:p>
+      <w:pPr>
+        <w:shd w:val="clear" w:color="auto" w:fill="1E1E1E"/>
+        <w:spacing w:after="0" w:line="330" w:lineRule="atLeast"/>
+        <w:rPr>
+          <w:rFonts w:ascii="Consolas" w:eastAsia="Times New Roman" w:hAnsi="Consolas" w:cs="Times New Roman"/>
+          <w:color w:val="DADADA"/>
+          <w:sz w:val="24"/>
+          <w:szCs w:val="24"/>
           <w:lang w:val="en-US" w:eastAsia="it-IT"/>
         </w:rPr>
       </w:pPr>
-    </w:p>
-    <w:p>
-      <w:pPr>
+      <w:r>
+        <w:rPr>
+          <w:rFonts w:ascii="Consolas" w:eastAsia="Times New Roman" w:hAnsi="Consolas" w:cs="Times New Roman"/>
+          <w:color w:val="57A64A"/>
+          <w:sz w:val="24"/>
+          <w:szCs w:val="24"/>
+          <w:lang w:val="en-US" w:eastAsia="it-IT"/>
+        </w:rPr>
+        <w:t>// ################################ COMMAND D</w:t>
+      </w:r>
+    </w:p>
+    <w:p>
+      <w:pPr>
+        <w:shd w:val="clear" w:color="auto" w:fill="1E1E1E"/>
         <w:spacing w:after="0" w:line="330" w:lineRule="atLeast"/>
         <w:rPr>
-          <w:rFonts w:ascii="Arial" w:eastAsia="Times New Roman" w:hAnsi="Arial" w:cs="Arial"/>
+          <w:rFonts w:ascii="Consolas" w:eastAsia="Times New Roman" w:hAnsi="Consolas" w:cs="Times New Roman"/>
+          <w:color w:val="DADADA"/>
           <w:sz w:val="24"/>
           <w:szCs w:val="24"/>
           <w:lang w:val="en-US" w:eastAsia="it-IT"/>
         </w:rPr>
       </w:pPr>
-    </w:p>
-    <w:p>
-      <w:pPr>
-        <w:spacing w:after="0" w:line="330" w:lineRule="atLeast"/>
-        <w:rPr>
-          <w:rFonts w:ascii="Arial" w:eastAsia="Times New Roman" w:hAnsi="Arial" w:cs="Arial"/>
+      <w:r>
+        <w:rPr>
+          <w:rFonts w:ascii="Consolas" w:eastAsia="Times New Roman" w:hAnsi="Consolas" w:cs="Times New Roman"/>
+          <w:color w:val="57A64A"/>
           <w:sz w:val="24"/>
           <w:szCs w:val="24"/>
           <w:lang w:val="en-US" w:eastAsia="it-IT"/>
         </w:rPr>
-      </w:pPr>
-    </w:p>
-    <w:p>
-      <w:pPr>
-        <w:spacing w:after="0" w:line="330" w:lineRule="atLeast"/>
-        <w:rPr>
-          <w:rFonts w:ascii="Arial" w:eastAsia="Times New Roman" w:hAnsi="Arial" w:cs="Arial"/>
+        <w:t xml:space="preserve">//Delete in EEPROM and </w:t>
+      </w:r>
+      <w:proofErr w:type="spellStart"/>
+      <w:r>
+        <w:rPr>
+          <w:rFonts w:ascii="Consolas" w:eastAsia="Times New Roman" w:hAnsi="Consolas" w:cs="Times New Roman"/>
+          <w:color w:val="57A64A"/>
           <w:sz w:val="24"/>
           <w:szCs w:val="24"/>
           <w:lang w:val="en-US" w:eastAsia="it-IT"/>
         </w:rPr>
-      </w:pPr>
+        <w:t>phoneAut</w:t>
+      </w:r>
+      <w:proofErr w:type="spellEnd"/>
+      <w:r>
+        <w:rPr>
+          <w:rFonts w:ascii="Consolas" w:eastAsia="Times New Roman" w:hAnsi="Consolas" w:cs="Times New Roman"/>
+          <w:color w:val="57A64A"/>
+          <w:sz w:val="24"/>
+          <w:szCs w:val="24"/>
+          <w:lang w:val="en-US" w:eastAsia="it-IT"/>
+        </w:rPr>
+        <w:t xml:space="preserve"> auxiliaries phone numbers except the Authorized </w:t>
+      </w:r>
+      <w:proofErr w:type="gramStart"/>
+      <w:r>
+        <w:rPr>
+          <w:rFonts w:ascii="Consolas" w:eastAsia="Times New Roman" w:hAnsi="Consolas" w:cs="Times New Roman"/>
+          <w:color w:val="57A64A"/>
+          <w:sz w:val="24"/>
+          <w:szCs w:val="24"/>
+          <w:lang w:val="en-US" w:eastAsia="it-IT"/>
+        </w:rPr>
+        <w:t>MASTER[</w:t>
+      </w:r>
+      <w:proofErr w:type="gramEnd"/>
+      <w:r>
+        <w:rPr>
+          <w:rFonts w:ascii="Consolas" w:eastAsia="Times New Roman" w:hAnsi="Consolas" w:cs="Times New Roman"/>
+          <w:color w:val="57A64A"/>
+          <w:sz w:val="24"/>
+          <w:szCs w:val="24"/>
+          <w:lang w:val="en-US" w:eastAsia="it-IT"/>
+        </w:rPr>
+        <w:t>0]</w:t>
+      </w:r>
     </w:p>
     <w:p>
       <w:pPr>
         <w:spacing w:after="0" w:line="330" w:lineRule="atLeast"/>
         <w:ind w:firstLine="708"/>
-        <w:rPr>
-          <w:rFonts w:ascii="Arial" w:eastAsia="Times New Roman" w:hAnsi="Arial" w:cs="Arial"/>
-          <w:b/>
-          <w:bCs/>
-          <w:sz w:val="24"/>
-          <w:szCs w:val="24"/>
-          <w:lang w:val="en-US" w:eastAsia="it-IT"/>
-        </w:rPr>
-      </w:pPr>
-    </w:p>
-    <w:p>
-      <w:pPr>
-        <w:spacing w:after="0" w:line="330" w:lineRule="atLeast"/>
         <w:rPr>
           <w:rFonts w:ascii="Arial" w:eastAsia="Times New Roman" w:hAnsi="Arial" w:cs="Arial"/>
           <w:b/>
@@ -13087,7 +14359,7 @@
   <w:style w:type="paragraph" w:default="1" w:styleId="Normale">
     <w:name w:val="Normal"/>
     <w:qFormat/>
-    <w:rsid w:val="00C04EB2"/>
+    <w:rsid w:val="005E414C"/>
   </w:style>
   <w:style w:type="paragraph" w:styleId="Titolo3">
     <w:name w:val="heading 3"/>

</xml_diff>

<commit_message>
Aggiornamento 3 doc TestPlan
</commit_message>
<xml_diff>
--- a/SMS Manager for Power monitoring.docx
+++ b/SMS Manager for Power monitoring.docx
@@ -13204,29 +13204,53 @@
     <w:p>
       <w:pPr>
         <w:spacing w:after="0" w:line="330" w:lineRule="atLeast"/>
-        <w:ind w:firstLine="708"/>
-        <w:rPr>
-          <w:rFonts w:ascii="Arial" w:eastAsia="Times New Roman" w:hAnsi="Arial" w:cs="Arial"/>
-          <w:b/>
-          <w:bCs/>
+        <w:rPr>
+          <w:rFonts w:ascii="Arial" w:eastAsia="Times New Roman" w:hAnsi="Arial" w:cs="Arial"/>
           <w:sz w:val="24"/>
           <w:szCs w:val="24"/>
           <w:lang w:val="en-US" w:eastAsia="it-IT"/>
         </w:rPr>
       </w:pPr>
-    </w:p>
-    <w:p>
-      <w:pPr>
-        <w:spacing w:after="0" w:line="330" w:lineRule="atLeast"/>
-        <w:rPr>
-          <w:rFonts w:ascii="Arial" w:eastAsia="Times New Roman" w:hAnsi="Arial" w:cs="Arial"/>
-          <w:b/>
-          <w:bCs/>
+      <w:r>
+        <w:rPr>
+          <w:rFonts w:ascii="Arial" w:eastAsia="Times New Roman" w:hAnsi="Arial" w:cs="Arial"/>
           <w:sz w:val="24"/>
           <w:szCs w:val="24"/>
           <w:lang w:val="en-US" w:eastAsia="it-IT"/>
         </w:rPr>
-      </w:pPr>
+        <w:t xml:space="preserve">Forse </w:t>
+      </w:r>
+      <w:proofErr w:type="spellStart"/>
+      <w:r>
+        <w:rPr>
+          <w:rFonts w:ascii="Arial" w:eastAsia="Times New Roman" w:hAnsi="Arial" w:cs="Arial"/>
+          <w:sz w:val="24"/>
+          <w:szCs w:val="24"/>
+          <w:lang w:val="en-US" w:eastAsia="it-IT"/>
+        </w:rPr>
+        <w:t>già</w:t>
+      </w:r>
+      <w:proofErr w:type="spellEnd"/>
+      <w:r>
+        <w:rPr>
+          <w:rFonts w:ascii="Arial" w:eastAsia="Times New Roman" w:hAnsi="Arial" w:cs="Arial"/>
+          <w:sz w:val="24"/>
+          <w:szCs w:val="24"/>
+          <w:lang w:val="en-US" w:eastAsia="it-IT"/>
+        </w:rPr>
+        <w:t xml:space="preserve"> </w:t>
+      </w:r>
+      <w:proofErr w:type="spellStart"/>
+      <w:r>
+        <w:rPr>
+          <w:rFonts w:ascii="Arial" w:eastAsia="Times New Roman" w:hAnsi="Arial" w:cs="Arial"/>
+          <w:sz w:val="24"/>
+          <w:szCs w:val="24"/>
+          <w:lang w:val="en-US" w:eastAsia="it-IT"/>
+        </w:rPr>
+        <w:t>fatto</w:t>
+      </w:r>
+      <w:proofErr w:type="spellEnd"/>
     </w:p>
     <w:p>
       <w:pPr>

</xml_diff>

<commit_message>
TO sul DOC Word
</commit_message>
<xml_diff>
--- a/SMS Manager for Power monitoring.docx
+++ b/SMS Manager for Power monitoring.docx
@@ -7772,15 +7772,15 @@
                 <w:rFonts w:ascii="Arial" w:eastAsia="Times New Roman" w:hAnsi="Arial" w:cs="Arial"/>
                 <w:sz w:val="16"/>
                 <w:szCs w:val="16"/>
-                <w:lang w:eastAsia="it-IT"/>
-              </w:rPr>
-            </w:pPr>
-            <w:r>
-              <w:rPr>
-                <w:rFonts w:ascii="Arial" w:eastAsia="Times New Roman" w:hAnsi="Arial" w:cs="Arial"/>
-                <w:sz w:val="16"/>
-                <w:szCs w:val="16"/>
-                <w:lang w:eastAsia="it-IT"/>
+                <w:lang w:val="en-US" w:eastAsia="it-IT"/>
+              </w:rPr>
+            </w:pPr>
+            <w:r>
+              <w:rPr>
+                <w:rFonts w:ascii="Arial" w:eastAsia="Times New Roman" w:hAnsi="Arial" w:cs="Arial"/>
+                <w:sz w:val="16"/>
+                <w:szCs w:val="16"/>
+                <w:lang w:val="en-US" w:eastAsia="it-IT"/>
               </w:rPr>
               <w:t xml:space="preserve">SMS: </w:t>
             </w:r>
@@ -7792,15 +7792,15 @@
                 <w:rFonts w:ascii="Arial" w:eastAsia="Times New Roman" w:hAnsi="Arial" w:cs="Arial"/>
                 <w:sz w:val="16"/>
                 <w:szCs w:val="16"/>
-                <w:lang w:eastAsia="it-IT"/>
-              </w:rPr>
-            </w:pPr>
-            <w:r>
-              <w:rPr>
-                <w:rFonts w:ascii="Arial" w:eastAsia="Times New Roman" w:hAnsi="Arial" w:cs="Arial"/>
-                <w:sz w:val="16"/>
-                <w:szCs w:val="16"/>
-                <w:lang w:eastAsia="it-IT"/>
+                <w:lang w:val="en-US" w:eastAsia="it-IT"/>
+              </w:rPr>
+            </w:pPr>
+            <w:r>
+              <w:rPr>
+                <w:rFonts w:ascii="Arial" w:eastAsia="Times New Roman" w:hAnsi="Arial" w:cs="Arial"/>
+                <w:sz w:val="16"/>
+                <w:szCs w:val="16"/>
+                <w:lang w:val="en-US" w:eastAsia="it-IT"/>
               </w:rPr>
               <w:t>”Authorized phone n." con:</w:t>
             </w:r>
@@ -8476,15 +8476,15 @@
                 <w:rFonts w:ascii="Arial" w:eastAsia="Times New Roman" w:hAnsi="Arial" w:cs="Arial"/>
                 <w:sz w:val="16"/>
                 <w:szCs w:val="16"/>
-                <w:lang w:eastAsia="it-IT"/>
-              </w:rPr>
-            </w:pPr>
-            <w:r>
-              <w:rPr>
-                <w:rFonts w:ascii="Arial" w:eastAsia="Times New Roman" w:hAnsi="Arial" w:cs="Arial"/>
-                <w:sz w:val="16"/>
-                <w:szCs w:val="16"/>
-                <w:lang w:eastAsia="it-IT"/>
+                <w:lang w:val="en-US" w:eastAsia="it-IT"/>
+              </w:rPr>
+            </w:pPr>
+            <w:r>
+              <w:rPr>
+                <w:rFonts w:ascii="Arial" w:eastAsia="Times New Roman" w:hAnsi="Arial" w:cs="Arial"/>
+                <w:sz w:val="16"/>
+                <w:szCs w:val="16"/>
+                <w:lang w:val="en-US" w:eastAsia="it-IT"/>
               </w:rPr>
               <w:t>SMS:</w:t>
             </w:r>
@@ -8497,15 +8497,15 @@
                 <w:rFonts w:ascii="Arial" w:eastAsia="Times New Roman" w:hAnsi="Arial" w:cs="Arial"/>
                 <w:sz w:val="16"/>
                 <w:szCs w:val="16"/>
-                <w:lang w:eastAsia="it-IT"/>
-              </w:rPr>
-            </w:pPr>
-            <w:r>
-              <w:rPr>
-                <w:rFonts w:ascii="Arial" w:eastAsia="Times New Roman" w:hAnsi="Arial" w:cs="Arial"/>
-                <w:sz w:val="16"/>
-                <w:szCs w:val="16"/>
-                <w:lang w:eastAsia="it-IT"/>
+                <w:lang w:val="en-US" w:eastAsia="it-IT"/>
+              </w:rPr>
+            </w:pPr>
+            <w:r>
+              <w:rPr>
+                <w:rFonts w:ascii="Arial" w:eastAsia="Times New Roman" w:hAnsi="Arial" w:cs="Arial"/>
+                <w:sz w:val="16"/>
+                <w:szCs w:val="16"/>
+                <w:lang w:val="en-US" w:eastAsia="it-IT"/>
               </w:rPr>
               <w:t>”Authorized phone n." con:</w:t>
             </w:r>
@@ -8961,15 +8961,15 @@
                 <w:rFonts w:ascii="Arial" w:eastAsia="Times New Roman" w:hAnsi="Arial" w:cs="Arial"/>
                 <w:sz w:val="16"/>
                 <w:szCs w:val="16"/>
-                <w:lang w:eastAsia="it-IT"/>
-              </w:rPr>
-            </w:pPr>
-            <w:r>
-              <w:rPr>
-                <w:rFonts w:ascii="Arial" w:eastAsia="Times New Roman" w:hAnsi="Arial" w:cs="Arial"/>
-                <w:sz w:val="16"/>
-                <w:szCs w:val="16"/>
-                <w:lang w:eastAsia="it-IT"/>
+                <w:lang w:val="en-US" w:eastAsia="it-IT"/>
+              </w:rPr>
+            </w:pPr>
+            <w:r>
+              <w:rPr>
+                <w:rFonts w:ascii="Arial" w:eastAsia="Times New Roman" w:hAnsi="Arial" w:cs="Arial"/>
+                <w:sz w:val="16"/>
+                <w:szCs w:val="16"/>
+                <w:lang w:val="en-US" w:eastAsia="it-IT"/>
               </w:rPr>
               <w:t>SMS:</w:t>
             </w:r>
@@ -8982,15 +8982,15 @@
                 <w:rFonts w:ascii="Arial" w:eastAsia="Times New Roman" w:hAnsi="Arial" w:cs="Arial"/>
                 <w:sz w:val="16"/>
                 <w:szCs w:val="16"/>
-                <w:lang w:eastAsia="it-IT"/>
-              </w:rPr>
-            </w:pPr>
-            <w:r>
-              <w:rPr>
-                <w:rFonts w:ascii="Arial" w:eastAsia="Times New Roman" w:hAnsi="Arial" w:cs="Arial"/>
-                <w:sz w:val="16"/>
-                <w:szCs w:val="16"/>
-                <w:lang w:eastAsia="it-IT"/>
+                <w:lang w:val="en-US" w:eastAsia="it-IT"/>
+              </w:rPr>
+            </w:pPr>
+            <w:r>
+              <w:rPr>
+                <w:rFonts w:ascii="Arial" w:eastAsia="Times New Roman" w:hAnsi="Arial" w:cs="Arial"/>
+                <w:sz w:val="16"/>
+                <w:szCs w:val="16"/>
+                <w:lang w:val="en-US" w:eastAsia="it-IT"/>
               </w:rPr>
               <w:t>”Authorized phone n." con:</w:t>
             </w:r>
@@ -9422,15 +9422,15 @@
                 <w:rFonts w:ascii="Arial" w:eastAsia="Times New Roman" w:hAnsi="Arial" w:cs="Arial"/>
                 <w:sz w:val="16"/>
                 <w:szCs w:val="16"/>
-                <w:lang w:eastAsia="it-IT"/>
-              </w:rPr>
-            </w:pPr>
-            <w:r>
-              <w:rPr>
-                <w:rFonts w:ascii="Arial" w:eastAsia="Times New Roman" w:hAnsi="Arial" w:cs="Arial"/>
-                <w:sz w:val="16"/>
-                <w:szCs w:val="16"/>
-                <w:lang w:eastAsia="it-IT"/>
+                <w:lang w:val="en-US" w:eastAsia="it-IT"/>
+              </w:rPr>
+            </w:pPr>
+            <w:r>
+              <w:rPr>
+                <w:rFonts w:ascii="Arial" w:eastAsia="Times New Roman" w:hAnsi="Arial" w:cs="Arial"/>
+                <w:sz w:val="16"/>
+                <w:szCs w:val="16"/>
+                <w:lang w:val="en-US" w:eastAsia="it-IT"/>
               </w:rPr>
               <w:t>SMS:</w:t>
             </w:r>
@@ -9443,15 +9443,15 @@
                 <w:rFonts w:ascii="Arial" w:eastAsia="Times New Roman" w:hAnsi="Arial" w:cs="Arial"/>
                 <w:sz w:val="16"/>
                 <w:szCs w:val="16"/>
-                <w:lang w:eastAsia="it-IT"/>
-              </w:rPr>
-            </w:pPr>
-            <w:r>
-              <w:rPr>
-                <w:rFonts w:ascii="Arial" w:eastAsia="Times New Roman" w:hAnsi="Arial" w:cs="Arial"/>
-                <w:sz w:val="16"/>
-                <w:szCs w:val="16"/>
-                <w:lang w:eastAsia="it-IT"/>
+                <w:lang w:val="en-US" w:eastAsia="it-IT"/>
+              </w:rPr>
+            </w:pPr>
+            <w:r>
+              <w:rPr>
+                <w:rFonts w:ascii="Arial" w:eastAsia="Times New Roman" w:hAnsi="Arial" w:cs="Arial"/>
+                <w:sz w:val="16"/>
+                <w:szCs w:val="16"/>
+                <w:lang w:val="en-US" w:eastAsia="it-IT"/>
               </w:rPr>
               <w:t>”Authorized phone n." con:</w:t>
             </w:r>
@@ -9888,15 +9888,15 @@
                 <w:rFonts w:ascii="Arial" w:eastAsia="Times New Roman" w:hAnsi="Arial" w:cs="Arial"/>
                 <w:sz w:val="16"/>
                 <w:szCs w:val="16"/>
-                <w:lang w:eastAsia="it-IT"/>
-              </w:rPr>
-            </w:pPr>
-            <w:r>
-              <w:rPr>
-                <w:rFonts w:ascii="Arial" w:eastAsia="Times New Roman" w:hAnsi="Arial" w:cs="Arial"/>
-                <w:sz w:val="16"/>
-                <w:szCs w:val="16"/>
-                <w:lang w:eastAsia="it-IT"/>
+                <w:lang w:val="en-US" w:eastAsia="it-IT"/>
+              </w:rPr>
+            </w:pPr>
+            <w:r>
+              <w:rPr>
+                <w:rFonts w:ascii="Arial" w:eastAsia="Times New Roman" w:hAnsi="Arial" w:cs="Arial"/>
+                <w:sz w:val="16"/>
+                <w:szCs w:val="16"/>
+                <w:lang w:val="en-US" w:eastAsia="it-IT"/>
               </w:rPr>
               <w:t>SMS:</w:t>
             </w:r>
@@ -9909,15 +9909,15 @@
                 <w:rFonts w:ascii="Arial" w:eastAsia="Times New Roman" w:hAnsi="Arial" w:cs="Arial"/>
                 <w:sz w:val="16"/>
                 <w:szCs w:val="16"/>
-                <w:lang w:eastAsia="it-IT"/>
-              </w:rPr>
-            </w:pPr>
-            <w:r>
-              <w:rPr>
-                <w:rFonts w:ascii="Arial" w:eastAsia="Times New Roman" w:hAnsi="Arial" w:cs="Arial"/>
-                <w:sz w:val="16"/>
-                <w:szCs w:val="16"/>
-                <w:lang w:eastAsia="it-IT"/>
+                <w:lang w:val="en-US" w:eastAsia="it-IT"/>
+              </w:rPr>
+            </w:pPr>
+            <w:r>
+              <w:rPr>
+                <w:rFonts w:ascii="Arial" w:eastAsia="Times New Roman" w:hAnsi="Arial" w:cs="Arial"/>
+                <w:sz w:val="16"/>
+                <w:szCs w:val="16"/>
+                <w:lang w:val="en-US" w:eastAsia="it-IT"/>
               </w:rPr>
               <w:t>”Authorized phone n." con:</w:t>
             </w:r>
@@ -10354,15 +10354,15 @@
                 <w:rFonts w:ascii="Arial" w:eastAsia="Times New Roman" w:hAnsi="Arial" w:cs="Arial"/>
                 <w:sz w:val="16"/>
                 <w:szCs w:val="16"/>
-                <w:lang w:eastAsia="it-IT"/>
-              </w:rPr>
-            </w:pPr>
-            <w:r>
-              <w:rPr>
-                <w:rFonts w:ascii="Arial" w:eastAsia="Times New Roman" w:hAnsi="Arial" w:cs="Arial"/>
-                <w:sz w:val="16"/>
-                <w:szCs w:val="16"/>
-                <w:lang w:eastAsia="it-IT"/>
+                <w:lang w:val="en-US" w:eastAsia="it-IT"/>
+              </w:rPr>
+            </w:pPr>
+            <w:r>
+              <w:rPr>
+                <w:rFonts w:ascii="Arial" w:eastAsia="Times New Roman" w:hAnsi="Arial" w:cs="Arial"/>
+                <w:sz w:val="16"/>
+                <w:szCs w:val="16"/>
+                <w:lang w:val="en-US" w:eastAsia="it-IT"/>
               </w:rPr>
               <w:t>SMS:</w:t>
             </w:r>
@@ -10375,15 +10375,15 @@
                 <w:rFonts w:ascii="Arial" w:eastAsia="Times New Roman" w:hAnsi="Arial" w:cs="Arial"/>
                 <w:sz w:val="16"/>
                 <w:szCs w:val="16"/>
-                <w:lang w:eastAsia="it-IT"/>
-              </w:rPr>
-            </w:pPr>
-            <w:r>
-              <w:rPr>
-                <w:rFonts w:ascii="Arial" w:eastAsia="Times New Roman" w:hAnsi="Arial" w:cs="Arial"/>
-                <w:sz w:val="16"/>
-                <w:szCs w:val="16"/>
-                <w:lang w:eastAsia="it-IT"/>
+                <w:lang w:val="en-US" w:eastAsia="it-IT"/>
+              </w:rPr>
+            </w:pPr>
+            <w:r>
+              <w:rPr>
+                <w:rFonts w:ascii="Arial" w:eastAsia="Times New Roman" w:hAnsi="Arial" w:cs="Arial"/>
+                <w:sz w:val="16"/>
+                <w:szCs w:val="16"/>
+                <w:lang w:val="en-US" w:eastAsia="it-IT"/>
               </w:rPr>
               <w:t>”Authorized phone n." con:</w:t>
             </w:r>
@@ -11929,15 +11929,15 @@
                 <w:rFonts w:ascii="Arial" w:eastAsia="Times New Roman" w:hAnsi="Arial" w:cs="Arial"/>
                 <w:sz w:val="16"/>
                 <w:szCs w:val="16"/>
-                <w:lang w:eastAsia="it-IT"/>
-              </w:rPr>
-            </w:pPr>
-            <w:r>
-              <w:rPr>
-                <w:rFonts w:ascii="Arial" w:eastAsia="Times New Roman" w:hAnsi="Arial" w:cs="Arial"/>
-                <w:sz w:val="16"/>
-                <w:szCs w:val="16"/>
-                <w:lang w:eastAsia="it-IT"/>
+                <w:lang w:val="en-US" w:eastAsia="it-IT"/>
+              </w:rPr>
+            </w:pPr>
+            <w:r>
+              <w:rPr>
+                <w:rFonts w:ascii="Arial" w:eastAsia="Times New Roman" w:hAnsi="Arial" w:cs="Arial"/>
+                <w:sz w:val="16"/>
+                <w:szCs w:val="16"/>
+                <w:lang w:val="en-US" w:eastAsia="it-IT"/>
               </w:rPr>
               <w:t>SMS:</w:t>
             </w:r>
@@ -11950,15 +11950,15 @@
                 <w:rFonts w:ascii="Arial" w:eastAsia="Times New Roman" w:hAnsi="Arial" w:cs="Arial"/>
                 <w:sz w:val="16"/>
                 <w:szCs w:val="16"/>
-                <w:lang w:eastAsia="it-IT"/>
-              </w:rPr>
-            </w:pPr>
-            <w:r>
-              <w:rPr>
-                <w:rFonts w:ascii="Arial" w:eastAsia="Times New Roman" w:hAnsi="Arial" w:cs="Arial"/>
-                <w:sz w:val="16"/>
-                <w:szCs w:val="16"/>
-                <w:lang w:eastAsia="it-IT"/>
+                <w:lang w:val="en-US" w:eastAsia="it-IT"/>
+              </w:rPr>
+            </w:pPr>
+            <w:r>
+              <w:rPr>
+                <w:rFonts w:ascii="Arial" w:eastAsia="Times New Roman" w:hAnsi="Arial" w:cs="Arial"/>
+                <w:sz w:val="16"/>
+                <w:szCs w:val="16"/>
+                <w:lang w:val="en-US" w:eastAsia="it-IT"/>
               </w:rPr>
               <w:t>”Authorized phone n." con:</w:t>
             </w:r>
@@ -12186,6 +12186,62 @@
           <w:lang w:val="en-US"/>
         </w:rPr>
       </w:pPr>
+      <w:r>
+        <w:rPr>
+          <w:rFonts w:ascii="Arial" w:hAnsi="Arial" w:cs="Arial"/>
+          <w:lang w:val="en-US"/>
+        </w:rPr>
+        <w:t>Verificare CalcNauxphones</w:t>
+      </w:r>
+    </w:p>
+    <w:p>
+      <w:pPr>
+        <w:rPr>
+          <w:rFonts w:ascii="Arial" w:hAnsi="Arial" w:cs="Arial"/>
+          <w:lang w:val="en-US"/>
+        </w:rPr>
+      </w:pPr>
+      <w:r>
+        <w:rPr>
+          <w:rFonts w:ascii="Arial" w:hAnsi="Arial" w:cs="Arial"/>
+          <w:lang w:val="en-US"/>
+        </w:rPr>
+        <w:t>List AutPhones</w:t>
+      </w:r>
+    </w:p>
+    <w:p>
+      <w:pPr>
+        <w:rPr>
+          <w:rFonts w:ascii="Arial" w:hAnsi="Arial" w:cs="Arial"/>
+          <w:lang w:val="en-US"/>
+        </w:rPr>
+      </w:pPr>
+      <w:r>
+        <w:rPr>
+          <w:rFonts w:ascii="Arial" w:hAnsi="Arial" w:cs="Arial"/>
+          <w:lang w:val="en-US"/>
+        </w:rPr>
+        <w:t>Restore Phones</w:t>
+      </w:r>
+    </w:p>
+    <w:p>
+      <w:pPr>
+        <w:rPr>
+          <w:rFonts w:ascii="Arial" w:hAnsi="Arial" w:cs="Arial"/>
+        </w:rPr>
+      </w:pPr>
+      <w:r>
+        <w:rPr>
+          <w:rFonts w:ascii="Arial" w:hAnsi="Arial" w:cs="Arial"/>
+        </w:rPr>
+        <w:t>Se gestiscono correttamente RAM ed E</w:t>
+      </w:r>
+      <w:r>
+        <w:rPr>
+          <w:rFonts w:ascii="Arial" w:hAnsi="Arial" w:cs="Arial"/>
+        </w:rPr>
+        <w:t>EPROM</w:t>
+      </w:r>
     </w:p>
     <w:sectPr>
       <w:pgSz w:w="16838" w:h="11906" w:orient="landscape"/>

</xml_diff>